<commit_message>
thêm SRS và cập nhật tài liệu
</commit_message>
<xml_diff>
--- a/docs/Nhóm 16/01 - Tai lieu du an/2. Ke hoach du an phan mem/Project_Charter_BlueMoon.docx
+++ b/docs/Nhóm 16/01 - Tai lieu du an/2. Ke hoach du an phan mem/Project_Charter_BlueMoon.docx
@@ -72,8 +72,21 @@
           <w:sz w:val="32"/>
           <w:szCs w:val="32"/>
         </w:rPr>
-        <w:t>Phần mềm quản lý và thu phí chung cư BlueMoon</w:t>
-      </w:r>
+        <w:t xml:space="preserve">Phần mềm quản lý và thu phí chung cư </w:t>
+      </w:r>
+      <w:proofErr w:type="spellStart"/>
+      <w:r>
+        <w:rPr>
+          <w:rFonts w:ascii="Arial" w:eastAsia="Arial" w:hAnsi="Arial" w:cs="Arial"/>
+          <w:b/>
+          <w:bCs/>
+          <w:color w:val="2E75B6"/>
+          <w:sz w:val="32"/>
+          <w:szCs w:val="32"/>
+        </w:rPr>
+        <w:t>BlueMoon</w:t>
+      </w:r>
+      <w:proofErr w:type="spellEnd"/>
     </w:p>
     <w:p>
       <w:pPr>
@@ -175,7 +188,31 @@
                 <w:sz w:val="22"/>
                 <w:szCs w:val="22"/>
               </w:rPr>
-              <w:t>Project Manager:</w:t>
+              <w:t xml:space="preserve">Project </w:t>
+            </w:r>
+            <w:proofErr w:type="spellStart"/>
+            <w:r>
+              <w:rPr>
+                <w:rFonts w:ascii="Arial" w:eastAsia="Arial" w:hAnsi="Arial" w:cs="Arial"/>
+                <w:b/>
+                <w:bCs/>
+                <w:color w:val="444444"/>
+                <w:sz w:val="22"/>
+                <w:szCs w:val="22"/>
+              </w:rPr>
+              <w:t>Manager</w:t>
+            </w:r>
+            <w:proofErr w:type="spellEnd"/>
+            <w:r>
+              <w:rPr>
+                <w:rFonts w:ascii="Arial" w:eastAsia="Arial" w:hAnsi="Arial" w:cs="Arial"/>
+                <w:b/>
+                <w:bCs/>
+                <w:color w:val="444444"/>
+                <w:sz w:val="22"/>
+                <w:szCs w:val="22"/>
+              </w:rPr>
+              <w:t>:</w:t>
             </w:r>
           </w:p>
         </w:tc>
@@ -361,8 +398,19 @@
                 <w:sz w:val="21"/>
                 <w:szCs w:val="21"/>
               </w:rPr>
-              <w:t>Xây dựng phần mềm quản lý và thu phí chung cư BlueMoon</w:t>
-            </w:r>
+              <w:t xml:space="preserve">Xây dựng phần mềm quản lý và thu phí chung cư </w:t>
+            </w:r>
+            <w:proofErr w:type="spellStart"/>
+            <w:r>
+              <w:rPr>
+                <w:rFonts w:ascii="Arial" w:eastAsia="Arial" w:hAnsi="Arial" w:cs="Arial"/>
+                <w:color w:val="000000"/>
+                <w:sz w:val="21"/>
+                <w:szCs w:val="21"/>
+              </w:rPr>
+              <w:t>BlueMoon</w:t>
+            </w:r>
+            <w:proofErr w:type="spellEnd"/>
           </w:p>
         </w:tc>
       </w:tr>
@@ -489,8 +537,19 @@
                 <w:sz w:val="21"/>
                 <w:szCs w:val="21"/>
               </w:rPr>
-              <w:t>Ban quản trị chung cư BlueMoon</w:t>
-            </w:r>
+              <w:t xml:space="preserve">Ban quản trị chung cư </w:t>
+            </w:r>
+            <w:proofErr w:type="spellStart"/>
+            <w:r>
+              <w:rPr>
+                <w:rFonts w:ascii="Arial" w:eastAsia="Arial" w:hAnsi="Arial" w:cs="Arial"/>
+                <w:color w:val="000000"/>
+                <w:sz w:val="21"/>
+                <w:szCs w:val="21"/>
+              </w:rPr>
+              <w:t>BlueMoon</w:t>
+            </w:r>
+            <w:proofErr w:type="spellEnd"/>
           </w:p>
         </w:tc>
       </w:tr>
@@ -553,8 +612,19 @@
                 <w:sz w:val="21"/>
                 <w:szCs w:val="21"/>
               </w:rPr>
-              <w:t>Công ty Cổ phần Quản lý BlueMoon</w:t>
-            </w:r>
+              <w:t xml:space="preserve">Công ty Cổ phần Quản lý </w:t>
+            </w:r>
+            <w:proofErr w:type="spellStart"/>
+            <w:r>
+              <w:rPr>
+                <w:rFonts w:ascii="Arial" w:eastAsia="Arial" w:hAnsi="Arial" w:cs="Arial"/>
+                <w:color w:val="000000"/>
+                <w:sz w:val="21"/>
+                <w:szCs w:val="21"/>
+              </w:rPr>
+              <w:t>BlueMoon</w:t>
+            </w:r>
+            <w:proofErr w:type="spellEnd"/>
           </w:p>
         </w:tc>
       </w:tr>
@@ -597,10 +667,9 @@
                 <w:sz w:val="21"/>
                 <w:szCs w:val="21"/>
               </w:rPr>
-              <w:t xml:space="preserve">Project Manager </w:t>
-            </w:r>
-          </w:p>
-          <w:p>
+              <w:t xml:space="preserve">Project </w:t>
+            </w:r>
+            <w:proofErr w:type="spellStart"/>
             <w:r>
               <w:rPr>
                 <w:rFonts w:ascii="Arial" w:eastAsia="Arial" w:hAnsi="Arial" w:cs="Arial"/>
@@ -610,8 +679,59 @@
                 <w:sz w:val="21"/>
                 <w:szCs w:val="21"/>
               </w:rPr>
-              <w:t>Product Owner</w:t>
-            </w:r>
+              <w:t>Manager</w:t>
+            </w:r>
+            <w:proofErr w:type="spellEnd"/>
+            <w:r>
+              <w:rPr>
+                <w:rFonts w:ascii="Arial" w:eastAsia="Arial" w:hAnsi="Arial" w:cs="Arial"/>
+                <w:b/>
+                <w:bCs/>
+                <w:color w:val="000000"/>
+                <w:sz w:val="21"/>
+                <w:szCs w:val="21"/>
+              </w:rPr>
+              <w:t xml:space="preserve"> </w:t>
+            </w:r>
+          </w:p>
+          <w:p>
+            <w:proofErr w:type="spellStart"/>
+            <w:r>
+              <w:rPr>
+                <w:rFonts w:ascii="Arial" w:eastAsia="Arial" w:hAnsi="Arial" w:cs="Arial"/>
+                <w:b/>
+                <w:bCs/>
+                <w:color w:val="000000"/>
+                <w:sz w:val="21"/>
+                <w:szCs w:val="21"/>
+              </w:rPr>
+              <w:t>Product</w:t>
+            </w:r>
+            <w:proofErr w:type="spellEnd"/>
+            <w:r>
+              <w:rPr>
+                <w:rFonts w:ascii="Arial" w:eastAsia="Arial" w:hAnsi="Arial" w:cs="Arial"/>
+                <w:b/>
+                <w:bCs/>
+                <w:color w:val="000000"/>
+                <w:sz w:val="21"/>
+                <w:szCs w:val="21"/>
+              </w:rPr>
+              <w:t xml:space="preserve"> </w:t>
+            </w:r>
+            <w:proofErr w:type="spellStart"/>
+            <w:r>
+              <w:rPr>
+                <w:rFonts w:ascii="Arial" w:eastAsia="Arial" w:hAnsi="Arial" w:cs="Arial"/>
+                <w:b/>
+                <w:bCs/>
+                <w:color w:val="000000"/>
+                <w:sz w:val="21"/>
+                <w:szCs w:val="21"/>
+              </w:rPr>
+              <w:t>Owner</w:t>
+            </w:r>
+            <w:proofErr w:type="spellEnd"/>
           </w:p>
         </w:tc>
         <w:tc>
@@ -704,8 +824,19 @@
                 <w:sz w:val="21"/>
                 <w:szCs w:val="21"/>
               </w:rPr>
-              <w:t>Phần mềm nội bộ, thay đổi toàn bộ cách thức quản lý thu phí và thông tin hộ dân cư tại chung cư BlueMoon</w:t>
-            </w:r>
+              <w:t xml:space="preserve">Phần mềm nội bộ, thay đổi toàn bộ cách thức quản lý thu phí và thông tin hộ dân cư tại chung cư </w:t>
+            </w:r>
+            <w:proofErr w:type="spellStart"/>
+            <w:r>
+              <w:rPr>
+                <w:rFonts w:ascii="Arial" w:eastAsia="Arial" w:hAnsi="Arial" w:cs="Arial"/>
+                <w:color w:val="000000"/>
+                <w:sz w:val="21"/>
+                <w:szCs w:val="21"/>
+              </w:rPr>
+              <w:t>BlueMoon</w:t>
+            </w:r>
+            <w:proofErr w:type="spellEnd"/>
           </w:p>
         </w:tc>
       </w:tr>
@@ -881,6 +1012,7 @@
             <w:vAlign w:val="center"/>
           </w:tcPr>
           <w:p>
+            <w:proofErr w:type="spellStart"/>
             <w:r>
               <w:rPr>
                 <w:rFonts w:ascii="Arial" w:eastAsia="Arial" w:hAnsi="Arial" w:cs="Arial"/>
@@ -892,6 +1024,7 @@
               </w:rPr>
               <w:t>Email</w:t>
             </w:r>
+            <w:proofErr w:type="spellEnd"/>
           </w:p>
         </w:tc>
       </w:tr>
@@ -945,15 +1078,37 @@
             <w:vAlign w:val="center"/>
           </w:tcPr>
           <w:p>
-            <w:r>
-              <w:rPr>
-                <w:rFonts w:ascii="Arial" w:eastAsia="Arial" w:hAnsi="Arial" w:cs="Arial"/>
-                <w:color w:val="000000"/>
-                <w:sz w:val="21"/>
-                <w:szCs w:val="21"/>
-              </w:rPr>
-              <w:t>Scrum Master</w:t>
-            </w:r>
+            <w:proofErr w:type="spellStart"/>
+            <w:r>
+              <w:rPr>
+                <w:rFonts w:ascii="Arial" w:eastAsia="Arial" w:hAnsi="Arial" w:cs="Arial"/>
+                <w:color w:val="000000"/>
+                <w:sz w:val="21"/>
+                <w:szCs w:val="21"/>
+              </w:rPr>
+              <w:t>Scrum</w:t>
+            </w:r>
+            <w:proofErr w:type="spellEnd"/>
+            <w:r>
+              <w:rPr>
+                <w:rFonts w:ascii="Arial" w:eastAsia="Arial" w:hAnsi="Arial" w:cs="Arial"/>
+                <w:color w:val="000000"/>
+                <w:sz w:val="21"/>
+                <w:szCs w:val="21"/>
+              </w:rPr>
+              <w:t xml:space="preserve"> </w:t>
+            </w:r>
+            <w:proofErr w:type="spellStart"/>
+            <w:r>
+              <w:rPr>
+                <w:rFonts w:ascii="Arial" w:eastAsia="Arial" w:hAnsi="Arial" w:cs="Arial"/>
+                <w:color w:val="000000"/>
+                <w:sz w:val="21"/>
+                <w:szCs w:val="21"/>
+              </w:rPr>
+              <w:t>Master</w:t>
+            </w:r>
+            <w:proofErr w:type="spellEnd"/>
           </w:p>
         </w:tc>
         <w:tc>
@@ -982,7 +1137,27 @@
                 <w:sz w:val="21"/>
                 <w:szCs w:val="21"/>
               </w:rPr>
-              <w:t>Hỗ trợ nhóm tuân thủ Scrum, loại bỏ trở ngại, tổ chức các buổi họp</w:t>
+              <w:t xml:space="preserve">Hỗ trợ nhóm tuân thủ </w:t>
+            </w:r>
+            <w:proofErr w:type="spellStart"/>
+            <w:r>
+              <w:rPr>
+                <w:rFonts w:ascii="Arial" w:eastAsia="Arial" w:hAnsi="Arial" w:cs="Arial"/>
+                <w:color w:val="000000"/>
+                <w:sz w:val="21"/>
+                <w:szCs w:val="21"/>
+              </w:rPr>
+              <w:t>Scrum</w:t>
+            </w:r>
+            <w:proofErr w:type="spellEnd"/>
+            <w:r>
+              <w:rPr>
+                <w:rFonts w:ascii="Arial" w:eastAsia="Arial" w:hAnsi="Arial" w:cs="Arial"/>
+                <w:color w:val="000000"/>
+                <w:sz w:val="21"/>
+                <w:szCs w:val="21"/>
+              </w:rPr>
+              <w:t>, loại bỏ trở ngại, tổ chức các buổi họp</w:t>
             </w:r>
           </w:p>
         </w:tc>
@@ -1067,15 +1242,27 @@
             <w:vAlign w:val="center"/>
           </w:tcPr>
           <w:p>
-            <w:r>
-              <w:rPr>
-                <w:rFonts w:ascii="Arial" w:eastAsia="Arial" w:hAnsi="Arial" w:cs="Arial"/>
-                <w:color w:val="000000"/>
-                <w:sz w:val="21"/>
-                <w:szCs w:val="21"/>
-              </w:rPr>
-              <w:t xml:space="preserve">Product </w:t>
-            </w:r>
+            <w:proofErr w:type="spellStart"/>
+            <w:r>
+              <w:rPr>
+                <w:rFonts w:ascii="Arial" w:eastAsia="Arial" w:hAnsi="Arial" w:cs="Arial"/>
+                <w:color w:val="000000"/>
+                <w:sz w:val="21"/>
+                <w:szCs w:val="21"/>
+              </w:rPr>
+              <w:t>Product</w:t>
+            </w:r>
+            <w:proofErr w:type="spellEnd"/>
+            <w:r>
+              <w:rPr>
+                <w:rFonts w:ascii="Arial" w:eastAsia="Arial" w:hAnsi="Arial" w:cs="Arial"/>
+                <w:color w:val="000000"/>
+                <w:sz w:val="21"/>
+                <w:szCs w:val="21"/>
+              </w:rPr>
+              <w:t xml:space="preserve"> </w:t>
+            </w:r>
+            <w:proofErr w:type="spellStart"/>
             <w:r>
               <w:rPr>
                 <w:rFonts w:ascii="Arial" w:eastAsia="Arial" w:hAnsi="Arial" w:cs="Arial"/>
@@ -1085,15 +1272,27 @@
               </w:rPr>
               <w:t>Owner</w:t>
             </w:r>
-            <w:r>
-              <w:rPr>
-                <w:rFonts w:ascii="Arial" w:eastAsia="Arial" w:hAnsi="Arial" w:cs="Arial"/>
-                <w:color w:val="000000"/>
-                <w:sz w:val="21"/>
-                <w:szCs w:val="21"/>
-              </w:rPr>
-              <w:t xml:space="preserve"> Project Manager</w:t>
-            </w:r>
+            <w:proofErr w:type="spellEnd"/>
+            <w:r>
+              <w:rPr>
+                <w:rFonts w:ascii="Arial" w:eastAsia="Arial" w:hAnsi="Arial" w:cs="Arial"/>
+                <w:color w:val="000000"/>
+                <w:sz w:val="21"/>
+                <w:szCs w:val="21"/>
+              </w:rPr>
+              <w:t xml:space="preserve"> Project </w:t>
+            </w:r>
+            <w:proofErr w:type="spellStart"/>
+            <w:r>
+              <w:rPr>
+                <w:rFonts w:ascii="Arial" w:eastAsia="Arial" w:hAnsi="Arial" w:cs="Arial"/>
+                <w:color w:val="000000"/>
+                <w:sz w:val="21"/>
+                <w:szCs w:val="21"/>
+              </w:rPr>
+              <w:t>Manager</w:t>
+            </w:r>
+            <w:proofErr w:type="spellEnd"/>
           </w:p>
         </w:tc>
         <w:tc>
@@ -1122,16 +1321,76 @@
                 <w:sz w:val="21"/>
                 <w:szCs w:val="21"/>
               </w:rPr>
-              <w:t xml:space="preserve">Đại diện khách hàng, quản lý Product Backlog, </w:t>
-            </w:r>
-            <w:r>
-              <w:rPr>
-                <w:rFonts w:ascii="Arial" w:eastAsia="Arial" w:hAnsi="Arial" w:cs="Arial"/>
-                <w:color w:val="000000"/>
-                <w:sz w:val="21"/>
-                <w:szCs w:val="21"/>
-              </w:rPr>
-              <w:t>quyết định định hướng sản phẩm</w:t>
+              <w:t xml:space="preserve">Đại diện khách hàng, quản lý </w:t>
+            </w:r>
+            <w:proofErr w:type="spellStart"/>
+            <w:r>
+              <w:rPr>
+                <w:rFonts w:ascii="Arial" w:eastAsia="Arial" w:hAnsi="Arial" w:cs="Arial"/>
+                <w:color w:val="000000"/>
+                <w:sz w:val="21"/>
+                <w:szCs w:val="21"/>
+              </w:rPr>
+              <w:t>Product</w:t>
+            </w:r>
+            <w:proofErr w:type="spellEnd"/>
+            <w:r>
+              <w:rPr>
+                <w:rFonts w:ascii="Arial" w:eastAsia="Arial" w:hAnsi="Arial" w:cs="Arial"/>
+                <w:color w:val="000000"/>
+                <w:sz w:val="21"/>
+                <w:szCs w:val="21"/>
+              </w:rPr>
+              <w:t xml:space="preserve"> </w:t>
+            </w:r>
+            <w:proofErr w:type="spellStart"/>
+            <w:r>
+              <w:rPr>
+                <w:rFonts w:ascii="Arial" w:eastAsia="Arial" w:hAnsi="Arial" w:cs="Arial"/>
+                <w:color w:val="000000"/>
+                <w:sz w:val="21"/>
+                <w:szCs w:val="21"/>
+              </w:rPr>
+              <w:t>Backlog</w:t>
+            </w:r>
+            <w:proofErr w:type="spellEnd"/>
+            <w:r>
+              <w:rPr>
+                <w:rFonts w:ascii="Arial" w:eastAsia="Arial" w:hAnsi="Arial" w:cs="Arial"/>
+                <w:color w:val="000000"/>
+                <w:sz w:val="21"/>
+                <w:szCs w:val="21"/>
+              </w:rPr>
+              <w:t xml:space="preserve">, </w:t>
+            </w:r>
+            <w:r>
+              <w:rPr>
+                <w:rFonts w:ascii="Arial" w:eastAsia="Arial" w:hAnsi="Arial" w:cs="Arial"/>
+                <w:color w:val="000000"/>
+                <w:sz w:val="21"/>
+                <w:szCs w:val="21"/>
+              </w:rPr>
+              <w:t xml:space="preserve">quyết định </w:t>
+            </w:r>
+            <w:proofErr w:type="spellStart"/>
+            <w:r>
+              <w:rPr>
+                <w:rFonts w:ascii="Arial" w:eastAsia="Arial" w:hAnsi="Arial" w:cs="Arial"/>
+                <w:color w:val="000000"/>
+                <w:sz w:val="21"/>
+                <w:szCs w:val="21"/>
+              </w:rPr>
+              <w:t>định</w:t>
+            </w:r>
+            <w:proofErr w:type="spellEnd"/>
+            <w:r>
+              <w:rPr>
+                <w:rFonts w:ascii="Arial" w:eastAsia="Arial" w:hAnsi="Arial" w:cs="Arial"/>
+                <w:color w:val="000000"/>
+                <w:sz w:val="21"/>
+                <w:szCs w:val="21"/>
+              </w:rPr>
+              <w:t xml:space="preserve"> hướng sản phẩm</w:t>
             </w:r>
           </w:p>
         </w:tc>
@@ -1234,6 +1493,7 @@
             <w:vAlign w:val="center"/>
           </w:tcPr>
           <w:p>
+            <w:proofErr w:type="spellStart"/>
             <w:r>
               <w:rPr>
                 <w:rFonts w:ascii="Arial" w:eastAsia="Arial" w:hAnsi="Arial" w:cs="Arial"/>
@@ -1243,6 +1503,7 @@
               </w:rPr>
               <w:t>Developer</w:t>
             </w:r>
+            <w:proofErr w:type="spellEnd"/>
           </w:p>
         </w:tc>
         <w:tc>
@@ -1365,6 +1626,7 @@
             <w:vAlign w:val="center"/>
           </w:tcPr>
           <w:p>
+            <w:proofErr w:type="spellStart"/>
             <w:r>
               <w:rPr>
                 <w:rFonts w:ascii="Arial" w:eastAsia="Arial" w:hAnsi="Arial" w:cs="Arial"/>
@@ -1374,6 +1636,7 @@
               </w:rPr>
               <w:t>Developer</w:t>
             </w:r>
+            <w:proofErr w:type="spellEnd"/>
           </w:p>
         </w:tc>
         <w:tc>
@@ -1506,6 +1769,7 @@
                 <w:szCs w:val="21"/>
               </w:rPr>
             </w:pPr>
+            <w:proofErr w:type="spellStart"/>
             <w:r>
               <w:rPr>
                 <w:rFonts w:ascii="Arial" w:eastAsia="Arial" w:hAnsi="Arial" w:cs="Arial"/>
@@ -1515,6 +1779,7 @@
               </w:rPr>
               <w:t>Developer</w:t>
             </w:r>
+            <w:proofErr w:type="spellEnd"/>
           </w:p>
         </w:tc>
         <w:tc>
@@ -1867,8 +2132,19 @@
                 <w:sz w:val="21"/>
                 <w:szCs w:val="21"/>
               </w:rPr>
-              <w:t>Ban quản trị chung cư BlueMoon</w:t>
-            </w:r>
+              <w:t xml:space="preserve">Ban quản trị chung cư </w:t>
+            </w:r>
+            <w:proofErr w:type="spellStart"/>
+            <w:r>
+              <w:rPr>
+                <w:rFonts w:ascii="Arial" w:eastAsia="Arial" w:hAnsi="Arial" w:cs="Arial"/>
+                <w:color w:val="000000"/>
+                <w:sz w:val="21"/>
+                <w:szCs w:val="21"/>
+              </w:rPr>
+              <w:t>BlueMoon</w:t>
+            </w:r>
+            <w:proofErr w:type="spellEnd"/>
           </w:p>
         </w:tc>
         <w:tc>
@@ -1989,8 +2265,19 @@
                 <w:sz w:val="21"/>
                 <w:szCs w:val="21"/>
               </w:rPr>
-              <w:t>Kế toán ban quản trị BlueMoon</w:t>
-            </w:r>
+              <w:t xml:space="preserve">Kế toán ban quản trị </w:t>
+            </w:r>
+            <w:proofErr w:type="spellStart"/>
+            <w:r>
+              <w:rPr>
+                <w:rFonts w:ascii="Arial" w:eastAsia="Arial" w:hAnsi="Arial" w:cs="Arial"/>
+                <w:color w:val="000000"/>
+                <w:sz w:val="21"/>
+                <w:szCs w:val="21"/>
+              </w:rPr>
+              <w:t>BlueMoon</w:t>
+            </w:r>
+            <w:proofErr w:type="spellEnd"/>
           </w:p>
         </w:tc>
         <w:tc>
@@ -2198,7 +2485,43 @@
           <w:sz w:val="22"/>
           <w:szCs w:val="22"/>
         </w:rPr>
-        <w:t>Ban quản trị chung cư BlueMoon (30 tầng, hơn 400 căn hộ) hiện đang quản lý việc thu phí hoàn toàn thủ công bằng Excel. Quy trình này gây ra nhiều điểm nghẽn nghiêm trọng: dữ liệu dễ sai sót khi nhập tay, thiếu cơ chế tính toán tự động, không lưu vết lịch sử chỉnh sửa, và khó đối soát tài chính. Ban quản trị có nhu cầu cấp thiết xây dựng phần mềm để số hoá toàn bộ quy trình này.</w:t>
+        <w:t xml:space="preserve">Ban quản trị chung cư </w:t>
+      </w:r>
+      <w:proofErr w:type="spellStart"/>
+      <w:r>
+        <w:rPr>
+          <w:rFonts w:ascii="Arial" w:eastAsia="Arial" w:hAnsi="Arial" w:cs="Arial"/>
+          <w:sz w:val="22"/>
+          <w:szCs w:val="22"/>
+        </w:rPr>
+        <w:t>BlueMoon</w:t>
+      </w:r>
+      <w:proofErr w:type="spellEnd"/>
+      <w:r>
+        <w:rPr>
+          <w:rFonts w:ascii="Arial" w:eastAsia="Arial" w:hAnsi="Arial" w:cs="Arial"/>
+          <w:sz w:val="22"/>
+          <w:szCs w:val="22"/>
+        </w:rPr>
+        <w:t xml:space="preserve"> (30 tầng, hơn 400 căn hộ) hiện đang quản lý việc thu phí hoàn toàn thủ công bằng Excel. Quy trình này gây ra nhiều điểm nghẽn nghiêm trọng: dữ liệu dễ sai sót khi nhập tay, thiếu cơ chế tính toán tự động, không lưu vết lịch sử chỉnh sửa, và khó đối soát tài chính. Ban quản trị có nhu cầu cấp thiết xây dựng phần mềm để số </w:t>
+      </w:r>
+      <w:proofErr w:type="spellStart"/>
+      <w:r>
+        <w:rPr>
+          <w:rFonts w:ascii="Arial" w:eastAsia="Arial" w:hAnsi="Arial" w:cs="Arial"/>
+          <w:sz w:val="22"/>
+          <w:szCs w:val="22"/>
+        </w:rPr>
+        <w:t>hoá</w:t>
+      </w:r>
+      <w:proofErr w:type="spellEnd"/>
+      <w:r>
+        <w:rPr>
+          <w:rFonts w:ascii="Arial" w:eastAsia="Arial" w:hAnsi="Arial" w:cs="Arial"/>
+          <w:sz w:val="22"/>
+          <w:szCs w:val="22"/>
+        </w:rPr>
+        <w:t xml:space="preserve"> toàn bộ quy trình này.</w:t>
       </w:r>
     </w:p>
     <w:p>
@@ -2232,7 +2555,25 @@
           <w:sz w:val="22"/>
           <w:szCs w:val="22"/>
         </w:rPr>
-        <w:t>Xây dựng phần mềm hỗ trợ ban quản trị chung cư BlueMoon quản lý thông tin về các loại phí (phí dịch vụ, phí quản lý vận hành, khoản đóng góp tự nguyện, phí gửi xe), quản lý thông tin hộ gia đình (hộ khẩu) và nhân khẩu đang sinh sống tại chung cư, thay thế hoàn toàn quy trình Excel thủ công hiện tại.</w:t>
+        <w:t xml:space="preserve">Xây dựng phần mềm hỗ trợ ban quản trị chung cư </w:t>
+      </w:r>
+      <w:proofErr w:type="spellStart"/>
+      <w:r>
+        <w:rPr>
+          <w:rFonts w:ascii="Arial" w:eastAsia="Arial" w:hAnsi="Arial" w:cs="Arial"/>
+          <w:sz w:val="22"/>
+          <w:szCs w:val="22"/>
+        </w:rPr>
+        <w:t>BlueMoon</w:t>
+      </w:r>
+      <w:proofErr w:type="spellEnd"/>
+      <w:r>
+        <w:rPr>
+          <w:rFonts w:ascii="Arial" w:eastAsia="Arial" w:hAnsi="Arial" w:cs="Arial"/>
+          <w:sz w:val="22"/>
+          <w:szCs w:val="22"/>
+        </w:rPr>
+        <w:t xml:space="preserve"> quản lý thông tin về các loại phí (phí dịch vụ, phí quản lý vận hành, khoản đóng góp tự nguyện, phí gửi xe), quản lý thông tin hộ gia đình (hộ khẩu) và nhân khẩu đang sinh sống tại chung cư, thay thế hoàn toàn quy trình Excel thủ công hiện tại.</w:t>
       </w:r>
     </w:p>
     <w:p>
@@ -2271,7 +2612,25 @@
           <w:sz w:val="22"/>
           <w:szCs w:val="22"/>
         </w:rPr>
-        <w:t>Quản lý được 100% các loại phí cần thu tại chung cư BlueMoon.</w:t>
+        <w:t xml:space="preserve">Quản lý được 100% các loại phí cần thu tại chung cư </w:t>
+      </w:r>
+      <w:proofErr w:type="spellStart"/>
+      <w:r>
+        <w:rPr>
+          <w:rFonts w:ascii="Arial" w:eastAsia="Arial" w:hAnsi="Arial" w:cs="Arial"/>
+          <w:sz w:val="22"/>
+          <w:szCs w:val="22"/>
+        </w:rPr>
+        <w:t>BlueMoon</w:t>
+      </w:r>
+      <w:proofErr w:type="spellEnd"/>
+      <w:r>
+        <w:rPr>
+          <w:rFonts w:ascii="Arial" w:eastAsia="Arial" w:hAnsi="Arial" w:cs="Arial"/>
+          <w:sz w:val="22"/>
+          <w:szCs w:val="22"/>
+        </w:rPr>
+        <w:t>.</w:t>
       </w:r>
     </w:p>
     <w:p>
@@ -2379,8 +2738,36 @@
           <w:sz w:val="22"/>
           <w:szCs w:val="22"/>
         </w:rPr>
-        <w:t>Bộ cài đặt phần mềm hoàn chỉnh cho máy tính cá nhân (Windows)</w:t>
-      </w:r>
+        <w:t xml:space="preserve">Mã nguồn và gói triển khai ứng dụng </w:t>
+      </w:r>
+      <w:proofErr w:type="spellStart"/>
+      <w:r>
+        <w:rPr>
+          <w:rFonts w:ascii="Arial" w:eastAsia="Arial" w:hAnsi="Arial" w:cs="Arial"/>
+          <w:sz w:val="22"/>
+          <w:szCs w:val="22"/>
+        </w:rPr>
+        <w:t>Web</w:t>
+      </w:r>
+      <w:proofErr w:type="spellEnd"/>
+      <w:r>
+        <w:rPr>
+          <w:rFonts w:ascii="Arial" w:eastAsia="Arial" w:hAnsi="Arial" w:cs="Arial"/>
+          <w:sz w:val="22"/>
+          <w:szCs w:val="22"/>
+        </w:rPr>
+        <w:t xml:space="preserve"> </w:t>
+      </w:r>
+      <w:proofErr w:type="spellStart"/>
+      <w:r>
+        <w:rPr>
+          <w:rFonts w:ascii="Arial" w:eastAsia="Arial" w:hAnsi="Arial" w:cs="Arial"/>
+          <w:sz w:val="22"/>
+          <w:szCs w:val="22"/>
+        </w:rPr>
+        <w:t>BlueMoon</w:t>
+      </w:r>
+      <w:proofErr w:type="spellEnd"/>
     </w:p>
     <w:p>
       <w:pPr>
@@ -2397,22 +2784,7 @@
           <w:sz w:val="22"/>
           <w:szCs w:val="22"/>
         </w:rPr>
-        <w:t>Hướng dẫn sử dụng và hướng dẫn cài đặt</w:t>
-      </w:r>
-    </w:p>
-    <w:p>
-      <w:pPr>
-        <w:spacing w:before="60" w:after="60"/>
-      </w:pPr>
-      <w:r>
-        <w:rPr>
-          <w:rFonts w:ascii="Arial" w:eastAsia="Arial" w:hAnsi="Arial" w:cs="Arial"/>
-          <w:b/>
-          <w:bCs/>
-          <w:sz w:val="22"/>
-          <w:szCs w:val="22"/>
-        </w:rPr>
-        <w:t>Cho chủ đầu tư / giảng viên:</w:t>
+        <w:t>Tài liệu hướng dẫn cài đặt và cấu hình hệ thống</w:t>
       </w:r>
     </w:p>
     <w:p>
@@ -2430,23 +2802,22 @@
           <w:sz w:val="22"/>
           <w:szCs w:val="22"/>
         </w:rPr>
-        <w:t>Mã nguồn phần mềm (JavaFX + MySQL</w:t>
-      </w:r>
-      <w:r>
-        <w:rPr>
-          <w:rFonts w:ascii="Arial" w:eastAsia="Arial" w:hAnsi="Arial" w:cs="Arial"/>
+        <w:t>Tài liệu hướng dẫn sử dụng</w:t>
+      </w:r>
+    </w:p>
+    <w:p>
+      <w:pPr>
+        <w:spacing w:before="60" w:after="60"/>
+      </w:pPr>
+      <w:r>
+        <w:rPr>
+          <w:rFonts w:ascii="Arial" w:eastAsia="Arial" w:hAnsi="Arial" w:cs="Arial"/>
+          <w:b/>
+          <w:bCs/>
           <w:sz w:val="22"/>
           <w:szCs w:val="22"/>
         </w:rPr>
-        <w:t xml:space="preserve"> + CSS</w:t>
-      </w:r>
-      <w:r>
-        <w:rPr>
-          <w:rFonts w:ascii="Arial" w:eastAsia="Arial" w:hAnsi="Arial" w:cs="Arial"/>
-          <w:sz w:val="22"/>
-          <w:szCs w:val="22"/>
-        </w:rPr>
-        <w:t>)</w:t>
+        <w:t>Cho chủ đầu tư / giảng viên:</w:t>
       </w:r>
     </w:p>
     <w:p>
@@ -2464,7 +2835,87 @@
           <w:sz w:val="22"/>
           <w:szCs w:val="22"/>
         </w:rPr>
-        <w:t>Tài liệu kỹ thuật: SRS, tài liệu phân tích thiết kế, tài liệu kiểm thử, API docs</w:t>
+        <w:t>Mã nguồn phần mềm (</w:t>
+      </w:r>
+      <w:proofErr w:type="spellStart"/>
+      <w:r>
+        <w:rPr>
+          <w:rFonts w:ascii="Arial" w:eastAsia="Arial" w:hAnsi="Arial" w:cs="Arial"/>
+          <w:sz w:val="22"/>
+          <w:szCs w:val="22"/>
+        </w:rPr>
+        <w:t>Spring</w:t>
+      </w:r>
+      <w:proofErr w:type="spellEnd"/>
+      <w:r>
+        <w:rPr>
+          <w:rFonts w:ascii="Arial" w:eastAsia="Arial" w:hAnsi="Arial" w:cs="Arial"/>
+          <w:sz w:val="22"/>
+          <w:szCs w:val="22"/>
+        </w:rPr>
+        <w:t xml:space="preserve"> </w:t>
+      </w:r>
+      <w:proofErr w:type="spellStart"/>
+      <w:r>
+        <w:rPr>
+          <w:rFonts w:ascii="Arial" w:eastAsia="Arial" w:hAnsi="Arial" w:cs="Arial"/>
+          <w:sz w:val="22"/>
+          <w:szCs w:val="22"/>
+        </w:rPr>
+        <w:t>Boot</w:t>
+      </w:r>
+      <w:proofErr w:type="spellEnd"/>
+      <w:r>
+        <w:rPr>
+          <w:rFonts w:ascii="Arial" w:eastAsia="Arial" w:hAnsi="Arial" w:cs="Arial"/>
+          <w:sz w:val="22"/>
+          <w:szCs w:val="22"/>
+        </w:rPr>
+        <w:t xml:space="preserve"> + </w:t>
+      </w:r>
+      <w:proofErr w:type="spellStart"/>
+      <w:r>
+        <w:rPr>
+          <w:rFonts w:ascii="Arial" w:eastAsia="Arial" w:hAnsi="Arial" w:cs="Arial"/>
+          <w:sz w:val="22"/>
+          <w:szCs w:val="22"/>
+        </w:rPr>
+        <w:t>Thymeleaf</w:t>
+      </w:r>
+      <w:proofErr w:type="spellEnd"/>
+      <w:r>
+        <w:rPr>
+          <w:rFonts w:ascii="Arial" w:eastAsia="Arial" w:hAnsi="Arial" w:cs="Arial"/>
+          <w:sz w:val="22"/>
+          <w:szCs w:val="22"/>
+        </w:rPr>
+        <w:t xml:space="preserve"> + </w:t>
+      </w:r>
+      <w:proofErr w:type="spellStart"/>
+      <w:r>
+        <w:rPr>
+          <w:rFonts w:ascii="Arial" w:eastAsia="Arial" w:hAnsi="Arial" w:cs="Arial"/>
+          <w:sz w:val="22"/>
+          <w:szCs w:val="22"/>
+        </w:rPr>
+        <w:t>MySQL</w:t>
+      </w:r>
+      <w:proofErr w:type="spellEnd"/>
+      <w:r>
+        <w:rPr>
+          <w:rFonts w:ascii="Arial" w:eastAsia="Arial" w:hAnsi="Arial" w:cs="Arial"/>
+          <w:sz w:val="22"/>
+          <w:szCs w:val="22"/>
+        </w:rPr>
+        <w:t xml:space="preserve"> + </w:t>
+      </w:r>
+      <w:r>
+        <w:rPr>
+          <w:rFonts w:ascii="Arial" w:eastAsia="Arial" w:hAnsi="Arial" w:cs="Arial"/>
+          <w:sz w:val="22"/>
+          <w:szCs w:val="22"/>
+        </w:rPr>
+        <w:t>CSS)</w:t>
       </w:r>
     </w:p>
     <w:p>
@@ -2482,7 +2933,71 @@
           <w:sz w:val="22"/>
           <w:szCs w:val="22"/>
         </w:rPr>
-        <w:t>Tài liệu dự án: Project Charter, Kế hoạch Scrum, Quản lý rủi ro</w:t>
+        <w:t xml:space="preserve">Tài liệu kỹ thuật: SRS, tài liệu phân tích thiết kế, tài liệu kiểm thử, API </w:t>
+      </w:r>
+      <w:proofErr w:type="spellStart"/>
+      <w:r>
+        <w:rPr>
+          <w:rFonts w:ascii="Arial" w:eastAsia="Arial" w:hAnsi="Arial" w:cs="Arial"/>
+          <w:sz w:val="22"/>
+          <w:szCs w:val="22"/>
+        </w:rPr>
+        <w:t>docs</w:t>
+      </w:r>
+      <w:proofErr w:type="spellEnd"/>
+    </w:p>
+    <w:p>
+      <w:pPr>
+        <w:pStyle w:val="oancuaDanhsach"/>
+        <w:numPr>
+          <w:ilvl w:val="0"/>
+          <w:numId w:val="2"/>
+        </w:numPr>
+        <w:spacing w:before="40" w:after="40"/>
+      </w:pPr>
+      <w:r>
+        <w:rPr>
+          <w:rFonts w:ascii="Arial" w:eastAsia="Arial" w:hAnsi="Arial" w:cs="Arial"/>
+          <w:sz w:val="22"/>
+          <w:szCs w:val="22"/>
+        </w:rPr>
+        <w:t xml:space="preserve">Tài liệu dự án: Project </w:t>
+      </w:r>
+      <w:proofErr w:type="spellStart"/>
+      <w:r>
+        <w:rPr>
+          <w:rFonts w:ascii="Arial" w:eastAsia="Arial" w:hAnsi="Arial" w:cs="Arial"/>
+          <w:sz w:val="22"/>
+          <w:szCs w:val="22"/>
+        </w:rPr>
+        <w:t>Charter</w:t>
+      </w:r>
+      <w:proofErr w:type="spellEnd"/>
+      <w:r>
+        <w:rPr>
+          <w:rFonts w:ascii="Arial" w:eastAsia="Arial" w:hAnsi="Arial" w:cs="Arial"/>
+          <w:sz w:val="22"/>
+          <w:szCs w:val="22"/>
+        </w:rPr>
+        <w:t xml:space="preserve">, Kế hoạch </w:t>
+      </w:r>
+      <w:proofErr w:type="spellStart"/>
+      <w:r>
+        <w:rPr>
+          <w:rFonts w:ascii="Arial" w:eastAsia="Arial" w:hAnsi="Arial" w:cs="Arial"/>
+          <w:sz w:val="22"/>
+          <w:szCs w:val="22"/>
+        </w:rPr>
+        <w:t>Scrum</w:t>
+      </w:r>
+      <w:proofErr w:type="spellEnd"/>
+      <w:r>
+        <w:rPr>
+          <w:rFonts w:ascii="Arial" w:eastAsia="Arial" w:hAnsi="Arial" w:cs="Arial"/>
+          <w:sz w:val="22"/>
+          <w:szCs w:val="22"/>
+        </w:rPr>
+        <w:t>, Quản lý rủi ro</w:t>
       </w:r>
     </w:p>
     <w:p>
@@ -2559,29 +3074,9 @@
                 <w:sz w:val="21"/>
                 <w:szCs w:val="21"/>
               </w:rPr>
-              <w:t>Bao gồm (In Scope)</w:t>
-            </w:r>
-          </w:p>
-        </w:tc>
-        <w:tc>
-          <w:tcPr>
-            <w:tcW w:w="4873" w:type="dxa"/>
-            <w:tcBorders>
-              <w:top w:val="single" w:sz="4" w:space="0" w:color="AAAAAA"/>
-              <w:left w:val="single" w:sz="4" w:space="0" w:color="AAAAAA"/>
-              <w:bottom w:val="single" w:sz="4" w:space="0" w:color="AAAAAA"/>
-              <w:right w:val="single" w:sz="4" w:space="0" w:color="AAAAAA"/>
-            </w:tcBorders>
-            <w:shd w:val="clear" w:color="auto" w:fill="2E75B6"/>
-            <w:tcMar>
-              <w:top w:w="80" w:type="dxa"/>
-              <w:left w:w="140" w:type="dxa"/>
-              <w:bottom w:w="80" w:type="dxa"/>
-              <w:right w:w="140" w:type="dxa"/>
-            </w:tcMar>
-            <w:vAlign w:val="center"/>
-          </w:tcPr>
-          <w:p>
+              <w:t xml:space="preserve">Bao gồm (In </w:t>
+            </w:r>
+            <w:proofErr w:type="spellStart"/>
             <w:r>
               <w:rPr>
                 <w:rFonts w:ascii="Arial" w:eastAsia="Arial" w:hAnsi="Arial" w:cs="Arial"/>
@@ -2591,7 +3086,123 @@
                 <w:sz w:val="21"/>
                 <w:szCs w:val="21"/>
               </w:rPr>
-              <w:t>Không bao gồm (Out of Scope)</w:t>
+              <w:t>Scope</w:t>
+            </w:r>
+            <w:proofErr w:type="spellEnd"/>
+            <w:r>
+              <w:rPr>
+                <w:rFonts w:ascii="Arial" w:eastAsia="Arial" w:hAnsi="Arial" w:cs="Arial"/>
+                <w:b/>
+                <w:bCs/>
+                <w:color w:val="FFFFFF"/>
+                <w:sz w:val="21"/>
+                <w:szCs w:val="21"/>
+              </w:rPr>
+              <w:t>)</w:t>
+            </w:r>
+          </w:p>
+        </w:tc>
+        <w:tc>
+          <w:tcPr>
+            <w:tcW w:w="4873" w:type="dxa"/>
+            <w:tcBorders>
+              <w:top w:val="single" w:sz="4" w:space="0" w:color="AAAAAA"/>
+              <w:left w:val="single" w:sz="4" w:space="0" w:color="AAAAAA"/>
+              <w:bottom w:val="single" w:sz="4" w:space="0" w:color="AAAAAA"/>
+              <w:right w:val="single" w:sz="4" w:space="0" w:color="AAAAAA"/>
+            </w:tcBorders>
+            <w:shd w:val="clear" w:color="auto" w:fill="2E75B6"/>
+            <w:tcMar>
+              <w:top w:w="80" w:type="dxa"/>
+              <w:left w:w="140" w:type="dxa"/>
+              <w:bottom w:w="80" w:type="dxa"/>
+              <w:right w:w="140" w:type="dxa"/>
+            </w:tcMar>
+            <w:vAlign w:val="center"/>
+          </w:tcPr>
+          <w:p>
+            <w:r>
+              <w:rPr>
+                <w:rFonts w:ascii="Arial" w:eastAsia="Arial" w:hAnsi="Arial" w:cs="Arial"/>
+                <w:b/>
+                <w:bCs/>
+                <w:color w:val="FFFFFF"/>
+                <w:sz w:val="21"/>
+                <w:szCs w:val="21"/>
+              </w:rPr>
+              <w:t>Không bao gồm (</w:t>
+            </w:r>
+            <w:proofErr w:type="spellStart"/>
+            <w:r>
+              <w:rPr>
+                <w:rFonts w:ascii="Arial" w:eastAsia="Arial" w:hAnsi="Arial" w:cs="Arial"/>
+                <w:b/>
+                <w:bCs/>
+                <w:color w:val="FFFFFF"/>
+                <w:sz w:val="21"/>
+                <w:szCs w:val="21"/>
+              </w:rPr>
+              <w:t>Out</w:t>
+            </w:r>
+            <w:proofErr w:type="spellEnd"/>
+            <w:r>
+              <w:rPr>
+                <w:rFonts w:ascii="Arial" w:eastAsia="Arial" w:hAnsi="Arial" w:cs="Arial"/>
+                <w:b/>
+                <w:bCs/>
+                <w:color w:val="FFFFFF"/>
+                <w:sz w:val="21"/>
+                <w:szCs w:val="21"/>
+              </w:rPr>
+              <w:t xml:space="preserve"> </w:t>
+            </w:r>
+            <w:proofErr w:type="spellStart"/>
+            <w:r>
+              <w:rPr>
+                <w:rFonts w:ascii="Arial" w:eastAsia="Arial" w:hAnsi="Arial" w:cs="Arial"/>
+                <w:b/>
+                <w:bCs/>
+                <w:color w:val="FFFFFF"/>
+                <w:sz w:val="21"/>
+                <w:szCs w:val="21"/>
+              </w:rPr>
+              <w:t>of</w:t>
+            </w:r>
+            <w:proofErr w:type="spellEnd"/>
+            <w:r>
+              <w:rPr>
+                <w:rFonts w:ascii="Arial" w:eastAsia="Arial" w:hAnsi="Arial" w:cs="Arial"/>
+                <w:b/>
+                <w:bCs/>
+                <w:color w:val="FFFFFF"/>
+                <w:sz w:val="21"/>
+                <w:szCs w:val="21"/>
+              </w:rPr>
+              <w:t xml:space="preserve"> </w:t>
+            </w:r>
+            <w:proofErr w:type="spellStart"/>
+            <w:r>
+              <w:rPr>
+                <w:rFonts w:ascii="Arial" w:eastAsia="Arial" w:hAnsi="Arial" w:cs="Arial"/>
+                <w:b/>
+                <w:bCs/>
+                <w:color w:val="FFFFFF"/>
+                <w:sz w:val="21"/>
+                <w:szCs w:val="21"/>
+              </w:rPr>
+              <w:t>Scope</w:t>
+            </w:r>
+            <w:proofErr w:type="spellEnd"/>
+            <w:r>
+              <w:rPr>
+                <w:rFonts w:ascii="Arial" w:eastAsia="Arial" w:hAnsi="Arial" w:cs="Arial"/>
+                <w:b/>
+                <w:bCs/>
+                <w:color w:val="FFFFFF"/>
+                <w:sz w:val="21"/>
+                <w:szCs w:val="21"/>
+              </w:rPr>
+              <w:t>)</w:t>
             </w:r>
           </w:p>
         </w:tc>
@@ -2656,13 +3267,23 @@
                 <w:numId w:val="2"/>
               </w:numPr>
             </w:pPr>
-            <w:r>
-              <w:rPr>
-                <w:rFonts w:ascii="Arial" w:eastAsia="Arial" w:hAnsi="Arial" w:cs="Arial"/>
-                <w:sz w:val="21"/>
-                <w:szCs w:val="21"/>
-              </w:rPr>
-              <w:t>Module quản lý thu phí (v1.0 + phí gửi xe)</w:t>
+            <w:proofErr w:type="spellStart"/>
+            <w:r>
+              <w:rPr>
+                <w:rFonts w:ascii="Arial" w:eastAsia="Arial" w:hAnsi="Arial" w:cs="Arial"/>
+                <w:sz w:val="21"/>
+                <w:szCs w:val="21"/>
+              </w:rPr>
+              <w:t>Module</w:t>
+            </w:r>
+            <w:proofErr w:type="spellEnd"/>
+            <w:r>
+              <w:rPr>
+                <w:rFonts w:ascii="Arial" w:eastAsia="Arial" w:hAnsi="Arial" w:cs="Arial"/>
+                <w:sz w:val="21"/>
+                <w:szCs w:val="21"/>
+              </w:rPr>
+              <w:t xml:space="preserve"> quản lý thu phí (v1.0 + phí gửi xe)</w:t>
             </w:r>
           </w:p>
           <w:p>
@@ -2673,13 +3294,23 @@
                 <w:numId w:val="2"/>
               </w:numPr>
             </w:pPr>
-            <w:r>
-              <w:rPr>
-                <w:rFonts w:ascii="Arial" w:eastAsia="Arial" w:hAnsi="Arial" w:cs="Arial"/>
-                <w:sz w:val="21"/>
-                <w:szCs w:val="21"/>
-              </w:rPr>
-              <w:t>Module quản lý người dùng &amp; phân quyền</w:t>
+            <w:proofErr w:type="spellStart"/>
+            <w:r>
+              <w:rPr>
+                <w:rFonts w:ascii="Arial" w:eastAsia="Arial" w:hAnsi="Arial" w:cs="Arial"/>
+                <w:sz w:val="21"/>
+                <w:szCs w:val="21"/>
+              </w:rPr>
+              <w:t>Module</w:t>
+            </w:r>
+            <w:proofErr w:type="spellEnd"/>
+            <w:r>
+              <w:rPr>
+                <w:rFonts w:ascii="Arial" w:eastAsia="Arial" w:hAnsi="Arial" w:cs="Arial"/>
+                <w:sz w:val="21"/>
+                <w:szCs w:val="21"/>
+              </w:rPr>
+              <w:t xml:space="preserve"> quản lý người dùng &amp; phân quyền</w:t>
             </w:r>
           </w:p>
           <w:p>
@@ -2690,13 +3321,23 @@
                 <w:numId w:val="2"/>
               </w:numPr>
             </w:pPr>
-            <w:r>
-              <w:rPr>
-                <w:rFonts w:ascii="Arial" w:eastAsia="Arial" w:hAnsi="Arial" w:cs="Arial"/>
-                <w:sz w:val="21"/>
-                <w:szCs w:val="21"/>
-              </w:rPr>
-              <w:t>Module quản lý hộ gia đình &amp; nhân khẩu</w:t>
+            <w:proofErr w:type="spellStart"/>
+            <w:r>
+              <w:rPr>
+                <w:rFonts w:ascii="Arial" w:eastAsia="Arial" w:hAnsi="Arial" w:cs="Arial"/>
+                <w:sz w:val="21"/>
+                <w:szCs w:val="21"/>
+              </w:rPr>
+              <w:t>Module</w:t>
+            </w:r>
+            <w:proofErr w:type="spellEnd"/>
+            <w:r>
+              <w:rPr>
+                <w:rFonts w:ascii="Arial" w:eastAsia="Arial" w:hAnsi="Arial" w:cs="Arial"/>
+                <w:sz w:val="21"/>
+                <w:szCs w:val="21"/>
+              </w:rPr>
+              <w:t xml:space="preserve"> quản lý hộ gia đình &amp; nhân khẩu</w:t>
             </w:r>
           </w:p>
         </w:tc>
@@ -2748,7 +3389,25 @@
                 <w:sz w:val="21"/>
                 <w:szCs w:val="21"/>
               </w:rPr>
-              <w:t>Thu hộ điện, nước, internet (để v2.0)</w:t>
+              <w:t xml:space="preserve">Thu hộ điện, nước, </w:t>
+            </w:r>
+            <w:proofErr w:type="spellStart"/>
+            <w:r>
+              <w:rPr>
+                <w:rFonts w:ascii="Arial" w:eastAsia="Arial" w:hAnsi="Arial" w:cs="Arial"/>
+                <w:sz w:val="21"/>
+                <w:szCs w:val="21"/>
+              </w:rPr>
+              <w:t>internet</w:t>
+            </w:r>
+            <w:proofErr w:type="spellEnd"/>
+            <w:r>
+              <w:rPr>
+                <w:rFonts w:ascii="Arial" w:eastAsia="Arial" w:hAnsi="Arial" w:cs="Arial"/>
+                <w:sz w:val="21"/>
+                <w:szCs w:val="21"/>
+              </w:rPr>
+              <w:t xml:space="preserve"> (để v2.0)</w:t>
             </w:r>
           </w:p>
           <w:p>
@@ -2782,8 +3441,18 @@
                 <w:sz w:val="21"/>
                 <w:szCs w:val="21"/>
               </w:rPr>
-              <w:t>Tích hợp hệ thống thanh toán online</w:t>
-            </w:r>
+              <w:t xml:space="preserve">Tích hợp hệ thống thanh toán </w:t>
+            </w:r>
+            <w:proofErr w:type="spellStart"/>
+            <w:r>
+              <w:rPr>
+                <w:rFonts w:ascii="Arial" w:eastAsia="Arial" w:hAnsi="Arial" w:cs="Arial"/>
+                <w:sz w:val="21"/>
+                <w:szCs w:val="21"/>
+              </w:rPr>
+              <w:t>online</w:t>
+            </w:r>
+            <w:proofErr w:type="spellEnd"/>
           </w:p>
         </w:tc>
       </w:tr>
@@ -2927,7 +3596,27 @@
                 <w:sz w:val="21"/>
                 <w:szCs w:val="21"/>
               </w:rPr>
-              <w:t>Giao diện (Frontend)</w:t>
+              <w:t>Giao diện (</w:t>
+            </w:r>
+            <w:proofErr w:type="spellStart"/>
+            <w:r>
+              <w:rPr>
+                <w:rFonts w:ascii="Arial" w:eastAsia="Arial" w:hAnsi="Arial" w:cs="Arial"/>
+                <w:color w:val="000000"/>
+                <w:sz w:val="21"/>
+                <w:szCs w:val="21"/>
+              </w:rPr>
+              <w:t>Frontend</w:t>
+            </w:r>
+            <w:proofErr w:type="spellEnd"/>
+            <w:r>
+              <w:rPr>
+                <w:rFonts w:ascii="Arial" w:eastAsia="Arial" w:hAnsi="Arial" w:cs="Arial"/>
+                <w:color w:val="000000"/>
+                <w:sz w:val="21"/>
+                <w:szCs w:val="21"/>
+              </w:rPr>
+              <w:t>)</w:t>
             </w:r>
           </w:p>
         </w:tc>
@@ -2950,14 +3639,25 @@
             <w:vAlign w:val="center"/>
           </w:tcPr>
           <w:p>
-            <w:r>
-              <w:rPr>
-                <w:rFonts w:ascii="Arial" w:eastAsia="Arial" w:hAnsi="Arial" w:cs="Arial"/>
-                <w:color w:val="000000"/>
-                <w:sz w:val="21"/>
-                <w:szCs w:val="21"/>
-              </w:rPr>
-              <w:t>JavaFX</w:t>
+            <w:proofErr w:type="spellStart"/>
+            <w:r>
+              <w:rPr>
+                <w:rFonts w:ascii="Arial" w:eastAsia="Arial" w:hAnsi="Arial" w:cs="Arial"/>
+                <w:color w:val="000000"/>
+                <w:sz w:val="21"/>
+                <w:szCs w:val="21"/>
+              </w:rPr>
+              <w:t>Thymeleaf</w:t>
+            </w:r>
+            <w:proofErr w:type="spellEnd"/>
+            <w:r>
+              <w:rPr>
+                <w:rFonts w:ascii="Arial" w:eastAsia="Arial" w:hAnsi="Arial" w:cs="Arial"/>
+                <w:color w:val="000000"/>
+                <w:sz w:val="21"/>
+                <w:szCs w:val="21"/>
+              </w:rPr>
+              <w:t>, HTML, CSS</w:t>
             </w:r>
           </w:p>
         </w:tc>
@@ -2982,15 +3682,17 @@
             <w:vAlign w:val="center"/>
           </w:tcPr>
           <w:p>
-            <w:r>
-              <w:rPr>
-                <w:rFonts w:ascii="Arial" w:eastAsia="Arial" w:hAnsi="Arial" w:cs="Arial"/>
-                <w:color w:val="000000"/>
-                <w:sz w:val="21"/>
-                <w:szCs w:val="21"/>
-              </w:rPr>
-              <w:t>Cơ sở dữ liệu</w:t>
-            </w:r>
+            <w:proofErr w:type="spellStart"/>
+            <w:r>
+              <w:rPr>
+                <w:rFonts w:ascii="Arial" w:eastAsia="Arial" w:hAnsi="Arial" w:cs="Arial"/>
+                <w:color w:val="000000"/>
+                <w:sz w:val="21"/>
+                <w:szCs w:val="21"/>
+              </w:rPr>
+              <w:t>Backend</w:t>
+            </w:r>
+            <w:proofErr w:type="spellEnd"/>
           </w:p>
         </w:tc>
         <w:tc>
@@ -3012,19 +3714,73 @@
             <w:vAlign w:val="center"/>
           </w:tcPr>
           <w:p>
-            <w:r>
-              <w:rPr>
-                <w:rFonts w:ascii="Arial" w:eastAsia="Arial" w:hAnsi="Arial" w:cs="Arial"/>
-                <w:color w:val="000000"/>
-                <w:sz w:val="21"/>
-                <w:szCs w:val="21"/>
-              </w:rPr>
-              <w:t>MySQL</w:t>
+            <w:proofErr w:type="spellStart"/>
+            <w:r>
+              <w:rPr>
+                <w:rFonts w:ascii="Arial" w:eastAsia="Arial" w:hAnsi="Arial" w:cs="Arial"/>
+                <w:color w:val="000000"/>
+                <w:sz w:val="21"/>
+                <w:szCs w:val="21"/>
+              </w:rPr>
+              <w:t>Spring</w:t>
+            </w:r>
+            <w:proofErr w:type="spellEnd"/>
+            <w:r>
+              <w:rPr>
+                <w:rFonts w:ascii="Arial" w:eastAsia="Arial" w:hAnsi="Arial" w:cs="Arial"/>
+                <w:color w:val="000000"/>
+                <w:sz w:val="21"/>
+                <w:szCs w:val="21"/>
+              </w:rPr>
+              <w:t xml:space="preserve"> </w:t>
+            </w:r>
+            <w:proofErr w:type="spellStart"/>
+            <w:r>
+              <w:rPr>
+                <w:rFonts w:ascii="Arial" w:eastAsia="Arial" w:hAnsi="Arial" w:cs="Arial"/>
+                <w:color w:val="000000"/>
+                <w:sz w:val="21"/>
+                <w:szCs w:val="21"/>
+              </w:rPr>
+              <w:t>Boot</w:t>
+            </w:r>
+            <w:proofErr w:type="spellEnd"/>
+            <w:r>
+              <w:rPr>
+                <w:rFonts w:ascii="Arial" w:eastAsia="Arial" w:hAnsi="Arial" w:cs="Arial"/>
+                <w:color w:val="000000"/>
+                <w:sz w:val="21"/>
+                <w:szCs w:val="21"/>
+              </w:rPr>
+              <w:t xml:space="preserve"> (</w:t>
+            </w:r>
+            <w:proofErr w:type="spellStart"/>
+            <w:r>
+              <w:rPr>
+                <w:rFonts w:ascii="Arial" w:eastAsia="Arial" w:hAnsi="Arial" w:cs="Arial"/>
+                <w:color w:val="000000"/>
+                <w:sz w:val="21"/>
+                <w:szCs w:val="21"/>
+              </w:rPr>
+              <w:t>Spring</w:t>
+            </w:r>
+            <w:proofErr w:type="spellEnd"/>
+            <w:r>
+              <w:rPr>
+                <w:rFonts w:ascii="Arial" w:eastAsia="Arial" w:hAnsi="Arial" w:cs="Arial"/>
+                <w:color w:val="000000"/>
+                <w:sz w:val="21"/>
+                <w:szCs w:val="21"/>
+              </w:rPr>
+              <w:t xml:space="preserve"> MVC)</w:t>
             </w:r>
           </w:p>
         </w:tc>
       </w:tr>
       <w:tr>
+        <w:trPr>
+          <w:trHeight w:val="281"/>
+        </w:trPr>
         <w:tc>
           <w:tcPr>
             <w:tcW w:w="2000" w:type="dxa"/>
@@ -3044,14 +3800,22 @@
             <w:vAlign w:val="center"/>
           </w:tcPr>
           <w:p>
-            <w:r>
-              <w:rPr>
-                <w:rFonts w:ascii="Arial" w:eastAsia="Arial" w:hAnsi="Arial" w:cs="Arial"/>
-                <w:color w:val="000000"/>
-                <w:sz w:val="21"/>
-                <w:szCs w:val="21"/>
-              </w:rPr>
-              <w:t>Ngôn ngữ lập trình</w:t>
+            <w:pPr>
+              <w:rPr>
+                <w:rFonts w:ascii="Arial" w:eastAsia="Arial" w:hAnsi="Arial" w:cs="Arial"/>
+                <w:color w:val="000000"/>
+                <w:sz w:val="21"/>
+                <w:szCs w:val="21"/>
+              </w:rPr>
+            </w:pPr>
+            <w:r>
+              <w:rPr>
+                <w:rFonts w:ascii="Arial" w:eastAsia="Arial" w:hAnsi="Arial" w:cs="Arial"/>
+                <w:color w:val="000000"/>
+                <w:sz w:val="21"/>
+                <w:szCs w:val="21"/>
+              </w:rPr>
+              <w:t>ORM</w:t>
             </w:r>
           </w:p>
         </w:tc>
@@ -3074,15 +3838,65 @@
             <w:vAlign w:val="center"/>
           </w:tcPr>
           <w:p>
-            <w:r>
-              <w:rPr>
-                <w:rFonts w:ascii="Arial" w:eastAsia="Arial" w:hAnsi="Arial" w:cs="Arial"/>
-                <w:color w:val="000000"/>
-                <w:sz w:val="21"/>
-                <w:szCs w:val="21"/>
-              </w:rPr>
-              <w:t>Java (JDK 17+)</w:t>
-            </w:r>
+            <w:pPr>
+              <w:rPr>
+                <w:rFonts w:ascii="Arial" w:eastAsia="Arial" w:hAnsi="Arial" w:cs="Arial"/>
+                <w:color w:val="000000"/>
+                <w:sz w:val="21"/>
+                <w:szCs w:val="21"/>
+              </w:rPr>
+            </w:pPr>
+            <w:proofErr w:type="spellStart"/>
+            <w:r>
+              <w:rPr>
+                <w:rFonts w:ascii="Arial" w:eastAsia="Arial" w:hAnsi="Arial" w:cs="Arial"/>
+                <w:color w:val="000000"/>
+                <w:sz w:val="21"/>
+                <w:szCs w:val="21"/>
+              </w:rPr>
+              <w:t>Spring</w:t>
+            </w:r>
+            <w:proofErr w:type="spellEnd"/>
+            <w:r>
+              <w:rPr>
+                <w:rFonts w:ascii="Arial" w:eastAsia="Arial" w:hAnsi="Arial" w:cs="Arial"/>
+                <w:color w:val="000000"/>
+                <w:sz w:val="21"/>
+                <w:szCs w:val="21"/>
+              </w:rPr>
+              <w:t xml:space="preserve"> </w:t>
+            </w:r>
+            <w:proofErr w:type="spellStart"/>
+            <w:r>
+              <w:rPr>
+                <w:rFonts w:ascii="Arial" w:eastAsia="Arial" w:hAnsi="Arial" w:cs="Arial"/>
+                <w:color w:val="000000"/>
+                <w:sz w:val="21"/>
+                <w:szCs w:val="21"/>
+              </w:rPr>
+              <w:t>Data</w:t>
+            </w:r>
+            <w:proofErr w:type="spellEnd"/>
+            <w:r>
+              <w:rPr>
+                <w:rFonts w:ascii="Arial" w:eastAsia="Arial" w:hAnsi="Arial" w:cs="Arial"/>
+                <w:color w:val="000000"/>
+                <w:sz w:val="21"/>
+                <w:szCs w:val="21"/>
+              </w:rPr>
+              <w:t xml:space="preserve"> JPA / </w:t>
+            </w:r>
+            <w:proofErr w:type="spellStart"/>
+            <w:r>
+              <w:rPr>
+                <w:rFonts w:ascii="Arial" w:eastAsia="Arial" w:hAnsi="Arial" w:cs="Arial"/>
+                <w:color w:val="000000"/>
+                <w:sz w:val="21"/>
+                <w:szCs w:val="21"/>
+              </w:rPr>
+              <w:t>Hibernate</w:t>
+            </w:r>
+            <w:proofErr w:type="spellEnd"/>
           </w:p>
         </w:tc>
       </w:tr>
@@ -3113,7 +3927,7 @@
                 <w:sz w:val="21"/>
                 <w:szCs w:val="21"/>
               </w:rPr>
-              <w:t>IDE</w:t>
+              <w:t>Cơ sở dữ liệu</w:t>
             </w:r>
           </w:p>
         </w:tc>
@@ -3136,14 +3950,25 @@
             <w:vAlign w:val="center"/>
           </w:tcPr>
           <w:p>
-            <w:r>
-              <w:rPr>
-                <w:rFonts w:ascii="Arial" w:eastAsia="Arial" w:hAnsi="Arial" w:cs="Arial"/>
-                <w:color w:val="000000"/>
-                <w:sz w:val="21"/>
-                <w:szCs w:val="21"/>
-              </w:rPr>
-              <w:t>IntelliJ IDEA / NetBeans</w:t>
+            <w:proofErr w:type="spellStart"/>
+            <w:r>
+              <w:rPr>
+                <w:rFonts w:ascii="Arial" w:eastAsia="Arial" w:hAnsi="Arial" w:cs="Arial"/>
+                <w:color w:val="000000"/>
+                <w:sz w:val="21"/>
+                <w:szCs w:val="21"/>
+              </w:rPr>
+              <w:t>MySQL</w:t>
+            </w:r>
+            <w:proofErr w:type="spellEnd"/>
+            <w:r>
+              <w:rPr>
+                <w:rFonts w:ascii="Arial" w:eastAsia="Arial" w:hAnsi="Arial" w:cs="Arial"/>
+                <w:color w:val="000000"/>
+                <w:sz w:val="21"/>
+                <w:szCs w:val="21"/>
+              </w:rPr>
+              <w:t xml:space="preserve"> 8+</w:t>
             </w:r>
           </w:p>
         </w:tc>
@@ -3175,7 +4000,7 @@
                 <w:sz w:val="21"/>
                 <w:szCs w:val="21"/>
               </w:rPr>
-              <w:t>Quản lý mã nguồn</w:t>
+              <w:t>Ngôn ngữ lập trình</w:t>
             </w:r>
           </w:p>
         </w:tc>
@@ -3198,14 +4023,25 @@
             <w:vAlign w:val="center"/>
           </w:tcPr>
           <w:p>
-            <w:r>
-              <w:rPr>
-                <w:rFonts w:ascii="Arial" w:eastAsia="Arial" w:hAnsi="Arial" w:cs="Arial"/>
-                <w:color w:val="000000"/>
-                <w:sz w:val="21"/>
-                <w:szCs w:val="21"/>
-              </w:rPr>
-              <w:t>Git / GitHub</w:t>
+            <w:proofErr w:type="spellStart"/>
+            <w:r>
+              <w:rPr>
+                <w:rFonts w:ascii="Arial" w:eastAsia="Arial" w:hAnsi="Arial" w:cs="Arial"/>
+                <w:color w:val="000000"/>
+                <w:sz w:val="21"/>
+                <w:szCs w:val="21"/>
+              </w:rPr>
+              <w:t>Java</w:t>
+            </w:r>
+            <w:proofErr w:type="spellEnd"/>
+            <w:r>
+              <w:rPr>
+                <w:rFonts w:ascii="Arial" w:eastAsia="Arial" w:hAnsi="Arial" w:cs="Arial"/>
+                <w:color w:val="000000"/>
+                <w:sz w:val="21"/>
+                <w:szCs w:val="21"/>
+              </w:rPr>
+              <w:t xml:space="preserve"> (JDK 17+)</w:t>
             </w:r>
           </w:p>
         </w:tc>
@@ -3237,6 +4073,163 @@
                 <w:sz w:val="21"/>
                 <w:szCs w:val="21"/>
               </w:rPr>
+              <w:t>IDE</w:t>
+            </w:r>
+          </w:p>
+        </w:tc>
+        <w:tc>
+          <w:tcPr>
+            <w:tcW w:w="7746" w:type="dxa"/>
+            <w:tcBorders>
+              <w:top w:val="single" w:sz="4" w:space="0" w:color="AAAAAA"/>
+              <w:left w:val="single" w:sz="4" w:space="0" w:color="AAAAAA"/>
+              <w:bottom w:val="single" w:sz="4" w:space="0" w:color="AAAAAA"/>
+              <w:right w:val="single" w:sz="4" w:space="0" w:color="AAAAAA"/>
+            </w:tcBorders>
+            <w:shd w:val="clear" w:color="auto" w:fill="F2F2F2"/>
+            <w:tcMar>
+              <w:top w:w="80" w:type="dxa"/>
+              <w:left w:w="140" w:type="dxa"/>
+              <w:bottom w:w="80" w:type="dxa"/>
+              <w:right w:w="140" w:type="dxa"/>
+            </w:tcMar>
+            <w:vAlign w:val="center"/>
+          </w:tcPr>
+          <w:p>
+            <w:proofErr w:type="spellStart"/>
+            <w:r>
+              <w:rPr>
+                <w:rFonts w:ascii="Arial" w:eastAsia="Arial" w:hAnsi="Arial" w:cs="Arial"/>
+                <w:color w:val="000000"/>
+                <w:sz w:val="21"/>
+                <w:szCs w:val="21"/>
+              </w:rPr>
+              <w:t>IntelliJ</w:t>
+            </w:r>
+            <w:proofErr w:type="spellEnd"/>
+            <w:r>
+              <w:rPr>
+                <w:rFonts w:ascii="Arial" w:eastAsia="Arial" w:hAnsi="Arial" w:cs="Arial"/>
+                <w:color w:val="000000"/>
+                <w:sz w:val="21"/>
+                <w:szCs w:val="21"/>
+              </w:rPr>
+              <w:t xml:space="preserve"> IDEA</w:t>
+            </w:r>
+          </w:p>
+        </w:tc>
+      </w:tr>
+      <w:tr>
+        <w:tc>
+          <w:tcPr>
+            <w:tcW w:w="2000" w:type="dxa"/>
+            <w:tcBorders>
+              <w:top w:val="single" w:sz="4" w:space="0" w:color="AAAAAA"/>
+              <w:left w:val="single" w:sz="4" w:space="0" w:color="AAAAAA"/>
+              <w:bottom w:val="single" w:sz="4" w:space="0" w:color="AAAAAA"/>
+              <w:right w:val="single" w:sz="4" w:space="0" w:color="AAAAAA"/>
+            </w:tcBorders>
+            <w:shd w:val="clear" w:color="auto" w:fill="FFFFFF"/>
+            <w:tcMar>
+              <w:top w:w="80" w:type="dxa"/>
+              <w:left w:w="140" w:type="dxa"/>
+              <w:bottom w:w="80" w:type="dxa"/>
+              <w:right w:w="140" w:type="dxa"/>
+            </w:tcMar>
+            <w:vAlign w:val="center"/>
+          </w:tcPr>
+          <w:p>
+            <w:r>
+              <w:rPr>
+                <w:rFonts w:ascii="Arial" w:eastAsia="Arial" w:hAnsi="Arial" w:cs="Arial"/>
+                <w:color w:val="000000"/>
+                <w:sz w:val="21"/>
+                <w:szCs w:val="21"/>
+              </w:rPr>
+              <w:t>Quản lý mã nguồn</w:t>
+            </w:r>
+          </w:p>
+        </w:tc>
+        <w:tc>
+          <w:tcPr>
+            <w:tcW w:w="7746" w:type="dxa"/>
+            <w:tcBorders>
+              <w:top w:val="single" w:sz="4" w:space="0" w:color="AAAAAA"/>
+              <w:left w:val="single" w:sz="4" w:space="0" w:color="AAAAAA"/>
+              <w:bottom w:val="single" w:sz="4" w:space="0" w:color="AAAAAA"/>
+              <w:right w:val="single" w:sz="4" w:space="0" w:color="AAAAAA"/>
+            </w:tcBorders>
+            <w:shd w:val="clear" w:color="auto" w:fill="FFFFFF"/>
+            <w:tcMar>
+              <w:top w:w="80" w:type="dxa"/>
+              <w:left w:w="140" w:type="dxa"/>
+              <w:bottom w:w="80" w:type="dxa"/>
+              <w:right w:w="140" w:type="dxa"/>
+            </w:tcMar>
+            <w:vAlign w:val="center"/>
+          </w:tcPr>
+          <w:p>
+            <w:proofErr w:type="spellStart"/>
+            <w:r>
+              <w:rPr>
+                <w:rFonts w:ascii="Arial" w:eastAsia="Arial" w:hAnsi="Arial" w:cs="Arial"/>
+                <w:color w:val="000000"/>
+                <w:sz w:val="21"/>
+                <w:szCs w:val="21"/>
+              </w:rPr>
+              <w:t>Git</w:t>
+            </w:r>
+            <w:proofErr w:type="spellEnd"/>
+            <w:r>
+              <w:rPr>
+                <w:rFonts w:ascii="Arial" w:eastAsia="Arial" w:hAnsi="Arial" w:cs="Arial"/>
+                <w:color w:val="000000"/>
+                <w:sz w:val="21"/>
+                <w:szCs w:val="21"/>
+              </w:rPr>
+              <w:t xml:space="preserve"> / </w:t>
+            </w:r>
+            <w:proofErr w:type="spellStart"/>
+            <w:r>
+              <w:rPr>
+                <w:rFonts w:ascii="Arial" w:eastAsia="Arial" w:hAnsi="Arial" w:cs="Arial"/>
+                <w:color w:val="000000"/>
+                <w:sz w:val="21"/>
+                <w:szCs w:val="21"/>
+              </w:rPr>
+              <w:t>GitHub</w:t>
+            </w:r>
+            <w:proofErr w:type="spellEnd"/>
+          </w:p>
+        </w:tc>
+      </w:tr>
+      <w:tr>
+        <w:tc>
+          <w:tcPr>
+            <w:tcW w:w="2000" w:type="dxa"/>
+            <w:tcBorders>
+              <w:top w:val="single" w:sz="4" w:space="0" w:color="AAAAAA"/>
+              <w:left w:val="single" w:sz="4" w:space="0" w:color="AAAAAA"/>
+              <w:bottom w:val="single" w:sz="4" w:space="0" w:color="AAAAAA"/>
+              <w:right w:val="single" w:sz="4" w:space="0" w:color="AAAAAA"/>
+            </w:tcBorders>
+            <w:shd w:val="clear" w:color="auto" w:fill="F2F2F2"/>
+            <w:tcMar>
+              <w:top w:w="80" w:type="dxa"/>
+              <w:left w:w="140" w:type="dxa"/>
+              <w:bottom w:w="80" w:type="dxa"/>
+              <w:right w:w="140" w:type="dxa"/>
+            </w:tcMar>
+            <w:vAlign w:val="center"/>
+          </w:tcPr>
+          <w:p>
+            <w:r>
+              <w:rPr>
+                <w:rFonts w:ascii="Arial" w:eastAsia="Arial" w:hAnsi="Arial" w:cs="Arial"/>
+                <w:color w:val="000000"/>
+                <w:sz w:val="21"/>
+                <w:szCs w:val="21"/>
+              </w:rPr>
               <w:t>Quản lý dự án</w:t>
             </w:r>
           </w:p>
@@ -3260,14 +4253,85 @@
             <w:vAlign w:val="center"/>
           </w:tcPr>
           <w:p>
-            <w:r>
-              <w:rPr>
-                <w:rFonts w:ascii="Arial" w:eastAsia="Arial" w:hAnsi="Arial" w:cs="Arial"/>
-                <w:color w:val="000000"/>
-                <w:sz w:val="21"/>
-                <w:szCs w:val="21"/>
-              </w:rPr>
-              <w:t>Agile – Scrum (3 Sprint + Sprint 0)</w:t>
+            <w:proofErr w:type="spellStart"/>
+            <w:r>
+              <w:rPr>
+                <w:rFonts w:ascii="Arial" w:eastAsia="Arial" w:hAnsi="Arial" w:cs="Arial"/>
+                <w:color w:val="000000"/>
+                <w:sz w:val="21"/>
+                <w:szCs w:val="21"/>
+              </w:rPr>
+              <w:t>Agile</w:t>
+            </w:r>
+            <w:proofErr w:type="spellEnd"/>
+            <w:r>
+              <w:rPr>
+                <w:rFonts w:ascii="Arial" w:eastAsia="Arial" w:hAnsi="Arial" w:cs="Arial"/>
+                <w:color w:val="000000"/>
+                <w:sz w:val="21"/>
+                <w:szCs w:val="21"/>
+              </w:rPr>
+              <w:t xml:space="preserve"> – </w:t>
+            </w:r>
+            <w:proofErr w:type="spellStart"/>
+            <w:r>
+              <w:rPr>
+                <w:rFonts w:ascii="Arial" w:eastAsia="Arial" w:hAnsi="Arial" w:cs="Arial"/>
+                <w:color w:val="000000"/>
+                <w:sz w:val="21"/>
+                <w:szCs w:val="21"/>
+              </w:rPr>
+              <w:t>Scrum</w:t>
+            </w:r>
+            <w:proofErr w:type="spellEnd"/>
+            <w:r>
+              <w:rPr>
+                <w:rFonts w:ascii="Arial" w:eastAsia="Arial" w:hAnsi="Arial" w:cs="Arial"/>
+                <w:color w:val="000000"/>
+                <w:sz w:val="21"/>
+                <w:szCs w:val="21"/>
+              </w:rPr>
+              <w:t xml:space="preserve"> (3 </w:t>
+            </w:r>
+            <w:proofErr w:type="spellStart"/>
+            <w:r>
+              <w:rPr>
+                <w:rFonts w:ascii="Arial" w:eastAsia="Arial" w:hAnsi="Arial" w:cs="Arial"/>
+                <w:color w:val="000000"/>
+                <w:sz w:val="21"/>
+                <w:szCs w:val="21"/>
+              </w:rPr>
+              <w:t>Sprint</w:t>
+            </w:r>
+            <w:proofErr w:type="spellEnd"/>
+            <w:r>
+              <w:rPr>
+                <w:rFonts w:ascii="Arial" w:eastAsia="Arial" w:hAnsi="Arial" w:cs="Arial"/>
+                <w:color w:val="000000"/>
+                <w:sz w:val="21"/>
+                <w:szCs w:val="21"/>
+              </w:rPr>
+              <w:t xml:space="preserve"> + </w:t>
+            </w:r>
+            <w:proofErr w:type="spellStart"/>
+            <w:r>
+              <w:rPr>
+                <w:rFonts w:ascii="Arial" w:eastAsia="Arial" w:hAnsi="Arial" w:cs="Arial"/>
+                <w:color w:val="000000"/>
+                <w:sz w:val="21"/>
+                <w:szCs w:val="21"/>
+              </w:rPr>
+              <w:t>Sprint</w:t>
+            </w:r>
+            <w:proofErr w:type="spellEnd"/>
+            <w:r>
+              <w:rPr>
+                <w:rFonts w:ascii="Arial" w:eastAsia="Arial" w:hAnsi="Arial" w:cs="Arial"/>
+                <w:color w:val="000000"/>
+                <w:sz w:val="21"/>
+                <w:szCs w:val="21"/>
+              </w:rPr>
+              <w:t xml:space="preserve"> 0)</w:t>
             </w:r>
           </w:p>
         </w:tc>
@@ -3373,6 +4437,7 @@
             <w:vAlign w:val="center"/>
           </w:tcPr>
           <w:p>
+            <w:proofErr w:type="spellStart"/>
             <w:r>
               <w:rPr>
                 <w:rFonts w:ascii="Arial" w:eastAsia="Arial" w:hAnsi="Arial" w:cs="Arial"/>
@@ -3384,6 +4449,7 @@
               </w:rPr>
               <w:t>Sprint</w:t>
             </w:r>
+            <w:proofErr w:type="spellEnd"/>
           </w:p>
         </w:tc>
         <w:tc>
@@ -3471,14 +4537,25 @@
             <w:vAlign w:val="center"/>
           </w:tcPr>
           <w:p>
-            <w:r>
-              <w:rPr>
-                <w:rFonts w:ascii="Arial" w:eastAsia="Arial" w:hAnsi="Arial" w:cs="Arial"/>
-                <w:color w:val="000000"/>
-                <w:sz w:val="21"/>
-                <w:szCs w:val="21"/>
-              </w:rPr>
-              <w:t>Sprint 0</w:t>
+            <w:proofErr w:type="spellStart"/>
+            <w:r>
+              <w:rPr>
+                <w:rFonts w:ascii="Arial" w:eastAsia="Arial" w:hAnsi="Arial" w:cs="Arial"/>
+                <w:color w:val="000000"/>
+                <w:sz w:val="21"/>
+                <w:szCs w:val="21"/>
+              </w:rPr>
+              <w:t>Sprint</w:t>
+            </w:r>
+            <w:proofErr w:type="spellEnd"/>
+            <w:r>
+              <w:rPr>
+                <w:rFonts w:ascii="Arial" w:eastAsia="Arial" w:hAnsi="Arial" w:cs="Arial"/>
+                <w:color w:val="000000"/>
+                <w:sz w:val="21"/>
+                <w:szCs w:val="21"/>
+              </w:rPr>
+              <w:t xml:space="preserve"> 0</w:t>
             </w:r>
           </w:p>
         </w:tc>
@@ -3531,14 +4608,65 @@
             <w:vAlign w:val="center"/>
           </w:tcPr>
           <w:p>
-            <w:r>
-              <w:rPr>
-                <w:rFonts w:ascii="Arial" w:eastAsia="Arial" w:hAnsi="Arial" w:cs="Arial"/>
-                <w:color w:val="000000"/>
-                <w:sz w:val="21"/>
-                <w:szCs w:val="21"/>
-              </w:rPr>
-              <w:t>Kick-off, lập Product Backlog, thiết lập môi trường phát triển, phân công vai trò</w:t>
+            <w:proofErr w:type="spellStart"/>
+            <w:r>
+              <w:rPr>
+                <w:rFonts w:ascii="Arial" w:eastAsia="Arial" w:hAnsi="Arial" w:cs="Arial"/>
+                <w:color w:val="000000"/>
+                <w:sz w:val="21"/>
+                <w:szCs w:val="21"/>
+              </w:rPr>
+              <w:t>Kick-off</w:t>
+            </w:r>
+            <w:proofErr w:type="spellEnd"/>
+            <w:r>
+              <w:rPr>
+                <w:rFonts w:ascii="Arial" w:eastAsia="Arial" w:hAnsi="Arial" w:cs="Arial"/>
+                <w:color w:val="000000"/>
+                <w:sz w:val="21"/>
+                <w:szCs w:val="21"/>
+              </w:rPr>
+              <w:t xml:space="preserve">, lập </w:t>
+            </w:r>
+            <w:proofErr w:type="spellStart"/>
+            <w:r>
+              <w:rPr>
+                <w:rFonts w:ascii="Arial" w:eastAsia="Arial" w:hAnsi="Arial" w:cs="Arial"/>
+                <w:color w:val="000000"/>
+                <w:sz w:val="21"/>
+                <w:szCs w:val="21"/>
+              </w:rPr>
+              <w:t>Product</w:t>
+            </w:r>
+            <w:proofErr w:type="spellEnd"/>
+            <w:r>
+              <w:rPr>
+                <w:rFonts w:ascii="Arial" w:eastAsia="Arial" w:hAnsi="Arial" w:cs="Arial"/>
+                <w:color w:val="000000"/>
+                <w:sz w:val="21"/>
+                <w:szCs w:val="21"/>
+              </w:rPr>
+              <w:t xml:space="preserve"> </w:t>
+            </w:r>
+            <w:proofErr w:type="spellStart"/>
+            <w:r>
+              <w:rPr>
+                <w:rFonts w:ascii="Arial" w:eastAsia="Arial" w:hAnsi="Arial" w:cs="Arial"/>
+                <w:color w:val="000000"/>
+                <w:sz w:val="21"/>
+                <w:szCs w:val="21"/>
+              </w:rPr>
+              <w:t>Backlog</w:t>
+            </w:r>
+            <w:proofErr w:type="spellEnd"/>
+            <w:r>
+              <w:rPr>
+                <w:rFonts w:ascii="Arial" w:eastAsia="Arial" w:hAnsi="Arial" w:cs="Arial"/>
+                <w:color w:val="000000"/>
+                <w:sz w:val="21"/>
+                <w:szCs w:val="21"/>
+              </w:rPr>
+              <w:t>, thiết lập môi trường phát triển, phân công vai trò</w:t>
             </w:r>
           </w:p>
         </w:tc>
@@ -3563,14 +4691,25 @@
             <w:vAlign w:val="center"/>
           </w:tcPr>
           <w:p>
-            <w:r>
-              <w:rPr>
-                <w:rFonts w:ascii="Arial" w:eastAsia="Arial" w:hAnsi="Arial" w:cs="Arial"/>
-                <w:color w:val="000000"/>
-                <w:sz w:val="21"/>
-                <w:szCs w:val="21"/>
-              </w:rPr>
-              <w:t>Sprint 1</w:t>
+            <w:proofErr w:type="spellStart"/>
+            <w:r>
+              <w:rPr>
+                <w:rFonts w:ascii="Arial" w:eastAsia="Arial" w:hAnsi="Arial" w:cs="Arial"/>
+                <w:color w:val="000000"/>
+                <w:sz w:val="21"/>
+                <w:szCs w:val="21"/>
+              </w:rPr>
+              <w:t>Sprint</w:t>
+            </w:r>
+            <w:proofErr w:type="spellEnd"/>
+            <w:r>
+              <w:rPr>
+                <w:rFonts w:ascii="Arial" w:eastAsia="Arial" w:hAnsi="Arial" w:cs="Arial"/>
+                <w:color w:val="000000"/>
+                <w:sz w:val="21"/>
+                <w:szCs w:val="21"/>
+              </w:rPr>
+              <w:t xml:space="preserve"> 1</w:t>
             </w:r>
           </w:p>
         </w:tc>
@@ -3655,14 +4794,25 @@
             <w:vAlign w:val="center"/>
           </w:tcPr>
           <w:p>
-            <w:r>
-              <w:rPr>
-                <w:rFonts w:ascii="Arial" w:eastAsia="Arial" w:hAnsi="Arial" w:cs="Arial"/>
-                <w:color w:val="000000"/>
-                <w:sz w:val="21"/>
-                <w:szCs w:val="21"/>
-              </w:rPr>
-              <w:t>Sprint 2</w:t>
+            <w:proofErr w:type="spellStart"/>
+            <w:r>
+              <w:rPr>
+                <w:rFonts w:ascii="Arial" w:eastAsia="Arial" w:hAnsi="Arial" w:cs="Arial"/>
+                <w:color w:val="000000"/>
+                <w:sz w:val="21"/>
+                <w:szCs w:val="21"/>
+              </w:rPr>
+              <w:t>Sprint</w:t>
+            </w:r>
+            <w:proofErr w:type="spellEnd"/>
+            <w:r>
+              <w:rPr>
+                <w:rFonts w:ascii="Arial" w:eastAsia="Arial" w:hAnsi="Arial" w:cs="Arial"/>
+                <w:color w:val="000000"/>
+                <w:sz w:val="21"/>
+                <w:szCs w:val="21"/>
+              </w:rPr>
+              <w:t xml:space="preserve"> 2</w:t>
             </w:r>
           </w:p>
         </w:tc>
@@ -3722,7 +4872,47 @@
                 <w:sz w:val="21"/>
                 <w:szCs w:val="21"/>
               </w:rPr>
-              <w:t>Ghi nhận thanh toán (RL-007, 008, 009), quản lý hộ khẩu/nhân khẩu (RL-013, 014, 015), audit log (RL-023)</w:t>
+              <w:t xml:space="preserve">Ghi nhận thanh toán (RL-007, 008, 009), quản lý hộ khẩu/nhân khẩu (RL-013, 014, 015), </w:t>
+            </w:r>
+            <w:proofErr w:type="spellStart"/>
+            <w:r>
+              <w:rPr>
+                <w:rFonts w:ascii="Arial" w:eastAsia="Arial" w:hAnsi="Arial" w:cs="Arial"/>
+                <w:color w:val="000000"/>
+                <w:sz w:val="21"/>
+                <w:szCs w:val="21"/>
+              </w:rPr>
+              <w:t>audit</w:t>
+            </w:r>
+            <w:proofErr w:type="spellEnd"/>
+            <w:r>
+              <w:rPr>
+                <w:rFonts w:ascii="Arial" w:eastAsia="Arial" w:hAnsi="Arial" w:cs="Arial"/>
+                <w:color w:val="000000"/>
+                <w:sz w:val="21"/>
+                <w:szCs w:val="21"/>
+              </w:rPr>
+              <w:t xml:space="preserve"> </w:t>
+            </w:r>
+            <w:proofErr w:type="spellStart"/>
+            <w:r>
+              <w:rPr>
+                <w:rFonts w:ascii="Arial" w:eastAsia="Arial" w:hAnsi="Arial" w:cs="Arial"/>
+                <w:color w:val="000000"/>
+                <w:sz w:val="21"/>
+                <w:szCs w:val="21"/>
+              </w:rPr>
+              <w:t>log</w:t>
+            </w:r>
+            <w:proofErr w:type="spellEnd"/>
+            <w:r>
+              <w:rPr>
+                <w:rFonts w:ascii="Arial" w:eastAsia="Arial" w:hAnsi="Arial" w:cs="Arial"/>
+                <w:color w:val="000000"/>
+                <w:sz w:val="21"/>
+                <w:szCs w:val="21"/>
+              </w:rPr>
+              <w:t xml:space="preserve"> (RL-023)</w:t>
             </w:r>
           </w:p>
         </w:tc>
@@ -3747,14 +4937,25 @@
             <w:vAlign w:val="center"/>
           </w:tcPr>
           <w:p>
-            <w:r>
-              <w:rPr>
-                <w:rFonts w:ascii="Arial" w:eastAsia="Arial" w:hAnsi="Arial" w:cs="Arial"/>
-                <w:color w:val="000000"/>
-                <w:sz w:val="21"/>
-                <w:szCs w:val="21"/>
-              </w:rPr>
-              <w:t>Sprint 3</w:t>
+            <w:proofErr w:type="spellStart"/>
+            <w:r>
+              <w:rPr>
+                <w:rFonts w:ascii="Arial" w:eastAsia="Arial" w:hAnsi="Arial" w:cs="Arial"/>
+                <w:color w:val="000000"/>
+                <w:sz w:val="21"/>
+                <w:szCs w:val="21"/>
+              </w:rPr>
+              <w:t>Sprint</w:t>
+            </w:r>
+            <w:proofErr w:type="spellEnd"/>
+            <w:r>
+              <w:rPr>
+                <w:rFonts w:ascii="Arial" w:eastAsia="Arial" w:hAnsi="Arial" w:cs="Arial"/>
+                <w:color w:val="000000"/>
+                <w:sz w:val="21"/>
+                <w:szCs w:val="21"/>
+              </w:rPr>
+              <w:t xml:space="preserve"> 3</w:t>
             </w:r>
           </w:p>
         </w:tc>
@@ -3814,7 +5015,47 @@
                 <w:sz w:val="21"/>
                 <w:szCs w:val="21"/>
               </w:rPr>
-              <w:t>Thống kê, xuất báo cáo (RL-011, 012), tra cứu nợ (RL-010), phí gửi xe (RL-019), import Excel (RL-018), refactor &amp; kiểm thử tổng thể</w:t>
+              <w:t xml:space="preserve">Thống kê, xuất báo cáo (RL-011, 012), tra cứu nợ (RL-010), phí gửi xe (RL-019), </w:t>
+            </w:r>
+            <w:proofErr w:type="spellStart"/>
+            <w:r>
+              <w:rPr>
+                <w:rFonts w:ascii="Arial" w:eastAsia="Arial" w:hAnsi="Arial" w:cs="Arial"/>
+                <w:color w:val="000000"/>
+                <w:sz w:val="21"/>
+                <w:szCs w:val="21"/>
+              </w:rPr>
+              <w:t>import</w:t>
+            </w:r>
+            <w:proofErr w:type="spellEnd"/>
+            <w:r>
+              <w:rPr>
+                <w:rFonts w:ascii="Arial" w:eastAsia="Arial" w:hAnsi="Arial" w:cs="Arial"/>
+                <w:color w:val="000000"/>
+                <w:sz w:val="21"/>
+                <w:szCs w:val="21"/>
+              </w:rPr>
+              <w:t xml:space="preserve"> Excel (RL-018), </w:t>
+            </w:r>
+            <w:proofErr w:type="spellStart"/>
+            <w:r>
+              <w:rPr>
+                <w:rFonts w:ascii="Arial" w:eastAsia="Arial" w:hAnsi="Arial" w:cs="Arial"/>
+                <w:color w:val="000000"/>
+                <w:sz w:val="21"/>
+                <w:szCs w:val="21"/>
+              </w:rPr>
+              <w:t>refactor</w:t>
+            </w:r>
+            <w:proofErr w:type="spellEnd"/>
+            <w:r>
+              <w:rPr>
+                <w:rFonts w:ascii="Arial" w:eastAsia="Arial" w:hAnsi="Arial" w:cs="Arial"/>
+                <w:color w:val="000000"/>
+                <w:sz w:val="21"/>
+                <w:szCs w:val="21"/>
+              </w:rPr>
+              <w:t xml:space="preserve"> &amp; kiểm thử tổng thể</w:t>
             </w:r>
           </w:p>
         </w:tc>
@@ -3839,6 +5080,7 @@
             <w:vAlign w:val="center"/>
           </w:tcPr>
           <w:p>
+            <w:proofErr w:type="spellStart"/>
             <w:r>
               <w:rPr>
                 <w:rFonts w:ascii="Arial" w:eastAsia="Arial" w:hAnsi="Arial" w:cs="Arial"/>
@@ -3848,6 +5090,7 @@
               </w:rPr>
               <w:t>Release</w:t>
             </w:r>
+            <w:proofErr w:type="spellEnd"/>
           </w:p>
         </w:tc>
         <w:tc>
@@ -4391,8 +5634,19 @@
                 <w:sz w:val="21"/>
                 <w:szCs w:val="21"/>
               </w:rPr>
-              <w:t>2 – Minor</w:t>
-            </w:r>
+              <w:t xml:space="preserve">2 – </w:t>
+            </w:r>
+            <w:proofErr w:type="spellStart"/>
+            <w:r>
+              <w:rPr>
+                <w:rFonts w:ascii="Arial" w:eastAsia="Arial" w:hAnsi="Arial" w:cs="Arial"/>
+                <w:color w:val="000000"/>
+                <w:sz w:val="21"/>
+                <w:szCs w:val="21"/>
+              </w:rPr>
+              <w:t>Minor</w:t>
+            </w:r>
+            <w:proofErr w:type="spellEnd"/>
           </w:p>
         </w:tc>
         <w:tc>
@@ -4421,8 +5675,59 @@
                 <w:sz w:val="21"/>
                 <w:szCs w:val="21"/>
               </w:rPr>
-              <w:t>Quy trình xử lý thay đổi qua Product Backlog, đàm phán lại timeline</w:t>
-            </w:r>
+              <w:t xml:space="preserve">Quy trình xử lý thay đổi qua </w:t>
+            </w:r>
+            <w:proofErr w:type="spellStart"/>
+            <w:r>
+              <w:rPr>
+                <w:rFonts w:ascii="Arial" w:eastAsia="Arial" w:hAnsi="Arial" w:cs="Arial"/>
+                <w:color w:val="000000"/>
+                <w:sz w:val="21"/>
+                <w:szCs w:val="21"/>
+              </w:rPr>
+              <w:t>Product</w:t>
+            </w:r>
+            <w:proofErr w:type="spellEnd"/>
+            <w:r>
+              <w:rPr>
+                <w:rFonts w:ascii="Arial" w:eastAsia="Arial" w:hAnsi="Arial" w:cs="Arial"/>
+                <w:color w:val="000000"/>
+                <w:sz w:val="21"/>
+                <w:szCs w:val="21"/>
+              </w:rPr>
+              <w:t xml:space="preserve"> </w:t>
+            </w:r>
+            <w:proofErr w:type="spellStart"/>
+            <w:r>
+              <w:rPr>
+                <w:rFonts w:ascii="Arial" w:eastAsia="Arial" w:hAnsi="Arial" w:cs="Arial"/>
+                <w:color w:val="000000"/>
+                <w:sz w:val="21"/>
+                <w:szCs w:val="21"/>
+              </w:rPr>
+              <w:t>Backlog</w:t>
+            </w:r>
+            <w:proofErr w:type="spellEnd"/>
+            <w:r>
+              <w:rPr>
+                <w:rFonts w:ascii="Arial" w:eastAsia="Arial" w:hAnsi="Arial" w:cs="Arial"/>
+                <w:color w:val="000000"/>
+                <w:sz w:val="21"/>
+                <w:szCs w:val="21"/>
+              </w:rPr>
+              <w:t xml:space="preserve">, đàm phán lại </w:t>
+            </w:r>
+            <w:proofErr w:type="spellStart"/>
+            <w:r>
+              <w:rPr>
+                <w:rFonts w:ascii="Arial" w:eastAsia="Arial" w:hAnsi="Arial" w:cs="Arial"/>
+                <w:color w:val="000000"/>
+                <w:sz w:val="21"/>
+                <w:szCs w:val="21"/>
+              </w:rPr>
+              <w:t>timeline</w:t>
+            </w:r>
+            <w:proofErr w:type="spellEnd"/>
           </w:p>
         </w:tc>
       </w:tr>
@@ -4566,14 +5871,45 @@
             <w:vAlign w:val="center"/>
           </w:tcPr>
           <w:p>
-            <w:r>
-              <w:rPr>
-                <w:rFonts w:ascii="Arial" w:eastAsia="Arial" w:hAnsi="Arial" w:cs="Arial"/>
-                <w:color w:val="000000"/>
-                <w:sz w:val="21"/>
-                <w:szCs w:val="21"/>
-              </w:rPr>
-              <w:t>Review tài liệu sau mỗi Sprint, bổ sung kịp thời</w:t>
+            <w:proofErr w:type="spellStart"/>
+            <w:r>
+              <w:rPr>
+                <w:rFonts w:ascii="Arial" w:eastAsia="Arial" w:hAnsi="Arial" w:cs="Arial"/>
+                <w:color w:val="000000"/>
+                <w:sz w:val="21"/>
+                <w:szCs w:val="21"/>
+              </w:rPr>
+              <w:t>Review</w:t>
+            </w:r>
+            <w:proofErr w:type="spellEnd"/>
+            <w:r>
+              <w:rPr>
+                <w:rFonts w:ascii="Arial" w:eastAsia="Arial" w:hAnsi="Arial" w:cs="Arial"/>
+                <w:color w:val="000000"/>
+                <w:sz w:val="21"/>
+                <w:szCs w:val="21"/>
+              </w:rPr>
+              <w:t xml:space="preserve"> tài liệu sau mỗi </w:t>
+            </w:r>
+            <w:proofErr w:type="spellStart"/>
+            <w:r>
+              <w:rPr>
+                <w:rFonts w:ascii="Arial" w:eastAsia="Arial" w:hAnsi="Arial" w:cs="Arial"/>
+                <w:color w:val="000000"/>
+                <w:sz w:val="21"/>
+                <w:szCs w:val="21"/>
+              </w:rPr>
+              <w:t>Sprint</w:t>
+            </w:r>
+            <w:proofErr w:type="spellEnd"/>
+            <w:r>
+              <w:rPr>
+                <w:rFonts w:ascii="Arial" w:eastAsia="Arial" w:hAnsi="Arial" w:cs="Arial"/>
+                <w:color w:val="000000"/>
+                <w:sz w:val="21"/>
+                <w:szCs w:val="21"/>
+              </w:rPr>
+              <w:t>, bổ sung kịp thời</w:t>
             </w:r>
           </w:p>
         </w:tc>
@@ -4718,14 +6054,85 @@
             <w:vAlign w:val="center"/>
           </w:tcPr>
           <w:p>
-            <w:r>
-              <w:rPr>
-                <w:rFonts w:ascii="Arial" w:eastAsia="Arial" w:hAnsi="Arial" w:cs="Arial"/>
-                <w:color w:val="000000"/>
-                <w:sz w:val="21"/>
-                <w:szCs w:val="21"/>
-              </w:rPr>
-              <w:t>Daily meeting, kênh Zalo/GitHub nội bộ</w:t>
+            <w:proofErr w:type="spellStart"/>
+            <w:r>
+              <w:rPr>
+                <w:rFonts w:ascii="Arial" w:eastAsia="Arial" w:hAnsi="Arial" w:cs="Arial"/>
+                <w:color w:val="000000"/>
+                <w:sz w:val="21"/>
+                <w:szCs w:val="21"/>
+              </w:rPr>
+              <w:t>Daily</w:t>
+            </w:r>
+            <w:proofErr w:type="spellEnd"/>
+            <w:r>
+              <w:rPr>
+                <w:rFonts w:ascii="Arial" w:eastAsia="Arial" w:hAnsi="Arial" w:cs="Arial"/>
+                <w:color w:val="000000"/>
+                <w:sz w:val="21"/>
+                <w:szCs w:val="21"/>
+              </w:rPr>
+              <w:t xml:space="preserve"> </w:t>
+            </w:r>
+            <w:proofErr w:type="spellStart"/>
+            <w:r>
+              <w:rPr>
+                <w:rFonts w:ascii="Arial" w:eastAsia="Arial" w:hAnsi="Arial" w:cs="Arial"/>
+                <w:color w:val="000000"/>
+                <w:sz w:val="21"/>
+                <w:szCs w:val="21"/>
+              </w:rPr>
+              <w:t>meeting</w:t>
+            </w:r>
+            <w:proofErr w:type="spellEnd"/>
+            <w:r>
+              <w:rPr>
+                <w:rFonts w:ascii="Arial" w:eastAsia="Arial" w:hAnsi="Arial" w:cs="Arial"/>
+                <w:color w:val="000000"/>
+                <w:sz w:val="21"/>
+                <w:szCs w:val="21"/>
+              </w:rPr>
+              <w:t xml:space="preserve">, kênh </w:t>
+            </w:r>
+            <w:proofErr w:type="spellStart"/>
+            <w:r>
+              <w:rPr>
+                <w:rFonts w:ascii="Arial" w:eastAsia="Arial" w:hAnsi="Arial" w:cs="Arial"/>
+                <w:color w:val="000000"/>
+                <w:sz w:val="21"/>
+                <w:szCs w:val="21"/>
+              </w:rPr>
+              <w:t>Zalo</w:t>
+            </w:r>
+            <w:proofErr w:type="spellEnd"/>
+            <w:r>
+              <w:rPr>
+                <w:rFonts w:ascii="Arial" w:eastAsia="Arial" w:hAnsi="Arial" w:cs="Arial"/>
+                <w:color w:val="000000"/>
+                <w:sz w:val="21"/>
+                <w:szCs w:val="21"/>
+              </w:rPr>
+              <w:t>/</w:t>
+            </w:r>
+            <w:proofErr w:type="spellStart"/>
+            <w:r>
+              <w:rPr>
+                <w:rFonts w:ascii="Arial" w:eastAsia="Arial" w:hAnsi="Arial" w:cs="Arial"/>
+                <w:color w:val="000000"/>
+                <w:sz w:val="21"/>
+                <w:szCs w:val="21"/>
+              </w:rPr>
+              <w:t>GitHub</w:t>
+            </w:r>
+            <w:proofErr w:type="spellEnd"/>
+            <w:r>
+              <w:rPr>
+                <w:rFonts w:ascii="Arial" w:eastAsia="Arial" w:hAnsi="Arial" w:cs="Arial"/>
+                <w:color w:val="000000"/>
+                <w:sz w:val="21"/>
+                <w:szCs w:val="21"/>
+              </w:rPr>
+              <w:t xml:space="preserve"> nội bộ</w:t>
             </w:r>
           </w:p>
         </w:tc>
@@ -4757,7 +6164,28 @@
                 <w:sz w:val="21"/>
                 <w:szCs w:val="21"/>
               </w:rPr>
-              <w:t>Ước tính effort quá lạc quan</w:t>
+              <w:lastRenderedPageBreak/>
+              <w:t xml:space="preserve">Ước tính </w:t>
+            </w:r>
+            <w:proofErr w:type="spellStart"/>
+            <w:r>
+              <w:rPr>
+                <w:rFonts w:ascii="Arial" w:eastAsia="Arial" w:hAnsi="Arial" w:cs="Arial"/>
+                <w:color w:val="000000"/>
+                <w:sz w:val="21"/>
+                <w:szCs w:val="21"/>
+              </w:rPr>
+              <w:t>effort</w:t>
+            </w:r>
+            <w:proofErr w:type="spellEnd"/>
+            <w:r>
+              <w:rPr>
+                <w:rFonts w:ascii="Arial" w:eastAsia="Arial" w:hAnsi="Arial" w:cs="Arial"/>
+                <w:color w:val="000000"/>
+                <w:sz w:val="21"/>
+                <w:szCs w:val="21"/>
+              </w:rPr>
+              <w:t xml:space="preserve"> quá lạc quan</w:t>
             </w:r>
           </w:p>
         </w:tc>
@@ -4877,8 +6305,59 @@
                 <w:sz w:val="21"/>
                 <w:szCs w:val="21"/>
               </w:rPr>
-              <w:t>Điều chỉnh Story Points sau mỗi Retrospective</w:t>
-            </w:r>
+              <w:t xml:space="preserve">Điều chỉnh </w:t>
+            </w:r>
+            <w:proofErr w:type="spellStart"/>
+            <w:r>
+              <w:rPr>
+                <w:rFonts w:ascii="Arial" w:eastAsia="Arial" w:hAnsi="Arial" w:cs="Arial"/>
+                <w:color w:val="000000"/>
+                <w:sz w:val="21"/>
+                <w:szCs w:val="21"/>
+              </w:rPr>
+              <w:t>Story</w:t>
+            </w:r>
+            <w:proofErr w:type="spellEnd"/>
+            <w:r>
+              <w:rPr>
+                <w:rFonts w:ascii="Arial" w:eastAsia="Arial" w:hAnsi="Arial" w:cs="Arial"/>
+                <w:color w:val="000000"/>
+                <w:sz w:val="21"/>
+                <w:szCs w:val="21"/>
+              </w:rPr>
+              <w:t xml:space="preserve"> </w:t>
+            </w:r>
+            <w:proofErr w:type="spellStart"/>
+            <w:r>
+              <w:rPr>
+                <w:rFonts w:ascii="Arial" w:eastAsia="Arial" w:hAnsi="Arial" w:cs="Arial"/>
+                <w:color w:val="000000"/>
+                <w:sz w:val="21"/>
+                <w:szCs w:val="21"/>
+              </w:rPr>
+              <w:t>Points</w:t>
+            </w:r>
+            <w:proofErr w:type="spellEnd"/>
+            <w:r>
+              <w:rPr>
+                <w:rFonts w:ascii="Arial" w:eastAsia="Arial" w:hAnsi="Arial" w:cs="Arial"/>
+                <w:color w:val="000000"/>
+                <w:sz w:val="21"/>
+                <w:szCs w:val="21"/>
+              </w:rPr>
+              <w:t xml:space="preserve"> sau mỗi </w:t>
+            </w:r>
+            <w:proofErr w:type="spellStart"/>
+            <w:r>
+              <w:rPr>
+                <w:rFonts w:ascii="Arial" w:eastAsia="Arial" w:hAnsi="Arial" w:cs="Arial"/>
+                <w:color w:val="000000"/>
+                <w:sz w:val="21"/>
+                <w:szCs w:val="21"/>
+              </w:rPr>
+              <w:t>Retrospective</w:t>
+            </w:r>
+            <w:proofErr w:type="spellEnd"/>
           </w:p>
         </w:tc>
       </w:tr>
@@ -4909,8 +6388,47 @@
                 <w:sz w:val="21"/>
                 <w:szCs w:val="21"/>
               </w:rPr>
-              <w:lastRenderedPageBreak/>
-              <w:t>Rủi ro kỹ thuật (JavaFX, MySQL)</w:t>
+              <w:t>Rủi ro kỹ thuật (</w:t>
+            </w:r>
+            <w:proofErr w:type="spellStart"/>
+            <w:r>
+              <w:rPr>
+                <w:rFonts w:ascii="Arial" w:eastAsia="Arial" w:hAnsi="Arial" w:cs="Arial"/>
+                <w:color w:val="000000"/>
+                <w:sz w:val="21"/>
+                <w:szCs w:val="21"/>
+              </w:rPr>
+              <w:t>JavaFX</w:t>
+            </w:r>
+            <w:proofErr w:type="spellEnd"/>
+            <w:r>
+              <w:rPr>
+                <w:rFonts w:ascii="Arial" w:eastAsia="Arial" w:hAnsi="Arial" w:cs="Arial"/>
+                <w:color w:val="000000"/>
+                <w:sz w:val="21"/>
+                <w:szCs w:val="21"/>
+              </w:rPr>
+              <w:t xml:space="preserve">, </w:t>
+            </w:r>
+            <w:proofErr w:type="spellStart"/>
+            <w:r>
+              <w:rPr>
+                <w:rFonts w:ascii="Arial" w:eastAsia="Arial" w:hAnsi="Arial" w:cs="Arial"/>
+                <w:color w:val="000000"/>
+                <w:sz w:val="21"/>
+                <w:szCs w:val="21"/>
+              </w:rPr>
+              <w:t>MySQL</w:t>
+            </w:r>
+            <w:proofErr w:type="spellEnd"/>
+            <w:r>
+              <w:rPr>
+                <w:rFonts w:ascii="Arial" w:eastAsia="Arial" w:hAnsi="Arial" w:cs="Arial"/>
+                <w:color w:val="000000"/>
+                <w:sz w:val="21"/>
+                <w:szCs w:val="21"/>
+              </w:rPr>
+              <w:t>)</w:t>
             </w:r>
           </w:p>
         </w:tc>
@@ -5000,8 +6518,19 @@
                 <w:sz w:val="21"/>
                 <w:szCs w:val="21"/>
               </w:rPr>
-              <w:t>2 – Minor</w:t>
-            </w:r>
+              <w:t xml:space="preserve">2 – </w:t>
+            </w:r>
+            <w:proofErr w:type="spellStart"/>
+            <w:r>
+              <w:rPr>
+                <w:rFonts w:ascii="Arial" w:eastAsia="Arial" w:hAnsi="Arial" w:cs="Arial"/>
+                <w:color w:val="000000"/>
+                <w:sz w:val="21"/>
+                <w:szCs w:val="21"/>
+              </w:rPr>
+              <w:t>Minor</w:t>
+            </w:r>
+            <w:proofErr w:type="spellEnd"/>
           </w:p>
         </w:tc>
         <w:tc>
@@ -5030,7 +6559,47 @@
                 <w:sz w:val="21"/>
                 <w:szCs w:val="21"/>
               </w:rPr>
-              <w:t>Phân công người tìm hiểu trước Sprint 1, sharing nội bộ</w:t>
+              <w:t xml:space="preserve">Phân công người tìm hiểu trước </w:t>
+            </w:r>
+            <w:proofErr w:type="spellStart"/>
+            <w:r>
+              <w:rPr>
+                <w:rFonts w:ascii="Arial" w:eastAsia="Arial" w:hAnsi="Arial" w:cs="Arial"/>
+                <w:color w:val="000000"/>
+                <w:sz w:val="21"/>
+                <w:szCs w:val="21"/>
+              </w:rPr>
+              <w:t>Sprint</w:t>
+            </w:r>
+            <w:proofErr w:type="spellEnd"/>
+            <w:r>
+              <w:rPr>
+                <w:rFonts w:ascii="Arial" w:eastAsia="Arial" w:hAnsi="Arial" w:cs="Arial"/>
+                <w:color w:val="000000"/>
+                <w:sz w:val="21"/>
+                <w:szCs w:val="21"/>
+              </w:rPr>
+              <w:t xml:space="preserve"> 1, </w:t>
+            </w:r>
+            <w:proofErr w:type="spellStart"/>
+            <w:r>
+              <w:rPr>
+                <w:rFonts w:ascii="Arial" w:eastAsia="Arial" w:hAnsi="Arial" w:cs="Arial"/>
+                <w:color w:val="000000"/>
+                <w:sz w:val="21"/>
+                <w:szCs w:val="21"/>
+              </w:rPr>
+              <w:t>sharing</w:t>
+            </w:r>
+            <w:proofErr w:type="spellEnd"/>
+            <w:r>
+              <w:rPr>
+                <w:rFonts w:ascii="Arial" w:eastAsia="Arial" w:hAnsi="Arial" w:cs="Arial"/>
+                <w:color w:val="000000"/>
+                <w:sz w:val="21"/>
+                <w:szCs w:val="21"/>
+              </w:rPr>
+              <w:t xml:space="preserve"> nội bộ</w:t>
             </w:r>
           </w:p>
         </w:tc>
@@ -5072,7 +6641,43 @@
           <w:sz w:val="22"/>
           <w:szCs w:val="22"/>
         </w:rPr>
-        <w:t>Dự án không kéo dài quá 8 tuần (4 Sprint). Nếu chậm tiến độ, ưu tiên cắt scope thay vì kéo dài thời gian.</w:t>
+        <w:t xml:space="preserve">Dự án không kéo dài quá 8 tuần (4 </w:t>
+      </w:r>
+      <w:proofErr w:type="spellStart"/>
+      <w:r>
+        <w:rPr>
+          <w:rFonts w:ascii="Arial" w:eastAsia="Arial" w:hAnsi="Arial" w:cs="Arial"/>
+          <w:sz w:val="22"/>
+          <w:szCs w:val="22"/>
+        </w:rPr>
+        <w:t>Sprint</w:t>
+      </w:r>
+      <w:proofErr w:type="spellEnd"/>
+      <w:r>
+        <w:rPr>
+          <w:rFonts w:ascii="Arial" w:eastAsia="Arial" w:hAnsi="Arial" w:cs="Arial"/>
+          <w:sz w:val="22"/>
+          <w:szCs w:val="22"/>
+        </w:rPr>
+        <w:t xml:space="preserve">). Nếu chậm tiến độ, ưu tiên cắt </w:t>
+      </w:r>
+      <w:proofErr w:type="spellStart"/>
+      <w:r>
+        <w:rPr>
+          <w:rFonts w:ascii="Arial" w:eastAsia="Arial" w:hAnsi="Arial" w:cs="Arial"/>
+          <w:sz w:val="22"/>
+          <w:szCs w:val="22"/>
+        </w:rPr>
+        <w:t>scope</w:t>
+      </w:r>
+      <w:proofErr w:type="spellEnd"/>
+      <w:r>
+        <w:rPr>
+          <w:rFonts w:ascii="Arial" w:eastAsia="Arial" w:hAnsi="Arial" w:cs="Arial"/>
+          <w:sz w:val="22"/>
+          <w:szCs w:val="22"/>
+        </w:rPr>
+        <w:t xml:space="preserve"> thay vì kéo dài thời gian.</w:t>
       </w:r>
     </w:p>
     <w:p>
@@ -5108,8 +6713,18 @@
           <w:sz w:val="22"/>
           <w:szCs w:val="22"/>
         </w:rPr>
-        <w:t>Phạm vi dự án không thay đổi sau khi các bên liên quan đã ký kết Project Charter.</w:t>
-      </w:r>
+        <w:t xml:space="preserve">Phạm vi dự án không thay đổi sau khi các bên liên quan đã ký kết Project </w:t>
+      </w:r>
+      <w:proofErr w:type="spellStart"/>
+      <w:r>
+        <w:rPr>
+          <w:rFonts w:ascii="Arial" w:eastAsia="Arial" w:hAnsi="Arial" w:cs="Arial"/>
+          <w:sz w:val="22"/>
+          <w:szCs w:val="22"/>
+        </w:rPr>
+        <w:t>Charter.</w:t>
+      </w:r>
+      <w:proofErr w:type="spellEnd"/>
     </w:p>
     <w:p>
       <w:pPr>
@@ -5126,13 +6741,44 @@
           <w:sz w:val="22"/>
           <w:szCs w:val="22"/>
         </w:rPr>
-        <w:t>Phần mềm phải chạy được trên Windows với JDK 17+ và MySQL 8+.</w:t>
-      </w:r>
-    </w:p>
-    <w:p>
-      <w:pPr>
-        <w:spacing w:before="160"/>
-      </w:pPr>
+        <w:t xml:space="preserve">Hệ thống phải hoạt động ổn định trên các máy tính sử dụng Windows 10/11 có cài đặt </w:t>
+      </w:r>
+      <w:proofErr w:type="spellStart"/>
+      <w:r>
+        <w:rPr>
+          <w:rFonts w:ascii="Arial" w:eastAsia="Arial" w:hAnsi="Arial" w:cs="Arial"/>
+          <w:sz w:val="22"/>
+          <w:szCs w:val="22"/>
+        </w:rPr>
+        <w:t>Java</w:t>
+      </w:r>
+      <w:proofErr w:type="spellEnd"/>
+      <w:r>
+        <w:rPr>
+          <w:rFonts w:ascii="Arial" w:eastAsia="Arial" w:hAnsi="Arial" w:cs="Arial"/>
+          <w:sz w:val="22"/>
+          <w:szCs w:val="22"/>
+        </w:rPr>
+        <w:t xml:space="preserve"> JDK 17+ và </w:t>
+      </w:r>
+      <w:proofErr w:type="spellStart"/>
+      <w:r>
+        <w:rPr>
+          <w:rFonts w:ascii="Arial" w:eastAsia="Arial" w:hAnsi="Arial" w:cs="Arial"/>
+          <w:sz w:val="22"/>
+          <w:szCs w:val="22"/>
+        </w:rPr>
+        <w:t>MySQL</w:t>
+      </w:r>
+      <w:proofErr w:type="spellEnd"/>
+      <w:r>
+        <w:rPr>
+          <w:rFonts w:ascii="Arial" w:eastAsia="Arial" w:hAnsi="Arial" w:cs="Arial"/>
+          <w:sz w:val="22"/>
+          <w:szCs w:val="22"/>
+        </w:rPr>
+        <w:t xml:space="preserve"> 8+.</w:t>
+      </w:r>
     </w:p>
     <w:p>
       <w:pPr>
@@ -5301,15 +6947,37 @@
             <w:vAlign w:val="center"/>
           </w:tcPr>
           <w:p>
-            <w:r>
-              <w:rPr>
-                <w:rFonts w:ascii="Arial" w:eastAsia="Arial" w:hAnsi="Arial" w:cs="Arial"/>
-                <w:color w:val="000000"/>
-                <w:sz w:val="21"/>
-                <w:szCs w:val="21"/>
-              </w:rPr>
-              <w:t>Daily standup</w:t>
-            </w:r>
+            <w:proofErr w:type="spellStart"/>
+            <w:r>
+              <w:rPr>
+                <w:rFonts w:ascii="Arial" w:eastAsia="Arial" w:hAnsi="Arial" w:cs="Arial"/>
+                <w:color w:val="000000"/>
+                <w:sz w:val="21"/>
+                <w:szCs w:val="21"/>
+              </w:rPr>
+              <w:t>Daily</w:t>
+            </w:r>
+            <w:proofErr w:type="spellEnd"/>
+            <w:r>
+              <w:rPr>
+                <w:rFonts w:ascii="Arial" w:eastAsia="Arial" w:hAnsi="Arial" w:cs="Arial"/>
+                <w:color w:val="000000"/>
+                <w:sz w:val="21"/>
+                <w:szCs w:val="21"/>
+              </w:rPr>
+              <w:t xml:space="preserve"> </w:t>
+            </w:r>
+            <w:proofErr w:type="spellStart"/>
+            <w:r>
+              <w:rPr>
+                <w:rFonts w:ascii="Arial" w:eastAsia="Arial" w:hAnsi="Arial" w:cs="Arial"/>
+                <w:color w:val="000000"/>
+                <w:sz w:val="21"/>
+                <w:szCs w:val="21"/>
+              </w:rPr>
+              <w:t>standup</w:t>
+            </w:r>
+            <w:proofErr w:type="spellEnd"/>
           </w:p>
         </w:tc>
         <w:tc>
@@ -5368,7 +7036,27 @@
                 <w:sz w:val="21"/>
                 <w:szCs w:val="21"/>
               </w:rPr>
-              <w:t xml:space="preserve">Cập nhật tiến độ, blockers – toàn bộ nhóm qua </w:t>
+              <w:t xml:space="preserve">Cập nhật tiến độ, </w:t>
+            </w:r>
+            <w:proofErr w:type="spellStart"/>
+            <w:r>
+              <w:rPr>
+                <w:rFonts w:ascii="Arial" w:eastAsia="Arial" w:hAnsi="Arial" w:cs="Arial"/>
+                <w:color w:val="000000"/>
+                <w:sz w:val="21"/>
+                <w:szCs w:val="21"/>
+              </w:rPr>
+              <w:t>blockers</w:t>
+            </w:r>
+            <w:proofErr w:type="spellEnd"/>
+            <w:r>
+              <w:rPr>
+                <w:rFonts w:ascii="Arial" w:eastAsia="Arial" w:hAnsi="Arial" w:cs="Arial"/>
+                <w:color w:val="000000"/>
+                <w:sz w:val="21"/>
+                <w:szCs w:val="21"/>
+              </w:rPr>
+              <w:t xml:space="preserve"> – toàn bộ nhóm qua </w:t>
             </w:r>
             <w:r>
               <w:rPr>
@@ -5386,8 +7074,39 @@
                 <w:sz w:val="21"/>
                 <w:szCs w:val="21"/>
               </w:rPr>
-              <w:t>/Google Meet</w:t>
-            </w:r>
+              <w:t>/</w:t>
+            </w:r>
+            <w:proofErr w:type="spellStart"/>
+            <w:r>
+              <w:rPr>
+                <w:rFonts w:ascii="Arial" w:eastAsia="Arial" w:hAnsi="Arial" w:cs="Arial"/>
+                <w:color w:val="000000"/>
+                <w:sz w:val="21"/>
+                <w:szCs w:val="21"/>
+              </w:rPr>
+              <w:t>Google</w:t>
+            </w:r>
+            <w:proofErr w:type="spellEnd"/>
+            <w:r>
+              <w:rPr>
+                <w:rFonts w:ascii="Arial" w:eastAsia="Arial" w:hAnsi="Arial" w:cs="Arial"/>
+                <w:color w:val="000000"/>
+                <w:sz w:val="21"/>
+                <w:szCs w:val="21"/>
+              </w:rPr>
+              <w:t xml:space="preserve"> </w:t>
+            </w:r>
+            <w:proofErr w:type="spellStart"/>
+            <w:r>
+              <w:rPr>
+                <w:rFonts w:ascii="Arial" w:eastAsia="Arial" w:hAnsi="Arial" w:cs="Arial"/>
+                <w:color w:val="000000"/>
+                <w:sz w:val="21"/>
+                <w:szCs w:val="21"/>
+              </w:rPr>
+              <w:t>Meet</w:t>
+            </w:r>
+            <w:proofErr w:type="spellEnd"/>
           </w:p>
         </w:tc>
       </w:tr>
@@ -5411,15 +7130,37 @@
             <w:vAlign w:val="center"/>
           </w:tcPr>
           <w:p>
-            <w:r>
-              <w:rPr>
-                <w:rFonts w:ascii="Arial" w:eastAsia="Arial" w:hAnsi="Arial" w:cs="Arial"/>
-                <w:color w:val="000000"/>
-                <w:sz w:val="21"/>
-                <w:szCs w:val="21"/>
-              </w:rPr>
-              <w:t>Weekly report</w:t>
-            </w:r>
+            <w:proofErr w:type="spellStart"/>
+            <w:r>
+              <w:rPr>
+                <w:rFonts w:ascii="Arial" w:eastAsia="Arial" w:hAnsi="Arial" w:cs="Arial"/>
+                <w:color w:val="000000"/>
+                <w:sz w:val="21"/>
+                <w:szCs w:val="21"/>
+              </w:rPr>
+              <w:t>Weekly</w:t>
+            </w:r>
+            <w:proofErr w:type="spellEnd"/>
+            <w:r>
+              <w:rPr>
+                <w:rFonts w:ascii="Arial" w:eastAsia="Arial" w:hAnsi="Arial" w:cs="Arial"/>
+                <w:color w:val="000000"/>
+                <w:sz w:val="21"/>
+                <w:szCs w:val="21"/>
+              </w:rPr>
+              <w:t xml:space="preserve"> </w:t>
+            </w:r>
+            <w:proofErr w:type="spellStart"/>
+            <w:r>
+              <w:rPr>
+                <w:rFonts w:ascii="Arial" w:eastAsia="Arial" w:hAnsi="Arial" w:cs="Arial"/>
+                <w:color w:val="000000"/>
+                <w:sz w:val="21"/>
+                <w:szCs w:val="21"/>
+              </w:rPr>
+              <w:t>report</w:t>
+            </w:r>
+            <w:proofErr w:type="spellEnd"/>
           </w:p>
         </w:tc>
         <w:tc>
@@ -5478,8 +7219,39 @@
                 <w:sz w:val="21"/>
                 <w:szCs w:val="21"/>
               </w:rPr>
-              <w:t>Báo cáo tiến độ gửi PO và nhóm qua Google Drive</w:t>
-            </w:r>
+              <w:t xml:space="preserve">Báo cáo tiến độ gửi PO và nhóm qua </w:t>
+            </w:r>
+            <w:proofErr w:type="spellStart"/>
+            <w:r>
+              <w:rPr>
+                <w:rFonts w:ascii="Arial" w:eastAsia="Arial" w:hAnsi="Arial" w:cs="Arial"/>
+                <w:color w:val="000000"/>
+                <w:sz w:val="21"/>
+                <w:szCs w:val="21"/>
+              </w:rPr>
+              <w:t>Google</w:t>
+            </w:r>
+            <w:proofErr w:type="spellEnd"/>
+            <w:r>
+              <w:rPr>
+                <w:rFonts w:ascii="Arial" w:eastAsia="Arial" w:hAnsi="Arial" w:cs="Arial"/>
+                <w:color w:val="000000"/>
+                <w:sz w:val="21"/>
+                <w:szCs w:val="21"/>
+              </w:rPr>
+              <w:t xml:space="preserve"> </w:t>
+            </w:r>
+            <w:proofErr w:type="spellStart"/>
+            <w:r>
+              <w:rPr>
+                <w:rFonts w:ascii="Arial" w:eastAsia="Arial" w:hAnsi="Arial" w:cs="Arial"/>
+                <w:color w:val="000000"/>
+                <w:sz w:val="21"/>
+                <w:szCs w:val="21"/>
+              </w:rPr>
+              <w:t>Drive</w:t>
+            </w:r>
+            <w:proofErr w:type="spellEnd"/>
           </w:p>
         </w:tc>
       </w:tr>
@@ -5503,15 +7275,37 @@
             <w:vAlign w:val="center"/>
           </w:tcPr>
           <w:p>
-            <w:r>
-              <w:rPr>
-                <w:rFonts w:ascii="Arial" w:eastAsia="Arial" w:hAnsi="Arial" w:cs="Arial"/>
-                <w:color w:val="000000"/>
-                <w:sz w:val="21"/>
-                <w:szCs w:val="21"/>
-              </w:rPr>
-              <w:t>Sprint Planning</w:t>
-            </w:r>
+            <w:proofErr w:type="spellStart"/>
+            <w:r>
+              <w:rPr>
+                <w:rFonts w:ascii="Arial" w:eastAsia="Arial" w:hAnsi="Arial" w:cs="Arial"/>
+                <w:color w:val="000000"/>
+                <w:sz w:val="21"/>
+                <w:szCs w:val="21"/>
+              </w:rPr>
+              <w:t>Sprint</w:t>
+            </w:r>
+            <w:proofErr w:type="spellEnd"/>
+            <w:r>
+              <w:rPr>
+                <w:rFonts w:ascii="Arial" w:eastAsia="Arial" w:hAnsi="Arial" w:cs="Arial"/>
+                <w:color w:val="000000"/>
+                <w:sz w:val="21"/>
+                <w:szCs w:val="21"/>
+              </w:rPr>
+              <w:t xml:space="preserve"> </w:t>
+            </w:r>
+            <w:proofErr w:type="spellStart"/>
+            <w:r>
+              <w:rPr>
+                <w:rFonts w:ascii="Arial" w:eastAsia="Arial" w:hAnsi="Arial" w:cs="Arial"/>
+                <w:color w:val="000000"/>
+                <w:sz w:val="21"/>
+                <w:szCs w:val="21"/>
+              </w:rPr>
+              <w:t>Planning</w:t>
+            </w:r>
+            <w:proofErr w:type="spellEnd"/>
           </w:p>
         </w:tc>
         <w:tc>
@@ -5540,8 +7334,19 @@
                 <w:sz w:val="21"/>
                 <w:szCs w:val="21"/>
               </w:rPr>
-              <w:t>Đầu mỗi Sprint</w:t>
-            </w:r>
+              <w:t xml:space="preserve">Đầu mỗi </w:t>
+            </w:r>
+            <w:proofErr w:type="spellStart"/>
+            <w:r>
+              <w:rPr>
+                <w:rFonts w:ascii="Arial" w:eastAsia="Arial" w:hAnsi="Arial" w:cs="Arial"/>
+                <w:color w:val="000000"/>
+                <w:sz w:val="21"/>
+                <w:szCs w:val="21"/>
+              </w:rPr>
+              <w:t>Sprint</w:t>
+            </w:r>
+            <w:proofErr w:type="spellEnd"/>
           </w:p>
         </w:tc>
         <w:tc>
@@ -5570,7 +7375,47 @@
                 <w:sz w:val="21"/>
                 <w:szCs w:val="21"/>
               </w:rPr>
-              <w:t>Chọn PBI, ước lượng Story Points – toàn nhóm</w:t>
+              <w:t xml:space="preserve">Chọn PBI, ước lượng </w:t>
+            </w:r>
+            <w:proofErr w:type="spellStart"/>
+            <w:r>
+              <w:rPr>
+                <w:rFonts w:ascii="Arial" w:eastAsia="Arial" w:hAnsi="Arial" w:cs="Arial"/>
+                <w:color w:val="000000"/>
+                <w:sz w:val="21"/>
+                <w:szCs w:val="21"/>
+              </w:rPr>
+              <w:t>Story</w:t>
+            </w:r>
+            <w:proofErr w:type="spellEnd"/>
+            <w:r>
+              <w:rPr>
+                <w:rFonts w:ascii="Arial" w:eastAsia="Arial" w:hAnsi="Arial" w:cs="Arial"/>
+                <w:color w:val="000000"/>
+                <w:sz w:val="21"/>
+                <w:szCs w:val="21"/>
+              </w:rPr>
+              <w:t xml:space="preserve"> </w:t>
+            </w:r>
+            <w:proofErr w:type="spellStart"/>
+            <w:r>
+              <w:rPr>
+                <w:rFonts w:ascii="Arial" w:eastAsia="Arial" w:hAnsi="Arial" w:cs="Arial"/>
+                <w:color w:val="000000"/>
+                <w:sz w:val="21"/>
+                <w:szCs w:val="21"/>
+              </w:rPr>
+              <w:t>Points</w:t>
+            </w:r>
+            <w:proofErr w:type="spellEnd"/>
+            <w:r>
+              <w:rPr>
+                <w:rFonts w:ascii="Arial" w:eastAsia="Arial" w:hAnsi="Arial" w:cs="Arial"/>
+                <w:color w:val="000000"/>
+                <w:sz w:val="21"/>
+                <w:szCs w:val="21"/>
+              </w:rPr>
+              <w:t xml:space="preserve"> – toàn nhóm</w:t>
             </w:r>
           </w:p>
         </w:tc>
@@ -5595,15 +7440,37 @@
             <w:vAlign w:val="center"/>
           </w:tcPr>
           <w:p>
-            <w:r>
-              <w:rPr>
-                <w:rFonts w:ascii="Arial" w:eastAsia="Arial" w:hAnsi="Arial" w:cs="Arial"/>
-                <w:color w:val="000000"/>
-                <w:sz w:val="21"/>
-                <w:szCs w:val="21"/>
-              </w:rPr>
-              <w:t>Sprint Review</w:t>
-            </w:r>
+            <w:proofErr w:type="spellStart"/>
+            <w:r>
+              <w:rPr>
+                <w:rFonts w:ascii="Arial" w:eastAsia="Arial" w:hAnsi="Arial" w:cs="Arial"/>
+                <w:color w:val="000000"/>
+                <w:sz w:val="21"/>
+                <w:szCs w:val="21"/>
+              </w:rPr>
+              <w:t>Sprint</w:t>
+            </w:r>
+            <w:proofErr w:type="spellEnd"/>
+            <w:r>
+              <w:rPr>
+                <w:rFonts w:ascii="Arial" w:eastAsia="Arial" w:hAnsi="Arial" w:cs="Arial"/>
+                <w:color w:val="000000"/>
+                <w:sz w:val="21"/>
+                <w:szCs w:val="21"/>
+              </w:rPr>
+              <w:t xml:space="preserve"> </w:t>
+            </w:r>
+            <w:proofErr w:type="spellStart"/>
+            <w:r>
+              <w:rPr>
+                <w:rFonts w:ascii="Arial" w:eastAsia="Arial" w:hAnsi="Arial" w:cs="Arial"/>
+                <w:color w:val="000000"/>
+                <w:sz w:val="21"/>
+                <w:szCs w:val="21"/>
+              </w:rPr>
+              <w:t>Review</w:t>
+            </w:r>
+            <w:proofErr w:type="spellEnd"/>
           </w:p>
         </w:tc>
         <w:tc>
@@ -5632,8 +7499,19 @@
                 <w:sz w:val="21"/>
                 <w:szCs w:val="21"/>
               </w:rPr>
-              <w:t>Cuối mỗi Sprint</w:t>
-            </w:r>
+              <w:t xml:space="preserve">Cuối mỗi </w:t>
+            </w:r>
+            <w:proofErr w:type="spellStart"/>
+            <w:r>
+              <w:rPr>
+                <w:rFonts w:ascii="Arial" w:eastAsia="Arial" w:hAnsi="Arial" w:cs="Arial"/>
+                <w:color w:val="000000"/>
+                <w:sz w:val="21"/>
+                <w:szCs w:val="21"/>
+              </w:rPr>
+              <w:t>Sprint</w:t>
+            </w:r>
+            <w:proofErr w:type="spellEnd"/>
           </w:p>
         </w:tc>
         <w:tc>
@@ -5655,15 +7533,37 @@
             <w:vAlign w:val="center"/>
           </w:tcPr>
           <w:p>
-            <w:r>
-              <w:rPr>
-                <w:rFonts w:ascii="Arial" w:eastAsia="Arial" w:hAnsi="Arial" w:cs="Arial"/>
-                <w:color w:val="000000"/>
-                <w:sz w:val="21"/>
-                <w:szCs w:val="21"/>
-              </w:rPr>
-              <w:t>Demo sản phẩm, PO &amp; khách hàng kiểm tra, cập nhật Backlog</w:t>
-            </w:r>
+            <w:proofErr w:type="spellStart"/>
+            <w:r>
+              <w:rPr>
+                <w:rFonts w:ascii="Arial" w:eastAsia="Arial" w:hAnsi="Arial" w:cs="Arial"/>
+                <w:color w:val="000000"/>
+                <w:sz w:val="21"/>
+                <w:szCs w:val="21"/>
+              </w:rPr>
+              <w:t>Demo</w:t>
+            </w:r>
+            <w:proofErr w:type="spellEnd"/>
+            <w:r>
+              <w:rPr>
+                <w:rFonts w:ascii="Arial" w:eastAsia="Arial" w:hAnsi="Arial" w:cs="Arial"/>
+                <w:color w:val="000000"/>
+                <w:sz w:val="21"/>
+                <w:szCs w:val="21"/>
+              </w:rPr>
+              <w:t xml:space="preserve"> sản phẩm, PO &amp; khách hàng kiểm tra, cập nhật </w:t>
+            </w:r>
+            <w:proofErr w:type="spellStart"/>
+            <w:r>
+              <w:rPr>
+                <w:rFonts w:ascii="Arial" w:eastAsia="Arial" w:hAnsi="Arial" w:cs="Arial"/>
+                <w:color w:val="000000"/>
+                <w:sz w:val="21"/>
+                <w:szCs w:val="21"/>
+              </w:rPr>
+              <w:t>Backlog</w:t>
+            </w:r>
+            <w:proofErr w:type="spellEnd"/>
           </w:p>
         </w:tc>
       </w:tr>
@@ -5687,15 +7587,37 @@
             <w:vAlign w:val="center"/>
           </w:tcPr>
           <w:p>
-            <w:r>
-              <w:rPr>
-                <w:rFonts w:ascii="Arial" w:eastAsia="Arial" w:hAnsi="Arial" w:cs="Arial"/>
-                <w:color w:val="000000"/>
-                <w:sz w:val="21"/>
-                <w:szCs w:val="21"/>
-              </w:rPr>
-              <w:t>Sprint Retrospective</w:t>
-            </w:r>
+            <w:proofErr w:type="spellStart"/>
+            <w:r>
+              <w:rPr>
+                <w:rFonts w:ascii="Arial" w:eastAsia="Arial" w:hAnsi="Arial" w:cs="Arial"/>
+                <w:color w:val="000000"/>
+                <w:sz w:val="21"/>
+                <w:szCs w:val="21"/>
+              </w:rPr>
+              <w:t>Sprint</w:t>
+            </w:r>
+            <w:proofErr w:type="spellEnd"/>
+            <w:r>
+              <w:rPr>
+                <w:rFonts w:ascii="Arial" w:eastAsia="Arial" w:hAnsi="Arial" w:cs="Arial"/>
+                <w:color w:val="000000"/>
+                <w:sz w:val="21"/>
+                <w:szCs w:val="21"/>
+              </w:rPr>
+              <w:t xml:space="preserve"> </w:t>
+            </w:r>
+            <w:proofErr w:type="spellStart"/>
+            <w:r>
+              <w:rPr>
+                <w:rFonts w:ascii="Arial" w:eastAsia="Arial" w:hAnsi="Arial" w:cs="Arial"/>
+                <w:color w:val="000000"/>
+                <w:sz w:val="21"/>
+                <w:szCs w:val="21"/>
+              </w:rPr>
+              <w:t>Retrospective</w:t>
+            </w:r>
+            <w:proofErr w:type="spellEnd"/>
           </w:p>
         </w:tc>
         <w:tc>
@@ -5724,8 +7646,19 @@
                 <w:sz w:val="21"/>
                 <w:szCs w:val="21"/>
               </w:rPr>
-              <w:t>Cuối mỗi Sprint</w:t>
-            </w:r>
+              <w:t xml:space="preserve">Cuối mỗi </w:t>
+            </w:r>
+            <w:proofErr w:type="spellStart"/>
+            <w:r>
+              <w:rPr>
+                <w:rFonts w:ascii="Arial" w:eastAsia="Arial" w:hAnsi="Arial" w:cs="Arial"/>
+                <w:color w:val="000000"/>
+                <w:sz w:val="21"/>
+                <w:szCs w:val="21"/>
+              </w:rPr>
+              <w:t>Sprint</w:t>
+            </w:r>
+            <w:proofErr w:type="spellEnd"/>
           </w:p>
         </w:tc>
         <w:tc>
@@ -6002,8 +7935,19 @@
                 <w:sz w:val="21"/>
                 <w:szCs w:val="21"/>
               </w:rPr>
-              <w:t>Ban quản trị BlueMoon</w:t>
-            </w:r>
+              <w:t xml:space="preserve">Ban quản trị </w:t>
+            </w:r>
+            <w:proofErr w:type="spellStart"/>
+            <w:r>
+              <w:rPr>
+                <w:rFonts w:ascii="Arial" w:eastAsia="Arial" w:hAnsi="Arial" w:cs="Arial"/>
+                <w:color w:val="000000"/>
+                <w:sz w:val="21"/>
+                <w:szCs w:val="21"/>
+              </w:rPr>
+              <w:t>BlueMoon</w:t>
+            </w:r>
+            <w:proofErr w:type="spellEnd"/>
           </w:p>
         </w:tc>
         <w:tc>
@@ -6104,8 +8048,19 @@
                 <w:sz w:val="21"/>
                 <w:szCs w:val="21"/>
               </w:rPr>
-              <w:t>Công ty CP Quản lý BlueMoon</w:t>
-            </w:r>
+              <w:t xml:space="preserve">Công ty CP Quản lý </w:t>
+            </w:r>
+            <w:proofErr w:type="spellStart"/>
+            <w:r>
+              <w:rPr>
+                <w:rFonts w:ascii="Arial" w:eastAsia="Arial" w:hAnsi="Arial" w:cs="Arial"/>
+                <w:color w:val="000000"/>
+                <w:sz w:val="21"/>
+                <w:szCs w:val="21"/>
+              </w:rPr>
+              <w:t>BlueMoon</w:t>
+            </w:r>
+            <w:proofErr w:type="spellEnd"/>
           </w:p>
         </w:tc>
         <w:tc>
@@ -6176,8 +8131,19 @@
                 <w:sz w:val="21"/>
                 <w:szCs w:val="21"/>
               </w:rPr>
-              <w:t>Project Manager</w:t>
-            </w:r>
+              <w:t xml:space="preserve">Project </w:t>
+            </w:r>
+            <w:proofErr w:type="spellStart"/>
+            <w:r>
+              <w:rPr>
+                <w:rFonts w:ascii="Arial" w:eastAsia="Arial" w:hAnsi="Arial" w:cs="Arial"/>
+                <w:color w:val="000000"/>
+                <w:sz w:val="21"/>
+                <w:szCs w:val="21"/>
+              </w:rPr>
+              <w:t>Manager</w:t>
+            </w:r>
+            <w:proofErr w:type="spellEnd"/>
           </w:p>
         </w:tc>
         <w:tc>
@@ -6393,7 +8359,97 @@
           <w:sz w:val="22"/>
           <w:szCs w:val="22"/>
         </w:rPr>
-        <w:t>Dự án áp dụng mô hình Agile – Scrum với 3 Sprint phát triển (Sprint 1–3) và 1 Sprint 0 khởi động.</w:t>
+        <w:t xml:space="preserve">Dự án áp dụng mô hình </w:t>
+      </w:r>
+      <w:proofErr w:type="spellStart"/>
+      <w:r>
+        <w:rPr>
+          <w:rFonts w:ascii="Arial" w:eastAsia="Arial" w:hAnsi="Arial" w:cs="Arial"/>
+          <w:sz w:val="22"/>
+          <w:szCs w:val="22"/>
+        </w:rPr>
+        <w:t>Agile</w:t>
+      </w:r>
+      <w:proofErr w:type="spellEnd"/>
+      <w:r>
+        <w:rPr>
+          <w:rFonts w:ascii="Arial" w:eastAsia="Arial" w:hAnsi="Arial" w:cs="Arial"/>
+          <w:sz w:val="22"/>
+          <w:szCs w:val="22"/>
+        </w:rPr>
+        <w:t xml:space="preserve"> – </w:t>
+      </w:r>
+      <w:proofErr w:type="spellStart"/>
+      <w:r>
+        <w:rPr>
+          <w:rFonts w:ascii="Arial" w:eastAsia="Arial" w:hAnsi="Arial" w:cs="Arial"/>
+          <w:sz w:val="22"/>
+          <w:szCs w:val="22"/>
+        </w:rPr>
+        <w:t>Scrum</w:t>
+      </w:r>
+      <w:proofErr w:type="spellEnd"/>
+      <w:r>
+        <w:rPr>
+          <w:rFonts w:ascii="Arial" w:eastAsia="Arial" w:hAnsi="Arial" w:cs="Arial"/>
+          <w:sz w:val="22"/>
+          <w:szCs w:val="22"/>
+        </w:rPr>
+        <w:t xml:space="preserve"> với 3 </w:t>
+      </w:r>
+      <w:proofErr w:type="spellStart"/>
+      <w:r>
+        <w:rPr>
+          <w:rFonts w:ascii="Arial" w:eastAsia="Arial" w:hAnsi="Arial" w:cs="Arial"/>
+          <w:sz w:val="22"/>
+          <w:szCs w:val="22"/>
+        </w:rPr>
+        <w:t>Sprint</w:t>
+      </w:r>
+      <w:proofErr w:type="spellEnd"/>
+      <w:r>
+        <w:rPr>
+          <w:rFonts w:ascii="Arial" w:eastAsia="Arial" w:hAnsi="Arial" w:cs="Arial"/>
+          <w:sz w:val="22"/>
+          <w:szCs w:val="22"/>
+        </w:rPr>
+        <w:t xml:space="preserve"> phát triển (</w:t>
+      </w:r>
+      <w:proofErr w:type="spellStart"/>
+      <w:r>
+        <w:rPr>
+          <w:rFonts w:ascii="Arial" w:eastAsia="Arial" w:hAnsi="Arial" w:cs="Arial"/>
+          <w:sz w:val="22"/>
+          <w:szCs w:val="22"/>
+        </w:rPr>
+        <w:t>Sprint</w:t>
+      </w:r>
+      <w:proofErr w:type="spellEnd"/>
+      <w:r>
+        <w:rPr>
+          <w:rFonts w:ascii="Arial" w:eastAsia="Arial" w:hAnsi="Arial" w:cs="Arial"/>
+          <w:sz w:val="22"/>
+          <w:szCs w:val="22"/>
+        </w:rPr>
+        <w:t xml:space="preserve"> 1–3) và 1 </w:t>
+      </w:r>
+      <w:proofErr w:type="spellStart"/>
+      <w:r>
+        <w:rPr>
+          <w:rFonts w:ascii="Arial" w:eastAsia="Arial" w:hAnsi="Arial" w:cs="Arial"/>
+          <w:sz w:val="22"/>
+          <w:szCs w:val="22"/>
+        </w:rPr>
+        <w:t>Sprint</w:t>
+      </w:r>
+      <w:proofErr w:type="spellEnd"/>
+      <w:r>
+        <w:rPr>
+          <w:rFonts w:ascii="Arial" w:eastAsia="Arial" w:hAnsi="Arial" w:cs="Arial"/>
+          <w:sz w:val="22"/>
+          <w:szCs w:val="22"/>
+        </w:rPr>
+        <w:t xml:space="preserve"> 0 khởi động.</w:t>
       </w:r>
     </w:p>
     <w:p>
@@ -6405,13 +8461,114 @@
         </w:numPr>
         <w:spacing w:before="40" w:after="40"/>
       </w:pPr>
+      <w:proofErr w:type="spellStart"/>
       <w:r>
         <w:rPr>
           <w:rFonts w:ascii="Arial" w:eastAsia="Arial" w:hAnsi="Arial" w:cs="Arial"/>
           <w:sz w:val="22"/>
           <w:szCs w:val="22"/>
         </w:rPr>
-        <w:t>Product Backlog được quản lý trong file KeHoach_Scrum_BlueMoon.xlsx, liên kết với Raw Log theo mã RL-xxx.</w:t>
+        <w:lastRenderedPageBreak/>
+        <w:t>Product</w:t>
+      </w:r>
+      <w:proofErr w:type="spellEnd"/>
+      <w:r>
+        <w:rPr>
+          <w:rFonts w:ascii="Arial" w:eastAsia="Arial" w:hAnsi="Arial" w:cs="Arial"/>
+          <w:sz w:val="22"/>
+          <w:szCs w:val="22"/>
+        </w:rPr>
+        <w:t xml:space="preserve"> </w:t>
+      </w:r>
+      <w:proofErr w:type="spellStart"/>
+      <w:r>
+        <w:rPr>
+          <w:rFonts w:ascii="Arial" w:eastAsia="Arial" w:hAnsi="Arial" w:cs="Arial"/>
+          <w:sz w:val="22"/>
+          <w:szCs w:val="22"/>
+        </w:rPr>
+        <w:t>Backlog</w:t>
+      </w:r>
+      <w:proofErr w:type="spellEnd"/>
+      <w:r>
+        <w:rPr>
+          <w:rFonts w:ascii="Arial" w:eastAsia="Arial" w:hAnsi="Arial" w:cs="Arial"/>
+          <w:sz w:val="22"/>
+          <w:szCs w:val="22"/>
+        </w:rPr>
+        <w:t xml:space="preserve"> được quản lý trong </w:t>
+      </w:r>
+      <w:proofErr w:type="spellStart"/>
+      <w:r>
+        <w:rPr>
+          <w:rFonts w:ascii="Arial" w:eastAsia="Arial" w:hAnsi="Arial" w:cs="Arial"/>
+          <w:sz w:val="22"/>
+          <w:szCs w:val="22"/>
+        </w:rPr>
+        <w:t>file</w:t>
+      </w:r>
+      <w:proofErr w:type="spellEnd"/>
+      <w:r>
+        <w:rPr>
+          <w:rFonts w:ascii="Arial" w:eastAsia="Arial" w:hAnsi="Arial" w:cs="Arial"/>
+          <w:sz w:val="22"/>
+          <w:szCs w:val="22"/>
+        </w:rPr>
+        <w:t xml:space="preserve"> KeHoach_Scrum_BlueMoon.xlsx, liên kết với </w:t>
+      </w:r>
+      <w:proofErr w:type="spellStart"/>
+      <w:r>
+        <w:rPr>
+          <w:rFonts w:ascii="Arial" w:eastAsia="Arial" w:hAnsi="Arial" w:cs="Arial"/>
+          <w:sz w:val="22"/>
+          <w:szCs w:val="22"/>
+        </w:rPr>
+        <w:t>Raw</w:t>
+      </w:r>
+      <w:proofErr w:type="spellEnd"/>
+      <w:r>
+        <w:rPr>
+          <w:rFonts w:ascii="Arial" w:eastAsia="Arial" w:hAnsi="Arial" w:cs="Arial"/>
+          <w:sz w:val="22"/>
+          <w:szCs w:val="22"/>
+        </w:rPr>
+        <w:t xml:space="preserve"> </w:t>
+      </w:r>
+      <w:proofErr w:type="spellStart"/>
+      <w:r>
+        <w:rPr>
+          <w:rFonts w:ascii="Arial" w:eastAsia="Arial" w:hAnsi="Arial" w:cs="Arial"/>
+          <w:sz w:val="22"/>
+          <w:szCs w:val="22"/>
+        </w:rPr>
+        <w:t>Log</w:t>
+      </w:r>
+      <w:proofErr w:type="spellEnd"/>
+      <w:r>
+        <w:rPr>
+          <w:rFonts w:ascii="Arial" w:eastAsia="Arial" w:hAnsi="Arial" w:cs="Arial"/>
+          <w:sz w:val="22"/>
+          <w:szCs w:val="22"/>
+        </w:rPr>
+        <w:t xml:space="preserve"> theo mã RL-</w:t>
+      </w:r>
+      <w:proofErr w:type="spellStart"/>
+      <w:r>
+        <w:rPr>
+          <w:rFonts w:ascii="Arial" w:eastAsia="Arial" w:hAnsi="Arial" w:cs="Arial"/>
+          <w:sz w:val="22"/>
+          <w:szCs w:val="22"/>
+        </w:rPr>
+        <w:t>xxx</w:t>
+      </w:r>
+      <w:proofErr w:type="spellEnd"/>
+      <w:r>
+        <w:rPr>
+          <w:rFonts w:ascii="Arial" w:eastAsia="Arial" w:hAnsi="Arial" w:cs="Arial"/>
+          <w:sz w:val="22"/>
+          <w:szCs w:val="22"/>
+        </w:rPr>
+        <w:t>.</w:t>
       </w:r>
     </w:p>
     <w:p>
@@ -6429,8 +8586,43 @@
           <w:sz w:val="22"/>
           <w:szCs w:val="22"/>
         </w:rPr>
-        <w:lastRenderedPageBreak/>
-        <w:t>Mọi thay đổi phạm vi sau khi ký kết phải được ghi nhận vào Product Backlog và thông báo cho PO.</w:t>
+        <w:t xml:space="preserve">Mọi thay đổi phạm vi sau khi ký kết phải được ghi nhận vào </w:t>
+      </w:r>
+      <w:proofErr w:type="spellStart"/>
+      <w:r>
+        <w:rPr>
+          <w:rFonts w:ascii="Arial" w:eastAsia="Arial" w:hAnsi="Arial" w:cs="Arial"/>
+          <w:sz w:val="22"/>
+          <w:szCs w:val="22"/>
+        </w:rPr>
+        <w:t>Product</w:t>
+      </w:r>
+      <w:proofErr w:type="spellEnd"/>
+      <w:r>
+        <w:rPr>
+          <w:rFonts w:ascii="Arial" w:eastAsia="Arial" w:hAnsi="Arial" w:cs="Arial"/>
+          <w:sz w:val="22"/>
+          <w:szCs w:val="22"/>
+        </w:rPr>
+        <w:t xml:space="preserve"> </w:t>
+      </w:r>
+      <w:proofErr w:type="spellStart"/>
+      <w:r>
+        <w:rPr>
+          <w:rFonts w:ascii="Arial" w:eastAsia="Arial" w:hAnsi="Arial" w:cs="Arial"/>
+          <w:sz w:val="22"/>
+          <w:szCs w:val="22"/>
+        </w:rPr>
+        <w:t>Backlog</w:t>
+      </w:r>
+      <w:proofErr w:type="spellEnd"/>
+      <w:r>
+        <w:rPr>
+          <w:rFonts w:ascii="Arial" w:eastAsia="Arial" w:hAnsi="Arial" w:cs="Arial"/>
+          <w:sz w:val="22"/>
+          <w:szCs w:val="22"/>
+        </w:rPr>
+        <w:t xml:space="preserve"> và thông báo cho PO.</w:t>
       </w:r>
     </w:p>
     <w:p>
@@ -7158,7 +9350,6 @@
   <w:style w:type="character" w:default="1" w:styleId="Phngmcinhcuaoanvn">
     <w:name w:val="Default Paragraph Font"/>
     <w:uiPriority w:val="1"/>
-    <w:semiHidden/>
     <w:unhideWhenUsed/>
   </w:style>
   <w:style w:type="table" w:default="1" w:styleId="BangThngthng">

</xml_diff>

<commit_message>
chỉnh sửa lại tài liệu kỹ thuật
</commit_message>
<xml_diff>
--- a/docs/Nhóm 16/01 - Tai lieu du an/2. Ke hoach du an phan mem/Project_Charter_BlueMoon.docx
+++ b/docs/Nhóm 16/01 - Tai lieu du an/2. Ke hoach du an phan mem/Project_Charter_BlueMoon.docx
@@ -899,7 +899,7 @@
         </w:trPr>
         <w:tc>
           <w:tcPr>
-            <w:tcW w:w="2200" w:type="dxa"/>
+            <w:tcW w:w="2103" w:type="dxa"/>
             <w:tcBorders>
               <w:top w:val="single" w:sz="4" w:space="0" w:color="AAAAAA"/>
               <w:left w:val="single" w:sz="4" w:space="0" w:color="AAAAAA"/>
@@ -931,7 +931,7 @@
         </w:tc>
         <w:tc>
           <w:tcPr>
-            <w:tcW w:w="1800" w:type="dxa"/>
+            <w:tcW w:w="1757" w:type="dxa"/>
             <w:tcBorders>
               <w:top w:val="single" w:sz="4" w:space="0" w:color="AAAAAA"/>
               <w:left w:val="single" w:sz="4" w:space="0" w:color="AAAAAA"/>
@@ -963,7 +963,7 @@
         </w:tc>
         <w:tc>
           <w:tcPr>
-            <w:tcW w:w="2600" w:type="dxa"/>
+            <w:tcW w:w="2485" w:type="dxa"/>
             <w:tcBorders>
               <w:top w:val="single" w:sz="4" w:space="0" w:color="AAAAAA"/>
               <w:left w:val="single" w:sz="4" w:space="0" w:color="AAAAAA"/>
@@ -995,7 +995,7 @@
         </w:tc>
         <w:tc>
           <w:tcPr>
-            <w:tcW w:w="3146" w:type="dxa"/>
+            <w:tcW w:w="3401" w:type="dxa"/>
             <w:tcBorders>
               <w:top w:val="single" w:sz="4" w:space="0" w:color="AAAAAA"/>
               <w:left w:val="single" w:sz="4" w:space="0" w:color="AAAAAA"/>
@@ -1031,7 +1031,7 @@
       <w:tr>
         <w:tc>
           <w:tcPr>
-            <w:tcW w:w="2200" w:type="dxa"/>
+            <w:tcW w:w="2103" w:type="dxa"/>
             <w:tcBorders>
               <w:top w:val="single" w:sz="4" w:space="0" w:color="AAAAAA"/>
               <w:left w:val="single" w:sz="4" w:space="0" w:color="AAAAAA"/>
@@ -1048,20 +1048,28 @@
             <w:vAlign w:val="center"/>
           </w:tcPr>
           <w:p>
-            <w:r>
-              <w:rPr>
-                <w:rFonts w:ascii="Arial" w:eastAsia="Arial" w:hAnsi="Arial" w:cs="Arial"/>
-                <w:color w:val="000000"/>
-                <w:sz w:val="21"/>
-                <w:szCs w:val="21"/>
-              </w:rPr>
-              <w:t>Trần Khánh Linh</w:t>
-            </w:r>
-          </w:p>
-        </w:tc>
-        <w:tc>
-          <w:tcPr>
-            <w:tcW w:w="1800" w:type="dxa"/>
+            <w:pPr>
+              <w:rPr>
+                <w:rFonts w:ascii="Arial" w:eastAsia="Arial" w:hAnsi="Arial" w:cs="Arial"/>
+                <w:color w:val="000000"/>
+                <w:sz w:val="21"/>
+                <w:szCs w:val="21"/>
+              </w:rPr>
+            </w:pPr>
+            <w:r>
+              <w:rPr>
+                <w:rFonts w:ascii="Arial" w:eastAsia="Arial" w:hAnsi="Arial" w:cs="Arial"/>
+                <w:color w:val="000000"/>
+                <w:sz w:val="21"/>
+                <w:szCs w:val="21"/>
+              </w:rPr>
+              <w:t>Lê Quang Huy</w:t>
+            </w:r>
+          </w:p>
+        </w:tc>
+        <w:tc>
+          <w:tcPr>
+            <w:tcW w:w="1757" w:type="dxa"/>
             <w:tcBorders>
               <w:top w:val="single" w:sz="4" w:space="0" w:color="AAAAAA"/>
               <w:left w:val="single" w:sz="4" w:space="0" w:color="AAAAAA"/>
@@ -1078,15 +1086,23 @@
             <w:vAlign w:val="center"/>
           </w:tcPr>
           <w:p>
-            <w:proofErr w:type="spellStart"/>
-            <w:r>
-              <w:rPr>
-                <w:rFonts w:ascii="Arial" w:eastAsia="Arial" w:hAnsi="Arial" w:cs="Arial"/>
-                <w:color w:val="000000"/>
-                <w:sz w:val="21"/>
-                <w:szCs w:val="21"/>
-              </w:rPr>
-              <w:t>Scrum</w:t>
+            <w:pPr>
+              <w:rPr>
+                <w:rFonts w:ascii="Arial" w:eastAsia="Arial" w:hAnsi="Arial" w:cs="Arial"/>
+                <w:color w:val="000000"/>
+                <w:sz w:val="21"/>
+                <w:szCs w:val="21"/>
+              </w:rPr>
+            </w:pPr>
+            <w:proofErr w:type="spellStart"/>
+            <w:r>
+              <w:rPr>
+                <w:rFonts w:ascii="Arial" w:eastAsia="Arial" w:hAnsi="Arial" w:cs="Arial"/>
+                <w:color w:val="000000"/>
+                <w:sz w:val="21"/>
+                <w:szCs w:val="21"/>
+              </w:rPr>
+              <w:t>Product</w:t>
             </w:r>
             <w:proofErr w:type="spellEnd"/>
             <w:r>
@@ -1106,14 +1122,34 @@
                 <w:sz w:val="21"/>
                 <w:szCs w:val="21"/>
               </w:rPr>
-              <w:t>Master</w:t>
-            </w:r>
-            <w:proofErr w:type="spellEnd"/>
-          </w:p>
-        </w:tc>
-        <w:tc>
-          <w:tcPr>
-            <w:tcW w:w="2600" w:type="dxa"/>
+              <w:t>Owner</w:t>
+            </w:r>
+            <w:proofErr w:type="spellEnd"/>
+            <w:r>
+              <w:rPr>
+                <w:rFonts w:ascii="Arial" w:eastAsia="Arial" w:hAnsi="Arial" w:cs="Arial"/>
+                <w:color w:val="000000"/>
+                <w:sz w:val="21"/>
+                <w:szCs w:val="21"/>
+              </w:rPr>
+              <w:t xml:space="preserve"> Project </w:t>
+            </w:r>
+            <w:proofErr w:type="spellStart"/>
+            <w:r>
+              <w:rPr>
+                <w:rFonts w:ascii="Arial" w:eastAsia="Arial" w:hAnsi="Arial" w:cs="Arial"/>
+                <w:color w:val="000000"/>
+                <w:sz w:val="21"/>
+                <w:szCs w:val="21"/>
+              </w:rPr>
+              <w:t>Manager</w:t>
+            </w:r>
+            <w:proofErr w:type="spellEnd"/>
+          </w:p>
+        </w:tc>
+        <w:tc>
+          <w:tcPr>
+            <w:tcW w:w="2485" w:type="dxa"/>
             <w:tcBorders>
               <w:top w:val="single" w:sz="4" w:space="0" w:color="AAAAAA"/>
               <w:left w:val="single" w:sz="4" w:space="0" w:color="AAAAAA"/>
@@ -1130,40 +1166,97 @@
             <w:vAlign w:val="center"/>
           </w:tcPr>
           <w:p>
-            <w:r>
-              <w:rPr>
-                <w:rFonts w:ascii="Arial" w:eastAsia="Arial" w:hAnsi="Arial" w:cs="Arial"/>
-                <w:color w:val="000000"/>
-                <w:sz w:val="21"/>
-                <w:szCs w:val="21"/>
-              </w:rPr>
-              <w:t xml:space="preserve">Hỗ trợ nhóm tuân thủ </w:t>
-            </w:r>
-            <w:proofErr w:type="spellStart"/>
-            <w:r>
-              <w:rPr>
-                <w:rFonts w:ascii="Arial" w:eastAsia="Arial" w:hAnsi="Arial" w:cs="Arial"/>
-                <w:color w:val="000000"/>
-                <w:sz w:val="21"/>
-                <w:szCs w:val="21"/>
-              </w:rPr>
-              <w:t>Scrum</w:t>
-            </w:r>
-            <w:proofErr w:type="spellEnd"/>
-            <w:r>
-              <w:rPr>
-                <w:rFonts w:ascii="Arial" w:eastAsia="Arial" w:hAnsi="Arial" w:cs="Arial"/>
-                <w:color w:val="000000"/>
-                <w:sz w:val="21"/>
-                <w:szCs w:val="21"/>
-              </w:rPr>
-              <w:t>, loại bỏ trở ngại, tổ chức các buổi họp</w:t>
-            </w:r>
-          </w:p>
-        </w:tc>
-        <w:tc>
-          <w:tcPr>
-            <w:tcW w:w="3146" w:type="dxa"/>
+            <w:pPr>
+              <w:rPr>
+                <w:rFonts w:ascii="Arial" w:eastAsia="Arial" w:hAnsi="Arial" w:cs="Arial"/>
+                <w:color w:val="000000"/>
+                <w:sz w:val="21"/>
+                <w:szCs w:val="21"/>
+              </w:rPr>
+            </w:pPr>
+            <w:r>
+              <w:rPr>
+                <w:rFonts w:ascii="Arial" w:eastAsia="Arial" w:hAnsi="Arial" w:cs="Arial"/>
+                <w:color w:val="000000"/>
+                <w:sz w:val="21"/>
+                <w:szCs w:val="21"/>
+              </w:rPr>
+              <w:t xml:space="preserve">Đại diện khách hàng, quản lý </w:t>
+            </w:r>
+            <w:proofErr w:type="spellStart"/>
+            <w:r>
+              <w:rPr>
+                <w:rFonts w:ascii="Arial" w:eastAsia="Arial" w:hAnsi="Arial" w:cs="Arial"/>
+                <w:color w:val="000000"/>
+                <w:sz w:val="21"/>
+                <w:szCs w:val="21"/>
+              </w:rPr>
+              <w:t>Product</w:t>
+            </w:r>
+            <w:proofErr w:type="spellEnd"/>
+            <w:r>
+              <w:rPr>
+                <w:rFonts w:ascii="Arial" w:eastAsia="Arial" w:hAnsi="Arial" w:cs="Arial"/>
+                <w:color w:val="000000"/>
+                <w:sz w:val="21"/>
+                <w:szCs w:val="21"/>
+              </w:rPr>
+              <w:t xml:space="preserve"> </w:t>
+            </w:r>
+            <w:proofErr w:type="spellStart"/>
+            <w:r>
+              <w:rPr>
+                <w:rFonts w:ascii="Arial" w:eastAsia="Arial" w:hAnsi="Arial" w:cs="Arial"/>
+                <w:color w:val="000000"/>
+                <w:sz w:val="21"/>
+                <w:szCs w:val="21"/>
+              </w:rPr>
+              <w:t>Backlog</w:t>
+            </w:r>
+            <w:proofErr w:type="spellEnd"/>
+            <w:r>
+              <w:rPr>
+                <w:rFonts w:ascii="Arial" w:eastAsia="Arial" w:hAnsi="Arial" w:cs="Arial"/>
+                <w:color w:val="000000"/>
+                <w:sz w:val="21"/>
+                <w:szCs w:val="21"/>
+              </w:rPr>
+              <w:t xml:space="preserve">, </w:t>
+            </w:r>
+            <w:r>
+              <w:rPr>
+                <w:rFonts w:ascii="Arial" w:eastAsia="Arial" w:hAnsi="Arial" w:cs="Arial"/>
+                <w:color w:val="000000"/>
+                <w:sz w:val="21"/>
+                <w:szCs w:val="21"/>
+              </w:rPr>
+              <w:t xml:space="preserve">quyết định </w:t>
+            </w:r>
+            <w:proofErr w:type="spellStart"/>
+            <w:r>
+              <w:rPr>
+                <w:rFonts w:ascii="Arial" w:eastAsia="Arial" w:hAnsi="Arial" w:cs="Arial"/>
+                <w:color w:val="000000"/>
+                <w:sz w:val="21"/>
+                <w:szCs w:val="21"/>
+              </w:rPr>
+              <w:t>định</w:t>
+            </w:r>
+            <w:proofErr w:type="spellEnd"/>
+            <w:r>
+              <w:rPr>
+                <w:rFonts w:ascii="Arial" w:eastAsia="Arial" w:hAnsi="Arial" w:cs="Arial"/>
+                <w:color w:val="000000"/>
+                <w:sz w:val="21"/>
+                <w:szCs w:val="21"/>
+              </w:rPr>
+              <w:t xml:space="preserve"> hướng sản phẩm</w:t>
+            </w:r>
+          </w:p>
+        </w:tc>
+        <w:tc>
+          <w:tcPr>
+            <w:tcW w:w="3401" w:type="dxa"/>
             <w:tcBorders>
               <w:top w:val="single" w:sz="4" w:space="0" w:color="AAAAAA"/>
               <w:left w:val="single" w:sz="4" w:space="0" w:color="AAAAAA"/>
@@ -1180,14 +1273,22 @@
             <w:vAlign w:val="center"/>
           </w:tcPr>
           <w:p>
-            <w:r>
-              <w:rPr>
-                <w:rFonts w:ascii="Arial" w:eastAsia="Arial" w:hAnsi="Arial" w:cs="Arial"/>
-                <w:color w:val="000000"/>
-                <w:sz w:val="21"/>
-                <w:szCs w:val="21"/>
-              </w:rPr>
-              <w:t>linh.tk235137@sis.hust.edu.vn</w:t>
+            <w:pPr>
+              <w:rPr>
+                <w:rFonts w:ascii="Arial" w:eastAsia="Arial" w:hAnsi="Arial" w:cs="Arial"/>
+                <w:color w:val="000000"/>
+                <w:sz w:val="21"/>
+                <w:szCs w:val="21"/>
+              </w:rPr>
+            </w:pPr>
+            <w:r>
+              <w:rPr>
+                <w:rFonts w:ascii="Arial" w:eastAsia="Arial" w:hAnsi="Arial" w:cs="Arial"/>
+                <w:color w:val="000000"/>
+                <w:sz w:val="21"/>
+                <w:szCs w:val="21"/>
+              </w:rPr>
+              <w:t>huy.lq225333@sis.hust.edu.vn</w:t>
             </w:r>
           </w:p>
         </w:tc>
@@ -1195,7 +1296,7 @@
       <w:tr>
         <w:tc>
           <w:tcPr>
-            <w:tcW w:w="2200" w:type="dxa"/>
+            <w:tcW w:w="2103" w:type="dxa"/>
             <w:tcBorders>
               <w:top w:val="single" w:sz="4" w:space="0" w:color="AAAAAA"/>
               <w:left w:val="single" w:sz="4" w:space="0" w:color="AAAAAA"/>
@@ -1219,13 +1320,13 @@
                 <w:sz w:val="21"/>
                 <w:szCs w:val="21"/>
               </w:rPr>
-              <w:t>Lê Quang Huy</w:t>
-            </w:r>
-          </w:p>
-        </w:tc>
-        <w:tc>
-          <w:tcPr>
-            <w:tcW w:w="1800" w:type="dxa"/>
+              <w:t>Trần Khánh Linh</w:t>
+            </w:r>
+          </w:p>
+        </w:tc>
+        <w:tc>
+          <w:tcPr>
+            <w:tcW w:w="1757" w:type="dxa"/>
             <w:tcBorders>
               <w:top w:val="single" w:sz="4" w:space="0" w:color="AAAAAA"/>
               <w:left w:val="single" w:sz="4" w:space="0" w:color="AAAAAA"/>
@@ -1250,7 +1351,7 @@
                 <w:sz w:val="21"/>
                 <w:szCs w:val="21"/>
               </w:rPr>
-              <w:t>Product</w:t>
+              <w:t>Scrum</w:t>
             </w:r>
             <w:proofErr w:type="spellEnd"/>
             <w:r>
@@ -1270,34 +1371,14 @@
                 <w:sz w:val="21"/>
                 <w:szCs w:val="21"/>
               </w:rPr>
-              <w:t>Owner</w:t>
-            </w:r>
-            <w:proofErr w:type="spellEnd"/>
-            <w:r>
-              <w:rPr>
-                <w:rFonts w:ascii="Arial" w:eastAsia="Arial" w:hAnsi="Arial" w:cs="Arial"/>
-                <w:color w:val="000000"/>
-                <w:sz w:val="21"/>
-                <w:szCs w:val="21"/>
-              </w:rPr>
-              <w:t xml:space="preserve"> Project </w:t>
-            </w:r>
-            <w:proofErr w:type="spellStart"/>
-            <w:r>
-              <w:rPr>
-                <w:rFonts w:ascii="Arial" w:eastAsia="Arial" w:hAnsi="Arial" w:cs="Arial"/>
-                <w:color w:val="000000"/>
-                <w:sz w:val="21"/>
-                <w:szCs w:val="21"/>
-              </w:rPr>
-              <w:t>Manager</w:t>
-            </w:r>
-            <w:proofErr w:type="spellEnd"/>
-          </w:p>
-        </w:tc>
-        <w:tc>
-          <w:tcPr>
-            <w:tcW w:w="2600" w:type="dxa"/>
+              <w:t>Master</w:t>
+            </w:r>
+            <w:proofErr w:type="spellEnd"/>
+          </w:p>
+        </w:tc>
+        <w:tc>
+          <w:tcPr>
+            <w:tcW w:w="2485" w:type="dxa"/>
             <w:tcBorders>
               <w:top w:val="single" w:sz="4" w:space="0" w:color="AAAAAA"/>
               <w:left w:val="single" w:sz="4" w:space="0" w:color="AAAAAA"/>
@@ -1321,82 +1402,33 @@
                 <w:sz w:val="21"/>
                 <w:szCs w:val="21"/>
               </w:rPr>
-              <w:t xml:space="preserve">Đại diện khách hàng, quản lý </w:t>
-            </w:r>
-            <w:proofErr w:type="spellStart"/>
-            <w:r>
-              <w:rPr>
-                <w:rFonts w:ascii="Arial" w:eastAsia="Arial" w:hAnsi="Arial" w:cs="Arial"/>
-                <w:color w:val="000000"/>
-                <w:sz w:val="21"/>
-                <w:szCs w:val="21"/>
-              </w:rPr>
-              <w:t>Product</w:t>
-            </w:r>
-            <w:proofErr w:type="spellEnd"/>
-            <w:r>
-              <w:rPr>
-                <w:rFonts w:ascii="Arial" w:eastAsia="Arial" w:hAnsi="Arial" w:cs="Arial"/>
-                <w:color w:val="000000"/>
-                <w:sz w:val="21"/>
-                <w:szCs w:val="21"/>
-              </w:rPr>
-              <w:t xml:space="preserve"> </w:t>
-            </w:r>
-            <w:proofErr w:type="spellStart"/>
-            <w:r>
-              <w:rPr>
-                <w:rFonts w:ascii="Arial" w:eastAsia="Arial" w:hAnsi="Arial" w:cs="Arial"/>
-                <w:color w:val="000000"/>
-                <w:sz w:val="21"/>
-                <w:szCs w:val="21"/>
-              </w:rPr>
-              <w:t>Backlog</w:t>
-            </w:r>
-            <w:proofErr w:type="spellEnd"/>
-            <w:r>
-              <w:rPr>
-                <w:rFonts w:ascii="Arial" w:eastAsia="Arial" w:hAnsi="Arial" w:cs="Arial"/>
-                <w:color w:val="000000"/>
-                <w:sz w:val="21"/>
-                <w:szCs w:val="21"/>
-              </w:rPr>
-              <w:t xml:space="preserve">, </w:t>
-            </w:r>
-            <w:r>
-              <w:rPr>
-                <w:rFonts w:ascii="Arial" w:eastAsia="Arial" w:hAnsi="Arial" w:cs="Arial"/>
-                <w:color w:val="000000"/>
-                <w:sz w:val="21"/>
-                <w:szCs w:val="21"/>
-              </w:rPr>
-              <w:t xml:space="preserve">quyết định </w:t>
-            </w:r>
-            <w:proofErr w:type="spellStart"/>
-            <w:r>
-              <w:rPr>
-                <w:rFonts w:ascii="Arial" w:eastAsia="Arial" w:hAnsi="Arial" w:cs="Arial"/>
-                <w:color w:val="000000"/>
-                <w:sz w:val="21"/>
-                <w:szCs w:val="21"/>
-              </w:rPr>
-              <w:t>định</w:t>
-            </w:r>
-            <w:proofErr w:type="spellEnd"/>
-            <w:r>
-              <w:rPr>
-                <w:rFonts w:ascii="Arial" w:eastAsia="Arial" w:hAnsi="Arial" w:cs="Arial"/>
-                <w:color w:val="000000"/>
-                <w:sz w:val="21"/>
-                <w:szCs w:val="21"/>
-              </w:rPr>
-              <w:t xml:space="preserve"> hướng sản phẩm</w:t>
-            </w:r>
-          </w:p>
-        </w:tc>
-        <w:tc>
-          <w:tcPr>
-            <w:tcW w:w="3146" w:type="dxa"/>
+              <w:t xml:space="preserve">Hỗ trợ nhóm tuân thủ </w:t>
+            </w:r>
+            <w:proofErr w:type="spellStart"/>
+            <w:r>
+              <w:rPr>
+                <w:rFonts w:ascii="Arial" w:eastAsia="Arial" w:hAnsi="Arial" w:cs="Arial"/>
+                <w:color w:val="000000"/>
+                <w:sz w:val="21"/>
+                <w:szCs w:val="21"/>
+              </w:rPr>
+              <w:t>Scrum</w:t>
+            </w:r>
+            <w:proofErr w:type="spellEnd"/>
+            <w:r>
+              <w:rPr>
+                <w:rFonts w:ascii="Arial" w:eastAsia="Arial" w:hAnsi="Arial" w:cs="Arial"/>
+                <w:color w:val="000000"/>
+                <w:sz w:val="21"/>
+                <w:szCs w:val="21"/>
+              </w:rPr>
+              <w:t>, loại bỏ trở ngại, tổ chức các buổi họp</w:t>
+            </w:r>
+          </w:p>
+        </w:tc>
+        <w:tc>
+          <w:tcPr>
+            <w:tcW w:w="3401" w:type="dxa"/>
             <w:tcBorders>
               <w:top w:val="single" w:sz="4" w:space="0" w:color="AAAAAA"/>
               <w:left w:val="single" w:sz="4" w:space="0" w:color="AAAAAA"/>
@@ -1420,25 +1452,7 @@
                 <w:sz w:val="21"/>
                 <w:szCs w:val="21"/>
               </w:rPr>
-              <w:t>huy.</w:t>
-            </w:r>
-            <w:r>
-              <w:rPr>
-                <w:rFonts w:ascii="Arial" w:eastAsia="Arial" w:hAnsi="Arial" w:cs="Arial"/>
-                <w:color w:val="000000"/>
-                <w:sz w:val="21"/>
-                <w:szCs w:val="21"/>
-              </w:rPr>
-              <w:t>lq225333</w:t>
-            </w:r>
-            <w:r>
-              <w:rPr>
-                <w:rFonts w:ascii="Arial" w:eastAsia="Arial" w:hAnsi="Arial" w:cs="Arial"/>
-                <w:color w:val="000000"/>
-                <w:sz w:val="21"/>
-                <w:szCs w:val="21"/>
-              </w:rPr>
-              <w:t>@sis.hust.edu.vn</w:t>
+              <w:t>linh.tk235137@sis.hust.edu.vn</w:t>
             </w:r>
           </w:p>
         </w:tc>
@@ -1446,7 +1460,7 @@
       <w:tr>
         <w:tc>
           <w:tcPr>
-            <w:tcW w:w="2200" w:type="dxa"/>
+            <w:tcW w:w="2103" w:type="dxa"/>
             <w:tcBorders>
               <w:top w:val="single" w:sz="4" w:space="0" w:color="AAAAAA"/>
               <w:left w:val="single" w:sz="4" w:space="0" w:color="AAAAAA"/>
@@ -1476,7 +1490,7 @@
         </w:tc>
         <w:tc>
           <w:tcPr>
-            <w:tcW w:w="1800" w:type="dxa"/>
+            <w:tcW w:w="1757" w:type="dxa"/>
             <w:tcBorders>
               <w:top w:val="single" w:sz="4" w:space="0" w:color="AAAAAA"/>
               <w:left w:val="single" w:sz="4" w:space="0" w:color="AAAAAA"/>
@@ -1508,7 +1522,7 @@
         </w:tc>
         <w:tc>
           <w:tcPr>
-            <w:tcW w:w="2600" w:type="dxa"/>
+            <w:tcW w:w="2485" w:type="dxa"/>
             <w:tcBorders>
               <w:top w:val="single" w:sz="4" w:space="0" w:color="AAAAAA"/>
               <w:left w:val="single" w:sz="4" w:space="0" w:color="AAAAAA"/>
@@ -1538,7 +1552,7 @@
         </w:tc>
         <w:tc>
           <w:tcPr>
-            <w:tcW w:w="3146" w:type="dxa"/>
+            <w:tcW w:w="3401" w:type="dxa"/>
             <w:tcBorders>
               <w:top w:val="single" w:sz="4" w:space="0" w:color="AAAAAA"/>
               <w:left w:val="single" w:sz="4" w:space="0" w:color="AAAAAA"/>
@@ -1579,7 +1593,7 @@
       <w:tr>
         <w:tc>
           <w:tcPr>
-            <w:tcW w:w="2200" w:type="dxa"/>
+            <w:tcW w:w="2103" w:type="dxa"/>
             <w:tcBorders>
               <w:top w:val="single" w:sz="4" w:space="0" w:color="AAAAAA"/>
               <w:left w:val="single" w:sz="4" w:space="0" w:color="AAAAAA"/>
@@ -1609,7 +1623,7 @@
         </w:tc>
         <w:tc>
           <w:tcPr>
-            <w:tcW w:w="1800" w:type="dxa"/>
+            <w:tcW w:w="1757" w:type="dxa"/>
             <w:tcBorders>
               <w:top w:val="single" w:sz="4" w:space="0" w:color="AAAAAA"/>
               <w:left w:val="single" w:sz="4" w:space="0" w:color="AAAAAA"/>
@@ -1641,7 +1655,7 @@
         </w:tc>
         <w:tc>
           <w:tcPr>
-            <w:tcW w:w="2600" w:type="dxa"/>
+            <w:tcW w:w="2485" w:type="dxa"/>
             <w:tcBorders>
               <w:top w:val="single" w:sz="4" w:space="0" w:color="AAAAAA"/>
               <w:left w:val="single" w:sz="4" w:space="0" w:color="AAAAAA"/>
@@ -1671,7 +1685,7 @@
         </w:tc>
         <w:tc>
           <w:tcPr>
-            <w:tcW w:w="3146" w:type="dxa"/>
+            <w:tcW w:w="3401" w:type="dxa"/>
             <w:tcBorders>
               <w:top w:val="single" w:sz="4" w:space="0" w:color="AAAAAA"/>
               <w:left w:val="single" w:sz="4" w:space="0" w:color="AAAAAA"/>
@@ -1706,14 +1720,13 @@
         </w:trPr>
         <w:tc>
           <w:tcPr>
-            <w:tcW w:w="2200" w:type="dxa"/>
-            <w:tcBorders>
-              <w:top w:val="single" w:sz="4" w:space="0" w:color="AAAAAA"/>
-              <w:left w:val="single" w:sz="4" w:space="0" w:color="AAAAAA"/>
-              <w:bottom w:val="single" w:sz="4" w:space="0" w:color="AAAAAA"/>
-              <w:right w:val="single" w:sz="4" w:space="0" w:color="AAAAAA"/>
-            </w:tcBorders>
-            <w:shd w:val="clear" w:color="auto" w:fill="F2F2F2"/>
+            <w:tcW w:w="2103" w:type="dxa"/>
+            <w:tcBorders>
+              <w:top w:val="single" w:sz="4" w:space="0" w:color="AAAAAA"/>
+              <w:left w:val="single" w:sz="4" w:space="0" w:color="AAAAAA"/>
+              <w:bottom w:val="single" w:sz="4" w:space="0" w:color="AAAAAA"/>
+              <w:right w:val="single" w:sz="4" w:space="0" w:color="AAAAAA"/>
+            </w:tcBorders>
             <w:tcMar>
               <w:top w:w="80" w:type="dxa"/>
               <w:left w:w="140" w:type="dxa"/>
@@ -1744,14 +1757,13 @@
         </w:tc>
         <w:tc>
           <w:tcPr>
-            <w:tcW w:w="1800" w:type="dxa"/>
-            <w:tcBorders>
-              <w:top w:val="single" w:sz="4" w:space="0" w:color="AAAAAA"/>
-              <w:left w:val="single" w:sz="4" w:space="0" w:color="AAAAAA"/>
-              <w:bottom w:val="single" w:sz="4" w:space="0" w:color="AAAAAA"/>
-              <w:right w:val="single" w:sz="4" w:space="0" w:color="AAAAAA"/>
-            </w:tcBorders>
-            <w:shd w:val="clear" w:color="auto" w:fill="F2F2F2"/>
+            <w:tcW w:w="1757" w:type="dxa"/>
+            <w:tcBorders>
+              <w:top w:val="single" w:sz="4" w:space="0" w:color="AAAAAA"/>
+              <w:left w:val="single" w:sz="4" w:space="0" w:color="AAAAAA"/>
+              <w:bottom w:val="single" w:sz="4" w:space="0" w:color="AAAAAA"/>
+              <w:right w:val="single" w:sz="4" w:space="0" w:color="AAAAAA"/>
+            </w:tcBorders>
             <w:tcMar>
               <w:top w:w="80" w:type="dxa"/>
               <w:left w:w="140" w:type="dxa"/>
@@ -1784,14 +1796,13 @@
         </w:tc>
         <w:tc>
           <w:tcPr>
-            <w:tcW w:w="2600" w:type="dxa"/>
-            <w:tcBorders>
-              <w:top w:val="single" w:sz="4" w:space="0" w:color="AAAAAA"/>
-              <w:left w:val="single" w:sz="4" w:space="0" w:color="AAAAAA"/>
-              <w:bottom w:val="single" w:sz="4" w:space="0" w:color="AAAAAA"/>
-              <w:right w:val="single" w:sz="4" w:space="0" w:color="AAAAAA"/>
-            </w:tcBorders>
-            <w:shd w:val="clear" w:color="auto" w:fill="F2F2F2"/>
+            <w:tcW w:w="2485" w:type="dxa"/>
+            <w:tcBorders>
+              <w:top w:val="single" w:sz="4" w:space="0" w:color="AAAAAA"/>
+              <w:left w:val="single" w:sz="4" w:space="0" w:color="AAAAAA"/>
+              <w:bottom w:val="single" w:sz="4" w:space="0" w:color="AAAAAA"/>
+              <w:right w:val="single" w:sz="4" w:space="0" w:color="AAAAAA"/>
+            </w:tcBorders>
             <w:tcMar>
               <w:top w:w="80" w:type="dxa"/>
               <w:left w:w="140" w:type="dxa"/>
@@ -1822,14 +1833,13 @@
         </w:tc>
         <w:tc>
           <w:tcPr>
-            <w:tcW w:w="3146" w:type="dxa"/>
-            <w:tcBorders>
-              <w:top w:val="single" w:sz="4" w:space="0" w:color="AAAAAA"/>
-              <w:left w:val="single" w:sz="4" w:space="0" w:color="AAAAAA"/>
-              <w:bottom w:val="single" w:sz="4" w:space="0" w:color="AAAAAA"/>
-              <w:right w:val="single" w:sz="4" w:space="0" w:color="AAAAAA"/>
-            </w:tcBorders>
-            <w:shd w:val="clear" w:color="auto" w:fill="F2F2F2"/>
+            <w:tcW w:w="3401" w:type="dxa"/>
+            <w:tcBorders>
+              <w:top w:val="single" w:sz="4" w:space="0" w:color="AAAAAA"/>
+              <w:left w:val="single" w:sz="4" w:space="0" w:color="AAAAAA"/>
+              <w:bottom w:val="single" w:sz="4" w:space="0" w:color="AAAAAA"/>
+              <w:right w:val="single" w:sz="4" w:space="0" w:color="AAAAAA"/>
+            </w:tcBorders>
             <w:tcMar>
               <w:top w:w="80" w:type="dxa"/>
               <w:left w:w="140" w:type="dxa"/>
@@ -6094,17 +6104,15 @@
               </w:rPr>
               <w:t xml:space="preserve">, kênh </w:t>
             </w:r>
-            <w:proofErr w:type="spellStart"/>
-            <w:r>
-              <w:rPr>
-                <w:rFonts w:ascii="Arial" w:eastAsia="Arial" w:hAnsi="Arial" w:cs="Arial"/>
-                <w:color w:val="000000"/>
-                <w:sz w:val="21"/>
-                <w:szCs w:val="21"/>
-              </w:rPr>
-              <w:t>Zalo</w:t>
-            </w:r>
-            <w:proofErr w:type="spellEnd"/>
+            <w:r>
+              <w:rPr>
+                <w:rFonts w:ascii="Arial" w:eastAsia="Arial" w:hAnsi="Arial" w:cs="Arial"/>
+                <w:color w:val="000000"/>
+                <w:sz w:val="21"/>
+                <w:szCs w:val="21"/>
+              </w:rPr>
+              <w:t>Messenger</w:t>
+            </w:r>
             <w:r>
               <w:rPr>
                 <w:rFonts w:ascii="Arial" w:eastAsia="Arial" w:hAnsi="Arial" w:cs="Arial"/>
@@ -6722,9 +6730,17 @@
           <w:sz w:val="22"/>
           <w:szCs w:val="22"/>
         </w:rPr>
-        <w:t>Charter.</w:t>
+        <w:t>Charter</w:t>
       </w:r>
       <w:proofErr w:type="spellEnd"/>
+      <w:r>
+        <w:rPr>
+          <w:rFonts w:ascii="Arial" w:eastAsia="Arial" w:hAnsi="Arial" w:cs="Arial"/>
+          <w:sz w:val="22"/>
+          <w:szCs w:val="22"/>
+        </w:rPr>
+        <w:t>.</w:t>
+      </w:r>
     </w:p>
     <w:p>
       <w:pPr>
@@ -9350,6 +9366,7 @@
   <w:style w:type="character" w:default="1" w:styleId="Phngmcinhcuaoanvn">
     <w:name w:val="Default Paragraph Font"/>
     <w:uiPriority w:val="1"/>
+    <w:semiHidden/>
     <w:unhideWhenUsed/>
   </w:style>
   <w:style w:type="table" w:default="1" w:styleId="BangThngthng">

</xml_diff>

<commit_message>
phương tiện + refactor
</commit_message>
<xml_diff>
--- a/docs/Nhóm 16/01 - Tai lieu du an/2. Ke hoach du an phan mem/Project_Charter_BlueMoon.docx
+++ b/docs/Nhóm 16/01 - Tai lieu du an/2. Ke hoach du an phan mem/Project_Charter_BlueMoon.docx
@@ -72,21 +72,8 @@
           <w:sz w:val="32"/>
           <w:szCs w:val="32"/>
         </w:rPr>
-        <w:t xml:space="preserve">Phần mềm quản lý và thu phí chung cư </w:t>
+        <w:t>Phần mềm quản lý và thu phí chung cư BlueMoon</w:t>
       </w:r>
-      <w:proofErr w:type="spellStart"/>
-      <w:r>
-        <w:rPr>
-          <w:rFonts w:ascii="Arial" w:eastAsia="Arial" w:hAnsi="Arial" w:cs="Arial"/>
-          <w:b/>
-          <w:bCs/>
-          <w:color w:val="2E75B6"/>
-          <w:sz w:val="32"/>
-          <w:szCs w:val="32"/>
-        </w:rPr>
-        <w:t>BlueMoon</w:t>
-      </w:r>
-      <w:proofErr w:type="spellEnd"/>
     </w:p>
     <w:p>
       <w:pPr>
@@ -188,31 +175,7 @@
                 <w:sz w:val="22"/>
                 <w:szCs w:val="22"/>
               </w:rPr>
-              <w:t xml:space="preserve">Project </w:t>
-            </w:r>
-            <w:proofErr w:type="spellStart"/>
-            <w:r>
-              <w:rPr>
-                <w:rFonts w:ascii="Arial" w:eastAsia="Arial" w:hAnsi="Arial" w:cs="Arial"/>
-                <w:b/>
-                <w:bCs/>
-                <w:color w:val="444444"/>
-                <w:sz w:val="22"/>
-                <w:szCs w:val="22"/>
-              </w:rPr>
-              <w:t>Manager</w:t>
-            </w:r>
-            <w:proofErr w:type="spellEnd"/>
-            <w:r>
-              <w:rPr>
-                <w:rFonts w:ascii="Arial" w:eastAsia="Arial" w:hAnsi="Arial" w:cs="Arial"/>
-                <w:b/>
-                <w:bCs/>
-                <w:color w:val="444444"/>
-                <w:sz w:val="22"/>
-                <w:szCs w:val="22"/>
-              </w:rPr>
-              <w:t>:</w:t>
+              <w:t>Project Manager:</w:t>
             </w:r>
           </w:p>
         </w:tc>
@@ -398,19 +361,8 @@
                 <w:sz w:val="21"/>
                 <w:szCs w:val="21"/>
               </w:rPr>
-              <w:t xml:space="preserve">Xây dựng phần mềm quản lý và thu phí chung cư </w:t>
-            </w:r>
-            <w:proofErr w:type="spellStart"/>
-            <w:r>
-              <w:rPr>
-                <w:rFonts w:ascii="Arial" w:eastAsia="Arial" w:hAnsi="Arial" w:cs="Arial"/>
-                <w:color w:val="000000"/>
-                <w:sz w:val="21"/>
-                <w:szCs w:val="21"/>
-              </w:rPr>
-              <w:t>BlueMoon</w:t>
-            </w:r>
-            <w:proofErr w:type="spellEnd"/>
+              <w:t>Xây dựng phần mềm quản lý và thu phí chung cư BlueMoon</w:t>
+            </w:r>
           </w:p>
         </w:tc>
       </w:tr>
@@ -537,19 +489,8 @@
                 <w:sz w:val="21"/>
                 <w:szCs w:val="21"/>
               </w:rPr>
-              <w:t xml:space="preserve">Ban quản trị chung cư </w:t>
-            </w:r>
-            <w:proofErr w:type="spellStart"/>
-            <w:r>
-              <w:rPr>
-                <w:rFonts w:ascii="Arial" w:eastAsia="Arial" w:hAnsi="Arial" w:cs="Arial"/>
-                <w:color w:val="000000"/>
-                <w:sz w:val="21"/>
-                <w:szCs w:val="21"/>
-              </w:rPr>
-              <w:t>BlueMoon</w:t>
-            </w:r>
-            <w:proofErr w:type="spellEnd"/>
+              <w:t>Ban quản trị chung cư BlueMoon</w:t>
+            </w:r>
           </w:p>
         </w:tc>
       </w:tr>
@@ -612,19 +553,8 @@
                 <w:sz w:val="21"/>
                 <w:szCs w:val="21"/>
               </w:rPr>
-              <w:t xml:space="preserve">Công ty Cổ phần Quản lý </w:t>
-            </w:r>
-            <w:proofErr w:type="spellStart"/>
-            <w:r>
-              <w:rPr>
-                <w:rFonts w:ascii="Arial" w:eastAsia="Arial" w:hAnsi="Arial" w:cs="Arial"/>
-                <w:color w:val="000000"/>
-                <w:sz w:val="21"/>
-                <w:szCs w:val="21"/>
-              </w:rPr>
-              <w:t>BlueMoon</w:t>
-            </w:r>
-            <w:proofErr w:type="spellEnd"/>
+              <w:t>Công ty Cổ phần Quản lý BlueMoon</w:t>
+            </w:r>
           </w:p>
         </w:tc>
       </w:tr>
@@ -667,9 +597,10 @@
                 <w:sz w:val="21"/>
                 <w:szCs w:val="21"/>
               </w:rPr>
-              <w:t xml:space="preserve">Project </w:t>
-            </w:r>
-            <w:proofErr w:type="spellStart"/>
+              <w:t xml:space="preserve">Project Manager </w:t>
+            </w:r>
+          </w:p>
+          <w:p>
             <w:r>
               <w:rPr>
                 <w:rFonts w:ascii="Arial" w:eastAsia="Arial" w:hAnsi="Arial" w:cs="Arial"/>
@@ -679,9 +610,61 @@
                 <w:sz w:val="21"/>
                 <w:szCs w:val="21"/>
               </w:rPr>
-              <w:t>Manager</w:t>
-            </w:r>
-            <w:proofErr w:type="spellEnd"/>
+              <w:t>Product Owner</w:t>
+            </w:r>
+          </w:p>
+        </w:tc>
+        <w:tc>
+          <w:tcPr>
+            <w:tcW w:w="6946" w:type="dxa"/>
+            <w:tcBorders>
+              <w:top w:val="single" w:sz="4" w:space="0" w:color="AAAAAA"/>
+              <w:left w:val="single" w:sz="4" w:space="0" w:color="AAAAAA"/>
+              <w:bottom w:val="single" w:sz="4" w:space="0" w:color="AAAAAA"/>
+              <w:right w:val="single" w:sz="4" w:space="0" w:color="AAAAAA"/>
+            </w:tcBorders>
+            <w:shd w:val="clear" w:color="auto" w:fill="FFFFFF"/>
+            <w:tcMar>
+              <w:top w:w="80" w:type="dxa"/>
+              <w:left w:w="140" w:type="dxa"/>
+              <w:bottom w:w="80" w:type="dxa"/>
+              <w:right w:w="140" w:type="dxa"/>
+            </w:tcMar>
+            <w:vAlign w:val="center"/>
+          </w:tcPr>
+          <w:p>
+            <w:r>
+              <w:rPr>
+                <w:rFonts w:ascii="Arial" w:eastAsia="Arial" w:hAnsi="Arial" w:cs="Arial"/>
+                <w:color w:val="000000"/>
+                <w:sz w:val="21"/>
+                <w:szCs w:val="21"/>
+              </w:rPr>
+              <w:t>Lê Quang Huy</w:t>
+            </w:r>
+          </w:p>
+        </w:tc>
+      </w:tr>
+      <w:tr>
+        <w:tc>
+          <w:tcPr>
+            <w:tcW w:w="2800" w:type="dxa"/>
+            <w:tcBorders>
+              <w:top w:val="single" w:sz="4" w:space="0" w:color="AAAAAA"/>
+              <w:left w:val="single" w:sz="4" w:space="0" w:color="AAAAAA"/>
+              <w:bottom w:val="single" w:sz="4" w:space="0" w:color="AAAAAA"/>
+              <w:right w:val="single" w:sz="4" w:space="0" w:color="AAAAAA"/>
+            </w:tcBorders>
+            <w:shd w:val="clear" w:color="auto" w:fill="D6E4F0"/>
+            <w:tcMar>
+              <w:top w:w="80" w:type="dxa"/>
+              <w:left w:w="140" w:type="dxa"/>
+              <w:bottom w:w="80" w:type="dxa"/>
+              <w:right w:w="140" w:type="dxa"/>
+            </w:tcMar>
+            <w:vAlign w:val="center"/>
+          </w:tcPr>
+          <w:p>
             <w:r>
               <w:rPr>
                 <w:rFonts w:ascii="Arial" w:eastAsia="Arial" w:hAnsi="Arial" w:cs="Arial"/>
@@ -691,47 +674,8 @@
                 <w:sz w:val="21"/>
                 <w:szCs w:val="21"/>
               </w:rPr>
-              <w:t xml:space="preserve"> </w:t>
-            </w:r>
-          </w:p>
-          <w:p>
-            <w:proofErr w:type="spellStart"/>
-            <w:r>
-              <w:rPr>
-                <w:rFonts w:ascii="Arial" w:eastAsia="Arial" w:hAnsi="Arial" w:cs="Arial"/>
-                <w:b/>
-                <w:bCs/>
-                <w:color w:val="000000"/>
-                <w:sz w:val="21"/>
-                <w:szCs w:val="21"/>
-              </w:rPr>
-              <w:t>Product</w:t>
-            </w:r>
-            <w:proofErr w:type="spellEnd"/>
-            <w:r>
-              <w:rPr>
-                <w:rFonts w:ascii="Arial" w:eastAsia="Arial" w:hAnsi="Arial" w:cs="Arial"/>
-                <w:b/>
-                <w:bCs/>
-                <w:color w:val="000000"/>
-                <w:sz w:val="21"/>
-                <w:szCs w:val="21"/>
-              </w:rPr>
-              <w:t xml:space="preserve"> </w:t>
-            </w:r>
-            <w:proofErr w:type="spellStart"/>
-            <w:r>
-              <w:rPr>
-                <w:rFonts w:ascii="Arial" w:eastAsia="Arial" w:hAnsi="Arial" w:cs="Arial"/>
-                <w:b/>
-                <w:bCs/>
-                <w:color w:val="000000"/>
-                <w:sz w:val="21"/>
-                <w:szCs w:val="21"/>
-              </w:rPr>
-              <w:t>Owner</w:t>
-            </w:r>
-            <w:proofErr w:type="spellEnd"/>
+              <w:t>Mức độ ảnh hưởng</w:t>
+            </w:r>
           </w:p>
         </w:tc>
         <w:tc>
@@ -760,83 +704,8 @@
                 <w:sz w:val="21"/>
                 <w:szCs w:val="21"/>
               </w:rPr>
-              <w:t>Lê Quang Huy</w:t>
-            </w:r>
-          </w:p>
-        </w:tc>
-      </w:tr>
-      <w:tr>
-        <w:tc>
-          <w:tcPr>
-            <w:tcW w:w="2800" w:type="dxa"/>
-            <w:tcBorders>
-              <w:top w:val="single" w:sz="4" w:space="0" w:color="AAAAAA"/>
-              <w:left w:val="single" w:sz="4" w:space="0" w:color="AAAAAA"/>
-              <w:bottom w:val="single" w:sz="4" w:space="0" w:color="AAAAAA"/>
-              <w:right w:val="single" w:sz="4" w:space="0" w:color="AAAAAA"/>
-            </w:tcBorders>
-            <w:shd w:val="clear" w:color="auto" w:fill="D6E4F0"/>
-            <w:tcMar>
-              <w:top w:w="80" w:type="dxa"/>
-              <w:left w:w="140" w:type="dxa"/>
-              <w:bottom w:w="80" w:type="dxa"/>
-              <w:right w:w="140" w:type="dxa"/>
-            </w:tcMar>
-            <w:vAlign w:val="center"/>
-          </w:tcPr>
-          <w:p>
-            <w:r>
-              <w:rPr>
-                <w:rFonts w:ascii="Arial" w:eastAsia="Arial" w:hAnsi="Arial" w:cs="Arial"/>
-                <w:b/>
-                <w:bCs/>
-                <w:color w:val="000000"/>
-                <w:sz w:val="21"/>
-                <w:szCs w:val="21"/>
-              </w:rPr>
-              <w:t>Mức độ ảnh hưởng</w:t>
-            </w:r>
-          </w:p>
-        </w:tc>
-        <w:tc>
-          <w:tcPr>
-            <w:tcW w:w="6946" w:type="dxa"/>
-            <w:tcBorders>
-              <w:top w:val="single" w:sz="4" w:space="0" w:color="AAAAAA"/>
-              <w:left w:val="single" w:sz="4" w:space="0" w:color="AAAAAA"/>
-              <w:bottom w:val="single" w:sz="4" w:space="0" w:color="AAAAAA"/>
-              <w:right w:val="single" w:sz="4" w:space="0" w:color="AAAAAA"/>
-            </w:tcBorders>
-            <w:shd w:val="clear" w:color="auto" w:fill="FFFFFF"/>
-            <w:tcMar>
-              <w:top w:w="80" w:type="dxa"/>
-              <w:left w:w="140" w:type="dxa"/>
-              <w:bottom w:w="80" w:type="dxa"/>
-              <w:right w:w="140" w:type="dxa"/>
-            </w:tcMar>
-            <w:vAlign w:val="center"/>
-          </w:tcPr>
-          <w:p>
-            <w:r>
-              <w:rPr>
-                <w:rFonts w:ascii="Arial" w:eastAsia="Arial" w:hAnsi="Arial" w:cs="Arial"/>
-                <w:color w:val="000000"/>
-                <w:sz w:val="21"/>
-                <w:szCs w:val="21"/>
-              </w:rPr>
-              <w:t xml:space="preserve">Phần mềm nội bộ, thay đổi toàn bộ cách thức quản lý thu phí và thông tin hộ dân cư tại chung cư </w:t>
-            </w:r>
-            <w:proofErr w:type="spellStart"/>
-            <w:r>
-              <w:rPr>
-                <w:rFonts w:ascii="Arial" w:eastAsia="Arial" w:hAnsi="Arial" w:cs="Arial"/>
-                <w:color w:val="000000"/>
-                <w:sz w:val="21"/>
-                <w:szCs w:val="21"/>
-              </w:rPr>
-              <w:t>BlueMoon</w:t>
-            </w:r>
-            <w:proofErr w:type="spellEnd"/>
+              <w:t>Phần mềm nội bộ, thay đổi toàn bộ cách thức quản lý thu phí và thông tin hộ dân cư tại chung cư BlueMoon</w:t>
+            </w:r>
           </w:p>
         </w:tc>
       </w:tr>
@@ -1012,7 +881,6 @@
             <w:vAlign w:val="center"/>
           </w:tcPr>
           <w:p>
-            <w:proofErr w:type="spellStart"/>
             <w:r>
               <w:rPr>
                 <w:rFonts w:ascii="Arial" w:eastAsia="Arial" w:hAnsi="Arial" w:cs="Arial"/>
@@ -1024,7 +892,6 @@
               </w:rPr>
               <w:t>Email</w:t>
             </w:r>
-            <w:proofErr w:type="spellEnd"/>
           </w:p>
         </w:tc>
       </w:tr>
@@ -1094,57 +961,15 @@
                 <w:szCs w:val="21"/>
               </w:rPr>
             </w:pPr>
-            <w:proofErr w:type="spellStart"/>
-            <w:r>
-              <w:rPr>
-                <w:rFonts w:ascii="Arial" w:eastAsia="Arial" w:hAnsi="Arial" w:cs="Arial"/>
-                <w:color w:val="000000"/>
-                <w:sz w:val="21"/>
-                <w:szCs w:val="21"/>
-              </w:rPr>
-              <w:t>Product</w:t>
-            </w:r>
-            <w:proofErr w:type="spellEnd"/>
-            <w:r>
-              <w:rPr>
-                <w:rFonts w:ascii="Arial" w:eastAsia="Arial" w:hAnsi="Arial" w:cs="Arial"/>
-                <w:color w:val="000000"/>
-                <w:sz w:val="21"/>
-                <w:szCs w:val="21"/>
-              </w:rPr>
-              <w:t xml:space="preserve"> </w:t>
-            </w:r>
-            <w:proofErr w:type="spellStart"/>
-            <w:r>
-              <w:rPr>
-                <w:rFonts w:ascii="Arial" w:eastAsia="Arial" w:hAnsi="Arial" w:cs="Arial"/>
-                <w:color w:val="000000"/>
-                <w:sz w:val="21"/>
-                <w:szCs w:val="21"/>
-              </w:rPr>
-              <w:t>Owner</w:t>
-            </w:r>
-            <w:proofErr w:type="spellEnd"/>
-            <w:r>
-              <w:rPr>
-                <w:rFonts w:ascii="Arial" w:eastAsia="Arial" w:hAnsi="Arial" w:cs="Arial"/>
-                <w:color w:val="000000"/>
-                <w:sz w:val="21"/>
-                <w:szCs w:val="21"/>
-              </w:rPr>
-              <w:t xml:space="preserve"> Project </w:t>
-            </w:r>
-            <w:proofErr w:type="spellStart"/>
-            <w:r>
-              <w:rPr>
-                <w:rFonts w:ascii="Arial" w:eastAsia="Arial" w:hAnsi="Arial" w:cs="Arial"/>
-                <w:color w:val="000000"/>
-                <w:sz w:val="21"/>
-                <w:szCs w:val="21"/>
-              </w:rPr>
-              <w:t>Manager</w:t>
-            </w:r>
-            <w:proofErr w:type="spellEnd"/>
+            <w:r>
+              <w:rPr>
+                <w:rFonts w:ascii="Arial" w:eastAsia="Arial" w:hAnsi="Arial" w:cs="Arial"/>
+                <w:color w:val="000000"/>
+                <w:sz w:val="21"/>
+                <w:szCs w:val="21"/>
+              </w:rPr>
+              <w:t>Product Owner Project Manager</w:t>
+            </w:r>
           </w:p>
         </w:tc>
         <w:tc>
@@ -1181,76 +1006,16 @@
                 <w:sz w:val="21"/>
                 <w:szCs w:val="21"/>
               </w:rPr>
-              <w:t xml:space="preserve">Đại diện khách hàng, quản lý </w:t>
-            </w:r>
-            <w:proofErr w:type="spellStart"/>
-            <w:r>
-              <w:rPr>
-                <w:rFonts w:ascii="Arial" w:eastAsia="Arial" w:hAnsi="Arial" w:cs="Arial"/>
-                <w:color w:val="000000"/>
-                <w:sz w:val="21"/>
-                <w:szCs w:val="21"/>
-              </w:rPr>
-              <w:t>Product</w:t>
-            </w:r>
-            <w:proofErr w:type="spellEnd"/>
-            <w:r>
-              <w:rPr>
-                <w:rFonts w:ascii="Arial" w:eastAsia="Arial" w:hAnsi="Arial" w:cs="Arial"/>
-                <w:color w:val="000000"/>
-                <w:sz w:val="21"/>
-                <w:szCs w:val="21"/>
-              </w:rPr>
-              <w:t xml:space="preserve"> </w:t>
-            </w:r>
-            <w:proofErr w:type="spellStart"/>
-            <w:r>
-              <w:rPr>
-                <w:rFonts w:ascii="Arial" w:eastAsia="Arial" w:hAnsi="Arial" w:cs="Arial"/>
-                <w:color w:val="000000"/>
-                <w:sz w:val="21"/>
-                <w:szCs w:val="21"/>
-              </w:rPr>
-              <w:t>Backlog</w:t>
-            </w:r>
-            <w:proofErr w:type="spellEnd"/>
-            <w:r>
-              <w:rPr>
-                <w:rFonts w:ascii="Arial" w:eastAsia="Arial" w:hAnsi="Arial" w:cs="Arial"/>
-                <w:color w:val="000000"/>
-                <w:sz w:val="21"/>
-                <w:szCs w:val="21"/>
-              </w:rPr>
-              <w:t xml:space="preserve">, </w:t>
-            </w:r>
-            <w:r>
-              <w:rPr>
-                <w:rFonts w:ascii="Arial" w:eastAsia="Arial" w:hAnsi="Arial" w:cs="Arial"/>
-                <w:color w:val="000000"/>
-                <w:sz w:val="21"/>
-                <w:szCs w:val="21"/>
-              </w:rPr>
-              <w:t xml:space="preserve">quyết định </w:t>
-            </w:r>
-            <w:proofErr w:type="spellStart"/>
-            <w:r>
-              <w:rPr>
-                <w:rFonts w:ascii="Arial" w:eastAsia="Arial" w:hAnsi="Arial" w:cs="Arial"/>
-                <w:color w:val="000000"/>
-                <w:sz w:val="21"/>
-                <w:szCs w:val="21"/>
-              </w:rPr>
-              <w:t>định</w:t>
-            </w:r>
-            <w:proofErr w:type="spellEnd"/>
-            <w:r>
-              <w:rPr>
-                <w:rFonts w:ascii="Arial" w:eastAsia="Arial" w:hAnsi="Arial" w:cs="Arial"/>
-                <w:color w:val="000000"/>
-                <w:sz w:val="21"/>
-                <w:szCs w:val="21"/>
-              </w:rPr>
-              <w:t xml:space="preserve"> hướng sản phẩm</w:t>
+              <w:t xml:space="preserve">Đại diện khách hàng, quản lý Product Backlog, </w:t>
+            </w:r>
+            <w:r>
+              <w:rPr>
+                <w:rFonts w:ascii="Arial" w:eastAsia="Arial" w:hAnsi="Arial" w:cs="Arial"/>
+                <w:color w:val="000000"/>
+                <w:sz w:val="21"/>
+                <w:szCs w:val="21"/>
+              </w:rPr>
+              <w:t>quyết định định hướng sản phẩm</w:t>
             </w:r>
           </w:p>
         </w:tc>
@@ -1343,37 +1108,15 @@
             <w:vAlign w:val="center"/>
           </w:tcPr>
           <w:p>
-            <w:proofErr w:type="spellStart"/>
-            <w:r>
-              <w:rPr>
-                <w:rFonts w:ascii="Arial" w:eastAsia="Arial" w:hAnsi="Arial" w:cs="Arial"/>
-                <w:color w:val="000000"/>
-                <w:sz w:val="21"/>
-                <w:szCs w:val="21"/>
-              </w:rPr>
-              <w:t>Scrum</w:t>
-            </w:r>
-            <w:proofErr w:type="spellEnd"/>
-            <w:r>
-              <w:rPr>
-                <w:rFonts w:ascii="Arial" w:eastAsia="Arial" w:hAnsi="Arial" w:cs="Arial"/>
-                <w:color w:val="000000"/>
-                <w:sz w:val="21"/>
-                <w:szCs w:val="21"/>
-              </w:rPr>
-              <w:t xml:space="preserve"> </w:t>
-            </w:r>
-            <w:proofErr w:type="spellStart"/>
-            <w:r>
-              <w:rPr>
-                <w:rFonts w:ascii="Arial" w:eastAsia="Arial" w:hAnsi="Arial" w:cs="Arial"/>
-                <w:color w:val="000000"/>
-                <w:sz w:val="21"/>
-                <w:szCs w:val="21"/>
-              </w:rPr>
-              <w:t>Master</w:t>
-            </w:r>
-            <w:proofErr w:type="spellEnd"/>
+            <w:r>
+              <w:rPr>
+                <w:rFonts w:ascii="Arial" w:eastAsia="Arial" w:hAnsi="Arial" w:cs="Arial"/>
+                <w:color w:val="000000"/>
+                <w:sz w:val="21"/>
+                <w:szCs w:val="21"/>
+              </w:rPr>
+              <w:t>Scrum Master</w:t>
+            </w:r>
           </w:p>
         </w:tc>
         <w:tc>
@@ -1402,27 +1145,7 @@
                 <w:sz w:val="21"/>
                 <w:szCs w:val="21"/>
               </w:rPr>
-              <w:t xml:space="preserve">Hỗ trợ nhóm tuân thủ </w:t>
-            </w:r>
-            <w:proofErr w:type="spellStart"/>
-            <w:r>
-              <w:rPr>
-                <w:rFonts w:ascii="Arial" w:eastAsia="Arial" w:hAnsi="Arial" w:cs="Arial"/>
-                <w:color w:val="000000"/>
-                <w:sz w:val="21"/>
-                <w:szCs w:val="21"/>
-              </w:rPr>
-              <w:t>Scrum</w:t>
-            </w:r>
-            <w:proofErr w:type="spellEnd"/>
-            <w:r>
-              <w:rPr>
-                <w:rFonts w:ascii="Arial" w:eastAsia="Arial" w:hAnsi="Arial" w:cs="Arial"/>
-                <w:color w:val="000000"/>
-                <w:sz w:val="21"/>
-                <w:szCs w:val="21"/>
-              </w:rPr>
-              <w:t>, loại bỏ trở ngại, tổ chức các buổi họp</w:t>
+              <w:t>Hỗ trợ nhóm tuân thủ Scrum, loại bỏ trở ngại, tổ chức các buổi họp</w:t>
             </w:r>
           </w:p>
         </w:tc>
@@ -1507,7 +1230,6 @@
             <w:vAlign w:val="center"/>
           </w:tcPr>
           <w:p>
-            <w:proofErr w:type="spellStart"/>
             <w:r>
               <w:rPr>
                 <w:rFonts w:ascii="Arial" w:eastAsia="Arial" w:hAnsi="Arial" w:cs="Arial"/>
@@ -1517,7 +1239,6 @@
               </w:rPr>
               <w:t>Developer</w:t>
             </w:r>
-            <w:proofErr w:type="spellEnd"/>
           </w:p>
         </w:tc>
         <w:tc>
@@ -1640,7 +1361,6 @@
             <w:vAlign w:val="center"/>
           </w:tcPr>
           <w:p>
-            <w:proofErr w:type="spellStart"/>
             <w:r>
               <w:rPr>
                 <w:rFonts w:ascii="Arial" w:eastAsia="Arial" w:hAnsi="Arial" w:cs="Arial"/>
@@ -1650,7 +1370,6 @@
               </w:rPr>
               <w:t>Developer</w:t>
             </w:r>
-            <w:proofErr w:type="spellEnd"/>
           </w:p>
         </w:tc>
         <w:tc>
@@ -1781,7 +1500,6 @@
                 <w:szCs w:val="21"/>
               </w:rPr>
             </w:pPr>
-            <w:proofErr w:type="spellStart"/>
             <w:r>
               <w:rPr>
                 <w:rFonts w:ascii="Arial" w:eastAsia="Arial" w:hAnsi="Arial" w:cs="Arial"/>
@@ -1791,7 +1509,6 @@
               </w:rPr>
               <w:t>Developer</w:t>
             </w:r>
-            <w:proofErr w:type="spellEnd"/>
           </w:p>
         </w:tc>
         <w:tc>
@@ -2142,19 +1859,8 @@
                 <w:sz w:val="21"/>
                 <w:szCs w:val="21"/>
               </w:rPr>
-              <w:t xml:space="preserve">Ban quản trị chung cư </w:t>
-            </w:r>
-            <w:proofErr w:type="spellStart"/>
-            <w:r>
-              <w:rPr>
-                <w:rFonts w:ascii="Arial" w:eastAsia="Arial" w:hAnsi="Arial" w:cs="Arial"/>
-                <w:color w:val="000000"/>
-                <w:sz w:val="21"/>
-                <w:szCs w:val="21"/>
-              </w:rPr>
-              <w:t>BlueMoon</w:t>
-            </w:r>
-            <w:proofErr w:type="spellEnd"/>
+              <w:t>Ban quản trị chung cư BlueMoon</w:t>
+            </w:r>
           </w:p>
         </w:tc>
         <w:tc>
@@ -2275,19 +1981,8 @@
                 <w:sz w:val="21"/>
                 <w:szCs w:val="21"/>
               </w:rPr>
-              <w:t xml:space="preserve">Kế toán ban quản trị </w:t>
-            </w:r>
-            <w:proofErr w:type="spellStart"/>
-            <w:r>
-              <w:rPr>
-                <w:rFonts w:ascii="Arial" w:eastAsia="Arial" w:hAnsi="Arial" w:cs="Arial"/>
-                <w:color w:val="000000"/>
-                <w:sz w:val="21"/>
-                <w:szCs w:val="21"/>
-              </w:rPr>
-              <w:t>BlueMoon</w:t>
-            </w:r>
-            <w:proofErr w:type="spellEnd"/>
+              <w:t>Kế toán ban quản trị BlueMoon</w:t>
+            </w:r>
           </w:p>
         </w:tc>
         <w:tc>
@@ -2495,43 +2190,7 @@
           <w:sz w:val="22"/>
           <w:szCs w:val="22"/>
         </w:rPr>
-        <w:t xml:space="preserve">Ban quản trị chung cư </w:t>
-      </w:r>
-      <w:proofErr w:type="spellStart"/>
-      <w:r>
-        <w:rPr>
-          <w:rFonts w:ascii="Arial" w:eastAsia="Arial" w:hAnsi="Arial" w:cs="Arial"/>
-          <w:sz w:val="22"/>
-          <w:szCs w:val="22"/>
-        </w:rPr>
-        <w:t>BlueMoon</w:t>
-      </w:r>
-      <w:proofErr w:type="spellEnd"/>
-      <w:r>
-        <w:rPr>
-          <w:rFonts w:ascii="Arial" w:eastAsia="Arial" w:hAnsi="Arial" w:cs="Arial"/>
-          <w:sz w:val="22"/>
-          <w:szCs w:val="22"/>
-        </w:rPr>
-        <w:t xml:space="preserve"> (30 tầng, hơn 400 căn hộ) hiện đang quản lý việc thu phí hoàn toàn thủ công bằng Excel. Quy trình này gây ra nhiều điểm nghẽn nghiêm trọng: dữ liệu dễ sai sót khi nhập tay, thiếu cơ chế tính toán tự động, không lưu vết lịch sử chỉnh sửa, và khó đối soát tài chính. Ban quản trị có nhu cầu cấp thiết xây dựng phần mềm để số </w:t>
-      </w:r>
-      <w:proofErr w:type="spellStart"/>
-      <w:r>
-        <w:rPr>
-          <w:rFonts w:ascii="Arial" w:eastAsia="Arial" w:hAnsi="Arial" w:cs="Arial"/>
-          <w:sz w:val="22"/>
-          <w:szCs w:val="22"/>
-        </w:rPr>
-        <w:t>hoá</w:t>
-      </w:r>
-      <w:proofErr w:type="spellEnd"/>
-      <w:r>
-        <w:rPr>
-          <w:rFonts w:ascii="Arial" w:eastAsia="Arial" w:hAnsi="Arial" w:cs="Arial"/>
-          <w:sz w:val="22"/>
-          <w:szCs w:val="22"/>
-        </w:rPr>
-        <w:t xml:space="preserve"> toàn bộ quy trình này.</w:t>
+        <w:t>Ban quản trị chung cư BlueMoon (30 tầng, hơn 400 căn hộ) hiện đang quản lý việc thu phí hoàn toàn thủ công bằng Excel. Quy trình này gây ra nhiều điểm nghẽn nghiêm trọng: dữ liệu dễ sai sót khi nhập tay, thiếu cơ chế tính toán tự động, không lưu vết lịch sử chỉnh sửa, và khó đối soát tài chính. Ban quản trị có nhu cầu cấp thiết xây dựng phần mềm để số hoá toàn bộ quy trình này.</w:t>
       </w:r>
     </w:p>
     <w:p>
@@ -2565,25 +2224,7 @@
           <w:sz w:val="22"/>
           <w:szCs w:val="22"/>
         </w:rPr>
-        <w:t xml:space="preserve">Xây dựng phần mềm hỗ trợ ban quản trị chung cư </w:t>
-      </w:r>
-      <w:proofErr w:type="spellStart"/>
-      <w:r>
-        <w:rPr>
-          <w:rFonts w:ascii="Arial" w:eastAsia="Arial" w:hAnsi="Arial" w:cs="Arial"/>
-          <w:sz w:val="22"/>
-          <w:szCs w:val="22"/>
-        </w:rPr>
-        <w:t>BlueMoon</w:t>
-      </w:r>
-      <w:proofErr w:type="spellEnd"/>
-      <w:r>
-        <w:rPr>
-          <w:rFonts w:ascii="Arial" w:eastAsia="Arial" w:hAnsi="Arial" w:cs="Arial"/>
-          <w:sz w:val="22"/>
-          <w:szCs w:val="22"/>
-        </w:rPr>
-        <w:t xml:space="preserve"> quản lý thông tin về các loại phí (phí dịch vụ, phí quản lý vận hành, khoản đóng góp tự nguyện, phí gửi xe), quản lý thông tin hộ gia đình (hộ khẩu) và nhân khẩu đang sinh sống tại chung cư, thay thế hoàn toàn quy trình Excel thủ công hiện tại.</w:t>
+        <w:t>Xây dựng phần mềm hỗ trợ ban quản trị chung cư BlueMoon quản lý thông tin về các loại phí (phí dịch vụ, phí quản lý vận hành, khoản đóng góp tự nguyện, phí gửi xe), quản lý thông tin hộ gia đình (hộ khẩu) và nhân khẩu đang sinh sống tại chung cư, thay thế hoàn toàn quy trình Excel thủ công hiện tại.</w:t>
       </w:r>
     </w:p>
     <w:p>
@@ -2622,25 +2263,7 @@
           <w:sz w:val="22"/>
           <w:szCs w:val="22"/>
         </w:rPr>
-        <w:t xml:space="preserve">Quản lý được 100% các loại phí cần thu tại chung cư </w:t>
-      </w:r>
-      <w:proofErr w:type="spellStart"/>
-      <w:r>
-        <w:rPr>
-          <w:rFonts w:ascii="Arial" w:eastAsia="Arial" w:hAnsi="Arial" w:cs="Arial"/>
-          <w:sz w:val="22"/>
-          <w:szCs w:val="22"/>
-        </w:rPr>
-        <w:t>BlueMoon</w:t>
-      </w:r>
-      <w:proofErr w:type="spellEnd"/>
-      <w:r>
-        <w:rPr>
-          <w:rFonts w:ascii="Arial" w:eastAsia="Arial" w:hAnsi="Arial" w:cs="Arial"/>
-          <w:sz w:val="22"/>
-          <w:szCs w:val="22"/>
-        </w:rPr>
-        <w:t>.</w:t>
+        <w:t>Quản lý được 100% các loại phí cần thu tại chung cư BlueMoon.</w:t>
       </w:r>
     </w:p>
     <w:p>
@@ -2748,36 +2371,8 @@
           <w:sz w:val="22"/>
           <w:szCs w:val="22"/>
         </w:rPr>
-        <w:t xml:space="preserve">Mã nguồn và gói triển khai ứng dụng </w:t>
+        <w:t>Mã nguồn và gói triển khai ứng dụng Web BlueMoon</w:t>
       </w:r>
-      <w:proofErr w:type="spellStart"/>
-      <w:r>
-        <w:rPr>
-          <w:rFonts w:ascii="Arial" w:eastAsia="Arial" w:hAnsi="Arial" w:cs="Arial"/>
-          <w:sz w:val="22"/>
-          <w:szCs w:val="22"/>
-        </w:rPr>
-        <w:t>Web</w:t>
-      </w:r>
-      <w:proofErr w:type="spellEnd"/>
-      <w:r>
-        <w:rPr>
-          <w:rFonts w:ascii="Arial" w:eastAsia="Arial" w:hAnsi="Arial" w:cs="Arial"/>
-          <w:sz w:val="22"/>
-          <w:szCs w:val="22"/>
-        </w:rPr>
-        <w:t xml:space="preserve"> </w:t>
-      </w:r>
-      <w:proofErr w:type="spellStart"/>
-      <w:r>
-        <w:rPr>
-          <w:rFonts w:ascii="Arial" w:eastAsia="Arial" w:hAnsi="Arial" w:cs="Arial"/>
-          <w:sz w:val="22"/>
-          <w:szCs w:val="22"/>
-        </w:rPr>
-        <w:t>BlueMoon</w:t>
-      </w:r>
-      <w:proofErr w:type="spellEnd"/>
     </w:p>
     <w:p>
       <w:pPr>
@@ -2847,77 +2442,13 @@
         </w:rPr>
         <w:t>Mã nguồn phần mềm (</w:t>
       </w:r>
-      <w:proofErr w:type="spellStart"/>
       <w:r>
         <w:rPr>
           <w:rFonts w:ascii="Arial" w:eastAsia="Arial" w:hAnsi="Arial" w:cs="Arial"/>
           <w:sz w:val="22"/>
           <w:szCs w:val="22"/>
         </w:rPr>
-        <w:t>Spring</w:t>
-      </w:r>
-      <w:proofErr w:type="spellEnd"/>
-      <w:r>
-        <w:rPr>
-          <w:rFonts w:ascii="Arial" w:eastAsia="Arial" w:hAnsi="Arial" w:cs="Arial"/>
-          <w:sz w:val="22"/>
-          <w:szCs w:val="22"/>
-        </w:rPr>
-        <w:t xml:space="preserve"> </w:t>
-      </w:r>
-      <w:proofErr w:type="spellStart"/>
-      <w:r>
-        <w:rPr>
-          <w:rFonts w:ascii="Arial" w:eastAsia="Arial" w:hAnsi="Arial" w:cs="Arial"/>
-          <w:sz w:val="22"/>
-          <w:szCs w:val="22"/>
-        </w:rPr>
-        <w:t>Boot</w:t>
-      </w:r>
-      <w:proofErr w:type="spellEnd"/>
-      <w:r>
-        <w:rPr>
-          <w:rFonts w:ascii="Arial" w:eastAsia="Arial" w:hAnsi="Arial" w:cs="Arial"/>
-          <w:sz w:val="22"/>
-          <w:szCs w:val="22"/>
-        </w:rPr>
-        <w:t xml:space="preserve"> + </w:t>
-      </w:r>
-      <w:proofErr w:type="spellStart"/>
-      <w:r>
-        <w:rPr>
-          <w:rFonts w:ascii="Arial" w:eastAsia="Arial" w:hAnsi="Arial" w:cs="Arial"/>
-          <w:sz w:val="22"/>
-          <w:szCs w:val="22"/>
-        </w:rPr>
-        <w:t>Thymeleaf</w:t>
-      </w:r>
-      <w:proofErr w:type="spellEnd"/>
-      <w:r>
-        <w:rPr>
-          <w:rFonts w:ascii="Arial" w:eastAsia="Arial" w:hAnsi="Arial" w:cs="Arial"/>
-          <w:sz w:val="22"/>
-          <w:szCs w:val="22"/>
-        </w:rPr>
-        <w:t xml:space="preserve"> + </w:t>
-      </w:r>
-      <w:proofErr w:type="spellStart"/>
-      <w:r>
-        <w:rPr>
-          <w:rFonts w:ascii="Arial" w:eastAsia="Arial" w:hAnsi="Arial" w:cs="Arial"/>
-          <w:sz w:val="22"/>
-          <w:szCs w:val="22"/>
-        </w:rPr>
-        <w:t>MySQL</w:t>
-      </w:r>
-      <w:proofErr w:type="spellEnd"/>
-      <w:r>
-        <w:rPr>
-          <w:rFonts w:ascii="Arial" w:eastAsia="Arial" w:hAnsi="Arial" w:cs="Arial"/>
-          <w:sz w:val="22"/>
-          <w:szCs w:val="22"/>
-        </w:rPr>
-        <w:t xml:space="preserve"> + </w:t>
+        <w:t xml:space="preserve">Spring Boot + Thymeleaf + MySQL + </w:t>
       </w:r>
       <w:r>
         <w:rPr>
@@ -2943,18 +2474,8 @@
           <w:sz w:val="22"/>
           <w:szCs w:val="22"/>
         </w:rPr>
-        <w:t xml:space="preserve">Tài liệu kỹ thuật: SRS, tài liệu phân tích thiết kế, tài liệu kiểm thử, API </w:t>
+        <w:t>Tài liệu kỹ thuật: SRS, tài liệu phân tích thiết kế, tài liệu kiểm thử, API docs</w:t>
       </w:r>
-      <w:proofErr w:type="spellStart"/>
-      <w:r>
-        <w:rPr>
-          <w:rFonts w:ascii="Arial" w:eastAsia="Arial" w:hAnsi="Arial" w:cs="Arial"/>
-          <w:sz w:val="22"/>
-          <w:szCs w:val="22"/>
-        </w:rPr>
-        <w:t>docs</w:t>
-      </w:r>
-      <w:proofErr w:type="spellEnd"/>
     </w:p>
     <w:p>
       <w:pPr>
@@ -2971,43 +2492,7 @@
           <w:sz w:val="22"/>
           <w:szCs w:val="22"/>
         </w:rPr>
-        <w:t xml:space="preserve">Tài liệu dự án: Project </w:t>
-      </w:r>
-      <w:proofErr w:type="spellStart"/>
-      <w:r>
-        <w:rPr>
-          <w:rFonts w:ascii="Arial" w:eastAsia="Arial" w:hAnsi="Arial" w:cs="Arial"/>
-          <w:sz w:val="22"/>
-          <w:szCs w:val="22"/>
-        </w:rPr>
-        <w:t>Charter</w:t>
-      </w:r>
-      <w:proofErr w:type="spellEnd"/>
-      <w:r>
-        <w:rPr>
-          <w:rFonts w:ascii="Arial" w:eastAsia="Arial" w:hAnsi="Arial" w:cs="Arial"/>
-          <w:sz w:val="22"/>
-          <w:szCs w:val="22"/>
-        </w:rPr>
-        <w:t xml:space="preserve">, Kế hoạch </w:t>
-      </w:r>
-      <w:proofErr w:type="spellStart"/>
-      <w:r>
-        <w:rPr>
-          <w:rFonts w:ascii="Arial" w:eastAsia="Arial" w:hAnsi="Arial" w:cs="Arial"/>
-          <w:sz w:val="22"/>
-          <w:szCs w:val="22"/>
-        </w:rPr>
-        <w:t>Scrum</w:t>
-      </w:r>
-      <w:proofErr w:type="spellEnd"/>
-      <w:r>
-        <w:rPr>
-          <w:rFonts w:ascii="Arial" w:eastAsia="Arial" w:hAnsi="Arial" w:cs="Arial"/>
-          <w:sz w:val="22"/>
-          <w:szCs w:val="22"/>
-        </w:rPr>
-        <w:t>, Quản lý rủi ro</w:t>
+        <w:t>Tài liệu dự án: Project Charter, Kế hoạch Scrum, Quản lý rủi ro</w:t>
       </w:r>
     </w:p>
     <w:p>
@@ -3084,9 +2569,29 @@
                 <w:sz w:val="21"/>
                 <w:szCs w:val="21"/>
               </w:rPr>
-              <w:t xml:space="preserve">Bao gồm (In </w:t>
-            </w:r>
-            <w:proofErr w:type="spellStart"/>
+              <w:t>Bao gồm (In Scope)</w:t>
+            </w:r>
+          </w:p>
+        </w:tc>
+        <w:tc>
+          <w:tcPr>
+            <w:tcW w:w="4873" w:type="dxa"/>
+            <w:tcBorders>
+              <w:top w:val="single" w:sz="4" w:space="0" w:color="AAAAAA"/>
+              <w:left w:val="single" w:sz="4" w:space="0" w:color="AAAAAA"/>
+              <w:bottom w:val="single" w:sz="4" w:space="0" w:color="AAAAAA"/>
+              <w:right w:val="single" w:sz="4" w:space="0" w:color="AAAAAA"/>
+            </w:tcBorders>
+            <w:shd w:val="clear" w:color="auto" w:fill="2E75B6"/>
+            <w:tcMar>
+              <w:top w:w="80" w:type="dxa"/>
+              <w:left w:w="140" w:type="dxa"/>
+              <w:bottom w:w="80" w:type="dxa"/>
+              <w:right w:w="140" w:type="dxa"/>
+            </w:tcMar>
+            <w:vAlign w:val="center"/>
+          </w:tcPr>
+          <w:p>
             <w:r>
               <w:rPr>
                 <w:rFonts w:ascii="Arial" w:eastAsia="Arial" w:hAnsi="Arial" w:cs="Arial"/>
@@ -3096,123 +2601,7 @@
                 <w:sz w:val="21"/>
                 <w:szCs w:val="21"/>
               </w:rPr>
-              <w:t>Scope</w:t>
-            </w:r>
-            <w:proofErr w:type="spellEnd"/>
-            <w:r>
-              <w:rPr>
-                <w:rFonts w:ascii="Arial" w:eastAsia="Arial" w:hAnsi="Arial" w:cs="Arial"/>
-                <w:b/>
-                <w:bCs/>
-                <w:color w:val="FFFFFF"/>
-                <w:sz w:val="21"/>
-                <w:szCs w:val="21"/>
-              </w:rPr>
-              <w:t>)</w:t>
-            </w:r>
-          </w:p>
-        </w:tc>
-        <w:tc>
-          <w:tcPr>
-            <w:tcW w:w="4873" w:type="dxa"/>
-            <w:tcBorders>
-              <w:top w:val="single" w:sz="4" w:space="0" w:color="AAAAAA"/>
-              <w:left w:val="single" w:sz="4" w:space="0" w:color="AAAAAA"/>
-              <w:bottom w:val="single" w:sz="4" w:space="0" w:color="AAAAAA"/>
-              <w:right w:val="single" w:sz="4" w:space="0" w:color="AAAAAA"/>
-            </w:tcBorders>
-            <w:shd w:val="clear" w:color="auto" w:fill="2E75B6"/>
-            <w:tcMar>
-              <w:top w:w="80" w:type="dxa"/>
-              <w:left w:w="140" w:type="dxa"/>
-              <w:bottom w:w="80" w:type="dxa"/>
-              <w:right w:w="140" w:type="dxa"/>
-            </w:tcMar>
-            <w:vAlign w:val="center"/>
-          </w:tcPr>
-          <w:p>
-            <w:r>
-              <w:rPr>
-                <w:rFonts w:ascii="Arial" w:eastAsia="Arial" w:hAnsi="Arial" w:cs="Arial"/>
-                <w:b/>
-                <w:bCs/>
-                <w:color w:val="FFFFFF"/>
-                <w:sz w:val="21"/>
-                <w:szCs w:val="21"/>
-              </w:rPr>
-              <w:t>Không bao gồm (</w:t>
-            </w:r>
-            <w:proofErr w:type="spellStart"/>
-            <w:r>
-              <w:rPr>
-                <w:rFonts w:ascii="Arial" w:eastAsia="Arial" w:hAnsi="Arial" w:cs="Arial"/>
-                <w:b/>
-                <w:bCs/>
-                <w:color w:val="FFFFFF"/>
-                <w:sz w:val="21"/>
-                <w:szCs w:val="21"/>
-              </w:rPr>
-              <w:t>Out</w:t>
-            </w:r>
-            <w:proofErr w:type="spellEnd"/>
-            <w:r>
-              <w:rPr>
-                <w:rFonts w:ascii="Arial" w:eastAsia="Arial" w:hAnsi="Arial" w:cs="Arial"/>
-                <w:b/>
-                <w:bCs/>
-                <w:color w:val="FFFFFF"/>
-                <w:sz w:val="21"/>
-                <w:szCs w:val="21"/>
-              </w:rPr>
-              <w:t xml:space="preserve"> </w:t>
-            </w:r>
-            <w:proofErr w:type="spellStart"/>
-            <w:r>
-              <w:rPr>
-                <w:rFonts w:ascii="Arial" w:eastAsia="Arial" w:hAnsi="Arial" w:cs="Arial"/>
-                <w:b/>
-                <w:bCs/>
-                <w:color w:val="FFFFFF"/>
-                <w:sz w:val="21"/>
-                <w:szCs w:val="21"/>
-              </w:rPr>
-              <w:t>of</w:t>
-            </w:r>
-            <w:proofErr w:type="spellEnd"/>
-            <w:r>
-              <w:rPr>
-                <w:rFonts w:ascii="Arial" w:eastAsia="Arial" w:hAnsi="Arial" w:cs="Arial"/>
-                <w:b/>
-                <w:bCs/>
-                <w:color w:val="FFFFFF"/>
-                <w:sz w:val="21"/>
-                <w:szCs w:val="21"/>
-              </w:rPr>
-              <w:t xml:space="preserve"> </w:t>
-            </w:r>
-            <w:proofErr w:type="spellStart"/>
-            <w:r>
-              <w:rPr>
-                <w:rFonts w:ascii="Arial" w:eastAsia="Arial" w:hAnsi="Arial" w:cs="Arial"/>
-                <w:b/>
-                <w:bCs/>
-                <w:color w:val="FFFFFF"/>
-                <w:sz w:val="21"/>
-                <w:szCs w:val="21"/>
-              </w:rPr>
-              <w:t>Scope</w:t>
-            </w:r>
-            <w:proofErr w:type="spellEnd"/>
-            <w:r>
-              <w:rPr>
-                <w:rFonts w:ascii="Arial" w:eastAsia="Arial" w:hAnsi="Arial" w:cs="Arial"/>
-                <w:b/>
-                <w:bCs/>
-                <w:color w:val="FFFFFF"/>
-                <w:sz w:val="21"/>
-                <w:szCs w:val="21"/>
-              </w:rPr>
-              <w:t>)</w:t>
+              <w:t>Không bao gồm (Out of Scope)</w:t>
             </w:r>
           </w:p>
         </w:tc>
@@ -3277,23 +2666,13 @@
                 <w:numId w:val="2"/>
               </w:numPr>
             </w:pPr>
-            <w:proofErr w:type="spellStart"/>
-            <w:r>
-              <w:rPr>
-                <w:rFonts w:ascii="Arial" w:eastAsia="Arial" w:hAnsi="Arial" w:cs="Arial"/>
-                <w:sz w:val="21"/>
-                <w:szCs w:val="21"/>
-              </w:rPr>
-              <w:t>Module</w:t>
-            </w:r>
-            <w:proofErr w:type="spellEnd"/>
-            <w:r>
-              <w:rPr>
-                <w:rFonts w:ascii="Arial" w:eastAsia="Arial" w:hAnsi="Arial" w:cs="Arial"/>
-                <w:sz w:val="21"/>
-                <w:szCs w:val="21"/>
-              </w:rPr>
-              <w:t xml:space="preserve"> quản lý thu phí (v1.0 + phí gửi xe)</w:t>
+            <w:r>
+              <w:rPr>
+                <w:rFonts w:ascii="Arial" w:eastAsia="Arial" w:hAnsi="Arial" w:cs="Arial"/>
+                <w:sz w:val="21"/>
+                <w:szCs w:val="21"/>
+              </w:rPr>
+              <w:t>Module quản lý thu phí (v1.0 + phí gửi xe)</w:t>
             </w:r>
           </w:p>
           <w:p>
@@ -3304,23 +2683,13 @@
                 <w:numId w:val="2"/>
               </w:numPr>
             </w:pPr>
-            <w:proofErr w:type="spellStart"/>
-            <w:r>
-              <w:rPr>
-                <w:rFonts w:ascii="Arial" w:eastAsia="Arial" w:hAnsi="Arial" w:cs="Arial"/>
-                <w:sz w:val="21"/>
-                <w:szCs w:val="21"/>
-              </w:rPr>
-              <w:t>Module</w:t>
-            </w:r>
-            <w:proofErr w:type="spellEnd"/>
-            <w:r>
-              <w:rPr>
-                <w:rFonts w:ascii="Arial" w:eastAsia="Arial" w:hAnsi="Arial" w:cs="Arial"/>
-                <w:sz w:val="21"/>
-                <w:szCs w:val="21"/>
-              </w:rPr>
-              <w:t xml:space="preserve"> quản lý người dùng &amp; phân quyền</w:t>
+            <w:r>
+              <w:rPr>
+                <w:rFonts w:ascii="Arial" w:eastAsia="Arial" w:hAnsi="Arial" w:cs="Arial"/>
+                <w:sz w:val="21"/>
+                <w:szCs w:val="21"/>
+              </w:rPr>
+              <w:t>Module quản lý người dùng &amp; phân quyền</w:t>
             </w:r>
           </w:p>
           <w:p>
@@ -3331,23 +2700,13 @@
                 <w:numId w:val="2"/>
               </w:numPr>
             </w:pPr>
-            <w:proofErr w:type="spellStart"/>
-            <w:r>
-              <w:rPr>
-                <w:rFonts w:ascii="Arial" w:eastAsia="Arial" w:hAnsi="Arial" w:cs="Arial"/>
-                <w:sz w:val="21"/>
-                <w:szCs w:val="21"/>
-              </w:rPr>
-              <w:t>Module</w:t>
-            </w:r>
-            <w:proofErr w:type="spellEnd"/>
-            <w:r>
-              <w:rPr>
-                <w:rFonts w:ascii="Arial" w:eastAsia="Arial" w:hAnsi="Arial" w:cs="Arial"/>
-                <w:sz w:val="21"/>
-                <w:szCs w:val="21"/>
-              </w:rPr>
-              <w:t xml:space="preserve"> quản lý hộ gia đình &amp; nhân khẩu</w:t>
+            <w:r>
+              <w:rPr>
+                <w:rFonts w:ascii="Arial" w:eastAsia="Arial" w:hAnsi="Arial" w:cs="Arial"/>
+                <w:sz w:val="21"/>
+                <w:szCs w:val="21"/>
+              </w:rPr>
+              <w:t>Module quản lý hộ gia đình &amp; nhân khẩu</w:t>
             </w:r>
           </w:p>
         </w:tc>
@@ -3399,25 +2758,7 @@
                 <w:sz w:val="21"/>
                 <w:szCs w:val="21"/>
               </w:rPr>
-              <w:t xml:space="preserve">Thu hộ điện, nước, </w:t>
-            </w:r>
-            <w:proofErr w:type="spellStart"/>
-            <w:r>
-              <w:rPr>
-                <w:rFonts w:ascii="Arial" w:eastAsia="Arial" w:hAnsi="Arial" w:cs="Arial"/>
-                <w:sz w:val="21"/>
-                <w:szCs w:val="21"/>
-              </w:rPr>
-              <w:t>internet</w:t>
-            </w:r>
-            <w:proofErr w:type="spellEnd"/>
-            <w:r>
-              <w:rPr>
-                <w:rFonts w:ascii="Arial" w:eastAsia="Arial" w:hAnsi="Arial" w:cs="Arial"/>
-                <w:sz w:val="21"/>
-                <w:szCs w:val="21"/>
-              </w:rPr>
-              <w:t xml:space="preserve"> (để v2.0)</w:t>
+              <w:t>Thu hộ điện, nước, internet (để v2.0)</w:t>
             </w:r>
           </w:p>
           <w:p>
@@ -3451,18 +2792,8 @@
                 <w:sz w:val="21"/>
                 <w:szCs w:val="21"/>
               </w:rPr>
-              <w:t xml:space="preserve">Tích hợp hệ thống thanh toán </w:t>
-            </w:r>
-            <w:proofErr w:type="spellStart"/>
-            <w:r>
-              <w:rPr>
-                <w:rFonts w:ascii="Arial" w:eastAsia="Arial" w:hAnsi="Arial" w:cs="Arial"/>
-                <w:sz w:val="21"/>
-                <w:szCs w:val="21"/>
-              </w:rPr>
-              <w:t>online</w:t>
-            </w:r>
-            <w:proofErr w:type="spellEnd"/>
+              <w:t>Tích hợp hệ thống thanh toán online</w:t>
+            </w:r>
           </w:p>
         </w:tc>
       </w:tr>
@@ -3606,27 +2937,7 @@
                 <w:sz w:val="21"/>
                 <w:szCs w:val="21"/>
               </w:rPr>
-              <w:t>Giao diện (</w:t>
-            </w:r>
-            <w:proofErr w:type="spellStart"/>
-            <w:r>
-              <w:rPr>
-                <w:rFonts w:ascii="Arial" w:eastAsia="Arial" w:hAnsi="Arial" w:cs="Arial"/>
-                <w:color w:val="000000"/>
-                <w:sz w:val="21"/>
-                <w:szCs w:val="21"/>
-              </w:rPr>
-              <w:t>Frontend</w:t>
-            </w:r>
-            <w:proofErr w:type="spellEnd"/>
-            <w:r>
-              <w:rPr>
-                <w:rFonts w:ascii="Arial" w:eastAsia="Arial" w:hAnsi="Arial" w:cs="Arial"/>
-                <w:color w:val="000000"/>
-                <w:sz w:val="21"/>
-                <w:szCs w:val="21"/>
-              </w:rPr>
-              <w:t>)</w:t>
+              <w:t>Giao diện (Frontend)</w:t>
             </w:r>
           </w:p>
         </w:tc>
@@ -3649,25 +2960,14 @@
             <w:vAlign w:val="center"/>
           </w:tcPr>
           <w:p>
-            <w:proofErr w:type="spellStart"/>
-            <w:r>
-              <w:rPr>
-                <w:rFonts w:ascii="Arial" w:eastAsia="Arial" w:hAnsi="Arial" w:cs="Arial"/>
-                <w:color w:val="000000"/>
-                <w:sz w:val="21"/>
-                <w:szCs w:val="21"/>
-              </w:rPr>
-              <w:t>Thymeleaf</w:t>
-            </w:r>
-            <w:proofErr w:type="spellEnd"/>
-            <w:r>
-              <w:rPr>
-                <w:rFonts w:ascii="Arial" w:eastAsia="Arial" w:hAnsi="Arial" w:cs="Arial"/>
-                <w:color w:val="000000"/>
-                <w:sz w:val="21"/>
-                <w:szCs w:val="21"/>
-              </w:rPr>
-              <w:t>, HTML, CSS</w:t>
+            <w:r>
+              <w:rPr>
+                <w:rFonts w:ascii="Arial" w:eastAsia="Arial" w:hAnsi="Arial" w:cs="Arial"/>
+                <w:color w:val="000000"/>
+                <w:sz w:val="21"/>
+                <w:szCs w:val="21"/>
+              </w:rPr>
+              <w:t>Thymeleaf, HTML, CSS</w:t>
             </w:r>
           </w:p>
         </w:tc>
@@ -3692,7 +2992,6 @@
             <w:vAlign w:val="center"/>
           </w:tcPr>
           <w:p>
-            <w:proofErr w:type="spellStart"/>
             <w:r>
               <w:rPr>
                 <w:rFonts w:ascii="Arial" w:eastAsia="Arial" w:hAnsi="Arial" w:cs="Arial"/>
@@ -3702,7 +3001,6 @@
               </w:rPr>
               <w:t>Backend</w:t>
             </w:r>
-            <w:proofErr w:type="spellEnd"/>
           </w:p>
         </w:tc>
         <w:tc>
@@ -3724,65 +3022,14 @@
             <w:vAlign w:val="center"/>
           </w:tcPr>
           <w:p>
-            <w:proofErr w:type="spellStart"/>
-            <w:r>
-              <w:rPr>
-                <w:rFonts w:ascii="Arial" w:eastAsia="Arial" w:hAnsi="Arial" w:cs="Arial"/>
-                <w:color w:val="000000"/>
-                <w:sz w:val="21"/>
-                <w:szCs w:val="21"/>
-              </w:rPr>
-              <w:t>Spring</w:t>
-            </w:r>
-            <w:proofErr w:type="spellEnd"/>
-            <w:r>
-              <w:rPr>
-                <w:rFonts w:ascii="Arial" w:eastAsia="Arial" w:hAnsi="Arial" w:cs="Arial"/>
-                <w:color w:val="000000"/>
-                <w:sz w:val="21"/>
-                <w:szCs w:val="21"/>
-              </w:rPr>
-              <w:t xml:space="preserve"> </w:t>
-            </w:r>
-            <w:proofErr w:type="spellStart"/>
-            <w:r>
-              <w:rPr>
-                <w:rFonts w:ascii="Arial" w:eastAsia="Arial" w:hAnsi="Arial" w:cs="Arial"/>
-                <w:color w:val="000000"/>
-                <w:sz w:val="21"/>
-                <w:szCs w:val="21"/>
-              </w:rPr>
-              <w:t>Boot</w:t>
-            </w:r>
-            <w:proofErr w:type="spellEnd"/>
-            <w:r>
-              <w:rPr>
-                <w:rFonts w:ascii="Arial" w:eastAsia="Arial" w:hAnsi="Arial" w:cs="Arial"/>
-                <w:color w:val="000000"/>
-                <w:sz w:val="21"/>
-                <w:szCs w:val="21"/>
-              </w:rPr>
-              <w:t xml:space="preserve"> (</w:t>
-            </w:r>
-            <w:proofErr w:type="spellStart"/>
-            <w:r>
-              <w:rPr>
-                <w:rFonts w:ascii="Arial" w:eastAsia="Arial" w:hAnsi="Arial" w:cs="Arial"/>
-                <w:color w:val="000000"/>
-                <w:sz w:val="21"/>
-                <w:szCs w:val="21"/>
-              </w:rPr>
-              <w:t>Spring</w:t>
-            </w:r>
-            <w:proofErr w:type="spellEnd"/>
-            <w:r>
-              <w:rPr>
-                <w:rFonts w:ascii="Arial" w:eastAsia="Arial" w:hAnsi="Arial" w:cs="Arial"/>
-                <w:color w:val="000000"/>
-                <w:sz w:val="21"/>
-                <w:szCs w:val="21"/>
-              </w:rPr>
-              <w:t xml:space="preserve"> MVC)</w:t>
+            <w:r>
+              <w:rPr>
+                <w:rFonts w:ascii="Arial" w:eastAsia="Arial" w:hAnsi="Arial" w:cs="Arial"/>
+                <w:color w:val="000000"/>
+                <w:sz w:val="21"/>
+                <w:szCs w:val="21"/>
+              </w:rPr>
+              <w:t>Spring Boot (Spring MVC)</w:t>
             </w:r>
           </w:p>
         </w:tc>
@@ -3856,57 +3103,15 @@
                 <w:szCs w:val="21"/>
               </w:rPr>
             </w:pPr>
-            <w:proofErr w:type="spellStart"/>
-            <w:r>
-              <w:rPr>
-                <w:rFonts w:ascii="Arial" w:eastAsia="Arial" w:hAnsi="Arial" w:cs="Arial"/>
-                <w:color w:val="000000"/>
-                <w:sz w:val="21"/>
-                <w:szCs w:val="21"/>
-              </w:rPr>
-              <w:t>Spring</w:t>
-            </w:r>
-            <w:proofErr w:type="spellEnd"/>
-            <w:r>
-              <w:rPr>
-                <w:rFonts w:ascii="Arial" w:eastAsia="Arial" w:hAnsi="Arial" w:cs="Arial"/>
-                <w:color w:val="000000"/>
-                <w:sz w:val="21"/>
-                <w:szCs w:val="21"/>
-              </w:rPr>
-              <w:t xml:space="preserve"> </w:t>
-            </w:r>
-            <w:proofErr w:type="spellStart"/>
-            <w:r>
-              <w:rPr>
-                <w:rFonts w:ascii="Arial" w:eastAsia="Arial" w:hAnsi="Arial" w:cs="Arial"/>
-                <w:color w:val="000000"/>
-                <w:sz w:val="21"/>
-                <w:szCs w:val="21"/>
-              </w:rPr>
-              <w:t>Data</w:t>
-            </w:r>
-            <w:proofErr w:type="spellEnd"/>
-            <w:r>
-              <w:rPr>
-                <w:rFonts w:ascii="Arial" w:eastAsia="Arial" w:hAnsi="Arial" w:cs="Arial"/>
-                <w:color w:val="000000"/>
-                <w:sz w:val="21"/>
-                <w:szCs w:val="21"/>
-              </w:rPr>
-              <w:t xml:space="preserve"> JPA / </w:t>
-            </w:r>
-            <w:proofErr w:type="spellStart"/>
-            <w:r>
-              <w:rPr>
-                <w:rFonts w:ascii="Arial" w:eastAsia="Arial" w:hAnsi="Arial" w:cs="Arial"/>
-                <w:color w:val="000000"/>
-                <w:sz w:val="21"/>
-                <w:szCs w:val="21"/>
-              </w:rPr>
-              <w:t>Hibernate</w:t>
-            </w:r>
-            <w:proofErr w:type="spellEnd"/>
+            <w:r>
+              <w:rPr>
+                <w:rFonts w:ascii="Arial" w:eastAsia="Arial" w:hAnsi="Arial" w:cs="Arial"/>
+                <w:color w:val="000000"/>
+                <w:sz w:val="21"/>
+                <w:szCs w:val="21"/>
+              </w:rPr>
+              <w:t>Spring Data JPA / Hibernate</w:t>
+            </w:r>
           </w:p>
         </w:tc>
       </w:tr>
@@ -3960,7 +3165,6 @@
             <w:vAlign w:val="center"/>
           </w:tcPr>
           <w:p>
-            <w:proofErr w:type="spellStart"/>
             <w:r>
               <w:rPr>
                 <w:rFonts w:ascii="Arial" w:eastAsia="Arial" w:hAnsi="Arial" w:cs="Arial"/>
@@ -3970,7 +3174,6 @@
               </w:rPr>
               <w:t>MySQL</w:t>
             </w:r>
-            <w:proofErr w:type="spellEnd"/>
             <w:r>
               <w:rPr>
                 <w:rFonts w:ascii="Arial" w:eastAsia="Arial" w:hAnsi="Arial" w:cs="Arial"/>
@@ -4033,25 +3236,14 @@
             <w:vAlign w:val="center"/>
           </w:tcPr>
           <w:p>
-            <w:proofErr w:type="spellStart"/>
-            <w:r>
-              <w:rPr>
-                <w:rFonts w:ascii="Arial" w:eastAsia="Arial" w:hAnsi="Arial" w:cs="Arial"/>
-                <w:color w:val="000000"/>
-                <w:sz w:val="21"/>
-                <w:szCs w:val="21"/>
-              </w:rPr>
-              <w:t>Java</w:t>
-            </w:r>
-            <w:proofErr w:type="spellEnd"/>
-            <w:r>
-              <w:rPr>
-                <w:rFonts w:ascii="Arial" w:eastAsia="Arial" w:hAnsi="Arial" w:cs="Arial"/>
-                <w:color w:val="000000"/>
-                <w:sz w:val="21"/>
-                <w:szCs w:val="21"/>
-              </w:rPr>
-              <w:t xml:space="preserve"> (JDK 17+)</w:t>
+            <w:r>
+              <w:rPr>
+                <w:rFonts w:ascii="Arial" w:eastAsia="Arial" w:hAnsi="Arial" w:cs="Arial"/>
+                <w:color w:val="000000"/>
+                <w:sz w:val="21"/>
+                <w:szCs w:val="21"/>
+              </w:rPr>
+              <w:t>Java (JDK 17+)</w:t>
             </w:r>
           </w:p>
         </w:tc>
@@ -4106,25 +3298,14 @@
             <w:vAlign w:val="center"/>
           </w:tcPr>
           <w:p>
-            <w:proofErr w:type="spellStart"/>
-            <w:r>
-              <w:rPr>
-                <w:rFonts w:ascii="Arial" w:eastAsia="Arial" w:hAnsi="Arial" w:cs="Arial"/>
-                <w:color w:val="000000"/>
-                <w:sz w:val="21"/>
-                <w:szCs w:val="21"/>
-              </w:rPr>
-              <w:t>IntelliJ</w:t>
-            </w:r>
-            <w:proofErr w:type="spellEnd"/>
-            <w:r>
-              <w:rPr>
-                <w:rFonts w:ascii="Arial" w:eastAsia="Arial" w:hAnsi="Arial" w:cs="Arial"/>
-                <w:color w:val="000000"/>
-                <w:sz w:val="21"/>
-                <w:szCs w:val="21"/>
-              </w:rPr>
-              <w:t xml:space="preserve"> IDEA</w:t>
+            <w:r>
+              <w:rPr>
+                <w:rFonts w:ascii="Arial" w:eastAsia="Arial" w:hAnsi="Arial" w:cs="Arial"/>
+                <w:color w:val="000000"/>
+                <w:sz w:val="21"/>
+                <w:szCs w:val="21"/>
+              </w:rPr>
+              <w:t>IntelliJ IDEA</w:t>
             </w:r>
           </w:p>
         </w:tc>
@@ -4179,37 +3360,15 @@
             <w:vAlign w:val="center"/>
           </w:tcPr>
           <w:p>
-            <w:proofErr w:type="spellStart"/>
-            <w:r>
-              <w:rPr>
-                <w:rFonts w:ascii="Arial" w:eastAsia="Arial" w:hAnsi="Arial" w:cs="Arial"/>
-                <w:color w:val="000000"/>
-                <w:sz w:val="21"/>
-                <w:szCs w:val="21"/>
-              </w:rPr>
-              <w:t>Git</w:t>
-            </w:r>
-            <w:proofErr w:type="spellEnd"/>
-            <w:r>
-              <w:rPr>
-                <w:rFonts w:ascii="Arial" w:eastAsia="Arial" w:hAnsi="Arial" w:cs="Arial"/>
-                <w:color w:val="000000"/>
-                <w:sz w:val="21"/>
-                <w:szCs w:val="21"/>
-              </w:rPr>
-              <w:t xml:space="preserve"> / </w:t>
-            </w:r>
-            <w:proofErr w:type="spellStart"/>
-            <w:r>
-              <w:rPr>
-                <w:rFonts w:ascii="Arial" w:eastAsia="Arial" w:hAnsi="Arial" w:cs="Arial"/>
-                <w:color w:val="000000"/>
-                <w:sz w:val="21"/>
-                <w:szCs w:val="21"/>
-              </w:rPr>
-              <w:t>GitHub</w:t>
-            </w:r>
-            <w:proofErr w:type="spellEnd"/>
+            <w:r>
+              <w:rPr>
+                <w:rFonts w:ascii="Arial" w:eastAsia="Arial" w:hAnsi="Arial" w:cs="Arial"/>
+                <w:color w:val="000000"/>
+                <w:sz w:val="21"/>
+                <w:szCs w:val="21"/>
+              </w:rPr>
+              <w:t>Git / GitHub</w:t>
+            </w:r>
           </w:p>
         </w:tc>
       </w:tr>
@@ -4263,85 +3422,14 @@
             <w:vAlign w:val="center"/>
           </w:tcPr>
           <w:p>
-            <w:proofErr w:type="spellStart"/>
-            <w:r>
-              <w:rPr>
-                <w:rFonts w:ascii="Arial" w:eastAsia="Arial" w:hAnsi="Arial" w:cs="Arial"/>
-                <w:color w:val="000000"/>
-                <w:sz w:val="21"/>
-                <w:szCs w:val="21"/>
-              </w:rPr>
-              <w:t>Agile</w:t>
-            </w:r>
-            <w:proofErr w:type="spellEnd"/>
-            <w:r>
-              <w:rPr>
-                <w:rFonts w:ascii="Arial" w:eastAsia="Arial" w:hAnsi="Arial" w:cs="Arial"/>
-                <w:color w:val="000000"/>
-                <w:sz w:val="21"/>
-                <w:szCs w:val="21"/>
-              </w:rPr>
-              <w:t xml:space="preserve"> – </w:t>
-            </w:r>
-            <w:proofErr w:type="spellStart"/>
-            <w:r>
-              <w:rPr>
-                <w:rFonts w:ascii="Arial" w:eastAsia="Arial" w:hAnsi="Arial" w:cs="Arial"/>
-                <w:color w:val="000000"/>
-                <w:sz w:val="21"/>
-                <w:szCs w:val="21"/>
-              </w:rPr>
-              <w:t>Scrum</w:t>
-            </w:r>
-            <w:proofErr w:type="spellEnd"/>
-            <w:r>
-              <w:rPr>
-                <w:rFonts w:ascii="Arial" w:eastAsia="Arial" w:hAnsi="Arial" w:cs="Arial"/>
-                <w:color w:val="000000"/>
-                <w:sz w:val="21"/>
-                <w:szCs w:val="21"/>
-              </w:rPr>
-              <w:t xml:space="preserve"> (3 </w:t>
-            </w:r>
-            <w:proofErr w:type="spellStart"/>
-            <w:r>
-              <w:rPr>
-                <w:rFonts w:ascii="Arial" w:eastAsia="Arial" w:hAnsi="Arial" w:cs="Arial"/>
-                <w:color w:val="000000"/>
-                <w:sz w:val="21"/>
-                <w:szCs w:val="21"/>
-              </w:rPr>
-              <w:t>Sprint</w:t>
-            </w:r>
-            <w:proofErr w:type="spellEnd"/>
-            <w:r>
-              <w:rPr>
-                <w:rFonts w:ascii="Arial" w:eastAsia="Arial" w:hAnsi="Arial" w:cs="Arial"/>
-                <w:color w:val="000000"/>
-                <w:sz w:val="21"/>
-                <w:szCs w:val="21"/>
-              </w:rPr>
-              <w:t xml:space="preserve"> + </w:t>
-            </w:r>
-            <w:proofErr w:type="spellStart"/>
-            <w:r>
-              <w:rPr>
-                <w:rFonts w:ascii="Arial" w:eastAsia="Arial" w:hAnsi="Arial" w:cs="Arial"/>
-                <w:color w:val="000000"/>
-                <w:sz w:val="21"/>
-                <w:szCs w:val="21"/>
-              </w:rPr>
-              <w:t>Sprint</w:t>
-            </w:r>
-            <w:proofErr w:type="spellEnd"/>
-            <w:r>
-              <w:rPr>
-                <w:rFonts w:ascii="Arial" w:eastAsia="Arial" w:hAnsi="Arial" w:cs="Arial"/>
-                <w:color w:val="000000"/>
-                <w:sz w:val="21"/>
-                <w:szCs w:val="21"/>
-              </w:rPr>
-              <w:t xml:space="preserve"> 0)</w:t>
+            <w:r>
+              <w:rPr>
+                <w:rFonts w:ascii="Arial" w:eastAsia="Arial" w:hAnsi="Arial" w:cs="Arial"/>
+                <w:color w:val="000000"/>
+                <w:sz w:val="21"/>
+                <w:szCs w:val="21"/>
+              </w:rPr>
+              <w:t>Agile – Scrum (3 Sprint + Sprint 0)</w:t>
             </w:r>
           </w:p>
         </w:tc>
@@ -4447,7 +3535,6 @@
             <w:vAlign w:val="center"/>
           </w:tcPr>
           <w:p>
-            <w:proofErr w:type="spellStart"/>
             <w:r>
               <w:rPr>
                 <w:rFonts w:ascii="Arial" w:eastAsia="Arial" w:hAnsi="Arial" w:cs="Arial"/>
@@ -4459,7 +3546,6 @@
               </w:rPr>
               <w:t>Sprint</w:t>
             </w:r>
-            <w:proofErr w:type="spellEnd"/>
           </w:p>
         </w:tc>
         <w:tc>
@@ -4547,25 +3633,14 @@
             <w:vAlign w:val="center"/>
           </w:tcPr>
           <w:p>
-            <w:proofErr w:type="spellStart"/>
-            <w:r>
-              <w:rPr>
-                <w:rFonts w:ascii="Arial" w:eastAsia="Arial" w:hAnsi="Arial" w:cs="Arial"/>
-                <w:color w:val="000000"/>
-                <w:sz w:val="21"/>
-                <w:szCs w:val="21"/>
-              </w:rPr>
-              <w:t>Sprint</w:t>
-            </w:r>
-            <w:proofErr w:type="spellEnd"/>
-            <w:r>
-              <w:rPr>
-                <w:rFonts w:ascii="Arial" w:eastAsia="Arial" w:hAnsi="Arial" w:cs="Arial"/>
-                <w:color w:val="000000"/>
-                <w:sz w:val="21"/>
-                <w:szCs w:val="21"/>
-              </w:rPr>
-              <w:t xml:space="preserve"> 0</w:t>
+            <w:r>
+              <w:rPr>
+                <w:rFonts w:ascii="Arial" w:eastAsia="Arial" w:hAnsi="Arial" w:cs="Arial"/>
+                <w:color w:val="000000"/>
+                <w:sz w:val="21"/>
+                <w:szCs w:val="21"/>
+              </w:rPr>
+              <w:t>Sprint 0</w:t>
             </w:r>
           </w:p>
         </w:tc>
@@ -4618,65 +3693,14 @@
             <w:vAlign w:val="center"/>
           </w:tcPr>
           <w:p>
-            <w:proofErr w:type="spellStart"/>
-            <w:r>
-              <w:rPr>
-                <w:rFonts w:ascii="Arial" w:eastAsia="Arial" w:hAnsi="Arial" w:cs="Arial"/>
-                <w:color w:val="000000"/>
-                <w:sz w:val="21"/>
-                <w:szCs w:val="21"/>
-              </w:rPr>
-              <w:t>Kick-off</w:t>
-            </w:r>
-            <w:proofErr w:type="spellEnd"/>
-            <w:r>
-              <w:rPr>
-                <w:rFonts w:ascii="Arial" w:eastAsia="Arial" w:hAnsi="Arial" w:cs="Arial"/>
-                <w:color w:val="000000"/>
-                <w:sz w:val="21"/>
-                <w:szCs w:val="21"/>
-              </w:rPr>
-              <w:t xml:space="preserve">, lập </w:t>
-            </w:r>
-            <w:proofErr w:type="spellStart"/>
-            <w:r>
-              <w:rPr>
-                <w:rFonts w:ascii="Arial" w:eastAsia="Arial" w:hAnsi="Arial" w:cs="Arial"/>
-                <w:color w:val="000000"/>
-                <w:sz w:val="21"/>
-                <w:szCs w:val="21"/>
-              </w:rPr>
-              <w:t>Product</w:t>
-            </w:r>
-            <w:proofErr w:type="spellEnd"/>
-            <w:r>
-              <w:rPr>
-                <w:rFonts w:ascii="Arial" w:eastAsia="Arial" w:hAnsi="Arial" w:cs="Arial"/>
-                <w:color w:val="000000"/>
-                <w:sz w:val="21"/>
-                <w:szCs w:val="21"/>
-              </w:rPr>
-              <w:t xml:space="preserve"> </w:t>
-            </w:r>
-            <w:proofErr w:type="spellStart"/>
-            <w:r>
-              <w:rPr>
-                <w:rFonts w:ascii="Arial" w:eastAsia="Arial" w:hAnsi="Arial" w:cs="Arial"/>
-                <w:color w:val="000000"/>
-                <w:sz w:val="21"/>
-                <w:szCs w:val="21"/>
-              </w:rPr>
-              <w:t>Backlog</w:t>
-            </w:r>
-            <w:proofErr w:type="spellEnd"/>
-            <w:r>
-              <w:rPr>
-                <w:rFonts w:ascii="Arial" w:eastAsia="Arial" w:hAnsi="Arial" w:cs="Arial"/>
-                <w:color w:val="000000"/>
-                <w:sz w:val="21"/>
-                <w:szCs w:val="21"/>
-              </w:rPr>
-              <w:t>, thiết lập môi trường phát triển, phân công vai trò</w:t>
+            <w:r>
+              <w:rPr>
+                <w:rFonts w:ascii="Arial" w:eastAsia="Arial" w:hAnsi="Arial" w:cs="Arial"/>
+                <w:color w:val="000000"/>
+                <w:sz w:val="21"/>
+                <w:szCs w:val="21"/>
+              </w:rPr>
+              <w:t>Kick-off, lập Product Backlog, thiết lập môi trường phát triển, phân công vai trò</w:t>
             </w:r>
           </w:p>
         </w:tc>
@@ -4701,25 +3725,14 @@
             <w:vAlign w:val="center"/>
           </w:tcPr>
           <w:p>
-            <w:proofErr w:type="spellStart"/>
-            <w:r>
-              <w:rPr>
-                <w:rFonts w:ascii="Arial" w:eastAsia="Arial" w:hAnsi="Arial" w:cs="Arial"/>
-                <w:color w:val="000000"/>
-                <w:sz w:val="21"/>
-                <w:szCs w:val="21"/>
-              </w:rPr>
-              <w:t>Sprint</w:t>
-            </w:r>
-            <w:proofErr w:type="spellEnd"/>
-            <w:r>
-              <w:rPr>
-                <w:rFonts w:ascii="Arial" w:eastAsia="Arial" w:hAnsi="Arial" w:cs="Arial"/>
-                <w:color w:val="000000"/>
-                <w:sz w:val="21"/>
-                <w:szCs w:val="21"/>
-              </w:rPr>
-              <w:t xml:space="preserve"> 1</w:t>
+            <w:r>
+              <w:rPr>
+                <w:rFonts w:ascii="Arial" w:eastAsia="Arial" w:hAnsi="Arial" w:cs="Arial"/>
+                <w:color w:val="000000"/>
+                <w:sz w:val="21"/>
+                <w:szCs w:val="21"/>
+              </w:rPr>
+              <w:t>Sprint 1</w:t>
             </w:r>
           </w:p>
         </w:tc>
@@ -4804,25 +3817,14 @@
             <w:vAlign w:val="center"/>
           </w:tcPr>
           <w:p>
-            <w:proofErr w:type="spellStart"/>
-            <w:r>
-              <w:rPr>
-                <w:rFonts w:ascii="Arial" w:eastAsia="Arial" w:hAnsi="Arial" w:cs="Arial"/>
-                <w:color w:val="000000"/>
-                <w:sz w:val="21"/>
-                <w:szCs w:val="21"/>
-              </w:rPr>
-              <w:t>Sprint</w:t>
-            </w:r>
-            <w:proofErr w:type="spellEnd"/>
-            <w:r>
-              <w:rPr>
-                <w:rFonts w:ascii="Arial" w:eastAsia="Arial" w:hAnsi="Arial" w:cs="Arial"/>
-                <w:color w:val="000000"/>
-                <w:sz w:val="21"/>
-                <w:szCs w:val="21"/>
-              </w:rPr>
-              <w:t xml:space="preserve"> 2</w:t>
+            <w:r>
+              <w:rPr>
+                <w:rFonts w:ascii="Arial" w:eastAsia="Arial" w:hAnsi="Arial" w:cs="Arial"/>
+                <w:color w:val="000000"/>
+                <w:sz w:val="21"/>
+                <w:szCs w:val="21"/>
+              </w:rPr>
+              <w:t>Sprint 2</w:t>
             </w:r>
           </w:p>
         </w:tc>
@@ -4882,47 +3884,7 @@
                 <w:sz w:val="21"/>
                 <w:szCs w:val="21"/>
               </w:rPr>
-              <w:t xml:space="preserve">Ghi nhận thanh toán (RL-007, 008, 009), quản lý hộ khẩu/nhân khẩu (RL-013, 014, 015), </w:t>
-            </w:r>
-            <w:proofErr w:type="spellStart"/>
-            <w:r>
-              <w:rPr>
-                <w:rFonts w:ascii="Arial" w:eastAsia="Arial" w:hAnsi="Arial" w:cs="Arial"/>
-                <w:color w:val="000000"/>
-                <w:sz w:val="21"/>
-                <w:szCs w:val="21"/>
-              </w:rPr>
-              <w:t>audit</w:t>
-            </w:r>
-            <w:proofErr w:type="spellEnd"/>
-            <w:r>
-              <w:rPr>
-                <w:rFonts w:ascii="Arial" w:eastAsia="Arial" w:hAnsi="Arial" w:cs="Arial"/>
-                <w:color w:val="000000"/>
-                <w:sz w:val="21"/>
-                <w:szCs w:val="21"/>
-              </w:rPr>
-              <w:t xml:space="preserve"> </w:t>
-            </w:r>
-            <w:proofErr w:type="spellStart"/>
-            <w:r>
-              <w:rPr>
-                <w:rFonts w:ascii="Arial" w:eastAsia="Arial" w:hAnsi="Arial" w:cs="Arial"/>
-                <w:color w:val="000000"/>
-                <w:sz w:val="21"/>
-                <w:szCs w:val="21"/>
-              </w:rPr>
-              <w:t>log</w:t>
-            </w:r>
-            <w:proofErr w:type="spellEnd"/>
-            <w:r>
-              <w:rPr>
-                <w:rFonts w:ascii="Arial" w:eastAsia="Arial" w:hAnsi="Arial" w:cs="Arial"/>
-                <w:color w:val="000000"/>
-                <w:sz w:val="21"/>
-                <w:szCs w:val="21"/>
-              </w:rPr>
-              <w:t xml:space="preserve"> (RL-023)</w:t>
+              <w:t>Ghi nhận thanh toán (RL-007, 008, 009), quản lý hộ khẩu/nhân khẩu (RL-013, 014, 015), audit log (RL-023)</w:t>
             </w:r>
           </w:p>
         </w:tc>
@@ -4947,25 +3909,14 @@
             <w:vAlign w:val="center"/>
           </w:tcPr>
           <w:p>
-            <w:proofErr w:type="spellStart"/>
-            <w:r>
-              <w:rPr>
-                <w:rFonts w:ascii="Arial" w:eastAsia="Arial" w:hAnsi="Arial" w:cs="Arial"/>
-                <w:color w:val="000000"/>
-                <w:sz w:val="21"/>
-                <w:szCs w:val="21"/>
-              </w:rPr>
-              <w:t>Sprint</w:t>
-            </w:r>
-            <w:proofErr w:type="spellEnd"/>
-            <w:r>
-              <w:rPr>
-                <w:rFonts w:ascii="Arial" w:eastAsia="Arial" w:hAnsi="Arial" w:cs="Arial"/>
-                <w:color w:val="000000"/>
-                <w:sz w:val="21"/>
-                <w:szCs w:val="21"/>
-              </w:rPr>
-              <w:t xml:space="preserve"> 3</w:t>
+            <w:r>
+              <w:rPr>
+                <w:rFonts w:ascii="Arial" w:eastAsia="Arial" w:hAnsi="Arial" w:cs="Arial"/>
+                <w:color w:val="000000"/>
+                <w:sz w:val="21"/>
+                <w:szCs w:val="21"/>
+              </w:rPr>
+              <w:t>Sprint 3</w:t>
             </w:r>
           </w:p>
         </w:tc>
@@ -5025,47 +3976,7 @@
                 <w:sz w:val="21"/>
                 <w:szCs w:val="21"/>
               </w:rPr>
-              <w:t xml:space="preserve">Thống kê, xuất báo cáo (RL-011, 012), tra cứu nợ (RL-010), phí gửi xe (RL-019), </w:t>
-            </w:r>
-            <w:proofErr w:type="spellStart"/>
-            <w:r>
-              <w:rPr>
-                <w:rFonts w:ascii="Arial" w:eastAsia="Arial" w:hAnsi="Arial" w:cs="Arial"/>
-                <w:color w:val="000000"/>
-                <w:sz w:val="21"/>
-                <w:szCs w:val="21"/>
-              </w:rPr>
-              <w:t>import</w:t>
-            </w:r>
-            <w:proofErr w:type="spellEnd"/>
-            <w:r>
-              <w:rPr>
-                <w:rFonts w:ascii="Arial" w:eastAsia="Arial" w:hAnsi="Arial" w:cs="Arial"/>
-                <w:color w:val="000000"/>
-                <w:sz w:val="21"/>
-                <w:szCs w:val="21"/>
-              </w:rPr>
-              <w:t xml:space="preserve"> Excel (RL-018), </w:t>
-            </w:r>
-            <w:proofErr w:type="spellStart"/>
-            <w:r>
-              <w:rPr>
-                <w:rFonts w:ascii="Arial" w:eastAsia="Arial" w:hAnsi="Arial" w:cs="Arial"/>
-                <w:color w:val="000000"/>
-                <w:sz w:val="21"/>
-                <w:szCs w:val="21"/>
-              </w:rPr>
-              <w:t>refactor</w:t>
-            </w:r>
-            <w:proofErr w:type="spellEnd"/>
-            <w:r>
-              <w:rPr>
-                <w:rFonts w:ascii="Arial" w:eastAsia="Arial" w:hAnsi="Arial" w:cs="Arial"/>
-                <w:color w:val="000000"/>
-                <w:sz w:val="21"/>
-                <w:szCs w:val="21"/>
-              </w:rPr>
-              <w:t xml:space="preserve"> &amp; kiểm thử tổng thể</w:t>
+              <w:t>Thống kê, xuất báo cáo (RL-011, 012), tra cứu nợ (RL-010), phí gửi xe (RL-019), import Excel (RL-018), refactor &amp; kiểm thử tổng thể</w:t>
             </w:r>
           </w:p>
         </w:tc>
@@ -5090,7 +4001,6 @@
             <w:vAlign w:val="center"/>
           </w:tcPr>
           <w:p>
-            <w:proofErr w:type="spellStart"/>
             <w:r>
               <w:rPr>
                 <w:rFonts w:ascii="Arial" w:eastAsia="Arial" w:hAnsi="Arial" w:cs="Arial"/>
@@ -5100,7 +4010,6 @@
               </w:rPr>
               <w:t>Release</w:t>
             </w:r>
-            <w:proofErr w:type="spellEnd"/>
           </w:p>
         </w:tc>
         <w:tc>
@@ -5644,19 +4553,8 @@
                 <w:sz w:val="21"/>
                 <w:szCs w:val="21"/>
               </w:rPr>
-              <w:t xml:space="preserve">2 – </w:t>
-            </w:r>
-            <w:proofErr w:type="spellStart"/>
-            <w:r>
-              <w:rPr>
-                <w:rFonts w:ascii="Arial" w:eastAsia="Arial" w:hAnsi="Arial" w:cs="Arial"/>
-                <w:color w:val="000000"/>
-                <w:sz w:val="21"/>
-                <w:szCs w:val="21"/>
-              </w:rPr>
-              <w:t>Minor</w:t>
-            </w:r>
-            <w:proofErr w:type="spellEnd"/>
+              <w:t>2 – Minor</w:t>
+            </w:r>
           </w:p>
         </w:tc>
         <w:tc>
@@ -5685,59 +4583,8 @@
                 <w:sz w:val="21"/>
                 <w:szCs w:val="21"/>
               </w:rPr>
-              <w:t xml:space="preserve">Quy trình xử lý thay đổi qua </w:t>
-            </w:r>
-            <w:proofErr w:type="spellStart"/>
-            <w:r>
-              <w:rPr>
-                <w:rFonts w:ascii="Arial" w:eastAsia="Arial" w:hAnsi="Arial" w:cs="Arial"/>
-                <w:color w:val="000000"/>
-                <w:sz w:val="21"/>
-                <w:szCs w:val="21"/>
-              </w:rPr>
-              <w:t>Product</w:t>
-            </w:r>
-            <w:proofErr w:type="spellEnd"/>
-            <w:r>
-              <w:rPr>
-                <w:rFonts w:ascii="Arial" w:eastAsia="Arial" w:hAnsi="Arial" w:cs="Arial"/>
-                <w:color w:val="000000"/>
-                <w:sz w:val="21"/>
-                <w:szCs w:val="21"/>
-              </w:rPr>
-              <w:t xml:space="preserve"> </w:t>
-            </w:r>
-            <w:proofErr w:type="spellStart"/>
-            <w:r>
-              <w:rPr>
-                <w:rFonts w:ascii="Arial" w:eastAsia="Arial" w:hAnsi="Arial" w:cs="Arial"/>
-                <w:color w:val="000000"/>
-                <w:sz w:val="21"/>
-                <w:szCs w:val="21"/>
-              </w:rPr>
-              <w:t>Backlog</w:t>
-            </w:r>
-            <w:proofErr w:type="spellEnd"/>
-            <w:r>
-              <w:rPr>
-                <w:rFonts w:ascii="Arial" w:eastAsia="Arial" w:hAnsi="Arial" w:cs="Arial"/>
-                <w:color w:val="000000"/>
-                <w:sz w:val="21"/>
-                <w:szCs w:val="21"/>
-              </w:rPr>
-              <w:t xml:space="preserve">, đàm phán lại </w:t>
-            </w:r>
-            <w:proofErr w:type="spellStart"/>
-            <w:r>
-              <w:rPr>
-                <w:rFonts w:ascii="Arial" w:eastAsia="Arial" w:hAnsi="Arial" w:cs="Arial"/>
-                <w:color w:val="000000"/>
-                <w:sz w:val="21"/>
-                <w:szCs w:val="21"/>
-              </w:rPr>
-              <w:t>timeline</w:t>
-            </w:r>
-            <w:proofErr w:type="spellEnd"/>
+              <w:t>Quy trình xử lý thay đổi qua Product Backlog, đàm phán lại timeline</w:t>
+            </w:r>
           </w:p>
         </w:tc>
       </w:tr>
@@ -5881,45 +4728,14 @@
             <w:vAlign w:val="center"/>
           </w:tcPr>
           <w:p>
-            <w:proofErr w:type="spellStart"/>
-            <w:r>
-              <w:rPr>
-                <w:rFonts w:ascii="Arial" w:eastAsia="Arial" w:hAnsi="Arial" w:cs="Arial"/>
-                <w:color w:val="000000"/>
-                <w:sz w:val="21"/>
-                <w:szCs w:val="21"/>
-              </w:rPr>
-              <w:t>Review</w:t>
-            </w:r>
-            <w:proofErr w:type="spellEnd"/>
-            <w:r>
-              <w:rPr>
-                <w:rFonts w:ascii="Arial" w:eastAsia="Arial" w:hAnsi="Arial" w:cs="Arial"/>
-                <w:color w:val="000000"/>
-                <w:sz w:val="21"/>
-                <w:szCs w:val="21"/>
-              </w:rPr>
-              <w:t xml:space="preserve"> tài liệu sau mỗi </w:t>
-            </w:r>
-            <w:proofErr w:type="spellStart"/>
-            <w:r>
-              <w:rPr>
-                <w:rFonts w:ascii="Arial" w:eastAsia="Arial" w:hAnsi="Arial" w:cs="Arial"/>
-                <w:color w:val="000000"/>
-                <w:sz w:val="21"/>
-                <w:szCs w:val="21"/>
-              </w:rPr>
-              <w:t>Sprint</w:t>
-            </w:r>
-            <w:proofErr w:type="spellEnd"/>
-            <w:r>
-              <w:rPr>
-                <w:rFonts w:ascii="Arial" w:eastAsia="Arial" w:hAnsi="Arial" w:cs="Arial"/>
-                <w:color w:val="000000"/>
-                <w:sz w:val="21"/>
-                <w:szCs w:val="21"/>
-              </w:rPr>
-              <w:t>, bổ sung kịp thời</w:t>
+            <w:r>
+              <w:rPr>
+                <w:rFonts w:ascii="Arial" w:eastAsia="Arial" w:hAnsi="Arial" w:cs="Arial"/>
+                <w:color w:val="000000"/>
+                <w:sz w:val="21"/>
+                <w:szCs w:val="21"/>
+              </w:rPr>
+              <w:t>Review tài liệu sau mỗi Sprint, bổ sung kịp thời</w:t>
             </w:r>
           </w:p>
         </w:tc>
@@ -6064,45 +4880,14 @@
             <w:vAlign w:val="center"/>
           </w:tcPr>
           <w:p>
-            <w:proofErr w:type="spellStart"/>
-            <w:r>
-              <w:rPr>
-                <w:rFonts w:ascii="Arial" w:eastAsia="Arial" w:hAnsi="Arial" w:cs="Arial"/>
-                <w:color w:val="000000"/>
-                <w:sz w:val="21"/>
-                <w:szCs w:val="21"/>
-              </w:rPr>
-              <w:t>Daily</w:t>
-            </w:r>
-            <w:proofErr w:type="spellEnd"/>
-            <w:r>
-              <w:rPr>
-                <w:rFonts w:ascii="Arial" w:eastAsia="Arial" w:hAnsi="Arial" w:cs="Arial"/>
-                <w:color w:val="000000"/>
-                <w:sz w:val="21"/>
-                <w:szCs w:val="21"/>
-              </w:rPr>
-              <w:t xml:space="preserve"> </w:t>
-            </w:r>
-            <w:proofErr w:type="spellStart"/>
-            <w:r>
-              <w:rPr>
-                <w:rFonts w:ascii="Arial" w:eastAsia="Arial" w:hAnsi="Arial" w:cs="Arial"/>
-                <w:color w:val="000000"/>
-                <w:sz w:val="21"/>
-                <w:szCs w:val="21"/>
-              </w:rPr>
-              <w:t>meeting</w:t>
-            </w:r>
-            <w:proofErr w:type="spellEnd"/>
-            <w:r>
-              <w:rPr>
-                <w:rFonts w:ascii="Arial" w:eastAsia="Arial" w:hAnsi="Arial" w:cs="Arial"/>
-                <w:color w:val="000000"/>
-                <w:sz w:val="21"/>
-                <w:szCs w:val="21"/>
-              </w:rPr>
-              <w:t xml:space="preserve">, kênh </w:t>
+            <w:r>
+              <w:rPr>
+                <w:rFonts w:ascii="Arial" w:eastAsia="Arial" w:hAnsi="Arial" w:cs="Arial"/>
+                <w:color w:val="000000"/>
+                <w:sz w:val="21"/>
+                <w:szCs w:val="21"/>
+              </w:rPr>
+              <w:t xml:space="preserve">Daily meeting, kênh </w:t>
             </w:r>
             <w:r>
               <w:rPr>
@@ -6120,27 +4905,7 @@
                 <w:sz w:val="21"/>
                 <w:szCs w:val="21"/>
               </w:rPr>
-              <w:t>/</w:t>
-            </w:r>
-            <w:proofErr w:type="spellStart"/>
-            <w:r>
-              <w:rPr>
-                <w:rFonts w:ascii="Arial" w:eastAsia="Arial" w:hAnsi="Arial" w:cs="Arial"/>
-                <w:color w:val="000000"/>
-                <w:sz w:val="21"/>
-                <w:szCs w:val="21"/>
-              </w:rPr>
-              <w:t>GitHub</w:t>
-            </w:r>
-            <w:proofErr w:type="spellEnd"/>
-            <w:r>
-              <w:rPr>
-                <w:rFonts w:ascii="Arial" w:eastAsia="Arial" w:hAnsi="Arial" w:cs="Arial"/>
-                <w:color w:val="000000"/>
-                <w:sz w:val="21"/>
-                <w:szCs w:val="21"/>
-              </w:rPr>
-              <w:t xml:space="preserve"> nội bộ</w:t>
+              <w:t>/GitHub nội bộ</w:t>
             </w:r>
           </w:p>
         </w:tc>
@@ -6173,27 +4938,7 @@
                 <w:szCs w:val="21"/>
               </w:rPr>
               <w:lastRenderedPageBreak/>
-              <w:t xml:space="preserve">Ước tính </w:t>
-            </w:r>
-            <w:proofErr w:type="spellStart"/>
-            <w:r>
-              <w:rPr>
-                <w:rFonts w:ascii="Arial" w:eastAsia="Arial" w:hAnsi="Arial" w:cs="Arial"/>
-                <w:color w:val="000000"/>
-                <w:sz w:val="21"/>
-                <w:szCs w:val="21"/>
-              </w:rPr>
-              <w:t>effort</w:t>
-            </w:r>
-            <w:proofErr w:type="spellEnd"/>
-            <w:r>
-              <w:rPr>
-                <w:rFonts w:ascii="Arial" w:eastAsia="Arial" w:hAnsi="Arial" w:cs="Arial"/>
-                <w:color w:val="000000"/>
-                <w:sz w:val="21"/>
-                <w:szCs w:val="21"/>
-              </w:rPr>
-              <w:t xml:space="preserve"> quá lạc quan</w:t>
+              <w:t>Ước tính effort quá lạc quan</w:t>
             </w:r>
           </w:p>
         </w:tc>
@@ -6313,59 +5058,8 @@
                 <w:sz w:val="21"/>
                 <w:szCs w:val="21"/>
               </w:rPr>
-              <w:t xml:space="preserve">Điều chỉnh </w:t>
-            </w:r>
-            <w:proofErr w:type="spellStart"/>
-            <w:r>
-              <w:rPr>
-                <w:rFonts w:ascii="Arial" w:eastAsia="Arial" w:hAnsi="Arial" w:cs="Arial"/>
-                <w:color w:val="000000"/>
-                <w:sz w:val="21"/>
-                <w:szCs w:val="21"/>
-              </w:rPr>
-              <w:t>Story</w:t>
-            </w:r>
-            <w:proofErr w:type="spellEnd"/>
-            <w:r>
-              <w:rPr>
-                <w:rFonts w:ascii="Arial" w:eastAsia="Arial" w:hAnsi="Arial" w:cs="Arial"/>
-                <w:color w:val="000000"/>
-                <w:sz w:val="21"/>
-                <w:szCs w:val="21"/>
-              </w:rPr>
-              <w:t xml:space="preserve"> </w:t>
-            </w:r>
-            <w:proofErr w:type="spellStart"/>
-            <w:r>
-              <w:rPr>
-                <w:rFonts w:ascii="Arial" w:eastAsia="Arial" w:hAnsi="Arial" w:cs="Arial"/>
-                <w:color w:val="000000"/>
-                <w:sz w:val="21"/>
-                <w:szCs w:val="21"/>
-              </w:rPr>
-              <w:t>Points</w:t>
-            </w:r>
-            <w:proofErr w:type="spellEnd"/>
-            <w:r>
-              <w:rPr>
-                <w:rFonts w:ascii="Arial" w:eastAsia="Arial" w:hAnsi="Arial" w:cs="Arial"/>
-                <w:color w:val="000000"/>
-                <w:sz w:val="21"/>
-                <w:szCs w:val="21"/>
-              </w:rPr>
-              <w:t xml:space="preserve"> sau mỗi </w:t>
-            </w:r>
-            <w:proofErr w:type="spellStart"/>
-            <w:r>
-              <w:rPr>
-                <w:rFonts w:ascii="Arial" w:eastAsia="Arial" w:hAnsi="Arial" w:cs="Arial"/>
-                <w:color w:val="000000"/>
-                <w:sz w:val="21"/>
-                <w:szCs w:val="21"/>
-              </w:rPr>
-              <w:t>Retrospective</w:t>
-            </w:r>
-            <w:proofErr w:type="spellEnd"/>
+              <w:t>Điều chỉnh Story Points sau mỗi Retrospective</w:t>
+            </w:r>
           </w:p>
         </w:tc>
       </w:tr>
@@ -6396,47 +5090,7 @@
                 <w:sz w:val="21"/>
                 <w:szCs w:val="21"/>
               </w:rPr>
-              <w:t>Rủi ro kỹ thuật (</w:t>
-            </w:r>
-            <w:proofErr w:type="spellStart"/>
-            <w:r>
-              <w:rPr>
-                <w:rFonts w:ascii="Arial" w:eastAsia="Arial" w:hAnsi="Arial" w:cs="Arial"/>
-                <w:color w:val="000000"/>
-                <w:sz w:val="21"/>
-                <w:szCs w:val="21"/>
-              </w:rPr>
-              <w:t>JavaFX</w:t>
-            </w:r>
-            <w:proofErr w:type="spellEnd"/>
-            <w:r>
-              <w:rPr>
-                <w:rFonts w:ascii="Arial" w:eastAsia="Arial" w:hAnsi="Arial" w:cs="Arial"/>
-                <w:color w:val="000000"/>
-                <w:sz w:val="21"/>
-                <w:szCs w:val="21"/>
-              </w:rPr>
-              <w:t xml:space="preserve">, </w:t>
-            </w:r>
-            <w:proofErr w:type="spellStart"/>
-            <w:r>
-              <w:rPr>
-                <w:rFonts w:ascii="Arial" w:eastAsia="Arial" w:hAnsi="Arial" w:cs="Arial"/>
-                <w:color w:val="000000"/>
-                <w:sz w:val="21"/>
-                <w:szCs w:val="21"/>
-              </w:rPr>
-              <w:t>MySQL</w:t>
-            </w:r>
-            <w:proofErr w:type="spellEnd"/>
-            <w:r>
-              <w:rPr>
-                <w:rFonts w:ascii="Arial" w:eastAsia="Arial" w:hAnsi="Arial" w:cs="Arial"/>
-                <w:color w:val="000000"/>
-                <w:sz w:val="21"/>
-                <w:szCs w:val="21"/>
-              </w:rPr>
-              <w:t>)</w:t>
+              <w:t>Rủi ro kỹ thuật</w:t>
             </w:r>
           </w:p>
         </w:tc>
@@ -6526,19 +5180,8 @@
                 <w:sz w:val="21"/>
                 <w:szCs w:val="21"/>
               </w:rPr>
-              <w:t xml:space="preserve">2 – </w:t>
-            </w:r>
-            <w:proofErr w:type="spellStart"/>
-            <w:r>
-              <w:rPr>
-                <w:rFonts w:ascii="Arial" w:eastAsia="Arial" w:hAnsi="Arial" w:cs="Arial"/>
-                <w:color w:val="000000"/>
-                <w:sz w:val="21"/>
-                <w:szCs w:val="21"/>
-              </w:rPr>
-              <w:t>Minor</w:t>
-            </w:r>
-            <w:proofErr w:type="spellEnd"/>
+              <w:t>2 – Minor</w:t>
+            </w:r>
           </w:p>
         </w:tc>
         <w:tc>
@@ -6567,47 +5210,7 @@
                 <w:sz w:val="21"/>
                 <w:szCs w:val="21"/>
               </w:rPr>
-              <w:t xml:space="preserve">Phân công người tìm hiểu trước </w:t>
-            </w:r>
-            <w:proofErr w:type="spellStart"/>
-            <w:r>
-              <w:rPr>
-                <w:rFonts w:ascii="Arial" w:eastAsia="Arial" w:hAnsi="Arial" w:cs="Arial"/>
-                <w:color w:val="000000"/>
-                <w:sz w:val="21"/>
-                <w:szCs w:val="21"/>
-              </w:rPr>
-              <w:t>Sprint</w:t>
-            </w:r>
-            <w:proofErr w:type="spellEnd"/>
-            <w:r>
-              <w:rPr>
-                <w:rFonts w:ascii="Arial" w:eastAsia="Arial" w:hAnsi="Arial" w:cs="Arial"/>
-                <w:color w:val="000000"/>
-                <w:sz w:val="21"/>
-                <w:szCs w:val="21"/>
-              </w:rPr>
-              <w:t xml:space="preserve"> 1, </w:t>
-            </w:r>
-            <w:proofErr w:type="spellStart"/>
-            <w:r>
-              <w:rPr>
-                <w:rFonts w:ascii="Arial" w:eastAsia="Arial" w:hAnsi="Arial" w:cs="Arial"/>
-                <w:color w:val="000000"/>
-                <w:sz w:val="21"/>
-                <w:szCs w:val="21"/>
-              </w:rPr>
-              <w:t>sharing</w:t>
-            </w:r>
-            <w:proofErr w:type="spellEnd"/>
-            <w:r>
-              <w:rPr>
-                <w:rFonts w:ascii="Arial" w:eastAsia="Arial" w:hAnsi="Arial" w:cs="Arial"/>
-                <w:color w:val="000000"/>
-                <w:sz w:val="21"/>
-                <w:szCs w:val="21"/>
-              </w:rPr>
-              <w:t xml:space="preserve"> nội bộ</w:t>
+              <w:t>Phân công người tìm hiểu trước Sprint 1, sharing nội bộ</w:t>
             </w:r>
           </w:p>
         </w:tc>
@@ -6649,43 +5252,7 @@
           <w:sz w:val="22"/>
           <w:szCs w:val="22"/>
         </w:rPr>
-        <w:t xml:space="preserve">Dự án không kéo dài quá 8 tuần (4 </w:t>
-      </w:r>
-      <w:proofErr w:type="spellStart"/>
-      <w:r>
-        <w:rPr>
-          <w:rFonts w:ascii="Arial" w:eastAsia="Arial" w:hAnsi="Arial" w:cs="Arial"/>
-          <w:sz w:val="22"/>
-          <w:szCs w:val="22"/>
-        </w:rPr>
-        <w:t>Sprint</w:t>
-      </w:r>
-      <w:proofErr w:type="spellEnd"/>
-      <w:r>
-        <w:rPr>
-          <w:rFonts w:ascii="Arial" w:eastAsia="Arial" w:hAnsi="Arial" w:cs="Arial"/>
-          <w:sz w:val="22"/>
-          <w:szCs w:val="22"/>
-        </w:rPr>
-        <w:t xml:space="preserve">). Nếu chậm tiến độ, ưu tiên cắt </w:t>
-      </w:r>
-      <w:proofErr w:type="spellStart"/>
-      <w:r>
-        <w:rPr>
-          <w:rFonts w:ascii="Arial" w:eastAsia="Arial" w:hAnsi="Arial" w:cs="Arial"/>
-          <w:sz w:val="22"/>
-          <w:szCs w:val="22"/>
-        </w:rPr>
-        <w:t>scope</w:t>
-      </w:r>
-      <w:proofErr w:type="spellEnd"/>
-      <w:r>
-        <w:rPr>
-          <w:rFonts w:ascii="Arial" w:eastAsia="Arial" w:hAnsi="Arial" w:cs="Arial"/>
-          <w:sz w:val="22"/>
-          <w:szCs w:val="22"/>
-        </w:rPr>
-        <w:t xml:space="preserve"> thay vì kéo dài thời gian.</w:t>
+        <w:t>Dự án không kéo dài quá 8 tuần (4 Sprint). Nếu chậm tiến độ, ưu tiên cắt scope thay vì kéo dài thời gian.</w:t>
       </w:r>
     </w:p>
     <w:p>
@@ -6721,25 +5288,7 @@
           <w:sz w:val="22"/>
           <w:szCs w:val="22"/>
         </w:rPr>
-        <w:t xml:space="preserve">Phạm vi dự án không thay đổi sau khi các bên liên quan đã ký kết Project </w:t>
-      </w:r>
-      <w:proofErr w:type="spellStart"/>
-      <w:r>
-        <w:rPr>
-          <w:rFonts w:ascii="Arial" w:eastAsia="Arial" w:hAnsi="Arial" w:cs="Arial"/>
-          <w:sz w:val="22"/>
-          <w:szCs w:val="22"/>
-        </w:rPr>
-        <w:t>Charter</w:t>
-      </w:r>
-      <w:proofErr w:type="spellEnd"/>
-      <w:r>
-        <w:rPr>
-          <w:rFonts w:ascii="Arial" w:eastAsia="Arial" w:hAnsi="Arial" w:cs="Arial"/>
-          <w:sz w:val="22"/>
-          <w:szCs w:val="22"/>
-        </w:rPr>
-        <w:t>.</w:t>
+        <w:t>Phạm vi dự án không thay đổi sau khi các bên liên quan đã ký kết Project Charter.</w:t>
       </w:r>
     </w:p>
     <w:p>
@@ -6757,43 +5306,7 @@
           <w:sz w:val="22"/>
           <w:szCs w:val="22"/>
         </w:rPr>
-        <w:t xml:space="preserve">Hệ thống phải hoạt động ổn định trên các máy tính sử dụng Windows 10/11 có cài đặt </w:t>
-      </w:r>
-      <w:proofErr w:type="spellStart"/>
-      <w:r>
-        <w:rPr>
-          <w:rFonts w:ascii="Arial" w:eastAsia="Arial" w:hAnsi="Arial" w:cs="Arial"/>
-          <w:sz w:val="22"/>
-          <w:szCs w:val="22"/>
-        </w:rPr>
-        <w:t>Java</w:t>
-      </w:r>
-      <w:proofErr w:type="spellEnd"/>
-      <w:r>
-        <w:rPr>
-          <w:rFonts w:ascii="Arial" w:eastAsia="Arial" w:hAnsi="Arial" w:cs="Arial"/>
-          <w:sz w:val="22"/>
-          <w:szCs w:val="22"/>
-        </w:rPr>
-        <w:t xml:space="preserve"> JDK 17+ và </w:t>
-      </w:r>
-      <w:proofErr w:type="spellStart"/>
-      <w:r>
-        <w:rPr>
-          <w:rFonts w:ascii="Arial" w:eastAsia="Arial" w:hAnsi="Arial" w:cs="Arial"/>
-          <w:sz w:val="22"/>
-          <w:szCs w:val="22"/>
-        </w:rPr>
-        <w:t>MySQL</w:t>
-      </w:r>
-      <w:proofErr w:type="spellEnd"/>
-      <w:r>
-        <w:rPr>
-          <w:rFonts w:ascii="Arial" w:eastAsia="Arial" w:hAnsi="Arial" w:cs="Arial"/>
-          <w:sz w:val="22"/>
-          <w:szCs w:val="22"/>
-        </w:rPr>
-        <w:t xml:space="preserve"> 8+.</w:t>
+        <w:t>Hệ thống phải hoạt động ổn định trên các máy tính sử dụng Windows 10/11 có cài đặt Java JDK 17+ và MySQL 8+.</w:t>
       </w:r>
     </w:p>
     <w:p>
@@ -6963,37 +5476,15 @@
             <w:vAlign w:val="center"/>
           </w:tcPr>
           <w:p>
-            <w:proofErr w:type="spellStart"/>
-            <w:r>
-              <w:rPr>
-                <w:rFonts w:ascii="Arial" w:eastAsia="Arial" w:hAnsi="Arial" w:cs="Arial"/>
-                <w:color w:val="000000"/>
-                <w:sz w:val="21"/>
-                <w:szCs w:val="21"/>
-              </w:rPr>
-              <w:t>Daily</w:t>
-            </w:r>
-            <w:proofErr w:type="spellEnd"/>
-            <w:r>
-              <w:rPr>
-                <w:rFonts w:ascii="Arial" w:eastAsia="Arial" w:hAnsi="Arial" w:cs="Arial"/>
-                <w:color w:val="000000"/>
-                <w:sz w:val="21"/>
-                <w:szCs w:val="21"/>
-              </w:rPr>
-              <w:t xml:space="preserve"> </w:t>
-            </w:r>
-            <w:proofErr w:type="spellStart"/>
-            <w:r>
-              <w:rPr>
-                <w:rFonts w:ascii="Arial" w:eastAsia="Arial" w:hAnsi="Arial" w:cs="Arial"/>
-                <w:color w:val="000000"/>
-                <w:sz w:val="21"/>
-                <w:szCs w:val="21"/>
-              </w:rPr>
-              <w:t>standup</w:t>
-            </w:r>
-            <w:proofErr w:type="spellEnd"/>
+            <w:r>
+              <w:rPr>
+                <w:rFonts w:ascii="Arial" w:eastAsia="Arial" w:hAnsi="Arial" w:cs="Arial"/>
+                <w:color w:val="000000"/>
+                <w:sz w:val="21"/>
+                <w:szCs w:val="21"/>
+              </w:rPr>
+              <w:t>Daily standup</w:t>
+            </w:r>
           </w:p>
         </w:tc>
         <w:tc>
@@ -7052,27 +5543,7 @@
                 <w:sz w:val="21"/>
                 <w:szCs w:val="21"/>
               </w:rPr>
-              <w:t xml:space="preserve">Cập nhật tiến độ, </w:t>
-            </w:r>
-            <w:proofErr w:type="spellStart"/>
-            <w:r>
-              <w:rPr>
-                <w:rFonts w:ascii="Arial" w:eastAsia="Arial" w:hAnsi="Arial" w:cs="Arial"/>
-                <w:color w:val="000000"/>
-                <w:sz w:val="21"/>
-                <w:szCs w:val="21"/>
-              </w:rPr>
-              <w:t>blockers</w:t>
-            </w:r>
-            <w:proofErr w:type="spellEnd"/>
-            <w:r>
-              <w:rPr>
-                <w:rFonts w:ascii="Arial" w:eastAsia="Arial" w:hAnsi="Arial" w:cs="Arial"/>
-                <w:color w:val="000000"/>
-                <w:sz w:val="21"/>
-                <w:szCs w:val="21"/>
-              </w:rPr>
-              <w:t xml:space="preserve"> – toàn bộ nhóm qua </w:t>
+              <w:t xml:space="preserve">Cập nhật tiến độ, blockers – toàn bộ nhóm qua </w:t>
             </w:r>
             <w:r>
               <w:rPr>
@@ -7090,39 +5561,8 @@
                 <w:sz w:val="21"/>
                 <w:szCs w:val="21"/>
               </w:rPr>
-              <w:t>/</w:t>
-            </w:r>
-            <w:proofErr w:type="spellStart"/>
-            <w:r>
-              <w:rPr>
-                <w:rFonts w:ascii="Arial" w:eastAsia="Arial" w:hAnsi="Arial" w:cs="Arial"/>
-                <w:color w:val="000000"/>
-                <w:sz w:val="21"/>
-                <w:szCs w:val="21"/>
-              </w:rPr>
-              <w:t>Google</w:t>
-            </w:r>
-            <w:proofErr w:type="spellEnd"/>
-            <w:r>
-              <w:rPr>
-                <w:rFonts w:ascii="Arial" w:eastAsia="Arial" w:hAnsi="Arial" w:cs="Arial"/>
-                <w:color w:val="000000"/>
-                <w:sz w:val="21"/>
-                <w:szCs w:val="21"/>
-              </w:rPr>
-              <w:t xml:space="preserve"> </w:t>
-            </w:r>
-            <w:proofErr w:type="spellStart"/>
-            <w:r>
-              <w:rPr>
-                <w:rFonts w:ascii="Arial" w:eastAsia="Arial" w:hAnsi="Arial" w:cs="Arial"/>
-                <w:color w:val="000000"/>
-                <w:sz w:val="21"/>
-                <w:szCs w:val="21"/>
-              </w:rPr>
-              <w:t>Meet</w:t>
-            </w:r>
-            <w:proofErr w:type="spellEnd"/>
+              <w:t>/Google Meet</w:t>
+            </w:r>
           </w:p>
         </w:tc>
       </w:tr>
@@ -7146,37 +5586,15 @@
             <w:vAlign w:val="center"/>
           </w:tcPr>
           <w:p>
-            <w:proofErr w:type="spellStart"/>
-            <w:r>
-              <w:rPr>
-                <w:rFonts w:ascii="Arial" w:eastAsia="Arial" w:hAnsi="Arial" w:cs="Arial"/>
-                <w:color w:val="000000"/>
-                <w:sz w:val="21"/>
-                <w:szCs w:val="21"/>
-              </w:rPr>
-              <w:t>Weekly</w:t>
-            </w:r>
-            <w:proofErr w:type="spellEnd"/>
-            <w:r>
-              <w:rPr>
-                <w:rFonts w:ascii="Arial" w:eastAsia="Arial" w:hAnsi="Arial" w:cs="Arial"/>
-                <w:color w:val="000000"/>
-                <w:sz w:val="21"/>
-                <w:szCs w:val="21"/>
-              </w:rPr>
-              <w:t xml:space="preserve"> </w:t>
-            </w:r>
-            <w:proofErr w:type="spellStart"/>
-            <w:r>
-              <w:rPr>
-                <w:rFonts w:ascii="Arial" w:eastAsia="Arial" w:hAnsi="Arial" w:cs="Arial"/>
-                <w:color w:val="000000"/>
-                <w:sz w:val="21"/>
-                <w:szCs w:val="21"/>
-              </w:rPr>
-              <w:t>report</w:t>
-            </w:r>
-            <w:proofErr w:type="spellEnd"/>
+            <w:r>
+              <w:rPr>
+                <w:rFonts w:ascii="Arial" w:eastAsia="Arial" w:hAnsi="Arial" w:cs="Arial"/>
+                <w:color w:val="000000"/>
+                <w:sz w:val="21"/>
+                <w:szCs w:val="21"/>
+              </w:rPr>
+              <w:t>Weekly report</w:t>
+            </w:r>
           </w:p>
         </w:tc>
         <w:tc>
@@ -7235,39 +5653,8 @@
                 <w:sz w:val="21"/>
                 <w:szCs w:val="21"/>
               </w:rPr>
-              <w:t xml:space="preserve">Báo cáo tiến độ gửi PO và nhóm qua </w:t>
-            </w:r>
-            <w:proofErr w:type="spellStart"/>
-            <w:r>
-              <w:rPr>
-                <w:rFonts w:ascii="Arial" w:eastAsia="Arial" w:hAnsi="Arial" w:cs="Arial"/>
-                <w:color w:val="000000"/>
-                <w:sz w:val="21"/>
-                <w:szCs w:val="21"/>
-              </w:rPr>
-              <w:t>Google</w:t>
-            </w:r>
-            <w:proofErr w:type="spellEnd"/>
-            <w:r>
-              <w:rPr>
-                <w:rFonts w:ascii="Arial" w:eastAsia="Arial" w:hAnsi="Arial" w:cs="Arial"/>
-                <w:color w:val="000000"/>
-                <w:sz w:val="21"/>
-                <w:szCs w:val="21"/>
-              </w:rPr>
-              <w:t xml:space="preserve"> </w:t>
-            </w:r>
-            <w:proofErr w:type="spellStart"/>
-            <w:r>
-              <w:rPr>
-                <w:rFonts w:ascii="Arial" w:eastAsia="Arial" w:hAnsi="Arial" w:cs="Arial"/>
-                <w:color w:val="000000"/>
-                <w:sz w:val="21"/>
-                <w:szCs w:val="21"/>
-              </w:rPr>
-              <w:t>Drive</w:t>
-            </w:r>
-            <w:proofErr w:type="spellEnd"/>
+              <w:t>Báo cáo tiến độ gửi PO và nhóm qua Google Drive</w:t>
+            </w:r>
           </w:p>
         </w:tc>
       </w:tr>
@@ -7291,37 +5678,15 @@
             <w:vAlign w:val="center"/>
           </w:tcPr>
           <w:p>
-            <w:proofErr w:type="spellStart"/>
-            <w:r>
-              <w:rPr>
-                <w:rFonts w:ascii="Arial" w:eastAsia="Arial" w:hAnsi="Arial" w:cs="Arial"/>
-                <w:color w:val="000000"/>
-                <w:sz w:val="21"/>
-                <w:szCs w:val="21"/>
-              </w:rPr>
-              <w:t>Sprint</w:t>
-            </w:r>
-            <w:proofErr w:type="spellEnd"/>
-            <w:r>
-              <w:rPr>
-                <w:rFonts w:ascii="Arial" w:eastAsia="Arial" w:hAnsi="Arial" w:cs="Arial"/>
-                <w:color w:val="000000"/>
-                <w:sz w:val="21"/>
-                <w:szCs w:val="21"/>
-              </w:rPr>
-              <w:t xml:space="preserve"> </w:t>
-            </w:r>
-            <w:proofErr w:type="spellStart"/>
-            <w:r>
-              <w:rPr>
-                <w:rFonts w:ascii="Arial" w:eastAsia="Arial" w:hAnsi="Arial" w:cs="Arial"/>
-                <w:color w:val="000000"/>
-                <w:sz w:val="21"/>
-                <w:szCs w:val="21"/>
-              </w:rPr>
-              <w:t>Planning</w:t>
-            </w:r>
-            <w:proofErr w:type="spellEnd"/>
+            <w:r>
+              <w:rPr>
+                <w:rFonts w:ascii="Arial" w:eastAsia="Arial" w:hAnsi="Arial" w:cs="Arial"/>
+                <w:color w:val="000000"/>
+                <w:sz w:val="21"/>
+                <w:szCs w:val="21"/>
+              </w:rPr>
+              <w:t>Sprint Planning</w:t>
+            </w:r>
           </w:p>
         </w:tc>
         <w:tc>
@@ -7350,19 +5715,8 @@
                 <w:sz w:val="21"/>
                 <w:szCs w:val="21"/>
               </w:rPr>
-              <w:t xml:space="preserve">Đầu mỗi </w:t>
-            </w:r>
-            <w:proofErr w:type="spellStart"/>
-            <w:r>
-              <w:rPr>
-                <w:rFonts w:ascii="Arial" w:eastAsia="Arial" w:hAnsi="Arial" w:cs="Arial"/>
-                <w:color w:val="000000"/>
-                <w:sz w:val="21"/>
-                <w:szCs w:val="21"/>
-              </w:rPr>
-              <w:t>Sprint</w:t>
-            </w:r>
-            <w:proofErr w:type="spellEnd"/>
+              <w:t>Đầu mỗi Sprint</w:t>
+            </w:r>
           </w:p>
         </w:tc>
         <w:tc>
@@ -7391,47 +5745,7 @@
                 <w:sz w:val="21"/>
                 <w:szCs w:val="21"/>
               </w:rPr>
-              <w:t xml:space="preserve">Chọn PBI, ước lượng </w:t>
-            </w:r>
-            <w:proofErr w:type="spellStart"/>
-            <w:r>
-              <w:rPr>
-                <w:rFonts w:ascii="Arial" w:eastAsia="Arial" w:hAnsi="Arial" w:cs="Arial"/>
-                <w:color w:val="000000"/>
-                <w:sz w:val="21"/>
-                <w:szCs w:val="21"/>
-              </w:rPr>
-              <w:t>Story</w:t>
-            </w:r>
-            <w:proofErr w:type="spellEnd"/>
-            <w:r>
-              <w:rPr>
-                <w:rFonts w:ascii="Arial" w:eastAsia="Arial" w:hAnsi="Arial" w:cs="Arial"/>
-                <w:color w:val="000000"/>
-                <w:sz w:val="21"/>
-                <w:szCs w:val="21"/>
-              </w:rPr>
-              <w:t xml:space="preserve"> </w:t>
-            </w:r>
-            <w:proofErr w:type="spellStart"/>
-            <w:r>
-              <w:rPr>
-                <w:rFonts w:ascii="Arial" w:eastAsia="Arial" w:hAnsi="Arial" w:cs="Arial"/>
-                <w:color w:val="000000"/>
-                <w:sz w:val="21"/>
-                <w:szCs w:val="21"/>
-              </w:rPr>
-              <w:t>Points</w:t>
-            </w:r>
-            <w:proofErr w:type="spellEnd"/>
-            <w:r>
-              <w:rPr>
-                <w:rFonts w:ascii="Arial" w:eastAsia="Arial" w:hAnsi="Arial" w:cs="Arial"/>
-                <w:color w:val="000000"/>
-                <w:sz w:val="21"/>
-                <w:szCs w:val="21"/>
-              </w:rPr>
-              <w:t xml:space="preserve"> – toàn nhóm</w:t>
+              <w:t>Chọn PBI, ước lượng Story Points – toàn nhóm</w:t>
             </w:r>
           </w:p>
         </w:tc>
@@ -7456,37 +5770,15 @@
             <w:vAlign w:val="center"/>
           </w:tcPr>
           <w:p>
-            <w:proofErr w:type="spellStart"/>
-            <w:r>
-              <w:rPr>
-                <w:rFonts w:ascii="Arial" w:eastAsia="Arial" w:hAnsi="Arial" w:cs="Arial"/>
-                <w:color w:val="000000"/>
-                <w:sz w:val="21"/>
-                <w:szCs w:val="21"/>
-              </w:rPr>
-              <w:t>Sprint</w:t>
-            </w:r>
-            <w:proofErr w:type="spellEnd"/>
-            <w:r>
-              <w:rPr>
-                <w:rFonts w:ascii="Arial" w:eastAsia="Arial" w:hAnsi="Arial" w:cs="Arial"/>
-                <w:color w:val="000000"/>
-                <w:sz w:val="21"/>
-                <w:szCs w:val="21"/>
-              </w:rPr>
-              <w:t xml:space="preserve"> </w:t>
-            </w:r>
-            <w:proofErr w:type="spellStart"/>
-            <w:r>
-              <w:rPr>
-                <w:rFonts w:ascii="Arial" w:eastAsia="Arial" w:hAnsi="Arial" w:cs="Arial"/>
-                <w:color w:val="000000"/>
-                <w:sz w:val="21"/>
-                <w:szCs w:val="21"/>
-              </w:rPr>
-              <w:t>Review</w:t>
-            </w:r>
-            <w:proofErr w:type="spellEnd"/>
+            <w:r>
+              <w:rPr>
+                <w:rFonts w:ascii="Arial" w:eastAsia="Arial" w:hAnsi="Arial" w:cs="Arial"/>
+                <w:color w:val="000000"/>
+                <w:sz w:val="21"/>
+                <w:szCs w:val="21"/>
+              </w:rPr>
+              <w:t>Sprint Review</w:t>
+            </w:r>
           </w:p>
         </w:tc>
         <w:tc>
@@ -7515,19 +5807,8 @@
                 <w:sz w:val="21"/>
                 <w:szCs w:val="21"/>
               </w:rPr>
-              <w:t xml:space="preserve">Cuối mỗi </w:t>
-            </w:r>
-            <w:proofErr w:type="spellStart"/>
-            <w:r>
-              <w:rPr>
-                <w:rFonts w:ascii="Arial" w:eastAsia="Arial" w:hAnsi="Arial" w:cs="Arial"/>
-                <w:color w:val="000000"/>
-                <w:sz w:val="21"/>
-                <w:szCs w:val="21"/>
-              </w:rPr>
-              <w:t>Sprint</w:t>
-            </w:r>
-            <w:proofErr w:type="spellEnd"/>
+              <w:t>Cuối mỗi Sprint</w:t>
+            </w:r>
           </w:p>
         </w:tc>
         <w:tc>
@@ -7549,37 +5830,15 @@
             <w:vAlign w:val="center"/>
           </w:tcPr>
           <w:p>
-            <w:proofErr w:type="spellStart"/>
-            <w:r>
-              <w:rPr>
-                <w:rFonts w:ascii="Arial" w:eastAsia="Arial" w:hAnsi="Arial" w:cs="Arial"/>
-                <w:color w:val="000000"/>
-                <w:sz w:val="21"/>
-                <w:szCs w:val="21"/>
-              </w:rPr>
-              <w:t>Demo</w:t>
-            </w:r>
-            <w:proofErr w:type="spellEnd"/>
-            <w:r>
-              <w:rPr>
-                <w:rFonts w:ascii="Arial" w:eastAsia="Arial" w:hAnsi="Arial" w:cs="Arial"/>
-                <w:color w:val="000000"/>
-                <w:sz w:val="21"/>
-                <w:szCs w:val="21"/>
-              </w:rPr>
-              <w:t xml:space="preserve"> sản phẩm, PO &amp; khách hàng kiểm tra, cập nhật </w:t>
-            </w:r>
-            <w:proofErr w:type="spellStart"/>
-            <w:r>
-              <w:rPr>
-                <w:rFonts w:ascii="Arial" w:eastAsia="Arial" w:hAnsi="Arial" w:cs="Arial"/>
-                <w:color w:val="000000"/>
-                <w:sz w:val="21"/>
-                <w:szCs w:val="21"/>
-              </w:rPr>
-              <w:t>Backlog</w:t>
-            </w:r>
-            <w:proofErr w:type="spellEnd"/>
+            <w:r>
+              <w:rPr>
+                <w:rFonts w:ascii="Arial" w:eastAsia="Arial" w:hAnsi="Arial" w:cs="Arial"/>
+                <w:color w:val="000000"/>
+                <w:sz w:val="21"/>
+                <w:szCs w:val="21"/>
+              </w:rPr>
+              <w:t>Demo sản phẩm, PO &amp; khách hàng kiểm tra, cập nhật Backlog</w:t>
+            </w:r>
           </w:p>
         </w:tc>
       </w:tr>
@@ -7603,37 +5862,15 @@
             <w:vAlign w:val="center"/>
           </w:tcPr>
           <w:p>
-            <w:proofErr w:type="spellStart"/>
-            <w:r>
-              <w:rPr>
-                <w:rFonts w:ascii="Arial" w:eastAsia="Arial" w:hAnsi="Arial" w:cs="Arial"/>
-                <w:color w:val="000000"/>
-                <w:sz w:val="21"/>
-                <w:szCs w:val="21"/>
-              </w:rPr>
-              <w:t>Sprint</w:t>
-            </w:r>
-            <w:proofErr w:type="spellEnd"/>
-            <w:r>
-              <w:rPr>
-                <w:rFonts w:ascii="Arial" w:eastAsia="Arial" w:hAnsi="Arial" w:cs="Arial"/>
-                <w:color w:val="000000"/>
-                <w:sz w:val="21"/>
-                <w:szCs w:val="21"/>
-              </w:rPr>
-              <w:t xml:space="preserve"> </w:t>
-            </w:r>
-            <w:proofErr w:type="spellStart"/>
-            <w:r>
-              <w:rPr>
-                <w:rFonts w:ascii="Arial" w:eastAsia="Arial" w:hAnsi="Arial" w:cs="Arial"/>
-                <w:color w:val="000000"/>
-                <w:sz w:val="21"/>
-                <w:szCs w:val="21"/>
-              </w:rPr>
-              <w:t>Retrospective</w:t>
-            </w:r>
-            <w:proofErr w:type="spellEnd"/>
+            <w:r>
+              <w:rPr>
+                <w:rFonts w:ascii="Arial" w:eastAsia="Arial" w:hAnsi="Arial" w:cs="Arial"/>
+                <w:color w:val="000000"/>
+                <w:sz w:val="21"/>
+                <w:szCs w:val="21"/>
+              </w:rPr>
+              <w:t>Sprint Retrospective</w:t>
+            </w:r>
           </w:p>
         </w:tc>
         <w:tc>
@@ -7662,19 +5899,8 @@
                 <w:sz w:val="21"/>
                 <w:szCs w:val="21"/>
               </w:rPr>
-              <w:t xml:space="preserve">Cuối mỗi </w:t>
-            </w:r>
-            <w:proofErr w:type="spellStart"/>
-            <w:r>
-              <w:rPr>
-                <w:rFonts w:ascii="Arial" w:eastAsia="Arial" w:hAnsi="Arial" w:cs="Arial"/>
-                <w:color w:val="000000"/>
-                <w:sz w:val="21"/>
-                <w:szCs w:val="21"/>
-              </w:rPr>
-              <w:t>Sprint</w:t>
-            </w:r>
-            <w:proofErr w:type="spellEnd"/>
+              <w:t>Cuối mỗi Sprint</w:t>
+            </w:r>
           </w:p>
         </w:tc>
         <w:tc>
@@ -7951,19 +6177,8 @@
                 <w:sz w:val="21"/>
                 <w:szCs w:val="21"/>
               </w:rPr>
-              <w:t xml:space="preserve">Ban quản trị </w:t>
-            </w:r>
-            <w:proofErr w:type="spellStart"/>
-            <w:r>
-              <w:rPr>
-                <w:rFonts w:ascii="Arial" w:eastAsia="Arial" w:hAnsi="Arial" w:cs="Arial"/>
-                <w:color w:val="000000"/>
-                <w:sz w:val="21"/>
-                <w:szCs w:val="21"/>
-              </w:rPr>
-              <w:t>BlueMoon</w:t>
-            </w:r>
-            <w:proofErr w:type="spellEnd"/>
+              <w:t>Ban quản trị BlueMoon</w:t>
+            </w:r>
           </w:p>
         </w:tc>
         <w:tc>
@@ -8064,19 +6279,8 @@
                 <w:sz w:val="21"/>
                 <w:szCs w:val="21"/>
               </w:rPr>
-              <w:t xml:space="preserve">Công ty CP Quản lý </w:t>
-            </w:r>
-            <w:proofErr w:type="spellStart"/>
-            <w:r>
-              <w:rPr>
-                <w:rFonts w:ascii="Arial" w:eastAsia="Arial" w:hAnsi="Arial" w:cs="Arial"/>
-                <w:color w:val="000000"/>
-                <w:sz w:val="21"/>
-                <w:szCs w:val="21"/>
-              </w:rPr>
-              <w:t>BlueMoon</w:t>
-            </w:r>
-            <w:proofErr w:type="spellEnd"/>
+              <w:t>Công ty CP Quản lý BlueMoon</w:t>
+            </w:r>
           </w:p>
         </w:tc>
         <w:tc>
@@ -8147,19 +6351,8 @@
                 <w:sz w:val="21"/>
                 <w:szCs w:val="21"/>
               </w:rPr>
-              <w:t xml:space="preserve">Project </w:t>
-            </w:r>
-            <w:proofErr w:type="spellStart"/>
-            <w:r>
-              <w:rPr>
-                <w:rFonts w:ascii="Arial" w:eastAsia="Arial" w:hAnsi="Arial" w:cs="Arial"/>
-                <w:color w:val="000000"/>
-                <w:sz w:val="21"/>
-                <w:szCs w:val="21"/>
-              </w:rPr>
-              <w:t>Manager</w:t>
-            </w:r>
-            <w:proofErr w:type="spellEnd"/>
+              <w:t>Project Manager</w:t>
+            </w:r>
           </w:p>
         </w:tc>
         <w:tc>
@@ -8375,216 +6568,7 @@
           <w:sz w:val="22"/>
           <w:szCs w:val="22"/>
         </w:rPr>
-        <w:t xml:space="preserve">Dự án áp dụng mô hình </w:t>
-      </w:r>
-      <w:proofErr w:type="spellStart"/>
-      <w:r>
-        <w:rPr>
-          <w:rFonts w:ascii="Arial" w:eastAsia="Arial" w:hAnsi="Arial" w:cs="Arial"/>
-          <w:sz w:val="22"/>
-          <w:szCs w:val="22"/>
-        </w:rPr>
-        <w:t>Agile</w:t>
-      </w:r>
-      <w:proofErr w:type="spellEnd"/>
-      <w:r>
-        <w:rPr>
-          <w:rFonts w:ascii="Arial" w:eastAsia="Arial" w:hAnsi="Arial" w:cs="Arial"/>
-          <w:sz w:val="22"/>
-          <w:szCs w:val="22"/>
-        </w:rPr>
-        <w:t xml:space="preserve"> – </w:t>
-      </w:r>
-      <w:proofErr w:type="spellStart"/>
-      <w:r>
-        <w:rPr>
-          <w:rFonts w:ascii="Arial" w:eastAsia="Arial" w:hAnsi="Arial" w:cs="Arial"/>
-          <w:sz w:val="22"/>
-          <w:szCs w:val="22"/>
-        </w:rPr>
-        <w:t>Scrum</w:t>
-      </w:r>
-      <w:proofErr w:type="spellEnd"/>
-      <w:r>
-        <w:rPr>
-          <w:rFonts w:ascii="Arial" w:eastAsia="Arial" w:hAnsi="Arial" w:cs="Arial"/>
-          <w:sz w:val="22"/>
-          <w:szCs w:val="22"/>
-        </w:rPr>
-        <w:t xml:space="preserve"> với 3 </w:t>
-      </w:r>
-      <w:proofErr w:type="spellStart"/>
-      <w:r>
-        <w:rPr>
-          <w:rFonts w:ascii="Arial" w:eastAsia="Arial" w:hAnsi="Arial" w:cs="Arial"/>
-          <w:sz w:val="22"/>
-          <w:szCs w:val="22"/>
-        </w:rPr>
-        <w:t>Sprint</w:t>
-      </w:r>
-      <w:proofErr w:type="spellEnd"/>
-      <w:r>
-        <w:rPr>
-          <w:rFonts w:ascii="Arial" w:eastAsia="Arial" w:hAnsi="Arial" w:cs="Arial"/>
-          <w:sz w:val="22"/>
-          <w:szCs w:val="22"/>
-        </w:rPr>
-        <w:t xml:space="preserve"> phát triển (</w:t>
-      </w:r>
-      <w:proofErr w:type="spellStart"/>
-      <w:r>
-        <w:rPr>
-          <w:rFonts w:ascii="Arial" w:eastAsia="Arial" w:hAnsi="Arial" w:cs="Arial"/>
-          <w:sz w:val="22"/>
-          <w:szCs w:val="22"/>
-        </w:rPr>
-        <w:t>Sprint</w:t>
-      </w:r>
-      <w:proofErr w:type="spellEnd"/>
-      <w:r>
-        <w:rPr>
-          <w:rFonts w:ascii="Arial" w:eastAsia="Arial" w:hAnsi="Arial" w:cs="Arial"/>
-          <w:sz w:val="22"/>
-          <w:szCs w:val="22"/>
-        </w:rPr>
-        <w:t xml:space="preserve"> 1–3) và 1 </w:t>
-      </w:r>
-      <w:proofErr w:type="spellStart"/>
-      <w:r>
-        <w:rPr>
-          <w:rFonts w:ascii="Arial" w:eastAsia="Arial" w:hAnsi="Arial" w:cs="Arial"/>
-          <w:sz w:val="22"/>
-          <w:szCs w:val="22"/>
-        </w:rPr>
-        <w:t>Sprint</w:t>
-      </w:r>
-      <w:proofErr w:type="spellEnd"/>
-      <w:r>
-        <w:rPr>
-          <w:rFonts w:ascii="Arial" w:eastAsia="Arial" w:hAnsi="Arial" w:cs="Arial"/>
-          <w:sz w:val="22"/>
-          <w:szCs w:val="22"/>
-        </w:rPr>
-        <w:t xml:space="preserve"> 0 khởi động.</w:t>
-      </w:r>
-    </w:p>
-    <w:p>
-      <w:pPr>
-        <w:pStyle w:val="oancuaDanhsach"/>
-        <w:numPr>
-          <w:ilvl w:val="0"/>
-          <w:numId w:val="2"/>
-        </w:numPr>
-        <w:spacing w:before="40" w:after="40"/>
-      </w:pPr>
-      <w:proofErr w:type="spellStart"/>
-      <w:r>
-        <w:rPr>
-          <w:rFonts w:ascii="Arial" w:eastAsia="Arial" w:hAnsi="Arial" w:cs="Arial"/>
-          <w:sz w:val="22"/>
-          <w:szCs w:val="22"/>
-        </w:rPr>
-        <w:lastRenderedPageBreak/>
-        <w:t>Product</w:t>
-      </w:r>
-      <w:proofErr w:type="spellEnd"/>
-      <w:r>
-        <w:rPr>
-          <w:rFonts w:ascii="Arial" w:eastAsia="Arial" w:hAnsi="Arial" w:cs="Arial"/>
-          <w:sz w:val="22"/>
-          <w:szCs w:val="22"/>
-        </w:rPr>
-        <w:t xml:space="preserve"> </w:t>
-      </w:r>
-      <w:proofErr w:type="spellStart"/>
-      <w:r>
-        <w:rPr>
-          <w:rFonts w:ascii="Arial" w:eastAsia="Arial" w:hAnsi="Arial" w:cs="Arial"/>
-          <w:sz w:val="22"/>
-          <w:szCs w:val="22"/>
-        </w:rPr>
-        <w:t>Backlog</w:t>
-      </w:r>
-      <w:proofErr w:type="spellEnd"/>
-      <w:r>
-        <w:rPr>
-          <w:rFonts w:ascii="Arial" w:eastAsia="Arial" w:hAnsi="Arial" w:cs="Arial"/>
-          <w:sz w:val="22"/>
-          <w:szCs w:val="22"/>
-        </w:rPr>
-        <w:t xml:space="preserve"> được quản lý trong </w:t>
-      </w:r>
-      <w:proofErr w:type="spellStart"/>
-      <w:r>
-        <w:rPr>
-          <w:rFonts w:ascii="Arial" w:eastAsia="Arial" w:hAnsi="Arial" w:cs="Arial"/>
-          <w:sz w:val="22"/>
-          <w:szCs w:val="22"/>
-        </w:rPr>
-        <w:t>file</w:t>
-      </w:r>
-      <w:proofErr w:type="spellEnd"/>
-      <w:r>
-        <w:rPr>
-          <w:rFonts w:ascii="Arial" w:eastAsia="Arial" w:hAnsi="Arial" w:cs="Arial"/>
-          <w:sz w:val="22"/>
-          <w:szCs w:val="22"/>
-        </w:rPr>
-        <w:t xml:space="preserve"> KeHoach_Scrum_BlueMoon.xlsx, liên kết với </w:t>
-      </w:r>
-      <w:proofErr w:type="spellStart"/>
-      <w:r>
-        <w:rPr>
-          <w:rFonts w:ascii="Arial" w:eastAsia="Arial" w:hAnsi="Arial" w:cs="Arial"/>
-          <w:sz w:val="22"/>
-          <w:szCs w:val="22"/>
-        </w:rPr>
-        <w:t>Raw</w:t>
-      </w:r>
-      <w:proofErr w:type="spellEnd"/>
-      <w:r>
-        <w:rPr>
-          <w:rFonts w:ascii="Arial" w:eastAsia="Arial" w:hAnsi="Arial" w:cs="Arial"/>
-          <w:sz w:val="22"/>
-          <w:szCs w:val="22"/>
-        </w:rPr>
-        <w:t xml:space="preserve"> </w:t>
-      </w:r>
-      <w:proofErr w:type="spellStart"/>
-      <w:r>
-        <w:rPr>
-          <w:rFonts w:ascii="Arial" w:eastAsia="Arial" w:hAnsi="Arial" w:cs="Arial"/>
-          <w:sz w:val="22"/>
-          <w:szCs w:val="22"/>
-        </w:rPr>
-        <w:t>Log</w:t>
-      </w:r>
-      <w:proofErr w:type="spellEnd"/>
-      <w:r>
-        <w:rPr>
-          <w:rFonts w:ascii="Arial" w:eastAsia="Arial" w:hAnsi="Arial" w:cs="Arial"/>
-          <w:sz w:val="22"/>
-          <w:szCs w:val="22"/>
-        </w:rPr>
-        <w:t xml:space="preserve"> theo mã RL-</w:t>
-      </w:r>
-      <w:proofErr w:type="spellStart"/>
-      <w:r>
-        <w:rPr>
-          <w:rFonts w:ascii="Arial" w:eastAsia="Arial" w:hAnsi="Arial" w:cs="Arial"/>
-          <w:sz w:val="22"/>
-          <w:szCs w:val="22"/>
-        </w:rPr>
-        <w:t>xxx</w:t>
-      </w:r>
-      <w:proofErr w:type="spellEnd"/>
-      <w:r>
-        <w:rPr>
-          <w:rFonts w:ascii="Arial" w:eastAsia="Arial" w:hAnsi="Arial" w:cs="Arial"/>
-          <w:sz w:val="22"/>
-          <w:szCs w:val="22"/>
-        </w:rPr>
-        <w:t>.</w:t>
+        <w:t>Dự án áp dụng mô hình Agile – Scrum với 3 Sprint phát triển (Sprint 1–3) và 1 Sprint 0 khởi động.</w:t>
       </w:r>
     </w:p>
     <w:p>
@@ -8602,43 +6586,26 @@
           <w:sz w:val="22"/>
           <w:szCs w:val="22"/>
         </w:rPr>
-        <w:t xml:space="preserve">Mọi thay đổi phạm vi sau khi ký kết phải được ghi nhận vào </w:t>
+        <w:lastRenderedPageBreak/>
+        <w:t>Product Backlog được quản lý trong file KeHoach_Scrum_BlueMoon.xlsx, liên kết với Raw Log theo mã RL-xxx.</w:t>
       </w:r>
-      <w:proofErr w:type="spellStart"/>
+    </w:p>
+    <w:p>
+      <w:pPr>
+        <w:pStyle w:val="oancuaDanhsach"/>
+        <w:numPr>
+          <w:ilvl w:val="0"/>
+          <w:numId w:val="2"/>
+        </w:numPr>
+        <w:spacing w:before="40" w:after="40"/>
+      </w:pPr>
       <w:r>
         <w:rPr>
           <w:rFonts w:ascii="Arial" w:eastAsia="Arial" w:hAnsi="Arial" w:cs="Arial"/>
           <w:sz w:val="22"/>
           <w:szCs w:val="22"/>
         </w:rPr>
-        <w:t>Product</w:t>
-      </w:r>
-      <w:proofErr w:type="spellEnd"/>
-      <w:r>
-        <w:rPr>
-          <w:rFonts w:ascii="Arial" w:eastAsia="Arial" w:hAnsi="Arial" w:cs="Arial"/>
-          <w:sz w:val="22"/>
-          <w:szCs w:val="22"/>
-        </w:rPr>
-        <w:t xml:space="preserve"> </w:t>
-      </w:r>
-      <w:proofErr w:type="spellStart"/>
-      <w:r>
-        <w:rPr>
-          <w:rFonts w:ascii="Arial" w:eastAsia="Arial" w:hAnsi="Arial" w:cs="Arial"/>
-          <w:sz w:val="22"/>
-          <w:szCs w:val="22"/>
-        </w:rPr>
-        <w:t>Backlog</w:t>
-      </w:r>
-      <w:proofErr w:type="spellEnd"/>
-      <w:r>
-        <w:rPr>
-          <w:rFonts w:ascii="Arial" w:eastAsia="Arial" w:hAnsi="Arial" w:cs="Arial"/>
-          <w:sz w:val="22"/>
-          <w:szCs w:val="22"/>
-        </w:rPr>
-        <w:t xml:space="preserve"> và thông báo cho PO.</w:t>
+        <w:t>Mọi thay đổi phạm vi sau khi ký kết phải được ghi nhận vào Product Backlog và thông báo cho PO.</w:t>
       </w:r>
     </w:p>
     <w:p>

</xml_diff>

<commit_message>
cập nhật tài liệu
</commit_message>
<xml_diff>
--- a/docs/Nhóm 16/01 - Tai lieu du an/2. Ke hoach du an phan mem/Project_Charter_BlueMoon.docx
+++ b/docs/Nhóm 16/01 - Tai lieu du an/2. Ke hoach du an phan mem/Project_Charter_BlueMoon.docx
@@ -246,7 +246,15 @@
                 <w:sz w:val="22"/>
                 <w:szCs w:val="22"/>
               </w:rPr>
-              <w:t>v1.0</w:t>
+              <w:t>v1</w:t>
+            </w:r>
+            <w:r>
+              <w:rPr>
+                <w:rFonts w:ascii="Arial" w:eastAsia="Arial" w:hAnsi="Arial" w:cs="Arial"/>
+                <w:sz w:val="22"/>
+                <w:szCs w:val="22"/>
+              </w:rPr>
+              <w:t>.0</w:t>
             </w:r>
           </w:p>
         </w:tc>
@@ -758,8 +766,8 @@
       </w:tblPr>
       <w:tblGrid>
         <w:gridCol w:w="2103"/>
-        <w:gridCol w:w="1757"/>
-        <w:gridCol w:w="2485"/>
+        <w:gridCol w:w="1861"/>
+        <w:gridCol w:w="2381"/>
         <w:gridCol w:w="3401"/>
       </w:tblGrid>
       <w:tr>
@@ -800,7 +808,7 @@
         </w:tc>
         <w:tc>
           <w:tcPr>
-            <w:tcW w:w="1757" w:type="dxa"/>
+            <w:tcW w:w="1861" w:type="dxa"/>
             <w:tcBorders>
               <w:top w:val="single" w:sz="4" w:space="0" w:color="AAAAAA"/>
               <w:left w:val="single" w:sz="4" w:space="0" w:color="AAAAAA"/>
@@ -832,7 +840,7 @@
         </w:tc>
         <w:tc>
           <w:tcPr>
-            <w:tcW w:w="2485" w:type="dxa"/>
+            <w:tcW w:w="2381" w:type="dxa"/>
             <w:tcBorders>
               <w:top w:val="single" w:sz="4" w:space="0" w:color="AAAAAA"/>
               <w:left w:val="single" w:sz="4" w:space="0" w:color="AAAAAA"/>
@@ -936,7 +944,7 @@
         </w:tc>
         <w:tc>
           <w:tcPr>
-            <w:tcW w:w="1757" w:type="dxa"/>
+            <w:tcW w:w="1861" w:type="dxa"/>
             <w:tcBorders>
               <w:top w:val="single" w:sz="4" w:space="0" w:color="AAAAAA"/>
               <w:left w:val="single" w:sz="4" w:space="0" w:color="AAAAAA"/>
@@ -974,7 +982,7 @@
         </w:tc>
         <w:tc>
           <w:tcPr>
-            <w:tcW w:w="2485" w:type="dxa"/>
+            <w:tcW w:w="2381" w:type="dxa"/>
             <w:tcBorders>
               <w:top w:val="single" w:sz="4" w:space="0" w:color="AAAAAA"/>
               <w:left w:val="single" w:sz="4" w:space="0" w:color="AAAAAA"/>
@@ -1091,7 +1099,7 @@
         </w:tc>
         <w:tc>
           <w:tcPr>
-            <w:tcW w:w="1757" w:type="dxa"/>
+            <w:tcW w:w="1861" w:type="dxa"/>
             <w:tcBorders>
               <w:top w:val="single" w:sz="4" w:space="0" w:color="AAAAAA"/>
               <w:left w:val="single" w:sz="4" w:space="0" w:color="AAAAAA"/>
@@ -1121,7 +1129,7 @@
         </w:tc>
         <w:tc>
           <w:tcPr>
-            <w:tcW w:w="2485" w:type="dxa"/>
+            <w:tcW w:w="2381" w:type="dxa"/>
             <w:tcBorders>
               <w:top w:val="single" w:sz="4" w:space="0" w:color="AAAAAA"/>
               <w:left w:val="single" w:sz="4" w:space="0" w:color="AAAAAA"/>
@@ -1213,7 +1221,7 @@
         </w:tc>
         <w:tc>
           <w:tcPr>
-            <w:tcW w:w="1757" w:type="dxa"/>
+            <w:tcW w:w="1861" w:type="dxa"/>
             <w:tcBorders>
               <w:top w:val="single" w:sz="4" w:space="0" w:color="AAAAAA"/>
               <w:left w:val="single" w:sz="4" w:space="0" w:color="AAAAAA"/>
@@ -1243,7 +1251,7 @@
         </w:tc>
         <w:tc>
           <w:tcPr>
-            <w:tcW w:w="2485" w:type="dxa"/>
+            <w:tcW w:w="2381" w:type="dxa"/>
             <w:tcBorders>
               <w:top w:val="single" w:sz="4" w:space="0" w:color="AAAAAA"/>
               <w:left w:val="single" w:sz="4" w:space="0" w:color="AAAAAA"/>
@@ -1344,7 +1352,7 @@
         </w:tc>
         <w:tc>
           <w:tcPr>
-            <w:tcW w:w="1757" w:type="dxa"/>
+            <w:tcW w:w="1861" w:type="dxa"/>
             <w:tcBorders>
               <w:top w:val="single" w:sz="4" w:space="0" w:color="AAAAAA"/>
               <w:left w:val="single" w:sz="4" w:space="0" w:color="AAAAAA"/>
@@ -1374,7 +1382,7 @@
         </w:tc>
         <w:tc>
           <w:tcPr>
-            <w:tcW w:w="2485" w:type="dxa"/>
+            <w:tcW w:w="2381" w:type="dxa"/>
             <w:tcBorders>
               <w:top w:val="single" w:sz="4" w:space="0" w:color="AAAAAA"/>
               <w:left w:val="single" w:sz="4" w:space="0" w:color="AAAAAA"/>
@@ -1476,7 +1484,7 @@
         </w:tc>
         <w:tc>
           <w:tcPr>
-            <w:tcW w:w="1757" w:type="dxa"/>
+            <w:tcW w:w="1861" w:type="dxa"/>
             <w:tcBorders>
               <w:top w:val="single" w:sz="4" w:space="0" w:color="AAAAAA"/>
               <w:left w:val="single" w:sz="4" w:space="0" w:color="AAAAAA"/>
@@ -1513,7 +1521,7 @@
         </w:tc>
         <w:tc>
           <w:tcPr>
-            <w:tcW w:w="2485" w:type="dxa"/>
+            <w:tcW w:w="2381" w:type="dxa"/>
             <w:tcBorders>
               <w:top w:val="single" w:sz="4" w:space="0" w:color="AAAAAA"/>
               <w:left w:val="single" w:sz="4" w:space="0" w:color="AAAAAA"/>
@@ -2160,7 +2168,6 @@
           <w:sz w:val="28"/>
           <w:szCs w:val="28"/>
         </w:rPr>
-        <w:lastRenderedPageBreak/>
         <w:t>4. Tuyên bố phạm vi dự án</w:t>
       </w:r>
     </w:p>
@@ -2534,8 +2541,8 @@
         <w:tblLook w:val="04A0" w:firstRow="1" w:lastRow="0" w:firstColumn="1" w:lastColumn="0" w:noHBand="0" w:noVBand="1"/>
       </w:tblPr>
       <w:tblGrid>
-        <w:gridCol w:w="4529"/>
-        <w:gridCol w:w="5217"/>
+        <w:gridCol w:w="2544"/>
+        <w:gridCol w:w="7202"/>
       </w:tblGrid>
       <w:tr>
         <w:trPr>
@@ -2706,6 +2713,7 @@
                 <w:sz w:val="21"/>
                 <w:szCs w:val="21"/>
               </w:rPr>
+              <w:lastRenderedPageBreak/>
               <w:t>Module quản lý hộ gia đình &amp; nhân khẩu</w:t>
             </w:r>
           </w:p>
@@ -2741,7 +2749,56 @@
                 <w:sz w:val="21"/>
                 <w:szCs w:val="21"/>
               </w:rPr>
-              <w:t>Nhập liệu dữ liệu ban đầu (nhân khẩu, hộ khẩu, phí)</w:t>
+              <w:lastRenderedPageBreak/>
+              <w:t xml:space="preserve">Nhập liệu dữ liệu </w:t>
+            </w:r>
+            <w:r>
+              <w:rPr>
+                <w:rFonts w:ascii="Arial" w:eastAsia="Arial" w:hAnsi="Arial" w:cs="Arial"/>
+                <w:sz w:val="21"/>
+                <w:szCs w:val="21"/>
+              </w:rPr>
+              <w:t xml:space="preserve">thực tế </w:t>
+            </w:r>
+            <w:r>
+              <w:rPr>
+                <w:rFonts w:ascii="Arial" w:eastAsia="Arial" w:hAnsi="Arial" w:cs="Arial"/>
+                <w:sz w:val="21"/>
+                <w:szCs w:val="21"/>
+              </w:rPr>
+              <w:t xml:space="preserve">ban đầu </w:t>
+            </w:r>
+            <w:r>
+              <w:rPr>
+                <w:rFonts w:ascii="Arial" w:eastAsia="Arial" w:hAnsi="Arial" w:cs="Arial"/>
+                <w:sz w:val="21"/>
+                <w:szCs w:val="21"/>
+              </w:rPr>
+              <w:t>của toàn bộ 400 căn</w:t>
+            </w:r>
+            <w:r>
+              <w:rPr>
+                <w:rFonts w:ascii="Arial" w:eastAsia="Arial" w:hAnsi="Arial" w:cs="Arial"/>
+                <w:sz w:val="21"/>
+                <w:szCs w:val="21"/>
+              </w:rPr>
+              <w:t xml:space="preserve"> hộ </w:t>
+            </w:r>
+            <w:r>
+              <w:rPr>
+                <w:rFonts w:ascii="Arial" w:eastAsia="Arial" w:hAnsi="Arial" w:cs="Arial"/>
+                <w:sz w:val="21"/>
+                <w:szCs w:val="21"/>
+              </w:rPr>
+              <w:t>vào hệ thống (khách hàng tự thực hiện qua công cụ Import do nhóm xây dựng; nhóm không chịu trách nhiệm nhập tay dữ liệu thay khách hàng</w:t>
+            </w:r>
+            <w:r>
+              <w:rPr>
+                <w:rFonts w:ascii="Arial" w:eastAsia="Arial" w:hAnsi="Arial" w:cs="Arial"/>
+                <w:sz w:val="21"/>
+                <w:szCs w:val="21"/>
+              </w:rPr>
+              <w:t>)</w:t>
             </w:r>
           </w:p>
           <w:p>
@@ -2872,7 +2929,6 @@
                 <w:sz w:val="21"/>
                 <w:szCs w:val="21"/>
               </w:rPr>
-              <w:lastRenderedPageBreak/>
               <w:t>Thành phần</w:t>
             </w:r>
           </w:p>
@@ -3430,6 +3486,240 @@
                 <w:szCs w:val="21"/>
               </w:rPr>
               <w:t>Agile – Scrum (3 Sprint + Sprint 0)</w:t>
+            </w:r>
+          </w:p>
+        </w:tc>
+      </w:tr>
+      <w:tr>
+        <w:tc>
+          <w:tcPr>
+            <w:tcW w:w="2000" w:type="dxa"/>
+            <w:tcBorders>
+              <w:top w:val="single" w:sz="4" w:space="0" w:color="AAAAAA"/>
+              <w:left w:val="single" w:sz="4" w:space="0" w:color="AAAAAA"/>
+              <w:bottom w:val="single" w:sz="4" w:space="0" w:color="AAAAAA"/>
+              <w:right w:val="single" w:sz="4" w:space="0" w:color="AAAAAA"/>
+            </w:tcBorders>
+            <w:shd w:val="clear" w:color="auto" w:fill="F2F2F2"/>
+            <w:tcMar>
+              <w:top w:w="80" w:type="dxa"/>
+              <w:left w:w="140" w:type="dxa"/>
+              <w:bottom w:w="80" w:type="dxa"/>
+              <w:right w:w="140" w:type="dxa"/>
+            </w:tcMar>
+            <w:vAlign w:val="center"/>
+          </w:tcPr>
+          <w:p>
+            <w:pPr>
+              <w:rPr>
+                <w:rFonts w:ascii="Arial" w:eastAsia="Arial" w:hAnsi="Arial" w:cs="Arial"/>
+                <w:color w:val="000000"/>
+                <w:sz w:val="21"/>
+                <w:szCs w:val="21"/>
+              </w:rPr>
+            </w:pPr>
+            <w:r>
+              <w:rPr>
+                <w:rFonts w:ascii="Arial" w:eastAsia="Arial" w:hAnsi="Arial" w:cs="Arial"/>
+                <w:color w:val="000000"/>
+                <w:sz w:val="21"/>
+                <w:szCs w:val="21"/>
+              </w:rPr>
+              <w:t>Thư viện UI</w:t>
+            </w:r>
+          </w:p>
+        </w:tc>
+        <w:tc>
+          <w:tcPr>
+            <w:tcW w:w="7746" w:type="dxa"/>
+            <w:tcBorders>
+              <w:top w:val="single" w:sz="4" w:space="0" w:color="AAAAAA"/>
+              <w:left w:val="single" w:sz="4" w:space="0" w:color="AAAAAA"/>
+              <w:bottom w:val="single" w:sz="4" w:space="0" w:color="AAAAAA"/>
+              <w:right w:val="single" w:sz="4" w:space="0" w:color="AAAAAA"/>
+            </w:tcBorders>
+            <w:shd w:val="clear" w:color="auto" w:fill="F2F2F2"/>
+            <w:tcMar>
+              <w:top w:w="80" w:type="dxa"/>
+              <w:left w:w="140" w:type="dxa"/>
+              <w:bottom w:w="80" w:type="dxa"/>
+              <w:right w:w="140" w:type="dxa"/>
+            </w:tcMar>
+            <w:vAlign w:val="center"/>
+          </w:tcPr>
+          <w:p>
+            <w:pPr>
+              <w:rPr>
+                <w:rFonts w:ascii="Arial" w:eastAsia="Arial" w:hAnsi="Arial" w:cs="Arial"/>
+                <w:color w:val="000000"/>
+                <w:sz w:val="21"/>
+                <w:szCs w:val="21"/>
+              </w:rPr>
+            </w:pPr>
+            <w:r>
+              <w:rPr>
+                <w:rFonts w:ascii="Arial" w:eastAsia="Arial" w:hAnsi="Arial" w:cs="Arial"/>
+                <w:color w:val="000000"/>
+                <w:sz w:val="21"/>
+                <w:szCs w:val="21"/>
+              </w:rPr>
+              <w:t>Bootstrap 5.3.2 + Bootstrap Icons 1.11.3 (CDN)</w:t>
+            </w:r>
+          </w:p>
+        </w:tc>
+      </w:tr>
+      <w:tr>
+        <w:tc>
+          <w:tcPr>
+            <w:tcW w:w="2000" w:type="dxa"/>
+            <w:tcBorders>
+              <w:top w:val="single" w:sz="4" w:space="0" w:color="AAAAAA"/>
+              <w:left w:val="single" w:sz="4" w:space="0" w:color="AAAAAA"/>
+              <w:bottom w:val="single" w:sz="4" w:space="0" w:color="AAAAAA"/>
+              <w:right w:val="single" w:sz="4" w:space="0" w:color="AAAAAA"/>
+            </w:tcBorders>
+            <w:shd w:val="clear" w:color="auto" w:fill="F2F2F2"/>
+            <w:tcMar>
+              <w:top w:w="80" w:type="dxa"/>
+              <w:left w:w="140" w:type="dxa"/>
+              <w:bottom w:w="80" w:type="dxa"/>
+              <w:right w:w="140" w:type="dxa"/>
+            </w:tcMar>
+            <w:vAlign w:val="center"/>
+          </w:tcPr>
+          <w:p>
+            <w:pPr>
+              <w:rPr>
+                <w:rFonts w:ascii="Arial" w:eastAsia="Arial" w:hAnsi="Arial" w:cs="Arial"/>
+                <w:color w:val="000000"/>
+                <w:sz w:val="21"/>
+                <w:szCs w:val="21"/>
+              </w:rPr>
+            </w:pPr>
+            <w:r>
+              <w:rPr>
+                <w:rFonts w:ascii="Arial" w:eastAsia="Arial" w:hAnsi="Arial" w:cs="Arial"/>
+                <w:color w:val="000000"/>
+                <w:sz w:val="21"/>
+                <w:szCs w:val="21"/>
+              </w:rPr>
+              <w:t>Dịch vụ Email</w:t>
+            </w:r>
+          </w:p>
+        </w:tc>
+        <w:tc>
+          <w:tcPr>
+            <w:tcW w:w="7746" w:type="dxa"/>
+            <w:tcBorders>
+              <w:top w:val="single" w:sz="4" w:space="0" w:color="AAAAAA"/>
+              <w:left w:val="single" w:sz="4" w:space="0" w:color="AAAAAA"/>
+              <w:bottom w:val="single" w:sz="4" w:space="0" w:color="AAAAAA"/>
+              <w:right w:val="single" w:sz="4" w:space="0" w:color="AAAAAA"/>
+            </w:tcBorders>
+            <w:shd w:val="clear" w:color="auto" w:fill="F2F2F2"/>
+            <w:tcMar>
+              <w:top w:w="80" w:type="dxa"/>
+              <w:left w:w="140" w:type="dxa"/>
+              <w:bottom w:w="80" w:type="dxa"/>
+              <w:right w:w="140" w:type="dxa"/>
+            </w:tcMar>
+            <w:vAlign w:val="center"/>
+          </w:tcPr>
+          <w:p>
+            <w:pPr>
+              <w:rPr>
+                <w:rFonts w:ascii="Arial" w:eastAsia="Arial" w:hAnsi="Arial" w:cs="Arial"/>
+                <w:color w:val="000000"/>
+                <w:sz w:val="21"/>
+                <w:szCs w:val="21"/>
+              </w:rPr>
+            </w:pPr>
+            <w:r>
+              <w:rPr>
+                <w:rFonts w:ascii="Arial" w:eastAsia="Arial" w:hAnsi="Arial" w:cs="Arial"/>
+                <w:color w:val="000000"/>
+                <w:sz w:val="21"/>
+                <w:szCs w:val="21"/>
+              </w:rPr>
+              <w:t>Brevo Transactional Email API (REST qua RestClient, không dùng SMTP/JavaMailSender) — dùng cho thông báo khoản thu mới, nhắc nợ tự động</w:t>
+            </w:r>
+          </w:p>
+        </w:tc>
+      </w:tr>
+      <w:tr>
+        <w:tc>
+          <w:tcPr>
+            <w:tcW w:w="2000" w:type="dxa"/>
+            <w:tcBorders>
+              <w:top w:val="single" w:sz="4" w:space="0" w:color="AAAAAA"/>
+              <w:left w:val="single" w:sz="4" w:space="0" w:color="AAAAAA"/>
+              <w:bottom w:val="single" w:sz="4" w:space="0" w:color="AAAAAA"/>
+              <w:right w:val="single" w:sz="4" w:space="0" w:color="AAAAAA"/>
+            </w:tcBorders>
+            <w:shd w:val="clear" w:color="auto" w:fill="F2F2F2"/>
+            <w:tcMar>
+              <w:top w:w="80" w:type="dxa"/>
+              <w:left w:w="140" w:type="dxa"/>
+              <w:bottom w:w="80" w:type="dxa"/>
+              <w:right w:w="140" w:type="dxa"/>
+            </w:tcMar>
+            <w:vAlign w:val="center"/>
+          </w:tcPr>
+          <w:p>
+            <w:pPr>
+              <w:rPr>
+                <w:rFonts w:ascii="Arial" w:eastAsia="Arial" w:hAnsi="Arial" w:cs="Arial"/>
+                <w:color w:val="000000"/>
+                <w:sz w:val="21"/>
+                <w:szCs w:val="21"/>
+              </w:rPr>
+            </w:pPr>
+            <w:r>
+              <w:rPr>
+                <w:rFonts w:ascii="Arial" w:eastAsia="Arial" w:hAnsi="Arial" w:cs="Arial"/>
+                <w:color w:val="000000"/>
+                <w:sz w:val="21"/>
+                <w:szCs w:val="21"/>
+              </w:rPr>
+              <w:t>Triển khai (Deployment)</w:t>
+            </w:r>
+          </w:p>
+        </w:tc>
+        <w:tc>
+          <w:tcPr>
+            <w:tcW w:w="7746" w:type="dxa"/>
+            <w:tcBorders>
+              <w:top w:val="single" w:sz="4" w:space="0" w:color="AAAAAA"/>
+              <w:left w:val="single" w:sz="4" w:space="0" w:color="AAAAAA"/>
+              <w:bottom w:val="single" w:sz="4" w:space="0" w:color="AAAAAA"/>
+              <w:right w:val="single" w:sz="4" w:space="0" w:color="AAAAAA"/>
+            </w:tcBorders>
+            <w:shd w:val="clear" w:color="auto" w:fill="F2F2F2"/>
+            <w:tcMar>
+              <w:top w:w="80" w:type="dxa"/>
+              <w:left w:w="140" w:type="dxa"/>
+              <w:bottom w:w="80" w:type="dxa"/>
+              <w:right w:w="140" w:type="dxa"/>
+            </w:tcMar>
+            <w:vAlign w:val="center"/>
+          </w:tcPr>
+          <w:p>
+            <w:pPr>
+              <w:rPr>
+                <w:rFonts w:ascii="Arial" w:eastAsia="Arial" w:hAnsi="Arial" w:cs="Arial"/>
+                <w:color w:val="000000"/>
+                <w:sz w:val="21"/>
+                <w:szCs w:val="21"/>
+              </w:rPr>
+            </w:pPr>
+            <w:r>
+              <w:rPr>
+                <w:rFonts w:ascii="Arial" w:eastAsia="Arial" w:hAnsi="Arial" w:cs="Arial"/>
+                <w:color w:val="000000"/>
+                <w:sz w:val="21"/>
+                <w:szCs w:val="21"/>
+              </w:rPr>
+              <w:t>Railway (PaaS) — chỉ phục vụ Web chính qua cổng public. Tính năng sinh hóa đơn mô phỏng thu hộ (/thu-ho/gen, cổng nội bộ 8081) chỉ chạy ở môi trường local, không deploy/không public trên Railway</w:t>
             </w:r>
           </w:p>
         </w:tc>
@@ -4937,7 +5227,6 @@
                 <w:sz w:val="21"/>
                 <w:szCs w:val="21"/>
               </w:rPr>
-              <w:lastRenderedPageBreak/>
               <w:t>Ước tính effort quá lạc quan</w:t>
             </w:r>
           </w:p>
@@ -5211,6 +5500,198 @@
                 <w:szCs w:val="21"/>
               </w:rPr>
               <w:t>Phân công người tìm hiểu trước Sprint 1, sharing nội bộ</w:t>
+            </w:r>
+          </w:p>
+        </w:tc>
+      </w:tr>
+      <w:tr>
+        <w:tc>
+          <w:tcPr>
+            <w:tcW w:w="2800" w:type="dxa"/>
+            <w:tcBorders>
+              <w:top w:val="single" w:sz="4" w:space="0" w:color="AAAAAA"/>
+              <w:left w:val="single" w:sz="4" w:space="0" w:color="AAAAAA"/>
+              <w:bottom w:val="single" w:sz="4" w:space="0" w:color="AAAAAA"/>
+              <w:right w:val="single" w:sz="4" w:space="0" w:color="AAAAAA"/>
+            </w:tcBorders>
+            <w:shd w:val="clear" w:color="auto" w:fill="F2F2F2"/>
+            <w:tcMar>
+              <w:top w:w="80" w:type="dxa"/>
+              <w:left w:w="140" w:type="dxa"/>
+              <w:bottom w:w="80" w:type="dxa"/>
+              <w:right w:w="140" w:type="dxa"/>
+            </w:tcMar>
+            <w:vAlign w:val="center"/>
+          </w:tcPr>
+          <w:p>
+            <w:pPr>
+              <w:rPr>
+                <w:rFonts w:ascii="Arial" w:eastAsia="Arial" w:hAnsi="Arial" w:cs="Arial"/>
+                <w:color w:val="000000"/>
+                <w:sz w:val="21"/>
+                <w:szCs w:val="21"/>
+              </w:rPr>
+            </w:pPr>
+            <w:r>
+              <w:rPr>
+                <w:rFonts w:ascii="Arial" w:eastAsia="Arial" w:hAnsi="Arial" w:cs="Arial"/>
+                <w:color w:val="000000"/>
+                <w:sz w:val="21"/>
+                <w:szCs w:val="21"/>
+              </w:rPr>
+              <w:t>Tính năng Thu hộ điện/nước/internet/gas dùng dữ liệu hóa đơn mô phỏng (SimulationDataService) thay cho tích hợp API thật từ nhà cung cấp (EVN, Hawaco, nhà mạng...), do dự án sinh viên không có quyền truy cập các API đó. Chỉ phục vụ demo cục bộ, không phải tính năng production thật.</w:t>
+            </w:r>
+          </w:p>
+        </w:tc>
+        <w:tc>
+          <w:tcPr>
+            <w:tcW w:w="1200" w:type="dxa"/>
+            <w:tcBorders>
+              <w:top w:val="single" w:sz="4" w:space="0" w:color="AAAAAA"/>
+              <w:left w:val="single" w:sz="4" w:space="0" w:color="AAAAAA"/>
+              <w:bottom w:val="single" w:sz="4" w:space="0" w:color="AAAAAA"/>
+              <w:right w:val="single" w:sz="4" w:space="0" w:color="AAAAAA"/>
+            </w:tcBorders>
+            <w:shd w:val="clear" w:color="auto" w:fill="F2F2F2"/>
+            <w:tcMar>
+              <w:top w:w="80" w:type="dxa"/>
+              <w:left w:w="140" w:type="dxa"/>
+              <w:bottom w:w="80" w:type="dxa"/>
+              <w:right w:w="140" w:type="dxa"/>
+            </w:tcMar>
+            <w:vAlign w:val="center"/>
+          </w:tcPr>
+          <w:p>
+            <w:pPr>
+              <w:rPr>
+                <w:rFonts w:ascii="Arial" w:eastAsia="Arial" w:hAnsi="Arial" w:cs="Arial"/>
+                <w:color w:val="000000"/>
+                <w:sz w:val="21"/>
+                <w:szCs w:val="21"/>
+              </w:rPr>
+            </w:pPr>
+            <w:r>
+              <w:rPr>
+                <w:rFonts w:ascii="Arial" w:eastAsia="Arial" w:hAnsi="Arial" w:cs="Arial"/>
+                <w:color w:val="000000"/>
+                <w:sz w:val="21"/>
+                <w:szCs w:val="21"/>
+              </w:rPr>
+              <w:t>Cao (3)</w:t>
+            </w:r>
+          </w:p>
+        </w:tc>
+        <w:tc>
+          <w:tcPr>
+            <w:tcW w:w="1200" w:type="dxa"/>
+            <w:tcBorders>
+              <w:top w:val="single" w:sz="4" w:space="0" w:color="AAAAAA"/>
+              <w:left w:val="single" w:sz="4" w:space="0" w:color="AAAAAA"/>
+              <w:bottom w:val="single" w:sz="4" w:space="0" w:color="AAAAAA"/>
+              <w:right w:val="single" w:sz="4" w:space="0" w:color="AAAAAA"/>
+            </w:tcBorders>
+            <w:shd w:val="clear" w:color="auto" w:fill="F2F2F2"/>
+            <w:tcMar>
+              <w:top w:w="80" w:type="dxa"/>
+              <w:left w:w="140" w:type="dxa"/>
+              <w:bottom w:w="80" w:type="dxa"/>
+              <w:right w:w="140" w:type="dxa"/>
+            </w:tcMar>
+            <w:vAlign w:val="center"/>
+          </w:tcPr>
+          <w:p>
+            <w:pPr>
+              <w:rPr>
+                <w:rFonts w:ascii="Arial" w:eastAsia="Arial" w:hAnsi="Arial" w:cs="Arial"/>
+                <w:color w:val="000000"/>
+                <w:sz w:val="21"/>
+                <w:szCs w:val="21"/>
+              </w:rPr>
+            </w:pPr>
+            <w:r>
+              <w:rPr>
+                <w:rFonts w:ascii="Arial" w:eastAsia="Arial" w:hAnsi="Arial" w:cs="Arial"/>
+                <w:color w:val="000000"/>
+                <w:sz w:val="21"/>
+                <w:szCs w:val="21"/>
+              </w:rPr>
+              <w:t>Thấp (1)</w:t>
+            </w:r>
+          </w:p>
+        </w:tc>
+        <w:tc>
+          <w:tcPr>
+            <w:tcW w:w="1200" w:type="dxa"/>
+            <w:tcBorders>
+              <w:top w:val="single" w:sz="4" w:space="0" w:color="AAAAAA"/>
+              <w:left w:val="single" w:sz="4" w:space="0" w:color="AAAAAA"/>
+              <w:bottom w:val="single" w:sz="4" w:space="0" w:color="AAAAAA"/>
+              <w:right w:val="single" w:sz="4" w:space="0" w:color="AAAAAA"/>
+            </w:tcBorders>
+            <w:shd w:val="clear" w:color="auto" w:fill="F2F2F2"/>
+            <w:tcMar>
+              <w:top w:w="80" w:type="dxa"/>
+              <w:left w:w="140" w:type="dxa"/>
+              <w:bottom w:w="80" w:type="dxa"/>
+              <w:right w:w="140" w:type="dxa"/>
+            </w:tcMar>
+            <w:vAlign w:val="center"/>
+          </w:tcPr>
+          <w:p>
+            <w:pPr>
+              <w:rPr>
+                <w:rFonts w:ascii="Arial" w:eastAsia="Arial" w:hAnsi="Arial" w:cs="Arial"/>
+                <w:color w:val="000000"/>
+                <w:sz w:val="21"/>
+                <w:szCs w:val="21"/>
+              </w:rPr>
+            </w:pPr>
+            <w:r>
+              <w:rPr>
+                <w:rFonts w:ascii="Arial" w:eastAsia="Arial" w:hAnsi="Arial" w:cs="Arial"/>
+                <w:color w:val="000000"/>
+                <w:sz w:val="21"/>
+                <w:szCs w:val="21"/>
+              </w:rPr>
+              <w:t>3 – Vừa</w:t>
+            </w:r>
+          </w:p>
+        </w:tc>
+        <w:tc>
+          <w:tcPr>
+            <w:tcW w:w="3346" w:type="dxa"/>
+            <w:tcBorders>
+              <w:top w:val="single" w:sz="4" w:space="0" w:color="AAAAAA"/>
+              <w:left w:val="single" w:sz="4" w:space="0" w:color="AAAAAA"/>
+              <w:bottom w:val="single" w:sz="4" w:space="0" w:color="AAAAAA"/>
+              <w:right w:val="single" w:sz="4" w:space="0" w:color="AAAAAA"/>
+            </w:tcBorders>
+            <w:shd w:val="clear" w:color="auto" w:fill="F2F2F2"/>
+            <w:tcMar>
+              <w:top w:w="80" w:type="dxa"/>
+              <w:left w:w="140" w:type="dxa"/>
+              <w:bottom w:w="80" w:type="dxa"/>
+              <w:right w:w="140" w:type="dxa"/>
+            </w:tcMar>
+            <w:vAlign w:val="center"/>
+          </w:tcPr>
+          <w:p>
+            <w:pPr>
+              <w:rPr>
+                <w:rFonts w:ascii="Arial" w:eastAsia="Arial" w:hAnsi="Arial" w:cs="Arial"/>
+                <w:color w:val="000000"/>
+                <w:sz w:val="21"/>
+                <w:szCs w:val="21"/>
+              </w:rPr>
+            </w:pPr>
+            <w:r>
+              <w:rPr>
+                <w:rFonts w:ascii="Arial" w:eastAsia="Arial" w:hAnsi="Arial" w:cs="Arial"/>
+                <w:color w:val="000000"/>
+                <w:sz w:val="21"/>
+                <w:szCs w:val="21"/>
+              </w:rPr>
+              <w:t>Ghi rõ trong tài liệu kỹ thuật và khi demo trước giảng viên rằng số liệu hóa đơn là mô phỏng deterministic theo hộ/dịch vụ/kỳ, không phải dữ liệu thật từ nhà cung cấp.</w:t>
             </w:r>
           </w:p>
         </w:tc>
@@ -5306,7 +5787,23 @@
           <w:sz w:val="22"/>
           <w:szCs w:val="22"/>
         </w:rPr>
-        <w:t>Hệ thống phải hoạt động ổn định trên các máy tính sử dụng Windows 10/11 có cài đặt Java JDK 17+ và MySQL 8+.</w:t>
+        <w:t xml:space="preserve">Hệ thống </w:t>
+      </w:r>
+      <w:r>
+        <w:rPr>
+          <w:rFonts w:ascii="Arial" w:eastAsia="Arial" w:hAnsi="Arial" w:cs="Arial"/>
+          <w:sz w:val="22"/>
+          <w:szCs w:val="22"/>
+        </w:rPr>
+        <w:t>production được triển khai trên Railway (container Linux, JDK 17+ runtime, MySQL 8+ qua addon do Railway cung cấp). Người dùng cuối chỉ cần máy có trình duyệt web hiện đại (Chrome, Edge, Firefox) và kết nối Internet để truy cập, không cần cài đặt phần mềm nào</w:t>
+      </w:r>
+      <w:r>
+        <w:rPr>
+          <w:rFonts w:ascii="Arial" w:eastAsia="Arial" w:hAnsi="Arial" w:cs="Arial"/>
+          <w:sz w:val="22"/>
+          <w:szCs w:val="22"/>
+        </w:rPr>
+        <w:t>.</w:t>
       </w:r>
     </w:p>
     <w:p>
@@ -5777,6 +6274,7 @@
                 <w:sz w:val="21"/>
                 <w:szCs w:val="21"/>
               </w:rPr>
+              <w:lastRenderedPageBreak/>
               <w:t>Sprint Review</w:t>
             </w:r>
           </w:p>
@@ -6586,7 +7084,6 @@
           <w:sz w:val="22"/>
           <w:szCs w:val="22"/>
         </w:rPr>
-        <w:lastRenderedPageBreak/>
         <w:t>Product Backlog được quản lý trong file KeHoach_Scrum_BlueMoon.xlsx, liên kết với Raw Log theo mã RL-xxx.</w:t>
       </w:r>
     </w:p>
@@ -6616,6 +7113,11 @@
           <w:numId w:val="2"/>
         </w:numPr>
         <w:spacing w:before="40" w:after="40"/>
+        <w:rPr>
+          <w:rFonts w:ascii="Arial" w:eastAsia="Arial" w:hAnsi="Arial" w:cs="Arial"/>
+          <w:sz w:val="22"/>
+          <w:szCs w:val="22"/>
+        </w:rPr>
       </w:pPr>
       <w:r>
         <w:rPr>
@@ -6626,7 +7128,132 @@
         <w:t>Tài liệu này kết hợp với Bảng quản lý rủi ro (Quan_ly_rui_ro.xlsx) tạo thành bộ tài liệu dự án đầy đủ theo yêu cầu Bài 4.1 và 4.3.</w:t>
       </w:r>
     </w:p>
+    <w:p>
+      <w:pPr>
+        <w:rPr>
+          <w:rFonts w:ascii="Arial" w:eastAsia="Arial" w:hAnsi="Arial" w:cs="Arial"/>
+          <w:b/>
+          <w:color w:val="1F4E79"/>
+          <w:sz w:val="28"/>
+        </w:rPr>
+      </w:pPr>
+      <w:r>
+        <w:rPr>
+          <w:rFonts w:ascii="Arial" w:eastAsia="Arial" w:hAnsi="Arial" w:cs="Arial"/>
+          <w:b/>
+          <w:color w:val="1F4E79"/>
+          <w:sz w:val="28"/>
+        </w:rPr>
+        <w:t>8. Phụ lục — Mở rộng phạm vi v2.0</w:t>
+      </w:r>
+    </w:p>
+    <w:p>
+      <w:pPr>
+        <w:rPr>
+          <w:rFonts w:ascii="Arial" w:eastAsia="Arial" w:hAnsi="Arial" w:cs="Arial"/>
+          <w:color w:val="000000"/>
+          <w:sz w:val="22"/>
+        </w:rPr>
+      </w:pPr>
+      <w:r>
+        <w:rPr>
+          <w:rFonts w:ascii="Arial" w:eastAsia="Arial" w:hAnsi="Arial" w:cs="Arial"/>
+          <w:color w:val="000000"/>
+          <w:sz w:val="22"/>
+        </w:rPr>
+        <w:t>Sau khi hoàn thành phiên bản v1.0 theo đúng phạm vi và timeline đã ký kết ở mục 4.5 và 4.8 (3 Sprint phát triển + Sprint 0, tổng cộng 8 tuần), nhóm đã thực hiện thêm các Sprint bổ sung để xây dựng phần mở rộng v2.0, bao gồm:</w:t>
+      </w:r>
+    </w:p>
+    <w:p>
+      <w:pPr>
+        <w:pStyle w:val="oancuaDanhsach"/>
+        <w:numPr>
+          <w:ilvl w:val="0"/>
+          <w:numId w:val="2"/>
+        </w:numPr>
+        <w:rPr>
+          <w:rFonts w:ascii="Arial" w:eastAsia="Arial" w:hAnsi="Arial" w:cs="Arial"/>
+          <w:color w:val="000000"/>
+          <w:sz w:val="22"/>
+        </w:rPr>
+      </w:pPr>
+      <w:r>
+        <w:rPr>
+          <w:rFonts w:ascii="Arial" w:eastAsia="Arial" w:hAnsi="Arial" w:cs="Arial"/>
+          <w:color w:val="000000"/>
+          <w:sz w:val="22"/>
+        </w:rPr>
+        <w:t>Quản lý Hóa đơn Thu hộ (điện/nước/internet/gas) tại một module riêng /thu-ho.</w:t>
+      </w:r>
+    </w:p>
+    <w:p>
+      <w:pPr>
+        <w:pStyle w:val="oancuaDanhsach"/>
+        <w:numPr>
+          <w:ilvl w:val="0"/>
+          <w:numId w:val="2"/>
+        </w:numPr>
+        <w:rPr>
+          <w:rFonts w:ascii="Arial" w:eastAsia="Arial" w:hAnsi="Arial" w:cs="Arial"/>
+          <w:color w:val="000000"/>
+          <w:sz w:val="22"/>
+        </w:rPr>
+      </w:pPr>
+      <w:r>
+        <w:rPr>
+          <w:rFonts w:ascii="Arial" w:eastAsia="Arial" w:hAnsi="Arial" w:cs="Arial"/>
+          <w:color w:val="000000"/>
+          <w:sz w:val="22"/>
+        </w:rPr>
+        <w:t>Mẫu khoản thu định kỳ tự động sinh kỳ thu hàng tháng.</w:t>
+      </w:r>
+    </w:p>
+    <w:p>
+      <w:pPr>
+        <w:pStyle w:val="oancuaDanhsach"/>
+        <w:numPr>
+          <w:ilvl w:val="0"/>
+          <w:numId w:val="2"/>
+        </w:numPr>
+        <w:rPr>
+          <w:rFonts w:ascii="Arial" w:eastAsia="Arial" w:hAnsi="Arial" w:cs="Arial"/>
+          <w:color w:val="000000"/>
+          <w:sz w:val="22"/>
+        </w:rPr>
+      </w:pPr>
+      <w:r>
+        <w:rPr>
+          <w:rFonts w:ascii="Arial" w:eastAsia="Arial" w:hAnsi="Arial" w:cs="Arial"/>
+          <w:color w:val="000000"/>
+          <w:sz w:val="22"/>
+        </w:rPr>
+        <w:t>Hoàn thiện quản lý phí gửi xe (PER_XE).</w:t>
+      </w:r>
+    </w:p>
+    <w:p>
+      <w:pPr>
+        <w:rPr>
+          <w:rFonts w:ascii="Arial" w:hAnsi="Arial" w:cs="Arial"/>
+          <w:color w:val="000000"/>
+          <w:sz w:val="22"/>
+        </w:rPr>
+      </w:pPr>
+      <w:r>
+        <w:rPr>
+          <w:rFonts w:ascii="Arial" w:eastAsia="Arial" w:hAnsi="Arial" w:cs="Arial"/>
+          <w:color w:val="000000"/>
+          <w:sz w:val="22"/>
+        </w:rPr>
+        <w:t>Đây là phần mở rộng ngoài cam kết ban đầu của Charter v1.0, được thực hiện theo thỏa thuận bổ sung với giảng viên hướng dẫn / nhà tài trợ dự án. Do đó phần mở rộng này không nằm trong ràng buộc “không kéo dài quá 8 tuần” của Charter gốc.</w:t>
+      </w:r>
+    </w:p>
     <w:sectPr>
+      <w:headerReference w:type="even" r:id="rId7"/>
+      <w:headerReference w:type="default" r:id="rId8"/>
+      <w:footerReference w:type="even" r:id="rId9"/>
+      <w:footerReference w:type="default" r:id="rId10"/>
+      <w:headerReference w:type="first" r:id="rId11"/>
+      <w:footerReference w:type="first" r:id="rId12"/>
       <w:pgSz w:w="11906" w:h="16838"/>
       <w:pgMar w:top="1080" w:right="1080" w:bottom="1080" w:left="1080" w:header="708" w:footer="708" w:gutter="0"/>
       <w:cols w:space="720"/>
@@ -6634,6 +7261,104 @@
     </w:sectPr>
   </w:body>
 </w:document>
+</file>
+
+<file path=word/endnotes.xml><?xml version="1.0" encoding="utf-8"?>
+<w:endnotes xmlns:wpc="http://schemas.microsoft.com/office/word/2010/wordprocessingCanvas" xmlns:cx="http://schemas.microsoft.com/office/drawing/2014/chartex" xmlns:cx1="http://schemas.microsoft.com/office/drawing/2015/9/8/chartex" xmlns:cx2="http://schemas.microsoft.com/office/drawing/2015/10/21/chartex" xmlns:cx3="http://schemas.microsoft.com/office/drawing/2016/5/9/chartex" xmlns:cx4="http://schemas.microsoft.com/office/drawing/2016/5/10/chartex" xmlns:cx5="http://schemas.microsoft.com/office/drawing/2016/5/11/chartex" xmlns:cx6="http://schemas.microsoft.com/office/drawing/2016/5/12/chartex" xmlns:cx7="http://schemas.microsoft.com/office/drawing/2016/5/13/chartex" xmlns:cx8="http://schemas.microsoft.com/office/drawing/2016/5/14/chartex" xmlns:mc="http://schemas.openxmlformats.org/markup-compatibility/2006" xmlns:aink="http://schemas.microsoft.com/office/drawing/2016/ink" xmlns:am3d="http://schemas.microsoft.com/office/drawing/2017/model3d" xmlns:o="urn:schemas-microsoft-com:office:office" xmlns:oel="http://schemas.microsoft.com/office/2019/extlst" xmlns:r="http://schemas.openxmlformats.org/officeDocument/2006/relationships" xmlns:m="http://schemas.openxmlformats.org/officeDocument/2006/math" xmlns:v="urn:schemas-microsoft-com:vml" xmlns:wp14="http://schemas.microsoft.com/office/word/2010/wordprocessingDrawing" xmlns:wp="http://schemas.openxmlformats.org/drawingml/2006/wordprocessingDrawing" xmlns:w10="urn:schemas-microsoft-com:office:word" xmlns:w="http://schemas.openxmlformats.org/wordprocessingml/2006/main" xmlns:w14="http://schemas.microsoft.com/office/word/2010/wordml" xmlns:w15="http://schemas.microsoft.com/office/word/2012/wordml" xmlns:w16cex="http://schemas.microsoft.com/office/word/2018/wordml/cex" xmlns:w16cid="http://schemas.microsoft.com/office/word/2016/wordml/cid" xmlns:w16="http://schemas.microsoft.com/office/word/2018/wordml" xmlns:w16du="http://schemas.microsoft.com/office/word/2023/wordml/word16du" xmlns:w16sdtdh="http://schemas.microsoft.com/office/word/2020/wordml/sdtdatahash" xmlns:w16sdtfl="http://schemas.microsoft.com/office/word/2024/wordml/sdtformatlock" xmlns:w16se="http://schemas.microsoft.com/office/word/2015/wordml/symex" xmlns:wpg="http://schemas.microsoft.com/office/word/2010/wordprocessingGroup" xmlns:wpi="http://schemas.microsoft.com/office/word/2010/wordprocessingInk" xmlns:wne="http://schemas.microsoft.com/office/word/2006/wordml" xmlns:wps="http://schemas.microsoft.com/office/word/2010/wordprocessingShape" mc:Ignorable="w14 w15 w16se w16cid w16 w16cex w16sdtdh w16sdtfl w16du wp14">
+  <w:endnote w:type="separator" w:id="-1">
+    <w:p>
+      <w:r>
+        <w:separator/>
+      </w:r>
+    </w:p>
+  </w:endnote>
+  <w:endnote w:type="continuationSeparator" w:id="0">
+    <w:p>
+      <w:r>
+        <w:continuationSeparator/>
+      </w:r>
+    </w:p>
+  </w:endnote>
+</w:endnotes>
+</file>
+
+<file path=word/footer1.xml><?xml version="1.0" encoding="utf-8"?>
+<w:ftr xmlns:wpc="http://schemas.microsoft.com/office/word/2010/wordprocessingCanvas" xmlns:cx="http://schemas.microsoft.com/office/drawing/2014/chartex" xmlns:cx1="http://schemas.microsoft.com/office/drawing/2015/9/8/chartex" xmlns:cx2="http://schemas.microsoft.com/office/drawing/2015/10/21/chartex" xmlns:cx3="http://schemas.microsoft.com/office/drawing/2016/5/9/chartex" xmlns:cx4="http://schemas.microsoft.com/office/drawing/2016/5/10/chartex" xmlns:cx5="http://schemas.microsoft.com/office/drawing/2016/5/11/chartex" xmlns:cx6="http://schemas.microsoft.com/office/drawing/2016/5/12/chartex" xmlns:cx7="http://schemas.microsoft.com/office/drawing/2016/5/13/chartex" xmlns:cx8="http://schemas.microsoft.com/office/drawing/2016/5/14/chartex" xmlns:mc="http://schemas.openxmlformats.org/markup-compatibility/2006" xmlns:aink="http://schemas.microsoft.com/office/drawing/2016/ink" xmlns:am3d="http://schemas.microsoft.com/office/drawing/2017/model3d" xmlns:o="urn:schemas-microsoft-com:office:office" xmlns:oel="http://schemas.microsoft.com/office/2019/extlst" xmlns:r="http://schemas.openxmlformats.org/officeDocument/2006/relationships" xmlns:m="http://schemas.openxmlformats.org/officeDocument/2006/math" xmlns:v="urn:schemas-microsoft-com:vml" xmlns:wp14="http://schemas.microsoft.com/office/word/2010/wordprocessingDrawing" xmlns:wp="http://schemas.openxmlformats.org/drawingml/2006/wordprocessingDrawing" xmlns:w10="urn:schemas-microsoft-com:office:word" xmlns:w="http://schemas.openxmlformats.org/wordprocessingml/2006/main" xmlns:w14="http://schemas.microsoft.com/office/word/2010/wordml" xmlns:w15="http://schemas.microsoft.com/office/word/2012/wordml" xmlns:w16cex="http://schemas.microsoft.com/office/word/2018/wordml/cex" xmlns:w16cid="http://schemas.microsoft.com/office/word/2016/wordml/cid" xmlns:w16="http://schemas.microsoft.com/office/word/2018/wordml" xmlns:w16du="http://schemas.microsoft.com/office/word/2023/wordml/word16du" xmlns:w16sdtdh="http://schemas.microsoft.com/office/word/2020/wordml/sdtdatahash" xmlns:w16sdtfl="http://schemas.microsoft.com/office/word/2024/wordml/sdtformatlock" xmlns:w16se="http://schemas.microsoft.com/office/word/2015/wordml/symex" xmlns:wpg="http://schemas.microsoft.com/office/word/2010/wordprocessingGroup" xmlns:wpi="http://schemas.microsoft.com/office/word/2010/wordprocessingInk" xmlns:wne="http://schemas.microsoft.com/office/word/2006/wordml" xmlns:wps="http://schemas.microsoft.com/office/word/2010/wordprocessingShape" mc:Ignorable="w14 w15 w16se w16cid w16 w16cex w16sdtdh w16sdtfl w16du wp14">
+  <w:p>
+    <w:pPr>
+      <w:pStyle w:val="Chntrang"/>
+    </w:pPr>
+  </w:p>
+</w:ftr>
+</file>
+
+<file path=word/footer2.xml><?xml version="1.0" encoding="utf-8"?>
+<w:ftr xmlns:wpc="http://schemas.microsoft.com/office/word/2010/wordprocessingCanvas" xmlns:cx="http://schemas.microsoft.com/office/drawing/2014/chartex" xmlns:cx1="http://schemas.microsoft.com/office/drawing/2015/9/8/chartex" xmlns:cx2="http://schemas.microsoft.com/office/drawing/2015/10/21/chartex" xmlns:cx3="http://schemas.microsoft.com/office/drawing/2016/5/9/chartex" xmlns:cx4="http://schemas.microsoft.com/office/drawing/2016/5/10/chartex" xmlns:cx5="http://schemas.microsoft.com/office/drawing/2016/5/11/chartex" xmlns:cx6="http://schemas.microsoft.com/office/drawing/2016/5/12/chartex" xmlns:cx7="http://schemas.microsoft.com/office/drawing/2016/5/13/chartex" xmlns:cx8="http://schemas.microsoft.com/office/drawing/2016/5/14/chartex" xmlns:mc="http://schemas.openxmlformats.org/markup-compatibility/2006" xmlns:aink="http://schemas.microsoft.com/office/drawing/2016/ink" xmlns:am3d="http://schemas.microsoft.com/office/drawing/2017/model3d" xmlns:o="urn:schemas-microsoft-com:office:office" xmlns:oel="http://schemas.microsoft.com/office/2019/extlst" xmlns:r="http://schemas.openxmlformats.org/officeDocument/2006/relationships" xmlns:m="http://schemas.openxmlformats.org/officeDocument/2006/math" xmlns:v="urn:schemas-microsoft-com:vml" xmlns:wp14="http://schemas.microsoft.com/office/word/2010/wordprocessingDrawing" xmlns:wp="http://schemas.openxmlformats.org/drawingml/2006/wordprocessingDrawing" xmlns:w10="urn:schemas-microsoft-com:office:word" xmlns:w="http://schemas.openxmlformats.org/wordprocessingml/2006/main" xmlns:w14="http://schemas.microsoft.com/office/word/2010/wordml" xmlns:w15="http://schemas.microsoft.com/office/word/2012/wordml" xmlns:w16cex="http://schemas.microsoft.com/office/word/2018/wordml/cex" xmlns:w16cid="http://schemas.microsoft.com/office/word/2016/wordml/cid" xmlns:w16="http://schemas.microsoft.com/office/word/2018/wordml" xmlns:w16du="http://schemas.microsoft.com/office/word/2023/wordml/word16du" xmlns:w16sdtdh="http://schemas.microsoft.com/office/word/2020/wordml/sdtdatahash" xmlns:w16sdtfl="http://schemas.microsoft.com/office/word/2024/wordml/sdtformatlock" xmlns:w16se="http://schemas.microsoft.com/office/word/2015/wordml/symex" xmlns:wpg="http://schemas.microsoft.com/office/word/2010/wordprocessingGroup" xmlns:wpi="http://schemas.microsoft.com/office/word/2010/wordprocessingInk" xmlns:wne="http://schemas.microsoft.com/office/word/2006/wordml" xmlns:wps="http://schemas.microsoft.com/office/word/2010/wordprocessingShape" mc:Ignorable="w14 w15 w16se w16cid w16 w16cex w16sdtdh w16sdtfl w16du wp14">
+  <w:p>
+    <w:pPr>
+      <w:pStyle w:val="Chntrang"/>
+    </w:pPr>
+  </w:p>
+</w:ftr>
+</file>
+
+<file path=word/footer3.xml><?xml version="1.0" encoding="utf-8"?>
+<w:ftr xmlns:wpc="http://schemas.microsoft.com/office/word/2010/wordprocessingCanvas" xmlns:cx="http://schemas.microsoft.com/office/drawing/2014/chartex" xmlns:cx1="http://schemas.microsoft.com/office/drawing/2015/9/8/chartex" xmlns:cx2="http://schemas.microsoft.com/office/drawing/2015/10/21/chartex" xmlns:cx3="http://schemas.microsoft.com/office/drawing/2016/5/9/chartex" xmlns:cx4="http://schemas.microsoft.com/office/drawing/2016/5/10/chartex" xmlns:cx5="http://schemas.microsoft.com/office/drawing/2016/5/11/chartex" xmlns:cx6="http://schemas.microsoft.com/office/drawing/2016/5/12/chartex" xmlns:cx7="http://schemas.microsoft.com/office/drawing/2016/5/13/chartex" xmlns:cx8="http://schemas.microsoft.com/office/drawing/2016/5/14/chartex" xmlns:mc="http://schemas.openxmlformats.org/markup-compatibility/2006" xmlns:aink="http://schemas.microsoft.com/office/drawing/2016/ink" xmlns:am3d="http://schemas.microsoft.com/office/drawing/2017/model3d" xmlns:o="urn:schemas-microsoft-com:office:office" xmlns:oel="http://schemas.microsoft.com/office/2019/extlst" xmlns:r="http://schemas.openxmlformats.org/officeDocument/2006/relationships" xmlns:m="http://schemas.openxmlformats.org/officeDocument/2006/math" xmlns:v="urn:schemas-microsoft-com:vml" xmlns:wp14="http://schemas.microsoft.com/office/word/2010/wordprocessingDrawing" xmlns:wp="http://schemas.openxmlformats.org/drawingml/2006/wordprocessingDrawing" xmlns:w10="urn:schemas-microsoft-com:office:word" xmlns:w="http://schemas.openxmlformats.org/wordprocessingml/2006/main" xmlns:w14="http://schemas.microsoft.com/office/word/2010/wordml" xmlns:w15="http://schemas.microsoft.com/office/word/2012/wordml" xmlns:w16cex="http://schemas.microsoft.com/office/word/2018/wordml/cex" xmlns:w16cid="http://schemas.microsoft.com/office/word/2016/wordml/cid" xmlns:w16="http://schemas.microsoft.com/office/word/2018/wordml" xmlns:w16du="http://schemas.microsoft.com/office/word/2023/wordml/word16du" xmlns:w16sdtdh="http://schemas.microsoft.com/office/word/2020/wordml/sdtdatahash" xmlns:w16sdtfl="http://schemas.microsoft.com/office/word/2024/wordml/sdtformatlock" xmlns:w16se="http://schemas.microsoft.com/office/word/2015/wordml/symex" xmlns:wpg="http://schemas.microsoft.com/office/word/2010/wordprocessingGroup" xmlns:wpi="http://schemas.microsoft.com/office/word/2010/wordprocessingInk" xmlns:wne="http://schemas.microsoft.com/office/word/2006/wordml" xmlns:wps="http://schemas.microsoft.com/office/word/2010/wordprocessingShape" mc:Ignorable="w14 w15 w16se w16cid w16 w16cex w16sdtdh w16sdtfl w16du wp14">
+  <w:p>
+    <w:pPr>
+      <w:pStyle w:val="Chntrang"/>
+    </w:pPr>
+  </w:p>
+</w:ftr>
+</file>
+
+<file path=word/footnotes.xml><?xml version="1.0" encoding="utf-8"?>
+<w:footnotes xmlns:wpc="http://schemas.microsoft.com/office/word/2010/wordprocessingCanvas" xmlns:cx="http://schemas.microsoft.com/office/drawing/2014/chartex" xmlns:cx1="http://schemas.microsoft.com/office/drawing/2015/9/8/chartex" xmlns:cx2="http://schemas.microsoft.com/office/drawing/2015/10/21/chartex" xmlns:cx3="http://schemas.microsoft.com/office/drawing/2016/5/9/chartex" xmlns:cx4="http://schemas.microsoft.com/office/drawing/2016/5/10/chartex" xmlns:cx5="http://schemas.microsoft.com/office/drawing/2016/5/11/chartex" xmlns:cx6="http://schemas.microsoft.com/office/drawing/2016/5/12/chartex" xmlns:cx7="http://schemas.microsoft.com/office/drawing/2016/5/13/chartex" xmlns:cx8="http://schemas.microsoft.com/office/drawing/2016/5/14/chartex" xmlns:mc="http://schemas.openxmlformats.org/markup-compatibility/2006" xmlns:aink="http://schemas.microsoft.com/office/drawing/2016/ink" xmlns:am3d="http://schemas.microsoft.com/office/drawing/2017/model3d" xmlns:o="urn:schemas-microsoft-com:office:office" xmlns:oel="http://schemas.microsoft.com/office/2019/extlst" xmlns:r="http://schemas.openxmlformats.org/officeDocument/2006/relationships" xmlns:m="http://schemas.openxmlformats.org/officeDocument/2006/math" xmlns:v="urn:schemas-microsoft-com:vml" xmlns:wp14="http://schemas.microsoft.com/office/word/2010/wordprocessingDrawing" xmlns:wp="http://schemas.openxmlformats.org/drawingml/2006/wordprocessingDrawing" xmlns:w10="urn:schemas-microsoft-com:office:word" xmlns:w="http://schemas.openxmlformats.org/wordprocessingml/2006/main" xmlns:w14="http://schemas.microsoft.com/office/word/2010/wordml" xmlns:w15="http://schemas.microsoft.com/office/word/2012/wordml" xmlns:w16cex="http://schemas.microsoft.com/office/word/2018/wordml/cex" xmlns:w16cid="http://schemas.microsoft.com/office/word/2016/wordml/cid" xmlns:w16="http://schemas.microsoft.com/office/word/2018/wordml" xmlns:w16du="http://schemas.microsoft.com/office/word/2023/wordml/word16du" xmlns:w16sdtdh="http://schemas.microsoft.com/office/word/2020/wordml/sdtdatahash" xmlns:w16sdtfl="http://schemas.microsoft.com/office/word/2024/wordml/sdtformatlock" xmlns:w16se="http://schemas.microsoft.com/office/word/2015/wordml/symex" xmlns:wpg="http://schemas.microsoft.com/office/word/2010/wordprocessingGroup" xmlns:wpi="http://schemas.microsoft.com/office/word/2010/wordprocessingInk" xmlns:wne="http://schemas.microsoft.com/office/word/2006/wordml" xmlns:wps="http://schemas.microsoft.com/office/word/2010/wordprocessingShape" mc:Ignorable="w14 w15 w16se w16cid w16 w16cex w16sdtdh w16sdtfl w16du wp14">
+  <w:footnote w:type="separator" w:id="-1">
+    <w:p>
+      <w:r>
+        <w:separator/>
+      </w:r>
+    </w:p>
+  </w:footnote>
+  <w:footnote w:type="continuationSeparator" w:id="0">
+    <w:p>
+      <w:r>
+        <w:continuationSeparator/>
+      </w:r>
+    </w:p>
+  </w:footnote>
+</w:footnotes>
+</file>
+
+<file path=word/header1.xml><?xml version="1.0" encoding="utf-8"?>
+<w:hdr xmlns:wpc="http://schemas.microsoft.com/office/word/2010/wordprocessingCanvas" xmlns:cx="http://schemas.microsoft.com/office/drawing/2014/chartex" xmlns:cx1="http://schemas.microsoft.com/office/drawing/2015/9/8/chartex" xmlns:cx2="http://schemas.microsoft.com/office/drawing/2015/10/21/chartex" xmlns:cx3="http://schemas.microsoft.com/office/drawing/2016/5/9/chartex" xmlns:cx4="http://schemas.microsoft.com/office/drawing/2016/5/10/chartex" xmlns:cx5="http://schemas.microsoft.com/office/drawing/2016/5/11/chartex" xmlns:cx6="http://schemas.microsoft.com/office/drawing/2016/5/12/chartex" xmlns:cx7="http://schemas.microsoft.com/office/drawing/2016/5/13/chartex" xmlns:cx8="http://schemas.microsoft.com/office/drawing/2016/5/14/chartex" xmlns:mc="http://schemas.openxmlformats.org/markup-compatibility/2006" xmlns:aink="http://schemas.microsoft.com/office/drawing/2016/ink" xmlns:am3d="http://schemas.microsoft.com/office/drawing/2017/model3d" xmlns:o="urn:schemas-microsoft-com:office:office" xmlns:oel="http://schemas.microsoft.com/office/2019/extlst" xmlns:r="http://schemas.openxmlformats.org/officeDocument/2006/relationships" xmlns:m="http://schemas.openxmlformats.org/officeDocument/2006/math" xmlns:v="urn:schemas-microsoft-com:vml" xmlns:wp14="http://schemas.microsoft.com/office/word/2010/wordprocessingDrawing" xmlns:wp="http://schemas.openxmlformats.org/drawingml/2006/wordprocessingDrawing" xmlns:w10="urn:schemas-microsoft-com:office:word" xmlns:w="http://schemas.openxmlformats.org/wordprocessingml/2006/main" xmlns:w14="http://schemas.microsoft.com/office/word/2010/wordml" xmlns:w15="http://schemas.microsoft.com/office/word/2012/wordml" xmlns:w16cex="http://schemas.microsoft.com/office/word/2018/wordml/cex" xmlns:w16cid="http://schemas.microsoft.com/office/word/2016/wordml/cid" xmlns:w16="http://schemas.microsoft.com/office/word/2018/wordml" xmlns:w16du="http://schemas.microsoft.com/office/word/2023/wordml/word16du" xmlns:w16sdtdh="http://schemas.microsoft.com/office/word/2020/wordml/sdtdatahash" xmlns:w16sdtfl="http://schemas.microsoft.com/office/word/2024/wordml/sdtformatlock" xmlns:w16se="http://schemas.microsoft.com/office/word/2015/wordml/symex" xmlns:wpg="http://schemas.microsoft.com/office/word/2010/wordprocessingGroup" xmlns:wpi="http://schemas.microsoft.com/office/word/2010/wordprocessingInk" xmlns:wne="http://schemas.microsoft.com/office/word/2006/wordml" xmlns:wps="http://schemas.microsoft.com/office/word/2010/wordprocessingShape" mc:Ignorable="w14 w15 w16se w16cid w16 w16cex w16sdtdh w16sdtfl w16du wp14">
+  <w:p>
+    <w:pPr>
+      <w:pStyle w:val="utrang"/>
+    </w:pPr>
+  </w:p>
+</w:hdr>
+</file>
+
+<file path=word/header2.xml><?xml version="1.0" encoding="utf-8"?>
+<w:hdr xmlns:wpc="http://schemas.microsoft.com/office/word/2010/wordprocessingCanvas" xmlns:cx="http://schemas.microsoft.com/office/drawing/2014/chartex" xmlns:cx1="http://schemas.microsoft.com/office/drawing/2015/9/8/chartex" xmlns:cx2="http://schemas.microsoft.com/office/drawing/2015/10/21/chartex" xmlns:cx3="http://schemas.microsoft.com/office/drawing/2016/5/9/chartex" xmlns:cx4="http://schemas.microsoft.com/office/drawing/2016/5/10/chartex" xmlns:cx5="http://schemas.microsoft.com/office/drawing/2016/5/11/chartex" xmlns:cx6="http://schemas.microsoft.com/office/drawing/2016/5/12/chartex" xmlns:cx7="http://schemas.microsoft.com/office/drawing/2016/5/13/chartex" xmlns:cx8="http://schemas.microsoft.com/office/drawing/2016/5/14/chartex" xmlns:mc="http://schemas.openxmlformats.org/markup-compatibility/2006" xmlns:aink="http://schemas.microsoft.com/office/drawing/2016/ink" xmlns:am3d="http://schemas.microsoft.com/office/drawing/2017/model3d" xmlns:o="urn:schemas-microsoft-com:office:office" xmlns:oel="http://schemas.microsoft.com/office/2019/extlst" xmlns:r="http://schemas.openxmlformats.org/officeDocument/2006/relationships" xmlns:m="http://schemas.openxmlformats.org/officeDocument/2006/math" xmlns:v="urn:schemas-microsoft-com:vml" xmlns:wp14="http://schemas.microsoft.com/office/word/2010/wordprocessingDrawing" xmlns:wp="http://schemas.openxmlformats.org/drawingml/2006/wordprocessingDrawing" xmlns:w10="urn:schemas-microsoft-com:office:word" xmlns:w="http://schemas.openxmlformats.org/wordprocessingml/2006/main" xmlns:w14="http://schemas.microsoft.com/office/word/2010/wordml" xmlns:w15="http://schemas.microsoft.com/office/word/2012/wordml" xmlns:w16cex="http://schemas.microsoft.com/office/word/2018/wordml/cex" xmlns:w16cid="http://schemas.microsoft.com/office/word/2016/wordml/cid" xmlns:w16="http://schemas.microsoft.com/office/word/2018/wordml" xmlns:w16du="http://schemas.microsoft.com/office/word/2023/wordml/word16du" xmlns:w16sdtdh="http://schemas.microsoft.com/office/word/2020/wordml/sdtdatahash" xmlns:w16sdtfl="http://schemas.microsoft.com/office/word/2024/wordml/sdtformatlock" xmlns:w16se="http://schemas.microsoft.com/office/word/2015/wordml/symex" xmlns:wpg="http://schemas.microsoft.com/office/word/2010/wordprocessingGroup" xmlns:wpi="http://schemas.microsoft.com/office/word/2010/wordprocessingInk" xmlns:wne="http://schemas.microsoft.com/office/word/2006/wordml" xmlns:wps="http://schemas.microsoft.com/office/word/2010/wordprocessingShape" mc:Ignorable="w14 w15 w16se w16cid w16 w16cex w16sdtdh w16sdtfl w16du wp14">
+  <w:p>
+    <w:pPr>
+      <w:pStyle w:val="utrang"/>
+    </w:pPr>
+  </w:p>
+</w:hdr>
+</file>
+
+<file path=word/header3.xml><?xml version="1.0" encoding="utf-8"?>
+<w:hdr xmlns:wpc="http://schemas.microsoft.com/office/word/2010/wordprocessingCanvas" xmlns:cx="http://schemas.microsoft.com/office/drawing/2014/chartex" xmlns:cx1="http://schemas.microsoft.com/office/drawing/2015/9/8/chartex" xmlns:cx2="http://schemas.microsoft.com/office/drawing/2015/10/21/chartex" xmlns:cx3="http://schemas.microsoft.com/office/drawing/2016/5/9/chartex" xmlns:cx4="http://schemas.microsoft.com/office/drawing/2016/5/10/chartex" xmlns:cx5="http://schemas.microsoft.com/office/drawing/2016/5/11/chartex" xmlns:cx6="http://schemas.microsoft.com/office/drawing/2016/5/12/chartex" xmlns:cx7="http://schemas.microsoft.com/office/drawing/2016/5/13/chartex" xmlns:cx8="http://schemas.microsoft.com/office/drawing/2016/5/14/chartex" xmlns:mc="http://schemas.openxmlformats.org/markup-compatibility/2006" xmlns:aink="http://schemas.microsoft.com/office/drawing/2016/ink" xmlns:am3d="http://schemas.microsoft.com/office/drawing/2017/model3d" xmlns:o="urn:schemas-microsoft-com:office:office" xmlns:oel="http://schemas.microsoft.com/office/2019/extlst" xmlns:r="http://schemas.openxmlformats.org/officeDocument/2006/relationships" xmlns:m="http://schemas.openxmlformats.org/officeDocument/2006/math" xmlns:v="urn:schemas-microsoft-com:vml" xmlns:wp14="http://schemas.microsoft.com/office/word/2010/wordprocessingDrawing" xmlns:wp="http://schemas.openxmlformats.org/drawingml/2006/wordprocessingDrawing" xmlns:w10="urn:schemas-microsoft-com:office:word" xmlns:w="http://schemas.openxmlformats.org/wordprocessingml/2006/main" xmlns:w14="http://schemas.microsoft.com/office/word/2010/wordml" xmlns:w15="http://schemas.microsoft.com/office/word/2012/wordml" xmlns:w16cex="http://schemas.microsoft.com/office/word/2018/wordml/cex" xmlns:w16cid="http://schemas.microsoft.com/office/word/2016/wordml/cid" xmlns:w16="http://schemas.microsoft.com/office/word/2018/wordml" xmlns:w16du="http://schemas.microsoft.com/office/word/2023/wordml/word16du" xmlns:w16sdtdh="http://schemas.microsoft.com/office/word/2020/wordml/sdtdatahash" xmlns:w16sdtfl="http://schemas.microsoft.com/office/word/2024/wordml/sdtformatlock" xmlns:w16se="http://schemas.microsoft.com/office/word/2015/wordml/symex" xmlns:wpg="http://schemas.microsoft.com/office/word/2010/wordprocessingGroup" xmlns:wpi="http://schemas.microsoft.com/office/word/2010/wordprocessingInk" xmlns:wne="http://schemas.microsoft.com/office/word/2006/wordml" xmlns:wps="http://schemas.microsoft.com/office/word/2010/wordprocessingShape" mc:Ignorable="w14 w15 w16se w16cid w16 w16cex w16sdtdh w16sdtfl w16du wp14">
+  <w:p>
+    <w:pPr>
+      <w:pStyle w:val="utrang"/>
+    </w:pPr>
+  </w:p>
+</w:hdr>
 </file>
 
 <file path=word/numbering.xml><?xml version="1.0" encoding="utf-8"?>
@@ -7333,7 +8058,6 @@
   <w:style w:type="character" w:default="1" w:styleId="Phngmcinhcuaoanvn">
     <w:name w:val="Default Paragraph Font"/>
     <w:uiPriority w:val="1"/>
-    <w:semiHidden/>
     <w:unhideWhenUsed/>
   </w:style>
   <w:style w:type="table" w:default="1" w:styleId="BangThngthng">
@@ -7452,6 +8176,48 @@
       <w:color w:val="605E5C"/>
       <w:shd w:val="clear" w:color="auto" w:fill="E1DFDD"/>
     </w:rPr>
+  </w:style>
+  <w:style w:type="paragraph" w:styleId="utrang">
+    <w:name w:val="header"/>
+    <w:basedOn w:val="Binhthng"/>
+    <w:link w:val="utrangChar"/>
+    <w:uiPriority w:val="99"/>
+    <w:unhideWhenUsed/>
+    <w:rsid w:val="00F2106E"/>
+    <w:pPr>
+      <w:tabs>
+        <w:tab w:val="center" w:pos="4513"/>
+        <w:tab w:val="right" w:pos="9026"/>
+      </w:tabs>
+    </w:pPr>
+  </w:style>
+  <w:style w:type="character" w:customStyle="1" w:styleId="utrangChar">
+    <w:name w:val="Đầu trang Char"/>
+    <w:basedOn w:val="Phngmcinhcuaoanvn"/>
+    <w:link w:val="utrang"/>
+    <w:uiPriority w:val="99"/>
+    <w:rsid w:val="00F2106E"/>
+  </w:style>
+  <w:style w:type="paragraph" w:styleId="Chntrang">
+    <w:name w:val="footer"/>
+    <w:basedOn w:val="Binhthng"/>
+    <w:link w:val="ChntrangChar"/>
+    <w:uiPriority w:val="99"/>
+    <w:unhideWhenUsed/>
+    <w:rsid w:val="00F2106E"/>
+    <w:pPr>
+      <w:tabs>
+        <w:tab w:val="center" w:pos="4513"/>
+        <w:tab w:val="right" w:pos="9026"/>
+      </w:tabs>
+    </w:pPr>
+  </w:style>
+  <w:style w:type="character" w:customStyle="1" w:styleId="ChntrangChar">
+    <w:name w:val="Chân trang Char"/>
+    <w:basedOn w:val="Phngmcinhcuaoanvn"/>
+    <w:link w:val="Chntrang"/>
+    <w:uiPriority w:val="99"/>
+    <w:rsid w:val="00F2106E"/>
   </w:style>
 </w:styles>
 </file>
@@ -7769,4 +8535,26 @@
     </a:ext>
   </a:extLst>
 </a:theme>
+</file>
+
+<file path=word/webextensions/taskpanes.xml><?xml version="1.0" encoding="utf-8"?>
+<wetp:taskpanes xmlns:wetp="http://schemas.microsoft.com/office/webextensions/taskpanes/2010/11">
+  <wetp:taskpane dockstate="right" visibility="0" width="438" row="0">
+    <wetp:webextensionref xmlns:r="http://schemas.openxmlformats.org/officeDocument/2006/relationships" r:id="rId1"/>
+  </wetp:taskpane>
+</wetp:taskpanes>
+</file>
+
+<file path=word/webextensions/webextension1.xml><?xml version="1.0" encoding="utf-8"?>
+<we:webextension xmlns:we="http://schemas.microsoft.com/office/webextensions/webextension/2010/11" id="{A114D4B9-5E6F-409B-A008-E9E6458E55E2}">
+  <we:reference id="wa200010453" version="1.0.0.1" store="en-US" storeType="OMEX"/>
+  <we:alternateReferences>
+    <we:reference id="WA200010453" version="1.0.0.1" store="" storeType="OMEX"/>
+  </we:alternateReferences>
+  <we:properties>
+    <we:property name="claude.fileId" value="&quot;6388c43e-50a1-49ec-adeb-db882aa79d60&quot;"/>
+  </we:properties>
+  <we:bindings/>
+  <we:snapshot xmlns:r="http://schemas.openxmlformats.org/officeDocument/2006/relationships"/>
+</we:webextension>
 </file>
</xml_diff>

<commit_message>
số nhóm bị sai
</commit_message>
<xml_diff>
--- a/docs/Nhóm 16/01 - Tai lieu du an/2. Ke hoach du an phan mem/Project_Charter_BlueMoon.docx
+++ b/docs/Nhóm 16/01 - Tai lieu du an/2. Ke hoach du an phan mem/Project_Charter_BlueMoon.docx
@@ -146,7 +146,23 @@
                 <w:sz w:val="22"/>
                 <w:szCs w:val="22"/>
               </w:rPr>
-              <w:t>Nhóm 6</w:t>
+              <w:t xml:space="preserve">Nhóm </w:t>
+            </w:r>
+            <w:r>
+              <w:rPr>
+                <w:rFonts w:ascii="Arial" w:eastAsia="Arial" w:hAnsi="Arial" w:cs="Arial"/>
+                <w:sz w:val="22"/>
+                <w:szCs w:val="22"/>
+              </w:rPr>
+              <w:t>1</w:t>
+            </w:r>
+            <w:r>
+              <w:rPr>
+                <w:rFonts w:ascii="Arial" w:eastAsia="Arial" w:hAnsi="Arial" w:cs="Arial"/>
+                <w:sz w:val="22"/>
+                <w:szCs w:val="22"/>
+              </w:rPr>
+              <w:t>6</w:t>
             </w:r>
           </w:p>
         </w:tc>
@@ -246,15 +262,7 @@
                 <w:sz w:val="22"/>
                 <w:szCs w:val="22"/>
               </w:rPr>
-              <w:t>v1</w:t>
-            </w:r>
-            <w:r>
-              <w:rPr>
-                <w:rFonts w:ascii="Arial" w:eastAsia="Arial" w:hAnsi="Arial" w:cs="Arial"/>
-                <w:sz w:val="22"/>
-                <w:szCs w:val="22"/>
-              </w:rPr>
-              <w:t>.0</w:t>
+              <w:t>v1.0</w:t>
             </w:r>
           </w:p>
         </w:tc>
@@ -433,7 +441,25 @@
                 <w:sz w:val="21"/>
                 <w:szCs w:val="21"/>
               </w:rPr>
-              <w:t>Nhóm 6 – Môn Nhập môn Công nghệ Phần mềm</w:t>
+              <w:t xml:space="preserve">Nhóm </w:t>
+            </w:r>
+            <w:r>
+              <w:rPr>
+                <w:rFonts w:ascii="Arial" w:eastAsia="Arial" w:hAnsi="Arial" w:cs="Arial"/>
+                <w:color w:val="000000"/>
+                <w:sz w:val="21"/>
+                <w:szCs w:val="21"/>
+              </w:rPr>
+              <w:t>1</w:t>
+            </w:r>
+            <w:r>
+              <w:rPr>
+                <w:rFonts w:ascii="Arial" w:eastAsia="Arial" w:hAnsi="Arial" w:cs="Arial"/>
+                <w:color w:val="000000"/>
+                <w:sz w:val="21"/>
+                <w:szCs w:val="21"/>
+              </w:rPr>
+              <w:t>6 – Môn Nhập môn Công nghệ Phần mềm</w:t>
             </w:r>
           </w:p>
         </w:tc>
@@ -8058,6 +8084,7 @@
   <w:style w:type="character" w:default="1" w:styleId="Phngmcinhcuaoanvn">
     <w:name w:val="Default Paragraph Font"/>
     <w:uiPriority w:val="1"/>
+    <w:semiHidden/>
     <w:unhideWhenUsed/>
   </w:style>
   <w:style w:type="table" w:default="1" w:styleId="BangThngthng">

</xml_diff>